<commit_message>
Sync Tencent documents and validate Luban configuration
Refresh 11 workbooks and 11 system documents from the master index. Fix missing Item metadata and reserved intelligence field names at the web source, then re-export. Add table and enum registration, generation script, source hashes, and evidence of strict generation and binary loading for all 14 tables.
</commit_message>
<xml_diff>
--- a/Word/《英雄酒馆》立项规划.docx
+++ b/Word/《英雄酒馆》立项规划.docx
@@ -2652,6 +2652,79 @@
 <file path=word/numbering.xml><?xml version="1.0" encoding="utf-8"?>
 <w:numbering xmlns:w="http://schemas.openxmlformats.org/wordprocessingml/2006/main">
   <w:abstractNum w:abstractNumId="0">
+    <w:lvl w:ilvl="0">
+      <w:start w:val="1"/>
+      <w:numFmt w:val="decimal"/>
+      <w:lvlText w:val="%1."/>
+      <w:lvlJc w:val="left"/>
+      <w:pPr>
+        <w:ind w:left="336" w:hanging="336"/>
+      </w:pPr>
+      <w:rPr/>
+    </w:lvl>
+    <w:lvl w:ilvl="7">
+      <w:start w:val="1"/>
+      <w:numFmt w:val="lowerLetter"/>
+      <w:lvlText w:val="%8."/>
+      <w:lvlJc w:val="left"/>
+      <w:pPr>
+        <w:ind w:left="3416" w:hanging="336"/>
+      </w:pPr>
+    </w:lvl>
+    <w:lvl w:ilvl="6">
+      <w:start w:val="1"/>
+      <w:numFmt w:val="decimal"/>
+      <w:lvlText w:val="%7."/>
+      <w:lvlJc w:val="left"/>
+      <w:pPr>
+        <w:ind w:left="2976" w:hanging="336"/>
+      </w:pPr>
+    </w:lvl>
+    <w:lvl w:ilvl="5">
+      <w:start w:val="1"/>
+      <w:numFmt w:val="lowerRoman"/>
+      <w:lvlText w:val="%6."/>
+      <w:lvlJc w:val="left"/>
+      <w:pPr>
+        <w:ind w:left="2536" w:hanging="336"/>
+      </w:pPr>
+    </w:lvl>
+    <w:lvl w:ilvl="8">
+      <w:start w:val="1"/>
+      <w:numFmt w:val="lowerRoman"/>
+      <w:lvlText w:val="%9."/>
+      <w:lvlJc w:val="left"/>
+      <w:pPr>
+        <w:ind w:left="3856" w:hanging="336"/>
+      </w:pPr>
+    </w:lvl>
+    <w:lvl w:ilvl="2">
+      <w:start w:val="1"/>
+      <w:numFmt w:val="lowerRoman"/>
+      <w:lvlText w:val="%3."/>
+      <w:lvlJc w:val="left"/>
+      <w:pPr>
+        <w:ind w:left="1216" w:hanging="336"/>
+      </w:pPr>
+    </w:lvl>
+    <w:lvl w:ilvl="1">
+      <w:start w:val="1"/>
+      <w:numFmt w:val="lowerLetter"/>
+      <w:lvlText w:val="%2."/>
+      <w:lvlJc w:val="left"/>
+      <w:pPr>
+        <w:ind w:left="776" w:hanging="336"/>
+      </w:pPr>
+    </w:lvl>
+    <w:lvl w:ilvl="3">
+      <w:start w:val="1"/>
+      <w:numFmt w:val="decimal"/>
+      <w:lvlText w:val="%4."/>
+      <w:lvlJc w:val="left"/>
+      <w:pPr>
+        <w:ind w:left="1656" w:hanging="336"/>
+      </w:pPr>
+    </w:lvl>
     <w:lvl w:ilvl="4">
       <w:start w:val="1"/>
       <w:numFmt w:val="lowerLetter"/>
@@ -2661,6 +2734,62 @@
         <w:ind w:left="2096" w:hanging="336"/>
       </w:pPr>
     </w:lvl>
+  </w:abstractNum>
+  <w:abstractNum w:abstractNumId="1">
+    <w:lvl w:ilvl="1">
+      <w:start w:val="1"/>
+      <w:numFmt w:val="lowerLetter"/>
+      <w:lvlText w:val="%2."/>
+      <w:lvlJc w:val="left"/>
+      <w:pPr>
+        <w:ind w:left="776" w:hanging="336"/>
+      </w:pPr>
+    </w:lvl>
+    <w:lvl w:ilvl="3">
+      <w:start w:val="1"/>
+      <w:numFmt w:val="decimal"/>
+      <w:lvlText w:val="%4."/>
+      <w:lvlJc w:val="left"/>
+      <w:pPr>
+        <w:ind w:left="1656" w:hanging="336"/>
+      </w:pPr>
+    </w:lvl>
+    <w:lvl w:ilvl="7">
+      <w:start w:val="1"/>
+      <w:numFmt w:val="lowerLetter"/>
+      <w:lvlText w:val="%8."/>
+      <w:lvlJc w:val="left"/>
+      <w:pPr>
+        <w:ind w:left="3416" w:hanging="336"/>
+      </w:pPr>
+    </w:lvl>
+    <w:lvl w:ilvl="4">
+      <w:start w:val="1"/>
+      <w:numFmt w:val="lowerLetter"/>
+      <w:lvlText w:val="%5."/>
+      <w:lvlJc w:val="left"/>
+      <w:pPr>
+        <w:ind w:left="2096" w:hanging="336"/>
+      </w:pPr>
+    </w:lvl>
+    <w:lvl w:ilvl="5">
+      <w:start w:val="1"/>
+      <w:numFmt w:val="lowerRoman"/>
+      <w:lvlText w:val="%6."/>
+      <w:lvlJc w:val="left"/>
+      <w:pPr>
+        <w:ind w:left="2536" w:hanging="336"/>
+      </w:pPr>
+    </w:lvl>
+    <w:lvl w:ilvl="6">
+      <w:start w:val="1"/>
+      <w:numFmt w:val="decimal"/>
+      <w:lvlText w:val="%7."/>
+      <w:lvlJc w:val="left"/>
+      <w:pPr>
+        <w:ind w:left="2976" w:hanging="336"/>
+      </w:pPr>
+    </w:lvl>
     <w:lvl w:ilvl="8">
       <w:start w:val="1"/>
       <w:numFmt w:val="lowerRoman"/>
@@ -2670,6 +2799,90 @@
         <w:ind w:left="3856" w:hanging="336"/>
       </w:pPr>
     </w:lvl>
+    <w:lvl w:ilvl="0">
+      <w:start w:val="1"/>
+      <w:numFmt w:val="decimal"/>
+      <w:lvlText w:val="%1."/>
+      <w:lvlJc w:val="left"/>
+      <w:pPr>
+        <w:ind w:left="336" w:hanging="336"/>
+      </w:pPr>
+      <w:rPr/>
+    </w:lvl>
+    <w:lvl w:ilvl="2">
+      <w:start w:val="1"/>
+      <w:numFmt w:val="lowerRoman"/>
+      <w:lvlText w:val="%3."/>
+      <w:lvlJc w:val="left"/>
+      <w:pPr>
+        <w:ind w:left="1216" w:hanging="336"/>
+      </w:pPr>
+    </w:lvl>
+  </w:abstractNum>
+  <w:abstractNum w:abstractNumId="2">
+    <w:lvl w:ilvl="7">
+      <w:start w:val="1"/>
+      <w:numFmt w:val="lowerLetter"/>
+      <w:lvlText w:val="%8."/>
+      <w:lvlJc w:val="left"/>
+      <w:pPr>
+        <w:ind w:left="3416" w:hanging="336"/>
+      </w:pPr>
+    </w:lvl>
+    <w:lvl w:ilvl="4">
+      <w:start w:val="1"/>
+      <w:numFmt w:val="lowerLetter"/>
+      <w:lvlText w:val="%5."/>
+      <w:lvlJc w:val="left"/>
+      <w:pPr>
+        <w:ind w:left="2096" w:hanging="336"/>
+      </w:pPr>
+    </w:lvl>
+    <w:lvl w:ilvl="2">
+      <w:start w:val="1"/>
+      <w:numFmt w:val="lowerRoman"/>
+      <w:lvlText w:val="%3."/>
+      <w:lvlJc w:val="left"/>
+      <w:pPr>
+        <w:ind w:left="1216" w:hanging="336"/>
+      </w:pPr>
+    </w:lvl>
+    <w:lvl w:ilvl="5">
+      <w:start w:val="1"/>
+      <w:numFmt w:val="lowerRoman"/>
+      <w:lvlText w:val="%6."/>
+      <w:lvlJc w:val="left"/>
+      <w:pPr>
+        <w:ind w:left="2536" w:hanging="336"/>
+      </w:pPr>
+    </w:lvl>
+    <w:lvl w:ilvl="3">
+      <w:start w:val="1"/>
+      <w:numFmt w:val="decimal"/>
+      <w:lvlText w:val="%4."/>
+      <w:lvlJc w:val="left"/>
+      <w:pPr>
+        <w:ind w:left="1656" w:hanging="336"/>
+      </w:pPr>
+    </w:lvl>
+    <w:lvl w:ilvl="8">
+      <w:start w:val="1"/>
+      <w:numFmt w:val="lowerRoman"/>
+      <w:lvlText w:val="%9."/>
+      <w:lvlJc w:val="left"/>
+      <w:pPr>
+        <w:ind w:left="3856" w:hanging="336"/>
+      </w:pPr>
+    </w:lvl>
+    <w:lvl w:ilvl="1">
+      <w:start w:val="1"/>
+      <w:numFmt w:val="lowerLetter"/>
+      <w:lvlText w:val="%2."/>
+      <w:lvlJc w:val="left"/>
+      <w:pPr>
+        <w:ind w:left="776" w:hanging="336"/>
+      </w:pPr>
+    </w:lvl>
     <w:lvl w:ilvl="6">
       <w:start w:val="1"/>
       <w:numFmt w:val="decimal"/>
@@ -2679,6 +2892,91 @@
         <w:ind w:left="2976" w:hanging="336"/>
       </w:pPr>
     </w:lvl>
+    <w:lvl w:ilvl="0">
+      <w:start w:val="1"/>
+      <w:numFmt w:val="decimal"/>
+      <w:lvlText w:val="%1."/>
+      <w:lvlJc w:val="left"/>
+      <w:pPr>
+        <w:ind w:left="336" w:hanging="336"/>
+      </w:pPr>
+      <w:rPr/>
+    </w:lvl>
+  </w:abstractNum>
+  <w:abstractNum w:abstractNumId="3">
+    <w:lvl w:ilvl="6">
+      <w:start w:val="1"/>
+      <w:numFmt w:val="decimal"/>
+      <w:lvlText w:val="%7."/>
+      <w:lvlJc w:val="left"/>
+      <w:pPr>
+        <w:ind w:left="2976" w:hanging="336"/>
+      </w:pPr>
+    </w:lvl>
+    <w:lvl w:ilvl="0">
+      <w:start w:val="1"/>
+      <w:numFmt w:val="decimal"/>
+      <w:lvlText w:val="%1."/>
+      <w:lvlJc w:val="left"/>
+      <w:pPr>
+        <w:ind w:left="336" w:hanging="336"/>
+      </w:pPr>
+      <w:rPr/>
+    </w:lvl>
+    <w:lvl w:ilvl="7">
+      <w:start w:val="1"/>
+      <w:numFmt w:val="lowerLetter"/>
+      <w:lvlText w:val="%8."/>
+      <w:lvlJc w:val="left"/>
+      <w:pPr>
+        <w:ind w:left="3416" w:hanging="336"/>
+      </w:pPr>
+    </w:lvl>
+    <w:lvl w:ilvl="1">
+      <w:start w:val="1"/>
+      <w:numFmt w:val="lowerLetter"/>
+      <w:lvlText w:val="%2."/>
+      <w:lvlJc w:val="left"/>
+      <w:pPr>
+        <w:ind w:left="776" w:hanging="336"/>
+      </w:pPr>
+    </w:lvl>
+    <w:lvl w:ilvl="8">
+      <w:start w:val="1"/>
+      <w:numFmt w:val="lowerRoman"/>
+      <w:lvlText w:val="%9."/>
+      <w:lvlJc w:val="left"/>
+      <w:pPr>
+        <w:ind w:left="3856" w:hanging="336"/>
+      </w:pPr>
+    </w:lvl>
+    <w:lvl w:ilvl="5">
+      <w:start w:val="1"/>
+      <w:numFmt w:val="lowerRoman"/>
+      <w:lvlText w:val="%6."/>
+      <w:lvlJc w:val="left"/>
+      <w:pPr>
+        <w:ind w:left="2536" w:hanging="336"/>
+      </w:pPr>
+    </w:lvl>
+    <w:lvl w:ilvl="4">
+      <w:start w:val="1"/>
+      <w:numFmt w:val="lowerLetter"/>
+      <w:lvlText w:val="%5."/>
+      <w:lvlJc w:val="left"/>
+      <w:pPr>
+        <w:ind w:left="2096" w:hanging="336"/>
+      </w:pPr>
+    </w:lvl>
+    <w:lvl w:ilvl="3">
+      <w:start w:val="1"/>
+      <w:numFmt w:val="decimal"/>
+      <w:lvlText w:val="%4."/>
+      <w:lvlJc w:val="left"/>
+      <w:pPr>
+        <w:ind w:left="1656" w:hanging="336"/>
+      </w:pPr>
+    </w:lvl>
     <w:lvl w:ilvl="2">
       <w:start w:val="1"/>
       <w:numFmt w:val="lowerRoman"/>
@@ -2688,6 +2986,35 @@
         <w:ind w:left="1216" w:hanging="336"/>
       </w:pPr>
     </w:lvl>
+  </w:abstractNum>
+  <w:abstractNum w:abstractNumId="4">
+    <w:lvl w:ilvl="3">
+      <w:start w:val="1"/>
+      <w:numFmt w:val="decimal"/>
+      <w:lvlText w:val="%4."/>
+      <w:lvlJc w:val="left"/>
+      <w:pPr>
+        <w:ind w:left="1656" w:hanging="336"/>
+      </w:pPr>
+    </w:lvl>
+    <w:lvl w:ilvl="5">
+      <w:start w:val="1"/>
+      <w:numFmt w:val="lowerRoman"/>
+      <w:lvlText w:val="%6."/>
+      <w:lvlJc w:val="left"/>
+      <w:pPr>
+        <w:ind w:left="2536" w:hanging="336"/>
+      </w:pPr>
+    </w:lvl>
+    <w:lvl w:ilvl="4">
+      <w:start w:val="1"/>
+      <w:numFmt w:val="lowerLetter"/>
+      <w:lvlText w:val="%5."/>
+      <w:lvlJc w:val="left"/>
+      <w:pPr>
+        <w:ind w:left="2096" w:hanging="336"/>
+      </w:pPr>
+    </w:lvl>
     <w:lvl w:ilvl="7">
       <w:start w:val="1"/>
       <w:numFmt w:val="lowerLetter"/>
@@ -2697,6 +3024,24 @@
         <w:ind w:left="3416" w:hanging="336"/>
       </w:pPr>
     </w:lvl>
+    <w:lvl w:ilvl="6">
+      <w:start w:val="1"/>
+      <w:numFmt w:val="decimal"/>
+      <w:lvlText w:val="%7."/>
+      <w:lvlJc w:val="left"/>
+      <w:pPr>
+        <w:ind w:left="2976" w:hanging="336"/>
+      </w:pPr>
+    </w:lvl>
+    <w:lvl w:ilvl="1">
+      <w:start w:val="1"/>
+      <w:numFmt w:val="lowerLetter"/>
+      <w:lvlText w:val="%2."/>
+      <w:lvlJc w:val="left"/>
+      <w:pPr>
+        <w:ind w:left="776" w:hanging="336"/>
+      </w:pPr>
+    </w:lvl>
     <w:lvl w:ilvl="0">
       <w:start w:val="1"/>
       <w:numFmt w:val="decimal"/>
@@ -2707,6 +3052,63 @@
       </w:pPr>
       <w:rPr/>
     </w:lvl>
+    <w:lvl w:ilvl="2">
+      <w:start w:val="1"/>
+      <w:numFmt w:val="lowerRoman"/>
+      <w:lvlText w:val="%3."/>
+      <w:lvlJc w:val="left"/>
+      <w:pPr>
+        <w:ind w:left="1216" w:hanging="336"/>
+      </w:pPr>
+    </w:lvl>
+    <w:lvl w:ilvl="8">
+      <w:start w:val="1"/>
+      <w:numFmt w:val="lowerRoman"/>
+      <w:lvlText w:val="%9."/>
+      <w:lvlJc w:val="left"/>
+      <w:pPr>
+        <w:ind w:left="3856" w:hanging="336"/>
+      </w:pPr>
+    </w:lvl>
+  </w:abstractNum>
+  <w:abstractNum w:abstractNumId="5">
+    <w:lvl w:ilvl="3">
+      <w:start w:val="1"/>
+      <w:numFmt w:val="decimal"/>
+      <w:lvlText w:val="%4."/>
+      <w:lvlJc w:val="left"/>
+      <w:pPr>
+        <w:ind w:left="1656" w:hanging="336"/>
+      </w:pPr>
+    </w:lvl>
+    <w:lvl w:ilvl="2">
+      <w:start w:val="1"/>
+      <w:numFmt w:val="lowerRoman"/>
+      <w:lvlText w:val="%3."/>
+      <w:lvlJc w:val="left"/>
+      <w:pPr>
+        <w:ind w:left="1216" w:hanging="336"/>
+      </w:pPr>
+    </w:lvl>
+    <w:lvl w:ilvl="0">
+      <w:start w:val="1"/>
+      <w:numFmt w:val="decimal"/>
+      <w:lvlText w:val="%1."/>
+      <w:lvlJc w:val="left"/>
+      <w:pPr>
+        <w:ind w:left="336" w:hanging="336"/>
+      </w:pPr>
+      <w:rPr/>
+    </w:lvl>
+    <w:lvl w:ilvl="8">
+      <w:start w:val="1"/>
+      <w:numFmt w:val="lowerRoman"/>
+      <w:lvlText w:val="%9."/>
+      <w:lvlJc w:val="left"/>
+      <w:pPr>
+        <w:ind w:left="3856" w:hanging="336"/>
+      </w:pPr>
+    </w:lvl>
     <w:lvl w:ilvl="1">
       <w:start w:val="1"/>
       <w:numFmt w:val="lowerLetter"/>
@@ -2716,6 +3118,15 @@
         <w:ind w:left="776" w:hanging="336"/>
       </w:pPr>
     </w:lvl>
+    <w:lvl w:ilvl="7">
+      <w:start w:val="1"/>
+      <w:numFmt w:val="lowerLetter"/>
+      <w:lvlText w:val="%8."/>
+      <w:lvlJc w:val="left"/>
+      <w:pPr>
+        <w:ind w:left="3416" w:hanging="336"/>
+      </w:pPr>
+    </w:lvl>
     <w:lvl w:ilvl="5">
       <w:start w:val="1"/>
       <w:numFmt w:val="lowerRoman"/>
@@ -2725,6 +3136,35 @@
         <w:ind w:left="2536" w:hanging="336"/>
       </w:pPr>
     </w:lvl>
+    <w:lvl w:ilvl="6">
+      <w:start w:val="1"/>
+      <w:numFmt w:val="decimal"/>
+      <w:lvlText w:val="%7."/>
+      <w:lvlJc w:val="left"/>
+      <w:pPr>
+        <w:ind w:left="2976" w:hanging="336"/>
+      </w:pPr>
+    </w:lvl>
+    <w:lvl w:ilvl="4">
+      <w:start w:val="1"/>
+      <w:numFmt w:val="lowerLetter"/>
+      <w:lvlText w:val="%5."/>
+      <w:lvlJc w:val="left"/>
+      <w:pPr>
+        <w:ind w:left="2096" w:hanging="336"/>
+      </w:pPr>
+    </w:lvl>
+  </w:abstractNum>
+  <w:abstractNum w:abstractNumId="6">
+    <w:lvl w:ilvl="5">
+      <w:start w:val="1"/>
+      <w:numFmt w:val="lowerRoman"/>
+      <w:lvlText w:val="%6."/>
+      <w:lvlJc w:val="left"/>
+      <w:pPr>
+        <w:ind w:left="2536" w:hanging="336"/>
+      </w:pPr>
+    </w:lvl>
     <w:lvl w:ilvl="3">
       <w:start w:val="1"/>
       <w:numFmt w:val="decimal"/>
@@ -2734,8 +3174,52 @@
         <w:ind w:left="1656" w:hanging="336"/>
       </w:pPr>
     </w:lvl>
-  </w:abstractNum>
-  <w:abstractNum w:abstractNumId="1">
+    <w:lvl w:ilvl="0">
+      <w:start w:val="1"/>
+      <w:numFmt w:val="decimal"/>
+      <w:lvlText w:val="%1."/>
+      <w:lvlJc w:val="left"/>
+      <w:pPr>
+        <w:ind w:left="336" w:hanging="336"/>
+      </w:pPr>
+      <w:rPr/>
+    </w:lvl>
+    <w:lvl w:ilvl="7">
+      <w:start w:val="1"/>
+      <w:numFmt w:val="lowerLetter"/>
+      <w:lvlText w:val="%8."/>
+      <w:lvlJc w:val="left"/>
+      <w:pPr>
+        <w:ind w:left="3416" w:hanging="336"/>
+      </w:pPr>
+    </w:lvl>
+    <w:lvl w:ilvl="6">
+      <w:start w:val="1"/>
+      <w:numFmt w:val="decimal"/>
+      <w:lvlText w:val="%7."/>
+      <w:lvlJc w:val="left"/>
+      <w:pPr>
+        <w:ind w:left="2976" w:hanging="336"/>
+      </w:pPr>
+    </w:lvl>
+    <w:lvl w:ilvl="1">
+      <w:start w:val="1"/>
+      <w:numFmt w:val="lowerLetter"/>
+      <w:lvlText w:val="%2."/>
+      <w:lvlJc w:val="left"/>
+      <w:pPr>
+        <w:ind w:left="776" w:hanging="336"/>
+      </w:pPr>
+    </w:lvl>
+    <w:lvl w:ilvl="4">
+      <w:start w:val="1"/>
+      <w:numFmt w:val="lowerLetter"/>
+      <w:lvlText w:val="%5."/>
+      <w:lvlJc w:val="left"/>
+      <w:pPr>
+        <w:ind w:left="2096" w:hanging="336"/>
+      </w:pPr>
+    </w:lvl>
     <w:lvl w:ilvl="8">
       <w:start w:val="1"/>
       <w:numFmt w:val="lowerRoman"/>
@@ -2745,6 +3229,44 @@
         <w:ind w:left="3856" w:hanging="336"/>
       </w:pPr>
     </w:lvl>
+    <w:lvl w:ilvl="2">
+      <w:start w:val="1"/>
+      <w:numFmt w:val="lowerRoman"/>
+      <w:lvlText w:val="%3."/>
+      <w:lvlJc w:val="left"/>
+      <w:pPr>
+        <w:ind w:left="1216" w:hanging="336"/>
+      </w:pPr>
+    </w:lvl>
+  </w:abstractNum>
+  <w:abstractNum w:abstractNumId="7">
+    <w:lvl w:ilvl="7">
+      <w:start w:val="1"/>
+      <w:numFmt w:val="lowerLetter"/>
+      <w:lvlText w:val="%8."/>
+      <w:lvlJc w:val="left"/>
+      <w:pPr>
+        <w:ind w:left="3416" w:hanging="336"/>
+      </w:pPr>
+    </w:lvl>
+    <w:lvl w:ilvl="2">
+      <w:start w:val="1"/>
+      <w:numFmt w:val="lowerRoman"/>
+      <w:lvlText w:val="%3."/>
+      <w:lvlJc w:val="left"/>
+      <w:pPr>
+        <w:ind w:left="1216" w:hanging="336"/>
+      </w:pPr>
+    </w:lvl>
+    <w:lvl w:ilvl="4">
+      <w:start w:val="1"/>
+      <w:numFmt w:val="lowerLetter"/>
+      <w:lvlText w:val="%5."/>
+      <w:lvlJc w:val="left"/>
+      <w:pPr>
+        <w:ind w:left="2096" w:hanging="336"/>
+      </w:pPr>
+    </w:lvl>
     <w:lvl w:ilvl="0">
       <w:start w:val="1"/>
       <w:numFmt w:val="decimal"/>
@@ -2755,6 +3277,24 @@
       </w:pPr>
       <w:rPr/>
     </w:lvl>
+    <w:lvl w:ilvl="1">
+      <w:start w:val="1"/>
+      <w:numFmt w:val="lowerLetter"/>
+      <w:lvlText w:val="%2."/>
+      <w:lvlJc w:val="left"/>
+      <w:pPr>
+        <w:ind w:left="776" w:hanging="336"/>
+      </w:pPr>
+    </w:lvl>
+    <w:lvl w:ilvl="8">
+      <w:start w:val="1"/>
+      <w:numFmt w:val="lowerRoman"/>
+      <w:lvlText w:val="%9."/>
+      <w:lvlJc w:val="left"/>
+      <w:pPr>
+        <w:ind w:left="3856" w:hanging="336"/>
+      </w:pPr>
+    </w:lvl>
     <w:lvl w:ilvl="3">
       <w:start w:val="1"/>
       <w:numFmt w:val="decimal"/>
@@ -2764,6 +3304,15 @@
         <w:ind w:left="1656" w:hanging="336"/>
       </w:pPr>
     </w:lvl>
+    <w:lvl w:ilvl="6">
+      <w:start w:val="1"/>
+      <w:numFmt w:val="decimal"/>
+      <w:lvlText w:val="%7."/>
+      <w:lvlJc w:val="left"/>
+      <w:pPr>
+        <w:ind w:left="2976" w:hanging="336"/>
+      </w:pPr>
+    </w:lvl>
     <w:lvl w:ilvl="5">
       <w:start w:val="1"/>
       <w:numFmt w:val="lowerRoman"/>
@@ -2771,555 +3320,6 @@
       <w:lvlJc w:val="left"/>
       <w:pPr>
         <w:ind w:left="2536" w:hanging="336"/>
-      </w:pPr>
-    </w:lvl>
-    <w:lvl w:ilvl="6">
-      <w:start w:val="1"/>
-      <w:numFmt w:val="decimal"/>
-      <w:lvlText w:val="%7."/>
-      <w:lvlJc w:val="left"/>
-      <w:pPr>
-        <w:ind w:left="2976" w:hanging="336"/>
-      </w:pPr>
-    </w:lvl>
-    <w:lvl w:ilvl="2">
-      <w:start w:val="1"/>
-      <w:numFmt w:val="lowerRoman"/>
-      <w:lvlText w:val="%3."/>
-      <w:lvlJc w:val="left"/>
-      <w:pPr>
-        <w:ind w:left="1216" w:hanging="336"/>
-      </w:pPr>
-    </w:lvl>
-    <w:lvl w:ilvl="4">
-      <w:start w:val="1"/>
-      <w:numFmt w:val="lowerLetter"/>
-      <w:lvlText w:val="%5."/>
-      <w:lvlJc w:val="left"/>
-      <w:pPr>
-        <w:ind w:left="2096" w:hanging="336"/>
-      </w:pPr>
-    </w:lvl>
-    <w:lvl w:ilvl="7">
-      <w:start w:val="1"/>
-      <w:numFmt w:val="lowerLetter"/>
-      <w:lvlText w:val="%8."/>
-      <w:lvlJc w:val="left"/>
-      <w:pPr>
-        <w:ind w:left="3416" w:hanging="336"/>
-      </w:pPr>
-    </w:lvl>
-    <w:lvl w:ilvl="1">
-      <w:start w:val="1"/>
-      <w:numFmt w:val="lowerLetter"/>
-      <w:lvlText w:val="%2."/>
-      <w:lvlJc w:val="left"/>
-      <w:pPr>
-        <w:ind w:left="776" w:hanging="336"/>
-      </w:pPr>
-    </w:lvl>
-  </w:abstractNum>
-  <w:abstractNum w:abstractNumId="2">
-    <w:lvl w:ilvl="4">
-      <w:start w:val="1"/>
-      <w:numFmt w:val="lowerLetter"/>
-      <w:lvlText w:val="%5."/>
-      <w:lvlJc w:val="left"/>
-      <w:pPr>
-        <w:ind w:left="2096" w:hanging="336"/>
-      </w:pPr>
-    </w:lvl>
-    <w:lvl w:ilvl="2">
-      <w:start w:val="1"/>
-      <w:numFmt w:val="lowerRoman"/>
-      <w:lvlText w:val="%3."/>
-      <w:lvlJc w:val="left"/>
-      <w:pPr>
-        <w:ind w:left="1216" w:hanging="336"/>
-      </w:pPr>
-    </w:lvl>
-    <w:lvl w:ilvl="8">
-      <w:start w:val="1"/>
-      <w:numFmt w:val="lowerRoman"/>
-      <w:lvlText w:val="%9."/>
-      <w:lvlJc w:val="left"/>
-      <w:pPr>
-        <w:ind w:left="3856" w:hanging="336"/>
-      </w:pPr>
-    </w:lvl>
-    <w:lvl w:ilvl="0">
-      <w:start w:val="1"/>
-      <w:numFmt w:val="decimal"/>
-      <w:lvlText w:val="%1."/>
-      <w:lvlJc w:val="left"/>
-      <w:pPr>
-        <w:ind w:left="336" w:hanging="336"/>
-      </w:pPr>
-      <w:rPr/>
-    </w:lvl>
-    <w:lvl w:ilvl="3">
-      <w:start w:val="1"/>
-      <w:numFmt w:val="decimal"/>
-      <w:lvlText w:val="%4."/>
-      <w:lvlJc w:val="left"/>
-      <w:pPr>
-        <w:ind w:left="1656" w:hanging="336"/>
-      </w:pPr>
-    </w:lvl>
-    <w:lvl w:ilvl="7">
-      <w:start w:val="1"/>
-      <w:numFmt w:val="lowerLetter"/>
-      <w:lvlText w:val="%8."/>
-      <w:lvlJc w:val="left"/>
-      <w:pPr>
-        <w:ind w:left="3416" w:hanging="336"/>
-      </w:pPr>
-    </w:lvl>
-    <w:lvl w:ilvl="5">
-      <w:start w:val="1"/>
-      <w:numFmt w:val="lowerRoman"/>
-      <w:lvlText w:val="%6."/>
-      <w:lvlJc w:val="left"/>
-      <w:pPr>
-        <w:ind w:left="2536" w:hanging="336"/>
-      </w:pPr>
-    </w:lvl>
-    <w:lvl w:ilvl="6">
-      <w:start w:val="1"/>
-      <w:numFmt w:val="decimal"/>
-      <w:lvlText w:val="%7."/>
-      <w:lvlJc w:val="left"/>
-      <w:pPr>
-        <w:ind w:left="2976" w:hanging="336"/>
-      </w:pPr>
-    </w:lvl>
-    <w:lvl w:ilvl="1">
-      <w:start w:val="1"/>
-      <w:numFmt w:val="lowerLetter"/>
-      <w:lvlText w:val="%2."/>
-      <w:lvlJc w:val="left"/>
-      <w:pPr>
-        <w:ind w:left="776" w:hanging="336"/>
-      </w:pPr>
-    </w:lvl>
-  </w:abstractNum>
-  <w:abstractNum w:abstractNumId="3">
-    <w:lvl w:ilvl="0">
-      <w:start w:val="1"/>
-      <w:numFmt w:val="decimal"/>
-      <w:lvlText w:val="%1."/>
-      <w:lvlJc w:val="left"/>
-      <w:pPr>
-        <w:ind w:left="336" w:hanging="336"/>
-      </w:pPr>
-      <w:rPr/>
-    </w:lvl>
-    <w:lvl w:ilvl="1">
-      <w:start w:val="1"/>
-      <w:numFmt w:val="lowerLetter"/>
-      <w:lvlText w:val="%2."/>
-      <w:lvlJc w:val="left"/>
-      <w:pPr>
-        <w:ind w:left="776" w:hanging="336"/>
-      </w:pPr>
-    </w:lvl>
-    <w:lvl w:ilvl="6">
-      <w:start w:val="1"/>
-      <w:numFmt w:val="decimal"/>
-      <w:lvlText w:val="%7."/>
-      <w:lvlJc w:val="left"/>
-      <w:pPr>
-        <w:ind w:left="2976" w:hanging="336"/>
-      </w:pPr>
-    </w:lvl>
-    <w:lvl w:ilvl="5">
-      <w:start w:val="1"/>
-      <w:numFmt w:val="lowerRoman"/>
-      <w:lvlText w:val="%6."/>
-      <w:lvlJc w:val="left"/>
-      <w:pPr>
-        <w:ind w:left="2536" w:hanging="336"/>
-      </w:pPr>
-    </w:lvl>
-    <w:lvl w:ilvl="4">
-      <w:start w:val="1"/>
-      <w:numFmt w:val="lowerLetter"/>
-      <w:lvlText w:val="%5."/>
-      <w:lvlJc w:val="left"/>
-      <w:pPr>
-        <w:ind w:left="2096" w:hanging="336"/>
-      </w:pPr>
-    </w:lvl>
-    <w:lvl w:ilvl="8">
-      <w:start w:val="1"/>
-      <w:numFmt w:val="lowerRoman"/>
-      <w:lvlText w:val="%9."/>
-      <w:lvlJc w:val="left"/>
-      <w:pPr>
-        <w:ind w:left="3856" w:hanging="336"/>
-      </w:pPr>
-    </w:lvl>
-    <w:lvl w:ilvl="2">
-      <w:start w:val="1"/>
-      <w:numFmt w:val="lowerRoman"/>
-      <w:lvlText w:val="%3."/>
-      <w:lvlJc w:val="left"/>
-      <w:pPr>
-        <w:ind w:left="1216" w:hanging="336"/>
-      </w:pPr>
-    </w:lvl>
-    <w:lvl w:ilvl="7">
-      <w:start w:val="1"/>
-      <w:numFmt w:val="lowerLetter"/>
-      <w:lvlText w:val="%8."/>
-      <w:lvlJc w:val="left"/>
-      <w:pPr>
-        <w:ind w:left="3416" w:hanging="336"/>
-      </w:pPr>
-    </w:lvl>
-    <w:lvl w:ilvl="3">
-      <w:start w:val="1"/>
-      <w:numFmt w:val="decimal"/>
-      <w:lvlText w:val="%4."/>
-      <w:lvlJc w:val="left"/>
-      <w:pPr>
-        <w:ind w:left="1656" w:hanging="336"/>
-      </w:pPr>
-    </w:lvl>
-  </w:abstractNum>
-  <w:abstractNum w:abstractNumId="4">
-    <w:lvl w:ilvl="5">
-      <w:start w:val="1"/>
-      <w:numFmt w:val="lowerRoman"/>
-      <w:lvlText w:val="%6."/>
-      <w:lvlJc w:val="left"/>
-      <w:pPr>
-        <w:ind w:left="2536" w:hanging="336"/>
-      </w:pPr>
-    </w:lvl>
-    <w:lvl w:ilvl="7">
-      <w:start w:val="1"/>
-      <w:numFmt w:val="lowerLetter"/>
-      <w:lvlText w:val="%8."/>
-      <w:lvlJc w:val="left"/>
-      <w:pPr>
-        <w:ind w:left="3416" w:hanging="336"/>
-      </w:pPr>
-    </w:lvl>
-    <w:lvl w:ilvl="8">
-      <w:start w:val="1"/>
-      <w:numFmt w:val="lowerRoman"/>
-      <w:lvlText w:val="%9."/>
-      <w:lvlJc w:val="left"/>
-      <w:pPr>
-        <w:ind w:left="3856" w:hanging="336"/>
-      </w:pPr>
-    </w:lvl>
-    <w:lvl w:ilvl="0">
-      <w:start w:val="1"/>
-      <w:numFmt w:val="decimal"/>
-      <w:lvlText w:val="%1."/>
-      <w:lvlJc w:val="left"/>
-      <w:pPr>
-        <w:ind w:left="336" w:hanging="336"/>
-      </w:pPr>
-      <w:rPr/>
-    </w:lvl>
-    <w:lvl w:ilvl="2">
-      <w:start w:val="1"/>
-      <w:numFmt w:val="lowerRoman"/>
-      <w:lvlText w:val="%3."/>
-      <w:lvlJc w:val="left"/>
-      <w:pPr>
-        <w:ind w:left="1216" w:hanging="336"/>
-      </w:pPr>
-    </w:lvl>
-    <w:lvl w:ilvl="3">
-      <w:start w:val="1"/>
-      <w:numFmt w:val="decimal"/>
-      <w:lvlText w:val="%4."/>
-      <w:lvlJc w:val="left"/>
-      <w:pPr>
-        <w:ind w:left="1656" w:hanging="336"/>
-      </w:pPr>
-    </w:lvl>
-    <w:lvl w:ilvl="1">
-      <w:start w:val="1"/>
-      <w:numFmt w:val="lowerLetter"/>
-      <w:lvlText w:val="%2."/>
-      <w:lvlJc w:val="left"/>
-      <w:pPr>
-        <w:ind w:left="776" w:hanging="336"/>
-      </w:pPr>
-    </w:lvl>
-    <w:lvl w:ilvl="4">
-      <w:start w:val="1"/>
-      <w:numFmt w:val="lowerLetter"/>
-      <w:lvlText w:val="%5."/>
-      <w:lvlJc w:val="left"/>
-      <w:pPr>
-        <w:ind w:left="2096" w:hanging="336"/>
-      </w:pPr>
-    </w:lvl>
-    <w:lvl w:ilvl="6">
-      <w:start w:val="1"/>
-      <w:numFmt w:val="decimal"/>
-      <w:lvlText w:val="%7."/>
-      <w:lvlJc w:val="left"/>
-      <w:pPr>
-        <w:ind w:left="2976" w:hanging="336"/>
-      </w:pPr>
-    </w:lvl>
-  </w:abstractNum>
-  <w:abstractNum w:abstractNumId="5">
-    <w:lvl w:ilvl="8">
-      <w:start w:val="1"/>
-      <w:numFmt w:val="lowerRoman"/>
-      <w:lvlText w:val="%9."/>
-      <w:lvlJc w:val="left"/>
-      <w:pPr>
-        <w:ind w:left="3856" w:hanging="336"/>
-      </w:pPr>
-    </w:lvl>
-    <w:lvl w:ilvl="7">
-      <w:start w:val="1"/>
-      <w:numFmt w:val="lowerLetter"/>
-      <w:lvlText w:val="%8."/>
-      <w:lvlJc w:val="left"/>
-      <w:pPr>
-        <w:ind w:left="3416" w:hanging="336"/>
-      </w:pPr>
-    </w:lvl>
-    <w:lvl w:ilvl="5">
-      <w:start w:val="1"/>
-      <w:numFmt w:val="lowerRoman"/>
-      <w:lvlText w:val="%6."/>
-      <w:lvlJc w:val="left"/>
-      <w:pPr>
-        <w:ind w:left="2536" w:hanging="336"/>
-      </w:pPr>
-    </w:lvl>
-    <w:lvl w:ilvl="6">
-      <w:start w:val="1"/>
-      <w:numFmt w:val="decimal"/>
-      <w:lvlText w:val="%7."/>
-      <w:lvlJc w:val="left"/>
-      <w:pPr>
-        <w:ind w:left="2976" w:hanging="336"/>
-      </w:pPr>
-    </w:lvl>
-    <w:lvl w:ilvl="0">
-      <w:start w:val="1"/>
-      <w:numFmt w:val="decimal"/>
-      <w:lvlText w:val="%1."/>
-      <w:lvlJc w:val="left"/>
-      <w:pPr>
-        <w:ind w:left="336" w:hanging="336"/>
-      </w:pPr>
-      <w:rPr/>
-    </w:lvl>
-    <w:lvl w:ilvl="2">
-      <w:start w:val="1"/>
-      <w:numFmt w:val="lowerRoman"/>
-      <w:lvlText w:val="%3."/>
-      <w:lvlJc w:val="left"/>
-      <w:pPr>
-        <w:ind w:left="1216" w:hanging="336"/>
-      </w:pPr>
-    </w:lvl>
-    <w:lvl w:ilvl="4">
-      <w:start w:val="1"/>
-      <w:numFmt w:val="lowerLetter"/>
-      <w:lvlText w:val="%5."/>
-      <w:lvlJc w:val="left"/>
-      <w:pPr>
-        <w:ind w:left="2096" w:hanging="336"/>
-      </w:pPr>
-    </w:lvl>
-    <w:lvl w:ilvl="3">
-      <w:start w:val="1"/>
-      <w:numFmt w:val="decimal"/>
-      <w:lvlText w:val="%4."/>
-      <w:lvlJc w:val="left"/>
-      <w:pPr>
-        <w:ind w:left="1656" w:hanging="336"/>
-      </w:pPr>
-    </w:lvl>
-    <w:lvl w:ilvl="1">
-      <w:start w:val="1"/>
-      <w:numFmt w:val="lowerLetter"/>
-      <w:lvlText w:val="%2."/>
-      <w:lvlJc w:val="left"/>
-      <w:pPr>
-        <w:ind w:left="776" w:hanging="336"/>
-      </w:pPr>
-    </w:lvl>
-  </w:abstractNum>
-  <w:abstractNum w:abstractNumId="6">
-    <w:lvl w:ilvl="6">
-      <w:start w:val="1"/>
-      <w:numFmt w:val="decimal"/>
-      <w:lvlText w:val="%7."/>
-      <w:lvlJc w:val="left"/>
-      <w:pPr>
-        <w:ind w:left="2976" w:hanging="336"/>
-      </w:pPr>
-    </w:lvl>
-    <w:lvl w:ilvl="3">
-      <w:start w:val="1"/>
-      <w:numFmt w:val="decimal"/>
-      <w:lvlText w:val="%4."/>
-      <w:lvlJc w:val="left"/>
-      <w:pPr>
-        <w:ind w:left="1656" w:hanging="336"/>
-      </w:pPr>
-    </w:lvl>
-    <w:lvl w:ilvl="8">
-      <w:start w:val="1"/>
-      <w:numFmt w:val="lowerRoman"/>
-      <w:lvlText w:val="%9."/>
-      <w:lvlJc w:val="left"/>
-      <w:pPr>
-        <w:ind w:left="3856" w:hanging="336"/>
-      </w:pPr>
-    </w:lvl>
-    <w:lvl w:ilvl="7">
-      <w:start w:val="1"/>
-      <w:numFmt w:val="lowerLetter"/>
-      <w:lvlText w:val="%8."/>
-      <w:lvlJc w:val="left"/>
-      <w:pPr>
-        <w:ind w:left="3416" w:hanging="336"/>
-      </w:pPr>
-    </w:lvl>
-    <w:lvl w:ilvl="0">
-      <w:start w:val="1"/>
-      <w:numFmt w:val="decimal"/>
-      <w:lvlText w:val="%1."/>
-      <w:lvlJc w:val="left"/>
-      <w:pPr>
-        <w:ind w:left="336" w:hanging="336"/>
-      </w:pPr>
-      <w:rPr/>
-    </w:lvl>
-    <w:lvl w:ilvl="2">
-      <w:start w:val="1"/>
-      <w:numFmt w:val="lowerRoman"/>
-      <w:lvlText w:val="%3."/>
-      <w:lvlJc w:val="left"/>
-      <w:pPr>
-        <w:ind w:left="1216" w:hanging="336"/>
-      </w:pPr>
-    </w:lvl>
-    <w:lvl w:ilvl="1">
-      <w:start w:val="1"/>
-      <w:numFmt w:val="lowerLetter"/>
-      <w:lvlText w:val="%2."/>
-      <w:lvlJc w:val="left"/>
-      <w:pPr>
-        <w:ind w:left="776" w:hanging="336"/>
-      </w:pPr>
-    </w:lvl>
-    <w:lvl w:ilvl="4">
-      <w:start w:val="1"/>
-      <w:numFmt w:val="lowerLetter"/>
-      <w:lvlText w:val="%5."/>
-      <w:lvlJc w:val="left"/>
-      <w:pPr>
-        <w:ind w:left="2096" w:hanging="336"/>
-      </w:pPr>
-    </w:lvl>
-    <w:lvl w:ilvl="5">
-      <w:start w:val="1"/>
-      <w:numFmt w:val="lowerRoman"/>
-      <w:lvlText w:val="%6."/>
-      <w:lvlJc w:val="left"/>
-      <w:pPr>
-        <w:ind w:left="2536" w:hanging="336"/>
-      </w:pPr>
-    </w:lvl>
-  </w:abstractNum>
-  <w:abstractNum w:abstractNumId="7">
-    <w:lvl w:ilvl="5">
-      <w:start w:val="1"/>
-      <w:numFmt w:val="lowerRoman"/>
-      <w:lvlText w:val="%6."/>
-      <w:lvlJc w:val="left"/>
-      <w:pPr>
-        <w:ind w:left="2536" w:hanging="336"/>
-      </w:pPr>
-    </w:lvl>
-    <w:lvl w:ilvl="1">
-      <w:start w:val="1"/>
-      <w:numFmt w:val="lowerLetter"/>
-      <w:lvlText w:val="%2."/>
-      <w:lvlJc w:val="left"/>
-      <w:pPr>
-        <w:ind w:left="776" w:hanging="336"/>
-      </w:pPr>
-    </w:lvl>
-    <w:lvl w:ilvl="8">
-      <w:start w:val="1"/>
-      <w:numFmt w:val="lowerRoman"/>
-      <w:lvlText w:val="%9."/>
-      <w:lvlJc w:val="left"/>
-      <w:pPr>
-        <w:ind w:left="3856" w:hanging="336"/>
-      </w:pPr>
-    </w:lvl>
-    <w:lvl w:ilvl="6">
-      <w:start w:val="1"/>
-      <w:numFmt w:val="decimal"/>
-      <w:lvlText w:val="%7."/>
-      <w:lvlJc w:val="left"/>
-      <w:pPr>
-        <w:ind w:left="2976" w:hanging="336"/>
-      </w:pPr>
-    </w:lvl>
-    <w:lvl w:ilvl="4">
-      <w:start w:val="1"/>
-      <w:numFmt w:val="lowerLetter"/>
-      <w:lvlText w:val="%5."/>
-      <w:lvlJc w:val="left"/>
-      <w:pPr>
-        <w:ind w:left="2096" w:hanging="336"/>
-      </w:pPr>
-    </w:lvl>
-    <w:lvl w:ilvl="0">
-      <w:start w:val="1"/>
-      <w:numFmt w:val="decimal"/>
-      <w:lvlText w:val="%1."/>
-      <w:lvlJc w:val="left"/>
-      <w:pPr>
-        <w:ind w:left="336" w:hanging="336"/>
-      </w:pPr>
-      <w:rPr/>
-    </w:lvl>
-    <w:lvl w:ilvl="7">
-      <w:start w:val="1"/>
-      <w:numFmt w:val="lowerLetter"/>
-      <w:lvlText w:val="%8."/>
-      <w:lvlJc w:val="left"/>
-      <w:pPr>
-        <w:ind w:left="3416" w:hanging="336"/>
-      </w:pPr>
-    </w:lvl>
-    <w:lvl w:ilvl="3">
-      <w:start w:val="1"/>
-      <w:numFmt w:val="decimal"/>
-      <w:lvlText w:val="%4."/>
-      <w:lvlJc w:val="left"/>
-      <w:pPr>
-        <w:ind w:left="1656" w:hanging="336"/>
-      </w:pPr>
-    </w:lvl>
-    <w:lvl w:ilvl="2">
-      <w:start w:val="1"/>
-      <w:numFmt w:val="lowerRoman"/>
-      <w:lvlText w:val="%3."/>
-      <w:lvlJc w:val="left"/>
-      <w:pPr>
-        <w:ind w:left="1216" w:hanging="336"/>
       </w:pPr>
     </w:lvl>
   </w:abstractNum>
@@ -3333,6 +3333,24 @@
         <w:ind w:left="1216" w:hanging="336"/>
       </w:pPr>
     </w:lvl>
+    <w:lvl w:ilvl="7">
+      <w:start w:val="1"/>
+      <w:numFmt w:val="lowerLetter"/>
+      <w:lvlText w:val="%8."/>
+      <w:lvlJc w:val="left"/>
+      <w:pPr>
+        <w:ind w:left="3416" w:hanging="336"/>
+      </w:pPr>
+    </w:lvl>
+    <w:lvl w:ilvl="1">
+      <w:start w:val="1"/>
+      <w:numFmt w:val="lowerLetter"/>
+      <w:lvlText w:val="%2."/>
+      <w:lvlJc w:val="left"/>
+      <w:pPr>
+        <w:ind w:left="776" w:hanging="336"/>
+      </w:pPr>
+    </w:lvl>
     <w:lvl w:ilvl="8">
       <w:start w:val="1"/>
       <w:numFmt w:val="lowerRoman"/>
@@ -3342,6 +3360,34 @@
         <w:ind w:left="3856" w:hanging="336"/>
       </w:pPr>
     </w:lvl>
+    <w:lvl w:ilvl="4">
+      <w:start w:val="1"/>
+      <w:numFmt w:val="lowerLetter"/>
+      <w:lvlText w:val="%5."/>
+      <w:lvlJc w:val="left"/>
+      <w:pPr>
+        <w:ind w:left="2096" w:hanging="336"/>
+      </w:pPr>
+    </w:lvl>
+    <w:lvl w:ilvl="0">
+      <w:start w:val="1"/>
+      <w:numFmt w:val="decimal"/>
+      <w:lvlText w:val="%1."/>
+      <w:lvlJc w:val="left"/>
+      <w:pPr>
+        <w:ind w:left="336" w:hanging="336"/>
+      </w:pPr>
+      <w:rPr/>
+    </w:lvl>
+    <w:lvl w:ilvl="3">
+      <w:start w:val="1"/>
+      <w:numFmt w:val="decimal"/>
+      <w:lvlText w:val="%4."/>
+      <w:lvlJc w:val="left"/>
+      <w:pPr>
+        <w:ind w:left="1656" w:hanging="336"/>
+      </w:pPr>
+    </w:lvl>
     <w:lvl w:ilvl="6">
       <w:start w:val="1"/>
       <w:numFmt w:val="decimal"/>
@@ -3351,6 +3397,17 @@
         <w:ind w:left="2976" w:hanging="336"/>
       </w:pPr>
     </w:lvl>
+    <w:lvl w:ilvl="5">
+      <w:start w:val="1"/>
+      <w:numFmt w:val="lowerRoman"/>
+      <w:lvlText w:val="%6."/>
+      <w:lvlJc w:val="left"/>
+      <w:pPr>
+        <w:ind w:left="2536" w:hanging="336"/>
+      </w:pPr>
+    </w:lvl>
+  </w:abstractNum>
+  <w:abstractNum w:abstractNumId="9">
     <w:lvl w:ilvl="0">
       <w:start w:val="1"/>
       <w:numFmt w:val="decimal"/>
@@ -3361,6 +3418,33 @@
       </w:pPr>
       <w:rPr/>
     </w:lvl>
+    <w:lvl w:ilvl="4">
+      <w:start w:val="1"/>
+      <w:numFmt w:val="lowerLetter"/>
+      <w:lvlText w:val="%5."/>
+      <w:lvlJc w:val="left"/>
+      <w:pPr>
+        <w:ind w:left="2096" w:hanging="336"/>
+      </w:pPr>
+    </w:lvl>
+    <w:lvl w:ilvl="2">
+      <w:start w:val="1"/>
+      <w:numFmt w:val="lowerRoman"/>
+      <w:lvlText w:val="%3."/>
+      <w:lvlJc w:val="left"/>
+      <w:pPr>
+        <w:ind w:left="1216" w:hanging="336"/>
+      </w:pPr>
+    </w:lvl>
+    <w:lvl w:ilvl="1">
+      <w:start w:val="1"/>
+      <w:numFmt w:val="lowerLetter"/>
+      <w:lvlText w:val="%2."/>
+      <w:lvlJc w:val="left"/>
+      <w:pPr>
+        <w:ind w:left="776" w:hanging="336"/>
+      </w:pPr>
+    </w:lvl>
     <w:lvl w:ilvl="3">
       <w:start w:val="1"/>
       <w:numFmt w:val="decimal"/>
@@ -3370,6 +3454,33 @@
         <w:ind w:left="1656" w:hanging="336"/>
       </w:pPr>
     </w:lvl>
+    <w:lvl w:ilvl="6">
+      <w:start w:val="1"/>
+      <w:numFmt w:val="decimal"/>
+      <w:lvlText w:val="%7."/>
+      <w:lvlJc w:val="left"/>
+      <w:pPr>
+        <w:ind w:left="2976" w:hanging="336"/>
+      </w:pPr>
+    </w:lvl>
+    <w:lvl w:ilvl="7">
+      <w:start w:val="1"/>
+      <w:numFmt w:val="lowerLetter"/>
+      <w:lvlText w:val="%8."/>
+      <w:lvlJc w:val="left"/>
+      <w:pPr>
+        <w:ind w:left="3416" w:hanging="336"/>
+      </w:pPr>
+    </w:lvl>
+    <w:lvl w:ilvl="8">
+      <w:start w:val="1"/>
+      <w:numFmt w:val="lowerRoman"/>
+      <w:lvlText w:val="%9."/>
+      <w:lvlJc w:val="left"/>
+      <w:pPr>
+        <w:ind w:left="3856" w:hanging="336"/>
+      </w:pPr>
+    </w:lvl>
     <w:lvl w:ilvl="5">
       <w:start w:val="1"/>
       <w:numFmt w:val="lowerRoman"/>
@@ -3379,6 +3490,45 @@
         <w:ind w:left="2536" w:hanging="336"/>
       </w:pPr>
     </w:lvl>
+  </w:abstractNum>
+  <w:abstractNum w:abstractNumId="10">
+    <w:lvl w:ilvl="8">
+      <w:start w:val="1"/>
+      <w:numFmt w:val="lowerRoman"/>
+      <w:lvlText w:val="%9."/>
+      <w:lvlJc w:val="left"/>
+      <w:pPr>
+        <w:ind w:left="3856" w:hanging="336"/>
+      </w:pPr>
+    </w:lvl>
+    <w:lvl w:ilvl="0">
+      <w:start w:val="1"/>
+      <w:numFmt w:val="decimal"/>
+      <w:lvlText w:val="%1."/>
+      <w:lvlJc w:val="left"/>
+      <w:pPr>
+        <w:ind w:left="336" w:hanging="336"/>
+      </w:pPr>
+      <w:rPr/>
+    </w:lvl>
+    <w:lvl w:ilvl="4">
+      <w:start w:val="1"/>
+      <w:numFmt w:val="lowerLetter"/>
+      <w:lvlText w:val="%5."/>
+      <w:lvlJc w:val="left"/>
+      <w:pPr>
+        <w:ind w:left="2096" w:hanging="336"/>
+      </w:pPr>
+    </w:lvl>
+    <w:lvl w:ilvl="1">
+      <w:start w:val="1"/>
+      <w:numFmt w:val="lowerLetter"/>
+      <w:lvlText w:val="%2."/>
+      <w:lvlJc w:val="left"/>
+      <w:pPr>
+        <w:ind w:left="776" w:hanging="336"/>
+      </w:pPr>
+    </w:lvl>
     <w:lvl w:ilvl="7">
       <w:start w:val="1"/>
       <w:numFmt w:val="lowerLetter"/>
@@ -3388,26 +3538,15 @@
         <w:ind w:left="3416" w:hanging="336"/>
       </w:pPr>
     </w:lvl>
-    <w:lvl w:ilvl="4">
-      <w:start w:val="1"/>
-      <w:numFmt w:val="lowerLetter"/>
-      <w:lvlText w:val="%5."/>
-      <w:lvlJc w:val="left"/>
-      <w:pPr>
-        <w:ind w:left="2096" w:hanging="336"/>
-      </w:pPr>
-    </w:lvl>
-    <w:lvl w:ilvl="1">
-      <w:start w:val="1"/>
-      <w:numFmt w:val="lowerLetter"/>
-      <w:lvlText w:val="%2."/>
-      <w:lvlJc w:val="left"/>
-      <w:pPr>
-        <w:ind w:left="776" w:hanging="336"/>
-      </w:pPr>
-    </w:lvl>
-  </w:abstractNum>
-  <w:abstractNum w:abstractNumId="9">
+    <w:lvl w:ilvl="6">
+      <w:start w:val="1"/>
+      <w:numFmt w:val="decimal"/>
+      <w:lvlText w:val="%7."/>
+      <w:lvlJc w:val="left"/>
+      <w:pPr>
+        <w:ind w:left="2976" w:hanging="336"/>
+      </w:pPr>
+    </w:lvl>
     <w:lvl w:ilvl="5">
       <w:start w:val="1"/>
       <w:numFmt w:val="lowerRoman"/>
@@ -3426,42 +3565,6 @@
         <w:ind w:left="1216" w:hanging="336"/>
       </w:pPr>
     </w:lvl>
-    <w:lvl w:ilvl="1">
-      <w:start w:val="1"/>
-      <w:numFmt w:val="lowerLetter"/>
-      <w:lvlText w:val="%2."/>
-      <w:lvlJc w:val="left"/>
-      <w:pPr>
-        <w:ind w:left="776" w:hanging="336"/>
-      </w:pPr>
-    </w:lvl>
-    <w:lvl w:ilvl="8">
-      <w:start w:val="1"/>
-      <w:numFmt w:val="lowerRoman"/>
-      <w:lvlText w:val="%9."/>
-      <w:lvlJc w:val="left"/>
-      <w:pPr>
-        <w:ind w:left="3856" w:hanging="336"/>
-      </w:pPr>
-    </w:lvl>
-    <w:lvl w:ilvl="7">
-      <w:start w:val="1"/>
-      <w:numFmt w:val="lowerLetter"/>
-      <w:lvlText w:val="%8."/>
-      <w:lvlJc w:val="left"/>
-      <w:pPr>
-        <w:ind w:left="3416" w:hanging="336"/>
-      </w:pPr>
-    </w:lvl>
-    <w:lvl w:ilvl="6">
-      <w:start w:val="1"/>
-      <w:numFmt w:val="decimal"/>
-      <w:lvlText w:val="%7."/>
-      <w:lvlJc w:val="left"/>
-      <w:pPr>
-        <w:ind w:left="2976" w:hanging="336"/>
-      </w:pPr>
-    </w:lvl>
     <w:lvl w:ilvl="3">
       <w:start w:val="1"/>
       <w:numFmt w:val="decimal"/>
@@ -3471,142 +3574,39 @@
         <w:ind w:left="1656" w:hanging="336"/>
       </w:pPr>
     </w:lvl>
-    <w:lvl w:ilvl="0">
-      <w:start w:val="1"/>
-      <w:numFmt w:val="decimal"/>
-      <w:lvlText w:val="%1."/>
-      <w:lvlJc w:val="left"/>
-      <w:pPr>
-        <w:ind w:left="336" w:hanging="336"/>
-      </w:pPr>
-      <w:rPr/>
-    </w:lvl>
-    <w:lvl w:ilvl="4">
-      <w:start w:val="1"/>
-      <w:numFmt w:val="lowerLetter"/>
-      <w:lvlText w:val="%5."/>
-      <w:lvlJc w:val="left"/>
-      <w:pPr>
-        <w:ind w:left="2096" w:hanging="336"/>
-      </w:pPr>
-    </w:lvl>
   </w:abstractNum>
-  <w:abstractNum w:abstractNumId="10">
-    <w:lvl w:ilvl="7">
-      <w:start w:val="1"/>
-      <w:numFmt w:val="lowerLetter"/>
-      <w:lvlText w:val="%8."/>
-      <w:lvlJc w:val="left"/>
-      <w:pPr>
-        <w:ind w:left="3416" w:hanging="336"/>
-      </w:pPr>
-    </w:lvl>
-    <w:lvl w:ilvl="4">
-      <w:start w:val="1"/>
-      <w:numFmt w:val="lowerLetter"/>
-      <w:lvlText w:val="%5."/>
-      <w:lvlJc w:val="left"/>
-      <w:pPr>
-        <w:ind w:left="2096" w:hanging="336"/>
-      </w:pPr>
-    </w:lvl>
-    <w:lvl w:ilvl="6">
-      <w:start w:val="1"/>
-      <w:numFmt w:val="decimal"/>
-      <w:lvlText w:val="%7."/>
-      <w:lvlJc w:val="left"/>
-      <w:pPr>
-        <w:ind w:left="2976" w:hanging="336"/>
-      </w:pPr>
-    </w:lvl>
-    <w:lvl w:ilvl="2">
-      <w:start w:val="1"/>
-      <w:numFmt w:val="lowerRoman"/>
-      <w:lvlText w:val="%3."/>
-      <w:lvlJc w:val="left"/>
-      <w:pPr>
-        <w:ind w:left="1216" w:hanging="336"/>
-      </w:pPr>
-    </w:lvl>
-    <w:lvl w:ilvl="1">
-      <w:start w:val="1"/>
-      <w:numFmt w:val="lowerLetter"/>
-      <w:lvlText w:val="%2."/>
-      <w:lvlJc w:val="left"/>
-      <w:pPr>
-        <w:ind w:left="776" w:hanging="336"/>
-      </w:pPr>
-    </w:lvl>
-    <w:lvl w:ilvl="8">
-      <w:start w:val="1"/>
-      <w:numFmt w:val="lowerRoman"/>
-      <w:lvlText w:val="%9."/>
-      <w:lvlJc w:val="left"/>
-      <w:pPr>
-        <w:ind w:left="3856" w:hanging="336"/>
-      </w:pPr>
-    </w:lvl>
-    <w:lvl w:ilvl="3">
-      <w:start w:val="1"/>
-      <w:numFmt w:val="decimal"/>
-      <w:lvlText w:val="%4."/>
-      <w:lvlJc w:val="left"/>
-      <w:pPr>
-        <w:ind w:left="1656" w:hanging="336"/>
-      </w:pPr>
-    </w:lvl>
-    <w:lvl w:ilvl="0">
-      <w:start w:val="1"/>
-      <w:numFmt w:val="decimal"/>
-      <w:lvlText w:val="%1."/>
-      <w:lvlJc w:val="left"/>
-      <w:pPr>
-        <w:ind w:left="336" w:hanging="336"/>
-      </w:pPr>
-      <w:rPr/>
-    </w:lvl>
-    <w:lvl w:ilvl="5">
-      <w:start w:val="1"/>
-      <w:numFmt w:val="lowerRoman"/>
-      <w:lvlText w:val="%6."/>
-      <w:lvlJc w:val="left"/>
-      <w:pPr>
-        <w:ind w:left="2536" w:hanging="336"/>
-      </w:pPr>
-    </w:lvl>
-  </w:abstractNum>
-  <w:num w:numId="4">
-    <w:abstractNumId w:val="3"/>
-  </w:num>
-  <w:num w:numId="6">
-    <w:abstractNumId w:val="5"/>
-  </w:num>
-  <w:num w:numId="2">
-    <w:abstractNumId w:val="7"/>
-  </w:num>
-  <w:num w:numId="7">
-    <w:abstractNumId w:val="4"/>
-  </w:num>
-  <w:num w:numId="3">
-    <w:abstractNumId w:val="0"/>
-  </w:num>
-  <w:num w:numId="9">
+  <w:num w:numId="5">
     <w:abstractNumId w:val="10"/>
   </w:num>
   <w:num w:numId="8">
-    <w:abstractNumId w:val="9"/>
+    <w:abstractNumId w:val="5"/>
+  </w:num>
+  <w:num w:numId="7">
+    <w:abstractNumId w:val="6"/>
+  </w:num>
+  <w:num w:numId="11">
+    <w:abstractNumId w:val="8"/>
+  </w:num>
+  <w:num w:numId="3">
+    <w:abstractNumId w:val="1"/>
   </w:num>
   <w:num w:numId="10">
+    <w:abstractNumId w:val="4"/>
+  </w:num>
+  <w:num w:numId="9">
+    <w:abstractNumId w:val="0"/>
+  </w:num>
+  <w:num w:numId="4">
     <w:abstractNumId w:val="2"/>
   </w:num>
   <w:num w:numId="1">
-    <w:abstractNumId w:val="6"/>
+    <w:abstractNumId w:val="3"/>
   </w:num>
-  <w:num w:numId="5">
-    <w:abstractNumId w:val="8"/>
+  <w:num w:numId="2">
+    <w:abstractNumId w:val="9"/>
   </w:num>
-  <w:num w:numId="11">
-    <w:abstractNumId w:val="1"/>
+  <w:num w:numId="6">
+    <w:abstractNumId w:val="7"/>
   </w:num>
 </w:numbering>
 </file>
@@ -3623,332 +3623,316 @@
     <w:pPrDefault/>
   </w:docDefaults>
   <w:latentStyles w:defLockedState="0" w:defUIPriority="0" w:defSemiHidden="0" w:defUnhideWhenUsed="0" w:defQFormat="0" w:count="376">
+    <w:lsdException w:name="Table Classic 3" w:semiHidden="1" w:unhideWhenUsed="1"/>
+    <w:lsdException w:name="Grid Table 6 Colorful" w:uiPriority="51"/>
+    <w:lsdException w:name="Colorful List Accent 2" w:uiPriority="72"/>
+    <w:lsdException w:name="Smart Hyperlink" w:uiPriority="99" w:semiHidden="1" w:unhideWhenUsed="1"/>
+    <w:lsdException w:name="Light List Accent 5" w:uiPriority="61"/>
+    <w:lsdException w:name="Table Classic 2" w:semiHidden="1" w:unhideWhenUsed="1"/>
+    <w:lsdException w:name="Quote" w:uiPriority="99"/>
+    <w:lsdException w:name="Table Simple 2" w:semiHidden="1" w:unhideWhenUsed="1"/>
+    <w:lsdException w:name="Grid Table 6 Colorful Accent 3" w:uiPriority="51"/>
+    <w:lsdException w:name="Grid Table 2" w:uiPriority="47"/>
+    <w:lsdException w:name="List Table 2 Accent 4" w:uiPriority="47"/>
+    <w:lsdException w:name="Table 3D effects 1" w:semiHidden="1" w:unhideWhenUsed="1"/>
+    <w:lsdException w:name="Table Columns 5" w:semiHidden="1" w:unhideWhenUsed="1"/>
+    <w:lsdException w:name="heading 5" w:qFormat="1"/>
+    <w:lsdException w:name="Colorful Grid Accent 4" w:uiPriority="73"/>
+    <w:lsdException w:name="HTML Acronym" w:uiPriority="99"/>
+    <w:lsdException w:name="Grid Table 4 Accent 3" w:uiPriority="49"/>
+    <w:lsdException w:name="Medium Grid 2 Accent 4" w:uiPriority="68"/>
+    <w:lsdException w:name="Table Theme" w:semiHidden="1" w:unhideWhenUsed="1"/>
+    <w:lsdException w:name="HTML Cite" w:uiPriority="99"/>
+    <w:lsdException w:name="List Table 5 Dark" w:uiPriority="50"/>
+    <w:lsdException w:name="Dark List Accent 6" w:uiPriority="70"/>
+    <w:lsdException w:name="Table Columns 3" w:semiHidden="1" w:unhideWhenUsed="1"/>
+    <w:lsdException w:name="Grid Table 4" w:uiPriority="49"/>
+    <w:lsdException w:name="Plain Table 2" w:uiPriority="42"/>
+    <w:lsdException w:name="Table List 4" w:semiHidden="1" w:unhideWhenUsed="1"/>
+    <w:lsdException w:name="toc 4" w:uiPriority="99"/>
+    <w:lsdException w:name="Normal" w:qFormat="1"/>
+    <w:lsdException w:name="List Table 6 Colorful Accent 2" w:uiPriority="51"/>
+    <w:lsdException w:name="Table Columns 2" w:semiHidden="1" w:unhideWhenUsed="1"/>
+    <w:lsdException w:name="heading 6" w:qFormat="1"/>
+    <w:lsdException w:name="List Table 4 Accent 1" w:uiPriority="49"/>
+    <w:lsdException w:name="footnote reference" w:uiPriority="99" w:semiHidden="1" w:unhideWhenUsed="1"/>
+    <w:lsdException w:name="List Table 5 Dark Accent 3" w:uiPriority="50"/>
+    <w:lsdException w:name="toc 2" w:uiPriority="99"/>
+    <w:lsdException w:name="Medium Shading 2 Accent 1" w:uiPriority="64"/>
+    <w:lsdException w:name="Grid Table 3 Accent 2" w:uiPriority="48"/>
+    <w:lsdException w:name="Title" w:qFormat="1"/>
+    <w:lsdException w:name="Grid Table 7 Colorful Accent 4" w:uiPriority="52"/>
+    <w:lsdException w:name="List Table 2 Accent 1" w:uiPriority="47"/>
+    <w:lsdException w:name="List Table 3 Accent 3" w:uiPriority="48"/>
+    <w:lsdException w:name="Medium Shading 1 Accent 6" w:uiPriority="63"/>
+    <w:lsdException w:name="Table Classic 4" w:semiHidden="1" w:unhideWhenUsed="1"/>
+    <w:lsdException w:name="Colorful Grid Accent 6" w:uiPriority="73"/>
+    <w:lsdException w:name="Medium Grid 3 Accent 5" w:uiPriority="69"/>
+    <w:lsdException w:name="Colorful Shading Accent 3" w:uiPriority="71"/>
+    <w:lsdException w:name="List Table 5 Dark Accent 4" w:uiPriority="50"/>
+    <w:lsdException w:name="Medium Grid 3 Accent 6" w:uiPriority="69"/>
+    <w:lsdException w:name="Table Columns 1" w:semiHidden="1" w:unhideWhenUsed="1"/>
+    <w:lsdException w:name="List Table 3 Accent 6" w:uiPriority="48"/>
+    <w:lsdException w:name="Table Professional" w:semiHidden="1" w:unhideWhenUsed="1"/>
+    <w:lsdException w:name="Light Grid Accent 3" w:uiPriority="62"/>
+    <w:lsdException w:name="Medium Shading 1 Accent 1" w:uiPriority="63"/>
+    <w:lsdException w:name="List Table 2 Accent 3" w:uiPriority="47"/>
     <w:lsdException w:name="heading 2" w:qFormat="1"/>
+    <w:lsdException w:name="Grid Table 2 Accent 6" w:uiPriority="47"/>
+    <w:lsdException w:name="List Table 4 Accent 3" w:uiPriority="49"/>
+    <w:lsdException w:name="HTML Definition" w:uiPriority="99"/>
+    <w:lsdException w:name="Medium Shading 2 Accent 2" w:uiPriority="64"/>
+    <w:lsdException w:name="Table Contemporary" w:semiHidden="1" w:unhideWhenUsed="1"/>
+    <w:lsdException w:name="HTML Code" w:uiPriority="99"/>
+    <w:lsdException w:name="Subtle Emphasis" w:uiPriority="19" w:qFormat="1"/>
+    <w:lsdException w:name="Table Colorful 1" w:semiHidden="1" w:unhideWhenUsed="1"/>
+    <w:lsdException w:name="Grid Table 5 Dark" w:uiPriority="50"/>
+    <w:lsdException w:name="Medium Grid 2" w:uiPriority="68"/>
+    <w:lsdException w:name="Light Shading Accent 3" w:uiPriority="60"/>
+    <w:lsdException w:name="Grid Table 1 Light Accent 4" w:uiPriority="46"/>
+    <w:lsdException w:name="Dark List Accent 3" w:uiPriority="70"/>
+    <w:lsdException w:name="Grid Table 1 Light Accent 3" w:uiPriority="46"/>
+    <w:lsdException w:name="Medium List 1 Accent 4" w:uiPriority="65"/>
+    <w:lsdException w:name="Grid Table 7 Colorful Accent 6" w:uiPriority="52"/>
+    <w:lsdException w:name="Light Shading Accent 2" w:uiPriority="60"/>
+    <w:lsdException w:name="Table 3D effects 3" w:semiHidden="1" w:unhideWhenUsed="1"/>
+    <w:lsdException w:name="Outline List 3" w:uiPriority="99" w:semiHidden="1" w:unhideWhenUsed="1"/>
+    <w:lsdException w:name="No Spacing" w:uiPriority="99"/>
+    <w:lsdException w:name="Grid Table 3 Accent 6" w:uiPriority="48"/>
+    <w:lsdException w:name="Grid Table 2 Accent 3" w:uiPriority="47"/>
+    <w:lsdException w:name="List Table 1 Light Accent 4" w:uiPriority="46"/>
+    <w:lsdException w:name="Grid Table 4 Accent 1" w:uiPriority="49"/>
+    <w:lsdException w:name="Medium List 2" w:uiPriority="66"/>
+    <w:lsdException w:name="HTML Top of Form" w:uiPriority="99" w:semiHidden="1" w:unhideWhenUsed="1"/>
+    <w:lsdException w:name="List Table 3 Accent 2" w:uiPriority="48"/>
+    <w:lsdException w:name="Grid Table 1 Light" w:uiPriority="46"/>
+    <w:lsdException w:name="Light Grid Accent 6" w:uiPriority="62"/>
+    <w:lsdException w:name="Medium List 2 Accent 1" w:uiPriority="66"/>
+    <w:lsdException w:name="TOC Heading" w:uiPriority="39" w:semiHidden="1" w:unhideWhenUsed="1" w:qFormat="1"/>
+    <w:lsdException w:name="Table Classic 1" w:semiHidden="1" w:unhideWhenUsed="1"/>
+    <w:lsdException w:name="Medium List 1 Accent 5" w:uiPriority="65"/>
+    <w:lsdException w:name="Table List 6" w:semiHidden="1" w:unhideWhenUsed="1"/>
+    <w:lsdException w:name="Grid Table 6 Colorful Accent 1" w:uiPriority="51"/>
+    <w:lsdException w:name="Grid Table 5 Dark Accent 2" w:uiPriority="50"/>
+    <w:lsdException w:name="toc 7" w:uiPriority="99"/>
+    <w:lsdException w:name="Book Title" w:uiPriority="33" w:qFormat="1"/>
+    <w:lsdException w:name="List Table 4" w:uiPriority="49"/>
+    <w:lsdException w:name="Grid Table 7 Colorful Accent 1" w:uiPriority="52"/>
+    <w:lsdException w:name="List Table 3 Accent 1" w:uiPriority="48"/>
+    <w:lsdException w:name="Emphasis" w:qFormat="1"/>
+    <w:lsdException w:name="HTML Bottom of Form" w:uiPriority="99" w:semiHidden="1" w:unhideWhenUsed="1"/>
+    <w:lsdException w:name="Medium Grid 3 Accent 1" w:uiPriority="69"/>
+    <w:lsdException w:name="Light Shading Accent 4" w:uiPriority="60"/>
+    <w:lsdException w:name="Table Grid 7" w:semiHidden="1" w:unhideWhenUsed="1"/>
+    <w:lsdException w:name="Light List Accent 3" w:uiPriority="61"/>
+    <w:lsdException w:name="heading 3" w:qFormat="1"/>
+    <w:lsdException w:name="Light Grid Accent 4" w:uiPriority="62"/>
+    <w:lsdException w:name="Colorful Shading Accent 1" w:uiPriority="71"/>
+    <w:lsdException w:name="Outline List 2" w:uiPriority="99" w:semiHidden="1" w:unhideWhenUsed="1"/>
+    <w:lsdException w:name="Table Subtle 1" w:semiHidden="1" w:unhideWhenUsed="1"/>
+    <w:lsdException w:name="Medium Shading 2 Accent 4" w:uiPriority="64"/>
+    <w:lsdException w:name="List Table 4 Accent 6" w:uiPriority="49"/>
+    <w:lsdException w:name="HTML Variable" w:uiPriority="99"/>
+    <w:lsdException w:name="Medium Grid 3 Accent 4" w:uiPriority="69"/>
+    <w:lsdException w:name="Colorful Grid Accent 5" w:uiPriority="73"/>
+    <w:lsdException w:name="Strong" w:qFormat="1"/>
+    <w:lsdException w:name="Grid Table 5 Dark Accent 5" w:uiPriority="50"/>
+    <w:lsdException w:name="Grid Table 3 Accent 5" w:uiPriority="48"/>
+    <w:lsdException w:name="toc 9" w:uiPriority="99"/>
+    <w:lsdException w:name="footnote text" w:uiPriority="99" w:semiHidden="1" w:unhideWhenUsed="1"/>
+    <w:lsdException w:name="Grid Table 4 Accent 4" w:uiPriority="49"/>
+    <w:lsdException w:name="Dark List Accent 4" w:uiPriority="70"/>
+    <w:lsdException w:name="Colorful List Accent 3" w:uiPriority="72"/>
+    <w:lsdException w:name="Table Web 2" w:semiHidden="1" w:unhideWhenUsed="1"/>
+    <w:lsdException w:name="Grid Table 6 Colorful Accent 4" w:uiPriority="51"/>
+    <w:lsdException w:name="Medium Grid 1 Accent 2" w:uiPriority="67"/>
+    <w:lsdException w:name="List Table 6 Colorful" w:uiPriority="51"/>
+    <w:lsdException w:name="Table Elegant" w:semiHidden="1" w:unhideWhenUsed="1"/>
+    <w:lsdException w:name="Grid Table 5 Dark Accent 3" w:uiPriority="50"/>
+    <w:lsdException w:name="Table Grid 1" w:semiHidden="1" w:unhideWhenUsed="1"/>
+    <w:lsdException w:name="Medium Grid 1 Accent 1" w:uiPriority="67"/>
+    <w:lsdException w:name="Grid Table 4 Accent 2" w:uiPriority="49"/>
+    <w:lsdException w:name="Colorful Shading Accent 2" w:uiPriority="71"/>
+    <w:lsdException w:name="Bibliography" w:uiPriority="37" w:semiHidden="1" w:unhideWhenUsed="1"/>
+    <w:lsdException w:name="Medium List 1 Accent 6" w:uiPriority="65"/>
+    <w:lsdException w:name="Light Grid Accent 2" w:uiPriority="62"/>
+    <w:lsdException w:name="Grid Table 6 Colorful Accent 5" w:uiPriority="51"/>
+    <w:lsdException w:name="List Table 6 Colorful Accent 1" w:uiPriority="51"/>
+    <w:lsdException w:name="List Table 6 Colorful Accent 6" w:uiPriority="51"/>
+    <w:lsdException w:name="Medium Shading 2 Accent 3" w:uiPriority="64"/>
+    <w:lsdException w:name="Table Grid 3" w:semiHidden="1" w:unhideWhenUsed="1"/>
+    <w:lsdException w:name="Table Web 1" w:semiHidden="1" w:unhideWhenUsed="1"/>
+    <w:lsdException w:name="Table Grid 6" w:semiHidden="1" w:unhideWhenUsed="1"/>
+    <w:lsdException w:name="Table Simple 3" w:semiHidden="1" w:unhideWhenUsed="1"/>
+    <w:lsdException w:name="Colorful Shading Accent 6" w:uiPriority="71"/>
+    <w:lsdException w:name="Table 3D effects 2" w:semiHidden="1" w:unhideWhenUsed="1"/>
+    <w:lsdException w:name="Grid Table 6 Colorful Accent 2" w:uiPriority="51"/>
+    <w:lsdException w:name="Light Grid" w:uiPriority="62"/>
+    <w:lsdException w:name="Colorful List Accent 1" w:uiPriority="72"/>
+    <w:lsdException w:name="Medium Grid 2 Accent 1" w:uiPriority="68"/>
+    <w:lsdException w:name="List Table 3" w:uiPriority="48"/>
+    <w:lsdException w:name="Medium Grid 1 Accent 6" w:uiPriority="67"/>
+    <w:lsdException w:name="Table Grid 8" w:semiHidden="1" w:unhideWhenUsed="1"/>
+    <w:lsdException w:name="Intense Reference" w:uiPriority="32" w:qFormat="1"/>
+    <w:lsdException w:name="Medium Shading 1 Accent 2" w:uiPriority="63"/>
+    <w:lsdException w:name="Colorful List" w:uiPriority="72"/>
+    <w:lsdException w:name="List Table 2 Accent 5" w:uiPriority="47"/>
+    <w:lsdException w:name="Grid Table 1 Light Accent 1" w:uiPriority="46"/>
+    <w:lsdException w:name="toc 8" w:uiPriority="99"/>
+    <w:lsdException w:name="List Table 1 Light Accent 1" w:uiPriority="46"/>
+    <w:lsdException w:name="Table Grid 4" w:semiHidden="1" w:unhideWhenUsed="1"/>
+    <w:lsdException w:name="Table Grid 5" w:semiHidden="1" w:unhideWhenUsed="1"/>
+    <w:lsdException w:name="Plain Table 5" w:uiPriority="45"/>
+    <w:lsdException w:name="heading 4" w:qFormat="1"/>
+    <w:lsdException w:name="Light Shading Accent 1" w:uiPriority="60"/>
+    <w:lsdException w:name="List Table 1 Light Accent 6" w:uiPriority="46"/>
+    <w:lsdException w:name="List Table 7 Colorful Accent 3" w:uiPriority="52"/>
+    <w:lsdException w:name="List Table 7 Colorful Accent 6" w:uiPriority="52"/>
+    <w:lsdException w:name="Colorful List Accent 4" w:uiPriority="72"/>
+    <w:lsdException w:name="Medium List 2 Accent 6" w:uiPriority="66"/>
+    <w:lsdException w:name="Medium List 1 Accent 2" w:uiPriority="65"/>
+    <w:lsdException w:name="Grid Table 2 Accent 5" w:uiPriority="47"/>
+    <w:lsdException w:name="Medium Grid 3 Accent 2" w:uiPriority="69"/>
+    <w:lsdException w:name="List Paragraph" w:uiPriority="99"/>
     <w:lsdException w:name="HTML Keyboard" w:uiPriority="99"/>
-    <w:lsdException w:name="Table Grid 6" w:semiHidden="1" w:unhideWhenUsed="1"/>
-    <w:lsdException w:name="Outline List 2" w:uiPriority="99" w:semiHidden="1" w:unhideWhenUsed="1"/>
-    <w:lsdException w:name="Grid Table 4 Accent 3" w:uiPriority="49"/>
-    <w:lsdException w:name="List Table 7 Colorful Accent 3" w:uiPriority="52"/>
+    <w:lsdException w:name="Table List 3" w:semiHidden="1" w:unhideWhenUsed="1"/>
+    <w:lsdException w:name="List Table 5 Dark Accent 5" w:uiPriority="50"/>
+    <w:lsdException w:name="Medium Grid 1 Accent 3" w:uiPriority="67"/>
+    <w:lsdException w:name="Dark List Accent 5" w:uiPriority="70"/>
+    <w:lsdException w:name="Plain Table 1" w:uiPriority="41"/>
+    <w:lsdException w:name="Grid Table 3" w:uiPriority="48"/>
+    <w:lsdException w:name="List Table 3 Accent 4" w:uiPriority="48"/>
+    <w:lsdException w:name="Medium List 2 Accent 4" w:uiPriority="66"/>
+    <w:lsdException w:name="heading 7" w:unhideWhenUsed="1" w:qFormat="1"/>
+    <w:lsdException w:name="Light Grid Accent 5" w:uiPriority="62"/>
+    <w:lsdException w:name="Medium Shading 1 Accent 3" w:uiPriority="63"/>
+    <w:lsdException w:name="toc 5" w:uiPriority="99"/>
+    <w:lsdException w:name="Grid Table 2 Accent 2" w:uiPriority="47"/>
+    <w:lsdException w:name="Grid Table 2 Accent 4" w:uiPriority="47"/>
+    <w:lsdException w:name="List Table 7 Colorful Accent 5" w:uiPriority="52"/>
+    <w:lsdException w:name="Light Shading Accent 6" w:uiPriority="60"/>
+    <w:lsdException w:name="Plain Table 3" w:uiPriority="43"/>
+    <w:lsdException w:name="List Table 7 Colorful Accent 2" w:uiPriority="52"/>
+    <w:lsdException w:name="heading 8" w:unhideWhenUsed="1" w:qFormat="1"/>
+    <w:lsdException w:name="List Table 3 Accent 5" w:uiPriority="48"/>
+    <w:lsdException w:name="Medium Shading 2" w:uiPriority="64"/>
+    <w:lsdException w:name="Plain Table 4" w:uiPriority="44"/>
+    <w:lsdException w:name="List Table 5 Dark Accent 2" w:uiPriority="50"/>
+    <w:lsdException w:name="HTML Typewriter" w:uiPriority="99"/>
+    <w:lsdException w:name="Grid Table 4 Accent 5" w:uiPriority="49"/>
+    <w:lsdException w:name="List Table 2" w:uiPriority="47"/>
+    <w:lsdException w:name="Medium Shading 1 Accent 4" w:uiPriority="63"/>
+    <w:lsdException w:name="Mention" w:uiPriority="99" w:semiHidden="1" w:unhideWhenUsed="1"/>
+    <w:lsdException w:name="List Table 5 Dark Accent 6" w:uiPriority="50"/>
+    <w:lsdException w:name="Unresolved Mention" w:uiPriority="99" w:semiHidden="1" w:unhideWhenUsed="1"/>
+    <w:lsdException w:name="Grid Table 3 Accent 4" w:uiPriority="48"/>
+    <w:lsdException w:name="Colorful Grid Accent 2" w:uiPriority="73"/>
+    <w:lsdException w:name="Grid Table 3 Accent 3" w:uiPriority="48"/>
+    <w:lsdException w:name="Medium Grid 2 Accent 2" w:uiPriority="68"/>
+    <w:lsdException w:name="List Table 2 Accent 6" w:uiPriority="47"/>
+    <w:lsdException w:name="Table List 1" w:semiHidden="1" w:unhideWhenUsed="1"/>
+    <w:lsdException w:name="Medium List 1 Accent 3" w:uiPriority="65"/>
+    <w:lsdException w:name="Medium List 2 Accent 5" w:uiPriority="66"/>
+    <w:lsdException w:name="Grid Table Light" w:uiPriority="40"/>
+    <w:lsdException w:name="Placeholder Text" w:uiPriority="99" w:semiHidden="1"/>
+    <w:lsdException w:name="Medium Shading 2 Accent 5" w:uiPriority="64"/>
+    <w:lsdException w:name="Medium Grid 3 Accent 3" w:uiPriority="69"/>
+    <w:lsdException w:name="List Table 6 Colorful Accent 4" w:uiPriority="51"/>
+    <w:lsdException w:name="Light List" w:uiPriority="61"/>
+    <w:lsdException w:name="Smart Link" w:uiPriority="99" w:semiHidden="1" w:unhideWhenUsed="1"/>
+    <w:lsdException w:name="List Table 7 Colorful Accent 4" w:uiPriority="52"/>
+    <w:lsdException w:name="toc 6" w:uiPriority="99"/>
+    <w:lsdException w:name="Default Paragraph Font" w:uiPriority="1" w:semiHidden="1" w:unhideWhenUsed="1"/>
+    <w:lsdException w:name="HTML Sample" w:uiPriority="99"/>
+    <w:lsdException w:name="Colorful Shading Accent 5" w:uiPriority="71"/>
+    <w:lsdException w:name="Medium Grid 2 Accent 6" w:uiPriority="68"/>
+    <w:lsdException w:name="Colorful Grid Accent 3" w:uiPriority="73"/>
+    <w:lsdException w:name="Light Shading Accent 5" w:uiPriority="60"/>
+    <w:lsdException w:name="caption" w:semiHidden="1" w:unhideWhenUsed="1" w:qFormat="1"/>
+    <w:lsdException w:name="Intense Quote" w:uiPriority="99"/>
+    <w:lsdException w:name="Medium Grid 1 Accent 4" w:uiPriority="67"/>
+    <w:lsdException w:name="Grid Table 3 Accent 1" w:uiPriority="48"/>
+    <w:lsdException w:name="Grid Table 5 Dark Accent 4" w:uiPriority="50"/>
+    <w:lsdException w:name="Medium Grid 3" w:uiPriority="69"/>
+    <w:lsdException w:name="Medium List 2 Accent 3" w:uiPriority="66"/>
+    <w:lsdException w:name="Hashtag" w:uiPriority="99" w:semiHidden="1" w:unhideWhenUsed="1"/>
+    <w:lsdException w:name="Grid Table 2 Accent 1" w:uiPriority="47"/>
+    <w:lsdException w:name="heading 9" w:unhideWhenUsed="1" w:qFormat="1"/>
+    <w:lsdException w:name="List Table 4 Accent 5" w:uiPriority="49"/>
+    <w:lsdException w:name="Grid Table 7 Colorful Accent 2" w:uiPriority="52"/>
+    <w:lsdException w:name="Colorful List Accent 6" w:uiPriority="72"/>
+    <w:lsdException w:name="List Table 4 Accent 4" w:uiPriority="49"/>
+    <w:lsdException w:name="Medium Grid 1 Accent 5" w:uiPriority="67"/>
+    <w:lsdException w:name="List Table 7 Colorful" w:uiPriority="52"/>
+    <w:lsdException w:name="List Table 7 Colorful Accent 1" w:uiPriority="52"/>
+    <w:lsdException w:name="List Table 5 Dark Accent 1" w:uiPriority="50"/>
+    <w:lsdException w:name="Medium Shading 2 Accent 6" w:uiPriority="64"/>
+    <w:lsdException w:name="Light List Accent 1" w:uiPriority="61"/>
+    <w:lsdException w:name="Table Web 3" w:semiHidden="1" w:unhideWhenUsed="1"/>
+    <w:lsdException w:name="Colorful List Accent 5" w:uiPriority="72"/>
+    <w:lsdException w:name="List Table 1 Light Accent 2" w:uiPriority="46"/>
+    <w:lsdException w:name="No List" w:uiPriority="99" w:semiHidden="1" w:unhideWhenUsed="1"/>
+    <w:lsdException w:name="List Table 1 Light" w:uiPriority="46"/>
+    <w:lsdException w:name="List Table 1 Light Accent 3" w:uiPriority="46"/>
+    <w:lsdException w:name="Grid Table 7 Colorful Accent 5" w:uiPriority="52"/>
+    <w:lsdException w:name="Grid Table 1 Light Accent 6" w:uiPriority="46"/>
+    <w:lsdException w:name="Medium List 1" w:uiPriority="65"/>
+    <w:lsdException w:name="List Table 4 Accent 2" w:uiPriority="49"/>
+    <w:lsdException w:name="Colorful Grid" w:uiPriority="73"/>
+    <w:lsdException w:name="List Table 2 Accent 2" w:uiPriority="47"/>
     <w:lsdException w:name="Medium List 2 Accent 2" w:uiPriority="66"/>
-    <w:lsdException w:name="footnote text" w:uiPriority="99" w:semiHidden="1" w:unhideWhenUsed="1"/>
+    <w:lsdException w:name="Table Grid 2" w:semiHidden="1" w:unhideWhenUsed="1"/>
+    <w:lsdException w:name="Revision" w:uiPriority="99" w:semiHidden="1"/>
+    <w:lsdException w:name="Light List Accent 6" w:uiPriority="61"/>
+    <w:lsdException w:name="Grid Table 7 Colorful Accent 3" w:uiPriority="52"/>
+    <w:lsdException w:name="Table Simple 1" w:semiHidden="1" w:unhideWhenUsed="1"/>
+    <w:lsdException w:name="Dark List Accent 1" w:uiPriority="70"/>
+    <w:lsdException w:name="Grid Table 5 Dark Accent 1" w:uiPriority="50"/>
+    <w:lsdException w:name="Grid Table 7 Colorful" w:uiPriority="52"/>
+    <w:lsdException w:name="List Table 6 Colorful Accent 3" w:uiPriority="51"/>
+    <w:lsdException w:name="Subtle Reference" w:uiPriority="31" w:qFormat="1"/>
+    <w:lsdException w:name="Medium Grid 1" w:uiPriority="67"/>
+    <w:lsdException w:name="HTML Preformatted" w:uiPriority="99"/>
+    <w:lsdException w:name="Intense Emphasis" w:uiPriority="21" w:qFormat="1"/>
+    <w:lsdException w:name="List Table 1 Light Accent 5" w:uiPriority="46"/>
+    <w:lsdException w:name="Medium Grid 2 Accent 5" w:uiPriority="68"/>
+    <w:lsdException w:name="Medium Shading 1" w:uiPriority="63"/>
+    <w:lsdException w:name="Light Shading" w:uiPriority="60"/>
+    <w:lsdException w:name="toc 3" w:uiPriority="99"/>
+    <w:lsdException w:name="Grid Table 1 Light Accent 2" w:uiPriority="46"/>
+    <w:lsdException w:name="HTML Address" w:uiPriority="99"/>
+    <w:lsdException w:name="Light List Accent 2" w:uiPriority="61"/>
+    <w:lsdException w:name="Table Colorful 2" w:semiHidden="1" w:unhideWhenUsed="1"/>
+    <w:lsdException w:name="Normal Table" w:uiPriority="99" w:semiHidden="1" w:unhideWhenUsed="1"/>
+    <w:lsdException w:name="Dark List" w:uiPriority="70"/>
+    <w:lsdException w:name="Grid Table 5 Dark Accent 6" w:uiPriority="50"/>
+    <w:lsdException w:name="Grid Table 1 Light Accent 5" w:uiPriority="46"/>
     <w:lsdException w:name="Table Columns 4" w:semiHidden="1" w:unhideWhenUsed="1"/>
-    <w:lsdException w:name="Colorful Shading Accent 2" w:uiPriority="71"/>
-    <w:lsdException w:name="Grid Table 1 Light" w:uiPriority="46"/>
-    <w:lsdException w:name="List Table 5 Dark Accent 1" w:uiPriority="50"/>
+    <w:lsdException w:name="Table Subtle 2" w:semiHidden="1" w:unhideWhenUsed="1"/>
+    <w:lsdException w:name="Light List Accent 4" w:uiPriority="61"/>
+    <w:lsdException w:name="Table List 8" w:semiHidden="1" w:unhideWhenUsed="1"/>
+    <w:lsdException w:name="Grid Table 6 Colorful Accent 6" w:uiPriority="51"/>
+    <w:lsdException w:name="Colorful Shading Accent 4" w:uiPriority="71"/>
+    <w:lsdException w:name="Table List 7" w:semiHidden="1" w:unhideWhenUsed="1"/>
+    <w:lsdException w:name="Outline List 1" w:uiPriority="99" w:semiHidden="1" w:unhideWhenUsed="1"/>
+    <w:lsdException w:name="Grid Table 4 Accent 6" w:uiPriority="49"/>
+    <w:lsdException w:name="Medium List 1 Accent 1" w:uiPriority="65"/>
+    <w:lsdException w:name="Table Grid" w:qFormat="1"/>
+    <w:lsdException w:name="heading 1" w:qFormat="1"/>
+    <w:lsdException w:name="Table List 2" w:semiHidden="1" w:unhideWhenUsed="1"/>
+    <w:lsdException w:name="Table Colorful 3" w:semiHidden="1" w:unhideWhenUsed="1"/>
+    <w:lsdException w:name="Colorful Grid Accent 1" w:uiPriority="73"/>
+    <w:lsdException w:name="toc 1" w:uiPriority="99"/>
+    <w:lsdException w:name="Subtitle" w:qFormat="1"/>
+    <w:lsdException w:name="Medium Shading 1 Accent 5" w:uiPriority="63"/>
+    <w:lsdException w:name="Dark List Accent 2" w:uiPriority="70"/>
+    <w:lsdException w:name="List Table 6 Colorful Accent 5" w:uiPriority="51"/>
+    <w:lsdException w:name="Medium Grid 2 Accent 3" w:uiPriority="68"/>
+    <w:lsdException w:name="Light Grid Accent 1" w:uiPriority="62"/>
     <w:lsdException w:name="Colorful Shading" w:uiPriority="71"/>
-    <w:lsdException w:name="Revision" w:uiPriority="99" w:semiHidden="1"/>
-    <w:lsdException w:name="heading 9" w:unhideWhenUsed="1" w:qFormat="1"/>
-    <w:lsdException w:name="Light Grid Accent 2" w:uiPriority="62"/>
-    <w:lsdException w:name="Unresolved Mention" w:uiPriority="99" w:semiHidden="1" w:unhideWhenUsed="1"/>
-    <w:lsdException w:name="Table Theme" w:semiHidden="1" w:unhideWhenUsed="1"/>
-    <w:lsdException w:name="HTML Definition" w:uiPriority="99"/>
-    <w:lsdException w:name="Colorful Grid Accent 4" w:uiPriority="73"/>
-    <w:lsdException w:name="Grid Table 6 Colorful Accent 2" w:uiPriority="51"/>
-    <w:lsdException w:name="Table 3D effects 1" w:semiHidden="1" w:unhideWhenUsed="1"/>
-    <w:lsdException w:name="Grid Table 3 Accent 4" w:uiPriority="48"/>
-    <w:lsdException w:name="Grid Table 4 Accent 5" w:uiPriority="49"/>
-    <w:lsdException w:name="Medium List 1 Accent 2" w:uiPriority="65"/>
-    <w:lsdException w:name="Table Grid" w:qFormat="1"/>
-    <w:lsdException w:name="List Table 7 Colorful Accent 2" w:uiPriority="52"/>
-    <w:lsdException w:name="List Table 3 Accent 6" w:uiPriority="48"/>
-    <w:lsdException w:name="Table List 3" w:semiHidden="1" w:unhideWhenUsed="1"/>
-    <w:lsdException w:name="Grid Table 6 Colorful Accent 4" w:uiPriority="51"/>
-    <w:lsdException w:name="Table Grid 2" w:semiHidden="1" w:unhideWhenUsed="1"/>
-    <w:lsdException w:name="Medium Shading 2 Accent 6" w:uiPriority="64"/>
-    <w:lsdException w:name="Grid Table 1 Light Accent 4" w:uiPriority="46"/>
-    <w:lsdException w:name="Medium List 1 Accent 1" w:uiPriority="65"/>
-    <w:lsdException w:name="Medium Grid 3 Accent 1" w:uiPriority="69"/>
-    <w:lsdException w:name="List Table 2 Accent 2" w:uiPriority="47"/>
-    <w:lsdException w:name="toc 1" w:uiPriority="99"/>
-    <w:lsdException w:name="Colorful Shading Accent 1" w:uiPriority="71"/>
-    <w:lsdException w:name="Medium Shading 2 Accent 1" w:uiPriority="64"/>
-    <w:lsdException w:name="Table 3D effects 2" w:semiHidden="1" w:unhideWhenUsed="1"/>
-    <w:lsdException w:name="Grid Table 7 Colorful Accent 3" w:uiPriority="52"/>
-    <w:lsdException w:name="Medium List 2 Accent 3" w:uiPriority="66"/>
-    <w:lsdException w:name="Table List 4" w:semiHidden="1" w:unhideWhenUsed="1"/>
-    <w:lsdException w:name="Medium Grid 2" w:uiPriority="68"/>
-    <w:lsdException w:name="Plain Table 5" w:uiPriority="45"/>
-    <w:lsdException w:name="Colorful List Accent 4" w:uiPriority="72"/>
-    <w:lsdException w:name="Dark List Accent 2" w:uiPriority="70"/>
-    <w:lsdException w:name="List Table 6 Colorful Accent 6" w:uiPriority="51"/>
-    <w:lsdException w:name="List Table 1 Light" w:uiPriority="46"/>
-    <w:lsdException w:name="Grid Table 2 Accent 2" w:uiPriority="47"/>
-    <w:lsdException w:name="Plain Table 3" w:uiPriority="43"/>
-    <w:lsdException w:name="Table Colorful 3" w:semiHidden="1" w:unhideWhenUsed="1"/>
-    <w:lsdException w:name="List Table 1 Light Accent 5" w:uiPriority="46"/>
-    <w:lsdException w:name="Table Grid 3" w:semiHidden="1" w:unhideWhenUsed="1"/>
-    <w:lsdException w:name="Grid Table 7 Colorful Accent 1" w:uiPriority="52"/>
-    <w:lsdException w:name="List Table 5 Dark Accent 5" w:uiPriority="50"/>
-    <w:lsdException w:name="Smart Link" w:uiPriority="99" w:semiHidden="1" w:unhideWhenUsed="1"/>
-    <w:lsdException w:name="Medium List 1 Accent 5" w:uiPriority="65"/>
-    <w:lsdException w:name="Table Colorful 1" w:semiHidden="1" w:unhideWhenUsed="1"/>
-    <w:lsdException w:name="Medium Shading 1 Accent 3" w:uiPriority="63"/>
-    <w:lsdException w:name="Medium Grid 3 Accent 6" w:uiPriority="69"/>
-    <w:lsdException w:name="Intense Quote" w:uiPriority="99"/>
-    <w:lsdException w:name="Light List" w:uiPriority="61"/>
-    <w:lsdException w:name="toc 9" w:uiPriority="99"/>
-    <w:lsdException w:name="Medium List 1 Accent 3" w:uiPriority="65"/>
-    <w:lsdException w:name="List Table 4" w:uiPriority="49"/>
-    <w:lsdException w:name="List Table 4 Accent 4" w:uiPriority="49"/>
-    <w:lsdException w:name="Table Grid 5" w:semiHidden="1" w:unhideWhenUsed="1"/>
-    <w:lsdException w:name="Colorful Grid Accent 2" w:uiPriority="73"/>
-    <w:lsdException w:name="List Table 4 Accent 3" w:uiPriority="49"/>
-    <w:lsdException w:name="Table Colorful 2" w:semiHidden="1" w:unhideWhenUsed="1"/>
-    <w:lsdException w:name="List Paragraph" w:uiPriority="99"/>
-    <w:lsdException w:name="List Table 5 Dark Accent 6" w:uiPriority="50"/>
-    <w:lsdException w:name="Subtle Reference" w:uiPriority="31" w:qFormat="1"/>
-    <w:lsdException w:name="Medium Shading 2 Accent 4" w:uiPriority="64"/>
-    <w:lsdException w:name="Grid Table 7 Colorful Accent 2" w:uiPriority="52"/>
-    <w:lsdException w:name="Light List Accent 4" w:uiPriority="61"/>
-    <w:lsdException w:name="List Table 2" w:uiPriority="47"/>
     <w:lsdException w:name="Table List 5" w:semiHidden="1" w:unhideWhenUsed="1"/>
-    <w:lsdException w:name="Grid Table 5 Dark Accent 5" w:uiPriority="50"/>
-    <w:lsdException w:name="List Table 2 Accent 4" w:uiPriority="47"/>
-    <w:lsdException w:name="Medium Shading 2 Accent 2" w:uiPriority="64"/>
-    <w:lsdException w:name="HTML Bottom of Form" w:uiPriority="99" w:semiHidden="1" w:unhideWhenUsed="1"/>
-    <w:lsdException w:name="Grid Table 7 Colorful" w:uiPriority="52"/>
-    <w:lsdException w:name="Grid Table 2 Accent 4" w:uiPriority="47"/>
-    <w:lsdException w:name="Dark List Accent 3" w:uiPriority="70"/>
-    <w:lsdException w:name="Grid Table 1 Light Accent 2" w:uiPriority="46"/>
-    <w:lsdException w:name="Table Simple 3" w:semiHidden="1" w:unhideWhenUsed="1"/>
-    <w:lsdException w:name="Grid Table 5 Dark Accent 3" w:uiPriority="50"/>
-    <w:lsdException w:name="Medium Grid 3 Accent 5" w:uiPriority="69"/>
-    <w:lsdException w:name="List Table 6 Colorful Accent 1" w:uiPriority="51"/>
-    <w:lsdException w:name="Colorful List Accent 5" w:uiPriority="72"/>
-    <w:lsdException w:name="Medium Shading 1 Accent 1" w:uiPriority="63"/>
-    <w:lsdException w:name="heading 7" w:unhideWhenUsed="1" w:qFormat="1"/>
-    <w:lsdException w:name="toc 8" w:uiPriority="99"/>
-    <w:lsdException w:name="No List" w:uiPriority="99" w:semiHidden="1" w:unhideWhenUsed="1"/>
-    <w:lsdException w:name="Medium Grid 1 Accent 6" w:uiPriority="67"/>
-    <w:lsdException w:name="Table Columns 1" w:semiHidden="1" w:unhideWhenUsed="1"/>
-    <w:lsdException w:name="Grid Table 6 Colorful" w:uiPriority="51"/>
-    <w:lsdException w:name="List Table 7 Colorful" w:uiPriority="52"/>
-    <w:lsdException w:name="Light Shading" w:uiPriority="60"/>
-    <w:lsdException w:name="Grid Table 6 Colorful Accent 1" w:uiPriority="51"/>
-    <w:lsdException w:name="Medium List 2 Accent 1" w:uiPriority="66"/>
-    <w:lsdException w:name="Grid Table 6 Colorful Accent 3" w:uiPriority="51"/>
-    <w:lsdException w:name="Table Elegant" w:semiHidden="1" w:unhideWhenUsed="1"/>
-    <w:lsdException w:name="List Table 2 Accent 1" w:uiPriority="47"/>
-    <w:lsdException w:name="Light Grid Accent 5" w:uiPriority="62"/>
-    <w:lsdException w:name="Table Professional" w:semiHidden="1" w:unhideWhenUsed="1"/>
-    <w:lsdException w:name="toc 4" w:uiPriority="99"/>
-    <w:lsdException w:name="Grid Table 3 Accent 3" w:uiPriority="48"/>
-    <w:lsdException w:name="Table Grid 4" w:semiHidden="1" w:unhideWhenUsed="1"/>
-    <w:lsdException w:name="Dark List" w:uiPriority="70"/>
-    <w:lsdException w:name="Medium Grid 1 Accent 5" w:uiPriority="67"/>
-    <w:lsdException w:name="Normal Table" w:uiPriority="99" w:semiHidden="1" w:unhideWhenUsed="1"/>
-    <w:lsdException w:name="Light List Accent 3" w:uiPriority="61"/>
-    <w:lsdException w:name="Table List 8" w:semiHidden="1" w:unhideWhenUsed="1"/>
-    <w:lsdException w:name="footnote reference" w:uiPriority="99" w:semiHidden="1" w:unhideWhenUsed="1"/>
-    <w:lsdException w:name="heading 8" w:unhideWhenUsed="1" w:qFormat="1"/>
-    <w:lsdException w:name="Light Grid" w:uiPriority="62"/>
-    <w:lsdException w:name="Medium Shading 1 Accent 6" w:uiPriority="63"/>
-    <w:lsdException w:name="Intense Emphasis" w:uiPriority="21" w:qFormat="1"/>
-    <w:lsdException w:name="heading 5" w:qFormat="1"/>
-    <w:lsdException w:name="Medium List 1 Accent 4" w:uiPriority="65"/>
-    <w:lsdException w:name="Medium Grid 2 Accent 1" w:uiPriority="68"/>
-    <w:lsdException w:name="Plain Table 4" w:uiPriority="44"/>
-    <w:lsdException w:name="Mention" w:uiPriority="99" w:semiHidden="1" w:unhideWhenUsed="1"/>
-    <w:lsdException w:name="Table Classic 4" w:semiHidden="1" w:unhideWhenUsed="1"/>
-    <w:lsdException w:name="Table Web 3" w:semiHidden="1" w:unhideWhenUsed="1"/>
-    <w:lsdException w:name="List Table 1 Light Accent 6" w:uiPriority="46"/>
-    <w:lsdException w:name="Dark List Accent 1" w:uiPriority="70"/>
-    <w:lsdException w:name="Table 3D effects 3" w:semiHidden="1" w:unhideWhenUsed="1"/>
-    <w:lsdException w:name="Grid Table 1 Light Accent 1" w:uiPriority="46"/>
-    <w:lsdException w:name="List Table 6 Colorful Accent 2" w:uiPriority="51"/>
-    <w:lsdException w:name="Colorful Grid Accent 1" w:uiPriority="73"/>
-    <w:lsdException w:name="Medium Shading 2 Accent 5" w:uiPriority="64"/>
-    <w:lsdException w:name="Medium Grid 1 Accent 2" w:uiPriority="67"/>
-    <w:lsdException w:name="Default Paragraph Font" w:uiPriority="1" w:semiHidden="1" w:unhideWhenUsed="1"/>
-    <w:lsdException w:name="Quote" w:uiPriority="99"/>
-    <w:lsdException w:name="Intense Reference" w:uiPriority="32" w:qFormat="1"/>
-    <w:lsdException w:name="List Table 5 Dark" w:uiPriority="50"/>
-    <w:lsdException w:name="Medium List 2 Accent 5" w:uiPriority="66"/>
-    <w:lsdException w:name="Medium Grid 2 Accent 6" w:uiPriority="68"/>
-    <w:lsdException w:name="Grid Table 5 Dark Accent 1" w:uiPriority="50"/>
-    <w:lsdException w:name="List Table 3 Accent 4" w:uiPriority="48"/>
-    <w:lsdException w:name="heading 3" w:qFormat="1"/>
-    <w:lsdException w:name="Grid Table 7 Colorful Accent 4" w:uiPriority="52"/>
-    <w:lsdException w:name="List Table 4 Accent 6" w:uiPriority="49"/>
-    <w:lsdException w:name="HTML Acronym" w:uiPriority="99"/>
-    <w:lsdException w:name="Medium Grid 1 Accent 3" w:uiPriority="67"/>
-    <w:lsdException w:name="Book Title" w:uiPriority="33" w:qFormat="1"/>
-    <w:lsdException w:name="Medium Grid 1" w:uiPriority="67"/>
-    <w:lsdException w:name="List Table 7 Colorful Accent 6" w:uiPriority="52"/>
-    <w:lsdException w:name="Medium Grid 1 Accent 1" w:uiPriority="67"/>
-    <w:lsdException w:name="Grid Table 4 Accent 6" w:uiPriority="49"/>
-    <w:lsdException w:name="toc 6" w:uiPriority="99"/>
-    <w:lsdException w:name="Grid Table 2 Accent 6" w:uiPriority="47"/>
-    <w:lsdException w:name="Outline List 3" w:uiPriority="99" w:semiHidden="1" w:unhideWhenUsed="1"/>
-    <w:lsdException w:name="Grid Table 5 Dark Accent 4" w:uiPriority="50"/>
-    <w:lsdException w:name="Table Classic 2" w:semiHidden="1" w:unhideWhenUsed="1"/>
-    <w:lsdException w:name="Grid Table 1 Light Accent 6" w:uiPriority="46"/>
-    <w:lsdException w:name="Colorful List" w:uiPriority="72"/>
-    <w:lsdException w:name="List Table 1 Light Accent 4" w:uiPriority="46"/>
-    <w:lsdException w:name="Grid Table 2 Accent 3" w:uiPriority="47"/>
-    <w:lsdException w:name="Light Grid Accent 1" w:uiPriority="62"/>
-    <w:lsdException w:name="Light Shading Accent 1" w:uiPriority="60"/>
-    <w:lsdException w:name="Table Grid 7" w:semiHidden="1" w:unhideWhenUsed="1"/>
-    <w:lsdException w:name="Medium List 2 Accent 4" w:uiPriority="66"/>
-    <w:lsdException w:name="Medium Grid 3 Accent 3" w:uiPriority="69"/>
-    <w:lsdException w:name="Bibliography" w:uiPriority="37" w:semiHidden="1" w:unhideWhenUsed="1"/>
-    <w:lsdException w:name="Grid Table 2 Accent 1" w:uiPriority="47"/>
-    <w:lsdException w:name="List Table 3 Accent 3" w:uiPriority="48"/>
-    <w:lsdException w:name="HTML Sample" w:uiPriority="99"/>
-    <w:lsdException w:name="List Table 3 Accent 5" w:uiPriority="48"/>
-    <w:lsdException w:name="Table Web 2" w:semiHidden="1" w:unhideWhenUsed="1"/>
-    <w:lsdException w:name="Medium List 1 Accent 6" w:uiPriority="65"/>
-    <w:lsdException w:name="List Table 7 Colorful Accent 1" w:uiPriority="52"/>
-    <w:lsdException w:name="Medium Shading 1 Accent 2" w:uiPriority="63"/>
-    <w:lsdException w:name="Subtle Emphasis" w:uiPriority="19" w:qFormat="1"/>
-    <w:lsdException w:name="List Table 2 Accent 3" w:uiPriority="47"/>
-    <w:lsdException w:name="Grid Table 6 Colorful Accent 5" w:uiPriority="51"/>
-    <w:lsdException w:name="HTML Typewriter" w:uiPriority="99"/>
-    <w:lsdException w:name="Grid Table 5 Dark" w:uiPriority="50"/>
-    <w:lsdException w:name="Light Shading Accent 6" w:uiPriority="60"/>
-    <w:lsdException w:name="heading 1" w:qFormat="1"/>
-    <w:lsdException w:name="Grid Table 4 Accent 1" w:uiPriority="49"/>
-    <w:lsdException w:name="heading 4" w:qFormat="1"/>
-    <w:lsdException w:name="toc 2" w:uiPriority="99"/>
-    <w:lsdException w:name="Table Subtle 1" w:semiHidden="1" w:unhideWhenUsed="1"/>
-    <w:lsdException w:name="Medium Shading 1 Accent 5" w:uiPriority="63"/>
-    <w:lsdException w:name="Table Grid 1" w:semiHidden="1" w:unhideWhenUsed="1"/>
-    <w:lsdException w:name="Grid Table 1 Light Accent 5" w:uiPriority="46"/>
-    <w:lsdException w:name="List Table 3 Accent 2" w:uiPriority="48"/>
-    <w:lsdException w:name="Grid Table 4 Accent 2" w:uiPriority="49"/>
-    <w:lsdException w:name="List Table 5 Dark Accent 2" w:uiPriority="50"/>
-    <w:lsdException w:name="HTML Cite" w:uiPriority="99"/>
-    <w:lsdException w:name="Dark List Accent 6" w:uiPriority="70"/>
-    <w:lsdException w:name="Colorful Shading Accent 3" w:uiPriority="71"/>
-    <w:lsdException w:name="Table List 7" w:semiHidden="1" w:unhideWhenUsed="1"/>
-    <w:lsdException w:name="List Table 4 Accent 2" w:uiPriority="49"/>
-    <w:lsdException w:name="Medium List 1" w:uiPriority="65"/>
-    <w:lsdException w:name="Grid Table 4 Accent 4" w:uiPriority="49"/>
-    <w:lsdException w:name="Medium Shading 2 Accent 3" w:uiPriority="64"/>
-    <w:lsdException w:name="List Table 2 Accent 5" w:uiPriority="47"/>
-    <w:lsdException w:name="List Table 6 Colorful" w:uiPriority="51"/>
-    <w:lsdException w:name="List Table 3" w:uiPriority="48"/>
-    <w:lsdException w:name="Grid Table Light" w:uiPriority="40"/>
-    <w:lsdException w:name="Grid Table 3 Accent 6" w:uiPriority="48"/>
-    <w:lsdException w:name="Light Shading Accent 5" w:uiPriority="60"/>
-    <w:lsdException w:name="Smart Hyperlink" w:uiPriority="99" w:semiHidden="1" w:unhideWhenUsed="1"/>
-    <w:lsdException w:name="Table Web 1" w:semiHidden="1" w:unhideWhenUsed="1"/>
-    <w:lsdException w:name="Colorful List Accent 6" w:uiPriority="72"/>
-    <w:lsdException w:name="Grid Table 4" w:uiPriority="49"/>
-    <w:lsdException w:name="toc 7" w:uiPriority="99"/>
-    <w:lsdException w:name="toc 3" w:uiPriority="99"/>
-    <w:lsdException w:name="Dark List Accent 4" w:uiPriority="70"/>
-    <w:lsdException w:name="Colorful Grid Accent 3" w:uiPriority="73"/>
-    <w:lsdException w:name="Table Columns 5" w:semiHidden="1" w:unhideWhenUsed="1"/>
-    <w:lsdException w:name="heading 6" w:qFormat="1"/>
-    <w:lsdException w:name="Light List Accent 1" w:uiPriority="61"/>
-    <w:lsdException w:name="HTML Code" w:uiPriority="99"/>
-    <w:lsdException w:name="No Spacing" w:uiPriority="99"/>
-    <w:lsdException w:name="List Table 2 Accent 6" w:uiPriority="47"/>
-    <w:lsdException w:name="List Table 3 Accent 1" w:uiPriority="48"/>
-    <w:lsdException w:name="List Table 5 Dark Accent 4" w:uiPriority="50"/>
-    <w:lsdException w:name="Hashtag" w:uiPriority="99" w:semiHidden="1" w:unhideWhenUsed="1"/>
-    <w:lsdException w:name="Table Contemporary" w:semiHidden="1" w:unhideWhenUsed="1"/>
-    <w:lsdException w:name="Table Grid 8" w:semiHidden="1" w:unhideWhenUsed="1"/>
-    <w:lsdException w:name="Light Grid Accent 4" w:uiPriority="62"/>
-    <w:lsdException w:name="Table Classic 3" w:semiHidden="1" w:unhideWhenUsed="1"/>
-    <w:lsdException w:name="Subtitle" w:qFormat="1"/>
-    <w:lsdException w:name="List Table 4 Accent 1" w:uiPriority="49"/>
-    <w:lsdException w:name="Light Shading Accent 2" w:uiPriority="60"/>
-    <w:lsdException w:name="Medium Grid 1 Accent 4" w:uiPriority="67"/>
-    <w:lsdException w:name="Colorful List Accent 3" w:uiPriority="72"/>
-    <w:lsdException w:name="Colorful Shading Accent 5" w:uiPriority="71"/>
-    <w:lsdException w:name="Plain Table 2" w:uiPriority="42"/>
-    <w:lsdException w:name="Medium Grid 3 Accent 2" w:uiPriority="69"/>
-    <w:lsdException w:name="Title" w:qFormat="1"/>
-    <w:lsdException w:name="Normal" w:qFormat="1"/>
-    <w:lsdException w:name="TOC Heading" w:uiPriority="39" w:semiHidden="1" w:unhideWhenUsed="1" w:qFormat="1"/>
-    <w:lsdException w:name="Table List 6" w:semiHidden="1" w:unhideWhenUsed="1"/>
-    <w:lsdException w:name="Placeholder Text" w:uiPriority="99" w:semiHidden="1"/>
-    <w:lsdException w:name="Medium List 2 Accent 6" w:uiPriority="66"/>
-    <w:lsdException w:name="List Table 6 Colorful Accent 5" w:uiPriority="51"/>
-    <w:lsdException w:name="List Table 7 Colorful Accent 4" w:uiPriority="52"/>
-    <w:lsdException w:name="Grid Table 5 Dark Accent 2" w:uiPriority="50"/>
-    <w:lsdException w:name="Table Subtle 2" w:semiHidden="1" w:unhideWhenUsed="1"/>
-    <w:lsdException w:name="Colorful Shading Accent 4" w:uiPriority="71"/>
-    <w:lsdException w:name="Emphasis" w:qFormat="1"/>
-    <w:lsdException w:name="HTML Preformatted" w:uiPriority="99"/>
-    <w:lsdException w:name="Light Shading Accent 3" w:uiPriority="60"/>
-    <w:lsdException w:name="Table List 1" w:semiHidden="1" w:unhideWhenUsed="1"/>
-    <w:lsdException w:name="Medium Grid 2 Accent 5" w:uiPriority="68"/>
-    <w:lsdException w:name="List Table 6 Colorful Accent 4" w:uiPriority="51"/>
-    <w:lsdException w:name="Table List 2" w:semiHidden="1" w:unhideWhenUsed="1"/>
-    <w:lsdException w:name="List Table 4 Accent 5" w:uiPriority="49"/>
-    <w:lsdException w:name="HTML Top of Form" w:uiPriority="99" w:semiHidden="1" w:unhideWhenUsed="1"/>
-    <w:lsdException w:name="Light Shading Accent 4" w:uiPriority="60"/>
-    <w:lsdException w:name="Grid Table 3 Accent 5" w:uiPriority="48"/>
-    <w:lsdException w:name="HTML Variable" w:uiPriority="99"/>
-    <w:lsdException w:name="toc 5" w:uiPriority="99"/>
-    <w:lsdException w:name="List Table 7 Colorful Accent 5" w:uiPriority="52"/>
-    <w:lsdException w:name="Grid Table 3 Accent 2" w:uiPriority="48"/>
-    <w:lsdException w:name="Table Columns 3" w:semiHidden="1" w:unhideWhenUsed="1"/>
-    <w:lsdException w:name="Grid Table 1 Light Accent 3" w:uiPriority="46"/>
-    <w:lsdException w:name="List Table 1 Light Accent 3" w:uiPriority="46"/>
-    <w:lsdException w:name="Outline List 1" w:uiPriority="99" w:semiHidden="1" w:unhideWhenUsed="1"/>
-    <w:lsdException w:name="Table Classic 1" w:semiHidden="1" w:unhideWhenUsed="1"/>
-    <w:lsdException w:name="List Table 6 Colorful Accent 3" w:uiPriority="51"/>
-    <w:lsdException w:name="Table Simple 1" w:semiHidden="1" w:unhideWhenUsed="1"/>
-    <w:lsdException w:name="Grid Table 2" w:uiPriority="47"/>
-    <w:lsdException w:name="HTML Address" w:uiPriority="99"/>
-    <w:lsdException w:name="Table Simple 2" w:semiHidden="1" w:unhideWhenUsed="1"/>
-    <w:lsdException w:name="Medium Grid 2 Accent 4" w:uiPriority="68"/>
-    <w:lsdException w:name="Medium List 2" w:uiPriority="66"/>
-    <w:lsdException w:name="Medium Grid 3 Accent 4" w:uiPriority="69"/>
-    <w:lsdException w:name="Medium Grid 3" w:uiPriority="69"/>
-    <w:lsdException w:name="Medium Shading 1 Accent 4" w:uiPriority="63"/>
-    <w:lsdException w:name="Light List Accent 2" w:uiPriority="61"/>
-    <w:lsdException w:name="Grid Table 2 Accent 5" w:uiPriority="47"/>
-    <w:lsdException w:name="List Table 5 Dark Accent 3" w:uiPriority="50"/>
-    <w:lsdException w:name="Medium Shading 2" w:uiPriority="64"/>
-    <w:lsdException w:name="Grid Table 3 Accent 1" w:uiPriority="48"/>
-    <w:lsdException w:name="caption" w:semiHidden="1" w:unhideWhenUsed="1" w:qFormat="1"/>
-    <w:lsdException w:name="Light List Accent 5" w:uiPriority="61"/>
-    <w:lsdException w:name="Dark List Accent 5" w:uiPriority="70"/>
-    <w:lsdException w:name="List Table 1 Light Accent 2" w:uiPriority="46"/>
-    <w:lsdException w:name="Grid Table 7 Colorful Accent 6" w:uiPriority="52"/>
-    <w:lsdException w:name="Medium Grid 2 Accent 3" w:uiPriority="68"/>
-    <w:lsdException w:name="Colorful Grid Accent 5" w:uiPriority="73"/>
-    <w:lsdException w:name="Light Grid Accent 6" w:uiPriority="62"/>
-    <w:lsdException w:name="Colorful Shading Accent 6" w:uiPriority="71"/>
-    <w:lsdException w:name="Plain Table 1" w:uiPriority="41"/>
-    <w:lsdException w:name="Light List Accent 6" w:uiPriority="61"/>
-    <w:lsdException w:name="Strong" w:qFormat="1"/>
-    <w:lsdException w:name="List Table 1 Light Accent 1" w:uiPriority="46"/>
-    <w:lsdException w:name="Colorful Grid" w:uiPriority="73"/>
-    <w:lsdException w:name="Light Grid Accent 3" w:uiPriority="62"/>
-    <w:lsdException w:name="Colorful List Accent 1" w:uiPriority="72"/>
-    <w:lsdException w:name="Medium Grid 2 Accent 2" w:uiPriority="68"/>
-    <w:lsdException w:name="Grid Table 7 Colorful Accent 5" w:uiPriority="52"/>
-    <w:lsdException w:name="Colorful List Accent 2" w:uiPriority="72"/>
-    <w:lsdException w:name="Colorful Grid Accent 6" w:uiPriority="73"/>
-    <w:lsdException w:name="Grid Table 6 Colorful Accent 6" w:uiPriority="51"/>
-    <w:lsdException w:name="Grid Table 5 Dark Accent 6" w:uiPriority="50"/>
-    <w:lsdException w:name="Table Columns 2" w:semiHidden="1" w:unhideWhenUsed="1"/>
-    <w:lsdException w:name="Grid Table 3" w:uiPriority="48"/>
-    <w:lsdException w:name="Medium Shading 1" w:uiPriority="63"/>
   </w:latentStyles>
-  <w:style w:type="paragraph" w:styleId="000002">
-    <w:name w:val="heading 1"/>
-    <w:basedOn w:val="000001"/>
-    <w:next w:val="000001"/>
-    <w:qFormat w:val="1"/>
-    <w:pPr>
-      <w:keepNext w:val="1"/>
-      <w:keepLines w:val="1"/>
-      <w:outlineLvl w:val="0"/>
-    </w:pPr>
-    <w:rPr>
-      <w:b w:val="1"/>
-      <w:kern w:val="44"/>
-      <w:sz w:val="36"/>
-    </w:rPr>
-  </w:style>
-  <w:style w:type="paragraph" w:styleId="iukpf3">
+  <w:style w:type="paragraph" w:styleId="7flirm">
     <w:name w:val="toc 2"/>
     <w:basedOn w:val="000001"/>
     <w:next w:val="000001"/>
@@ -3966,67 +3950,7 @@
       <w:szCs w:val="22"/>
     </w:rPr>
   </w:style>
-  <w:style w:type="table" w:styleId="00000c" w:default="1">
-    <w:name w:val="Normal Table"/>
-    <w:uiPriority w:val="99"/>
-    <w:semiHidden w:val="1"/>
-    <w:unhideWhenUsed w:val="1"/>
-    <w:tblPr>
-      <w:tblInd w:w="0" w:type="dxa"/>
-      <w:tblCellMar>
-        <w:top w:w="0" w:type="dxa"/>
-        <w:left w:w="108" w:type="dxa"/>
-        <w:bottom w:w="0" w:type="dxa"/>
-        <w:right w:w="108" w:type="dxa"/>
-      </w:tblCellMar>
-    </w:tblPr>
-  </w:style>
-  <w:style w:type="paragraph" w:styleId="wdzf10">
-    <w:name w:val="toc 2"/>
-    <w:basedOn w:val="000001"/>
-    <w:next w:val="000001"/>
-    <w:autoRedefine w:val="1"/>
-    <w:uiPriority w:val="39"/>
-    <w:unhideWhenUsed w:val="1"/>
-    <w:pPr>
-      <w:ind w:left="210"/>
-      <w:jc w:val="left"/>
-    </w:pPr>
-    <w:rPr>
-      <w:rFonts w:eastAsiaTheme="minorHAnsi"/>
-      <w:smallCaps w:val="1"/>
-      <w:sz w:val="22"/>
-      <w:szCs w:val="22"/>
-    </w:rPr>
-  </w:style>
-  <w:style w:type="character" w:styleId="000017" w:customStyle="1">
-    <w:name w:val="melo-codeblock-Base-theme-char"/>
-    <w:uiPriority w:val="99"/>
-    <w:rPr>
-      <w:rFonts w:ascii="Monaco" w:hAnsi="Monaco" w:eastAsia="Monaco" w:cs="Monaco"/>
-      <w:color w:val="000000"/>
-      <w:sz w:val="21"/>
-    </w:rPr>
-  </w:style>
-  <w:style w:type="paragraph" w:styleId="ohqvve">
-    <w:name w:val="toc 2"/>
-    <w:basedOn w:val="000001"/>
-    <w:next w:val="000001"/>
-    <w:autoRedefine w:val="1"/>
-    <w:uiPriority w:val="39"/>
-    <w:unhideWhenUsed w:val="1"/>
-    <w:pPr>
-      <w:ind w:left="210"/>
-      <w:jc w:val="left"/>
-    </w:pPr>
-    <w:rPr>
-      <w:rFonts w:eastAsiaTheme="minorHAnsi"/>
-      <w:smallCaps w:val="1"/>
-      <w:sz w:val="22"/>
-      <w:szCs w:val="22"/>
-    </w:rPr>
-  </w:style>
-  <w:style w:type="paragraph" w:styleId="1vk9h8">
+  <w:style w:type="paragraph" w:styleId="o14ybc">
     <w:name w:val="toc 3"/>
     <w:basedOn w:val="000001"/>
     <w:next w:val="000001"/>
@@ -4040,132 +3964,6 @@
     <w:rPr>
       <w:rFonts w:eastAsiaTheme="minorHAnsi"/>
       <w:iCs w:val="1"/>
-      <w:sz w:val="22"/>
-      <w:szCs w:val="22"/>
-    </w:rPr>
-  </w:style>
-  <w:style w:type="paragraph" w:styleId="000009">
-    <w:name w:val="heading 8"/>
-    <w:basedOn w:val="000001"/>
-    <w:next w:val="000001"/>
-    <w:unhideWhenUsed w:val="1"/>
-    <w:qFormat w:val="1"/>
-    <w:pPr>
-      <w:keepNext w:val="1"/>
-      <w:keepLines w:val="1"/>
-      <w:spacing w:line="480" w:lineRule="auto"/>
-      <w:outlineLvl w:val="7"/>
-    </w:pPr>
-    <w:rPr>
-      <w:b w:val="1"/>
-    </w:rPr>
-  </w:style>
-  <w:style w:type="paragraph" w:styleId="000018" w:customStyle="1">
-    <w:name w:val="melo-codeblock-Base-theme-para"/>
-    <w:uiPriority w:val="99"/>
-    <w:pPr>
-      <w:snapToGrid w:val="0"/>
-      <w:spacing w:line="360" w:lineRule="auto"/>
-    </w:pPr>
-    <w:rPr>
-      <w:rFonts w:ascii="Monaco" w:hAnsi="Monaco" w:eastAsia="Monaco" w:cs="Monaco"/>
-      <w:color w:val="000000"/>
-      <w:sz w:val="21"/>
-    </w:rPr>
-  </w:style>
-  <w:style w:type="character" w:styleId="000016">
-    <w:name w:val="Hyperlink"/>
-    <w:basedOn w:val="00000b"/>
-    <w:rPr>
-      <w:color w:val="1E6FFF"/>
-      <w:u w:val="single"/>
-    </w:rPr>
-  </w:style>
-  <w:style w:type="paragraph" w:styleId="2e4cod">
-    <w:name w:val="toc 2"/>
-    <w:basedOn w:val="000001"/>
-    <w:next w:val="000001"/>
-    <w:autoRedefine w:val="1"/>
-    <w:uiPriority w:val="39"/>
-    <w:unhideWhenUsed w:val="1"/>
-    <w:pPr>
-      <w:ind w:left="210"/>
-      <w:jc w:val="left"/>
-    </w:pPr>
-    <w:rPr>
-      <w:rFonts w:eastAsiaTheme="minorHAnsi"/>
-      <w:smallCaps w:val="1"/>
-      <w:sz w:val="22"/>
-      <w:szCs w:val="22"/>
-    </w:rPr>
-  </w:style>
-  <w:style w:type="paragraph" w:styleId="9buhbs">
-    <w:name w:val="toc 1"/>
-    <w:basedOn w:val="000001"/>
-    <w:next w:val="000001"/>
-    <w:autoRedefine w:val="1"/>
-    <w:uiPriority w:val="39"/>
-    <w:unhideWhenUsed w:val="1"/>
-    <w:pPr>
-      <w:spacing w:before="120" w:after="120"/>
-      <w:jc w:val="left"/>
-    </w:pPr>
-    <w:rPr>
-      <w:rFonts w:eastAsiaTheme="minorHAnsi"/>
-      <w:b w:val="1"/>
-      <w:bCs w:val="1"/>
-      <w:caps w:val="1"/>
-      <w:sz w:val="22"/>
-      <w:szCs w:val="22"/>
-    </w:rPr>
-  </w:style>
-  <w:style w:type="paragraph" w:styleId="000004">
-    <w:name w:val="heading 3"/>
-    <w:basedOn w:val="000001"/>
-    <w:next w:val="000001"/>
-    <w:qFormat w:val="1"/>
-    <w:pPr>
-      <w:keepNext w:val="1"/>
-      <w:keepLines w:val="1"/>
-      <w:outlineLvl w:val="2"/>
-    </w:pPr>
-    <w:rPr>
-      <w:b w:val="1"/>
-      <w:sz w:val="28"/>
-    </w:rPr>
-  </w:style>
-  <w:style w:type="paragraph" w:styleId="000013">
-    <w:name w:val="Title"/>
-    <w:basedOn w:val="000001"/>
-    <w:next w:val="000001"/>
-    <w:link w:val="000014"/>
-    <w:qFormat w:val="1"/>
-    <w:pPr>
-      <w:jc w:val="center"/>
-      <w:outlineLvl w:val="0"/>
-    </w:pPr>
-    <w:rPr>
-      <w:rFonts w:cstheme="majorBidi"/>
-      <w:b w:val="1"/>
-      <w:bCs w:val="1"/>
-      <w:sz w:val="48"/>
-      <w:szCs w:val="32"/>
-    </w:rPr>
-  </w:style>
-  <w:style w:type="paragraph" w:styleId="zwphl0">
-    <w:name w:val="toc 2"/>
-    <w:basedOn w:val="000001"/>
-    <w:next w:val="000001"/>
-    <w:autoRedefine w:val="1"/>
-    <w:uiPriority w:val="39"/>
-    <w:unhideWhenUsed w:val="1"/>
-    <w:pPr>
-      <w:ind w:left="210"/>
-      <w:jc w:val="left"/>
-    </w:pPr>
-    <w:rPr>
-      <w:rFonts w:eastAsiaTheme="minorHAnsi"/>
-      <w:smallCaps w:val="1"/>
       <w:sz w:val="22"/>
       <w:szCs w:val="22"/>
     </w:rPr>
@@ -4188,7 +3986,108 @@
       <w:szCs w:val="22"/>
     </w:rPr>
   </w:style>
-  <w:style w:type="paragraph" w:styleId="64a5ey">
+  <w:style w:type="paragraph" w:styleId="h8wprv">
+    <w:name w:val="toc 2"/>
+    <w:basedOn w:val="000001"/>
+    <w:next w:val="000001"/>
+    <w:autoRedefine w:val="1"/>
+    <w:uiPriority w:val="39"/>
+    <w:unhideWhenUsed w:val="1"/>
+    <w:pPr>
+      <w:ind w:left="210"/>
+      <w:jc w:val="left"/>
+    </w:pPr>
+    <w:rPr>
+      <w:rFonts w:eastAsiaTheme="minorHAnsi"/>
+      <w:smallCaps w:val="1"/>
+      <w:sz w:val="22"/>
+      <w:szCs w:val="22"/>
+    </w:rPr>
+  </w:style>
+  <w:style w:type="paragraph" w:styleId="00000a">
+    <w:name w:val="heading 9"/>
+    <w:basedOn w:val="000001"/>
+    <w:next w:val="000001"/>
+    <w:unhideWhenUsed w:val="1"/>
+    <w:qFormat w:val="1"/>
+    <w:pPr>
+      <w:keepNext w:val="1"/>
+      <w:keepLines w:val="1"/>
+      <w:spacing w:line="480" w:lineRule="auto"/>
+      <w:outlineLvl w:val="8"/>
+    </w:pPr>
+    <w:rPr>
+      <w:b w:val="1"/>
+    </w:rPr>
+  </w:style>
+  <w:style w:type="paragraph" w:styleId="wdzf10">
+    <w:name w:val="toc 2"/>
+    <w:basedOn w:val="000001"/>
+    <w:next w:val="000001"/>
+    <w:autoRedefine w:val="1"/>
+    <w:uiPriority w:val="39"/>
+    <w:unhideWhenUsed w:val="1"/>
+    <w:pPr>
+      <w:ind w:left="210"/>
+      <w:jc w:val="left"/>
+    </w:pPr>
+    <w:rPr>
+      <w:rFonts w:eastAsiaTheme="minorHAnsi"/>
+      <w:smallCaps w:val="1"/>
+      <w:sz w:val="22"/>
+      <w:szCs w:val="22"/>
+    </w:rPr>
+  </w:style>
+  <w:style w:type="paragraph" w:styleId="000006">
+    <w:name w:val="heading 5"/>
+    <w:basedOn w:val="000001"/>
+    <w:next w:val="000001"/>
+    <w:qFormat w:val="1"/>
+    <w:pPr>
+      <w:keepNext w:val="1"/>
+      <w:keepLines w:val="1"/>
+      <w:spacing w:line="480" w:lineRule="auto"/>
+      <w:outlineLvl w:val="4"/>
+    </w:pPr>
+    <w:rPr>
+      <w:b w:val="1"/>
+    </w:rPr>
+  </w:style>
+  <w:style w:type="paragraph" w:styleId="zwphl0">
+    <w:name w:val="toc 2"/>
+    <w:basedOn w:val="000001"/>
+    <w:next w:val="000001"/>
+    <w:autoRedefine w:val="1"/>
+    <w:uiPriority w:val="39"/>
+    <w:unhideWhenUsed w:val="1"/>
+    <w:pPr>
+      <w:ind w:left="210"/>
+      <w:jc w:val="left"/>
+    </w:pPr>
+    <w:rPr>
+      <w:rFonts w:eastAsiaTheme="minorHAnsi"/>
+      <w:smallCaps w:val="1"/>
+      <w:sz w:val="22"/>
+      <w:szCs w:val="22"/>
+    </w:rPr>
+  </w:style>
+  <w:style w:type="paragraph" w:styleId="000002">
+    <w:name w:val="heading 1"/>
+    <w:basedOn w:val="000001"/>
+    <w:next w:val="000001"/>
+    <w:qFormat w:val="1"/>
+    <w:pPr>
+      <w:keepNext w:val="1"/>
+      <w:keepLines w:val="1"/>
+      <w:outlineLvl w:val="0"/>
+    </w:pPr>
+    <w:rPr>
+      <w:b w:val="1"/>
+      <w:kern w:val="44"/>
+      <w:sz w:val="36"/>
+    </w:rPr>
+  </w:style>
+  <w:style w:type="paragraph" w:styleId="vwvnpp">
     <w:name w:val="toc 3"/>
     <w:basedOn w:val="000001"/>
     <w:next w:val="000001"/>
@@ -4206,22 +4105,54 @@
       <w:szCs w:val="22"/>
     </w:rPr>
   </w:style>
-  <w:style w:type="paragraph" w:styleId="rolian">
-    <w:name w:val="toc 3"/>
+  <w:style w:type="character" w:styleId="00000b" w:default="1">
+    <w:name w:val="Default Paragraph Font"/>
+    <w:uiPriority w:val="1"/>
+    <w:semiHidden w:val="1"/>
+    <w:unhideWhenUsed w:val="1"/>
+  </w:style>
+  <w:style w:type="paragraph" w:styleId="000018" w:customStyle="1">
+    <w:name w:val="melo-codeblock-Base-theme-para"/>
+    <w:uiPriority w:val="99"/>
+    <w:pPr>
+      <w:snapToGrid w:val="0"/>
+      <w:spacing w:line="360" w:lineRule="auto"/>
+    </w:pPr>
+    <w:rPr>
+      <w:rFonts w:ascii="Monaco" w:hAnsi="Monaco" w:eastAsia="Monaco" w:cs="Monaco"/>
+      <w:color w:val="000000"/>
+      <w:sz w:val="21"/>
+    </w:rPr>
+  </w:style>
+  <w:style w:type="paragraph" w:styleId="00000f">
+    <w:name w:val="footer"/>
+    <w:basedOn w:val="000001"/>
+    <w:pPr>
+      <w:tabs>
+        <w:tab w:val="center" w:pos="4153"/>
+        <w:tab w:val="right" w:pos="8306"/>
+      </w:tabs>
+      <w:snapToGrid w:val="0"/>
+      <w:jc w:val="center"/>
+    </w:pPr>
+    <w:rPr>
+      <w:sz w:val="18"/>
+      <w:szCs w:val="18"/>
+    </w:rPr>
+  </w:style>
+  <w:style w:type="paragraph" w:styleId="000007">
+    <w:name w:val="heading 6"/>
     <w:basedOn w:val="000001"/>
     <w:next w:val="000001"/>
-    <w:autoRedefine w:val="1"/>
-    <w:uiPriority w:val="39"/>
-    <w:unhideWhenUsed w:val="1"/>
+    <w:qFormat w:val="1"/>
     <w:pPr>
-      <w:ind w:left="420"/>
-      <w:jc w:val="left"/>
+      <w:keepNext w:val="1"/>
+      <w:keepLines w:val="1"/>
+      <w:spacing w:line="480" w:lineRule="auto"/>
+      <w:outlineLvl w:val="5"/>
     </w:pPr>
     <w:rPr>
-      <w:rFonts w:eastAsiaTheme="minorHAnsi"/>
-      <w:iCs w:val="1"/>
-      <w:sz w:val="22"/>
-      <w:szCs w:val="22"/>
+      <w:b w:val="1"/>
     </w:rPr>
   </w:style>
   <w:style w:type="paragraph" w:styleId="000001" w:default="1">
@@ -4239,90 +4170,16 @@
       <w:szCs w:val="24"/>
     </w:rPr>
   </w:style>
-  <w:style w:type="paragraph" w:styleId="000010">
-    <w:name w:val="header"/>
-    <w:basedOn w:val="000001"/>
-    <w:pPr>
-      <w:pBdr>
-        <w:bottom w:val="single" w:color="auto" w:sz="6" w:space="1"/>
-      </w:pBdr>
-      <w:tabs>
-        <w:tab w:val="center" w:pos="4153"/>
-        <w:tab w:val="right" w:pos="8306"/>
-      </w:tabs>
-      <w:snapToGrid w:val="0"/>
-      <w:jc w:val="center"/>
-    </w:pPr>
+  <w:style w:type="character" w:styleId="000017" w:customStyle="1">
+    <w:name w:val="melo-codeblock-Base-theme-char"/>
+    <w:uiPriority w:val="99"/>
     <w:rPr>
-      <w:sz w:val="18"/>
-      <w:szCs w:val="18"/>
+      <w:rFonts w:ascii="Monaco" w:hAnsi="Monaco" w:eastAsia="Monaco" w:cs="Monaco"/>
+      <w:color w:val="000000"/>
+      <w:sz w:val="21"/>
     </w:rPr>
   </w:style>
-  <w:style w:type="numbering" w:styleId="00000d" w:default="1">
-    <w:name w:val="No List"/>
-    <w:uiPriority w:val="99"/>
-    <w:semiHidden w:val="1"/>
-    <w:unhideWhenUsed w:val="1"/>
-  </w:style>
-  <w:style w:type="paragraph" w:styleId="000007">
-    <w:name w:val="heading 6"/>
-    <w:basedOn w:val="000001"/>
-    <w:next w:val="000001"/>
-    <w:qFormat w:val="1"/>
-    <w:pPr>
-      <w:keepNext w:val="1"/>
-      <w:keepLines w:val="1"/>
-      <w:spacing w:line="480" w:lineRule="auto"/>
-      <w:outlineLvl w:val="5"/>
-    </w:pPr>
-    <w:rPr>
-      <w:b w:val="1"/>
-    </w:rPr>
-  </w:style>
-  <w:style w:type="paragraph" w:styleId="00000e">
-    <w:name w:val="toc 8"/>
-    <w:basedOn w:val="000001"/>
-    <w:next w:val="000001"/>
-    <w:autoRedefine w:val="1"/>
-    <w:uiPriority w:val="99"/>
-    <w:pPr>
-      <w:ind w:left="2940" w:leftChars="1400"/>
-    </w:pPr>
-  </w:style>
-  <w:style w:type="paragraph" w:styleId="000003">
-    <w:name w:val="heading 2"/>
-    <w:basedOn w:val="000001"/>
-    <w:next w:val="000001"/>
-    <w:qFormat w:val="1"/>
-    <w:pPr>
-      <w:keepNext w:val="1"/>
-      <w:keepLines w:val="1"/>
-      <w:outlineLvl w:val="1"/>
-    </w:pPr>
-    <w:rPr>
-      <w:b w:val="1"/>
-      <w:sz w:val="32"/>
-    </w:rPr>
-  </w:style>
-  <w:style w:type="paragraph" w:styleId="iwzifo">
-    <w:name w:val="toc 3"/>
-    <w:basedOn w:val="000001"/>
-    <w:next w:val="000001"/>
-    <w:autoRedefine w:val="1"/>
-    <w:uiPriority w:val="39"/>
-    <w:unhideWhenUsed w:val="1"/>
-    <w:pPr>
-      <w:ind w:left="420"/>
-      <w:jc w:val="left"/>
-    </w:pPr>
-    <w:rPr>
-      <w:rFonts w:eastAsiaTheme="minorHAnsi"/>
-      <w:iCs w:val="1"/>
-      <w:sz w:val="22"/>
-      <w:szCs w:val="22"/>
-    </w:rPr>
-  </w:style>
-  <w:style w:type="paragraph" w:styleId="h8wprv">
+  <w:style w:type="paragraph" w:styleId="ohqvve">
     <w:name w:val="toc 2"/>
     <w:basedOn w:val="000001"/>
     <w:next w:val="000001"/>
@@ -4359,36 +4216,35 @@
       <w:szCs w:val="32"/>
     </w:rPr>
   </w:style>
-  <w:style w:type="paragraph" w:styleId="00000f">
-    <w:name w:val="footer"/>
-    <w:basedOn w:val="000001"/>
-    <w:pPr>
-      <w:tabs>
-        <w:tab w:val="center" w:pos="4153"/>
-        <w:tab w:val="right" w:pos="8306"/>
-      </w:tabs>
-      <w:snapToGrid w:val="0"/>
-      <w:jc w:val="center"/>
-    </w:pPr>
-    <w:rPr>
-      <w:sz w:val="18"/>
-      <w:szCs w:val="18"/>
-    </w:rPr>
+  <w:style w:type="table" w:styleId="00000c" w:default="1">
+    <w:name w:val="Normal Table"/>
+    <w:uiPriority w:val="99"/>
+    <w:semiHidden w:val="1"/>
+    <w:unhideWhenUsed w:val="1"/>
+    <w:tblPr>
+      <w:tblInd w:w="0" w:type="dxa"/>
+      <w:tblCellMar>
+        <w:top w:w="0" w:type="dxa"/>
+        <w:left w:w="108" w:type="dxa"/>
+        <w:bottom w:w="0" w:type="dxa"/>
+        <w:right w:w="108" w:type="dxa"/>
+      </w:tblCellMar>
+    </w:tblPr>
   </w:style>
-  <w:style w:type="paragraph" w:styleId="o14ybc">
-    <w:name w:val="toc 3"/>
+  <w:style w:type="paragraph" w:styleId="b7ecvy">
+    <w:name w:val="toc 2"/>
     <w:basedOn w:val="000001"/>
     <w:next w:val="000001"/>
     <w:autoRedefine w:val="1"/>
     <w:uiPriority w:val="39"/>
     <w:unhideWhenUsed w:val="1"/>
     <w:pPr>
-      <w:ind w:left="420"/>
+      <w:ind w:left="210"/>
       <w:jc w:val="left"/>
     </w:pPr>
     <w:rPr>
       <w:rFonts w:eastAsiaTheme="minorHAnsi"/>
-      <w:iCs w:val="1"/>
+      <w:smallCaps w:val="1"/>
       <w:sz w:val="22"/>
       <w:szCs w:val="22"/>
     </w:rPr>
@@ -4426,6 +4282,153 @@
       <w:szCs w:val="22"/>
     </w:rPr>
   </w:style>
+  <w:style w:type="paragraph" w:styleId="000010">
+    <w:name w:val="header"/>
+    <w:basedOn w:val="000001"/>
+    <w:pPr>
+      <w:pBdr>
+        <w:bottom w:val="single" w:color="auto" w:sz="6" w:space="1"/>
+      </w:pBdr>
+      <w:tabs>
+        <w:tab w:val="center" w:pos="4153"/>
+        <w:tab w:val="right" w:pos="8306"/>
+      </w:tabs>
+      <w:snapToGrid w:val="0"/>
+      <w:jc w:val="center"/>
+    </w:pPr>
+    <w:rPr>
+      <w:sz w:val="18"/>
+      <w:szCs w:val="18"/>
+    </w:rPr>
+  </w:style>
+  <w:style w:type="paragraph" w:styleId="iukpf3">
+    <w:name w:val="toc 2"/>
+    <w:basedOn w:val="000001"/>
+    <w:next w:val="000001"/>
+    <w:autoRedefine w:val="1"/>
+    <w:uiPriority w:val="39"/>
+    <w:unhideWhenUsed w:val="1"/>
+    <w:pPr>
+      <w:ind w:left="210"/>
+      <w:jc w:val="left"/>
+    </w:pPr>
+    <w:rPr>
+      <w:rFonts w:eastAsiaTheme="minorHAnsi"/>
+      <w:smallCaps w:val="1"/>
+      <w:sz w:val="22"/>
+      <w:szCs w:val="22"/>
+    </w:rPr>
+  </w:style>
+  <w:style w:type="paragraph" w:styleId="000004">
+    <w:name w:val="heading 3"/>
+    <w:basedOn w:val="000001"/>
+    <w:next w:val="000001"/>
+    <w:qFormat w:val="1"/>
+    <w:pPr>
+      <w:keepNext w:val="1"/>
+      <w:keepLines w:val="1"/>
+      <w:outlineLvl w:val="2"/>
+    </w:pPr>
+    <w:rPr>
+      <w:b w:val="1"/>
+      <w:sz w:val="28"/>
+    </w:rPr>
+  </w:style>
+  <w:style w:type="paragraph" w:styleId="64a5ey">
+    <w:name w:val="toc 3"/>
+    <w:basedOn w:val="000001"/>
+    <w:next w:val="000001"/>
+    <w:autoRedefine w:val="1"/>
+    <w:uiPriority w:val="39"/>
+    <w:unhideWhenUsed w:val="1"/>
+    <w:pPr>
+      <w:ind w:left="420"/>
+      <w:jc w:val="left"/>
+    </w:pPr>
+    <w:rPr>
+      <w:rFonts w:eastAsiaTheme="minorHAnsi"/>
+      <w:iCs w:val="1"/>
+      <w:sz w:val="22"/>
+      <w:szCs w:val="22"/>
+    </w:rPr>
+  </w:style>
+  <w:style w:type="paragraph" w:styleId="000013">
+    <w:name w:val="Title"/>
+    <w:basedOn w:val="000001"/>
+    <w:next w:val="000001"/>
+    <w:link w:val="000014"/>
+    <w:qFormat w:val="1"/>
+    <w:pPr>
+      <w:jc w:val="center"/>
+      <w:outlineLvl w:val="0"/>
+    </w:pPr>
+    <w:rPr>
+      <w:rFonts w:cstheme="majorBidi"/>
+      <w:b w:val="1"/>
+      <w:bCs w:val="1"/>
+      <w:sz w:val="48"/>
+      <w:szCs w:val="32"/>
+    </w:rPr>
+  </w:style>
+  <w:style w:type="numbering" w:styleId="00000d" w:default="1">
+    <w:name w:val="No List"/>
+    <w:uiPriority w:val="99"/>
+    <w:semiHidden w:val="1"/>
+    <w:unhideWhenUsed w:val="1"/>
+  </w:style>
+  <w:style w:type="paragraph" w:styleId="iwzifo">
+    <w:name w:val="toc 3"/>
+    <w:basedOn w:val="000001"/>
+    <w:next w:val="000001"/>
+    <w:autoRedefine w:val="1"/>
+    <w:uiPriority w:val="39"/>
+    <w:unhideWhenUsed w:val="1"/>
+    <w:pPr>
+      <w:ind w:left="420"/>
+      <w:jc w:val="left"/>
+    </w:pPr>
+    <w:rPr>
+      <w:rFonts w:eastAsiaTheme="minorHAnsi"/>
+      <w:iCs w:val="1"/>
+      <w:sz w:val="22"/>
+      <w:szCs w:val="22"/>
+    </w:rPr>
+  </w:style>
+  <w:style w:type="paragraph" w:styleId="000003">
+    <w:name w:val="heading 2"/>
+    <w:basedOn w:val="000001"/>
+    <w:next w:val="000001"/>
+    <w:qFormat w:val="1"/>
+    <w:pPr>
+      <w:keepNext w:val="1"/>
+      <w:keepLines w:val="1"/>
+      <w:outlineLvl w:val="1"/>
+    </w:pPr>
+    <w:rPr>
+      <w:b w:val="1"/>
+      <w:sz w:val="32"/>
+    </w:rPr>
+  </w:style>
+  <w:style w:type="paragraph" w:styleId="9buhbs">
+    <w:name w:val="toc 1"/>
+    <w:basedOn w:val="000001"/>
+    <w:next w:val="000001"/>
+    <w:autoRedefine w:val="1"/>
+    <w:uiPriority w:val="39"/>
+    <w:unhideWhenUsed w:val="1"/>
+    <w:pPr>
+      <w:spacing w:before="120" w:after="120"/>
+      <w:jc w:val="left"/>
+    </w:pPr>
+    <w:rPr>
+      <w:rFonts w:eastAsiaTheme="minorHAnsi"/>
+      <w:b w:val="1"/>
+      <w:bCs w:val="1"/>
+      <w:caps w:val="1"/>
+      <w:sz w:val="22"/>
+      <w:szCs w:val="22"/>
+    </w:rPr>
+  </w:style>
   <w:style w:type="paragraph" w:styleId="m2crkd">
     <w:name w:val="toc 2"/>
     <w:basedOn w:val="000001"/>
@@ -4444,20 +4447,22 @@
       <w:szCs w:val="22"/>
     </w:rPr>
   </w:style>
-  <w:style w:type="paragraph" w:styleId="00000a">
-    <w:name w:val="heading 9"/>
+  <w:style w:type="paragraph" w:styleId="rolian">
+    <w:name w:val="toc 3"/>
     <w:basedOn w:val="000001"/>
     <w:next w:val="000001"/>
+    <w:autoRedefine w:val="1"/>
+    <w:uiPriority w:val="39"/>
     <w:unhideWhenUsed w:val="1"/>
-    <w:qFormat w:val="1"/>
     <w:pPr>
-      <w:keepNext w:val="1"/>
-      <w:keepLines w:val="1"/>
-      <w:spacing w:line="480" w:lineRule="auto"/>
-      <w:outlineLvl w:val="8"/>
+      <w:ind w:left="420"/>
+      <w:jc w:val="left"/>
     </w:pPr>
     <w:rPr>
-      <w:b w:val="1"/>
+      <w:rFonts w:eastAsiaTheme="minorHAnsi"/>
+      <w:iCs w:val="1"/>
+      <w:sz w:val="22"/>
+      <w:szCs w:val="22"/>
     </w:rPr>
   </w:style>
   <w:style w:type="paragraph" w:styleId="000008">
@@ -4476,13 +4481,7 @@
       <w:b w:val="1"/>
     </w:rPr>
   </w:style>
-  <w:style w:type="character" w:styleId="00000b" w:default="1">
-    <w:name w:val="Default Paragraph Font"/>
-    <w:uiPriority w:val="1"/>
-    <w:semiHidden w:val="1"/>
-    <w:unhideWhenUsed w:val="1"/>
-  </w:style>
-  <w:style w:type="paragraph" w:styleId="vwvnpp">
+  <w:style w:type="paragraph" w:styleId="1vk9h8">
     <w:name w:val="toc 3"/>
     <w:basedOn w:val="000001"/>
     <w:next w:val="000001"/>
@@ -4498,72 +4497,6 @@
       <w:iCs w:val="1"/>
       <w:sz w:val="22"/>
       <w:szCs w:val="22"/>
-    </w:rPr>
-  </w:style>
-  <w:style w:type="paragraph" w:styleId="000005">
-    <w:name w:val="heading 4"/>
-    <w:basedOn w:val="000001"/>
-    <w:next w:val="000001"/>
-    <w:qFormat w:val="1"/>
-    <w:pPr>
-      <w:keepNext w:val="1"/>
-      <w:keepLines w:val="1"/>
-      <w:outlineLvl w:val="3"/>
-    </w:pPr>
-    <w:rPr>
-      <w:b w:val="1"/>
-      <w:sz w:val="24"/>
-    </w:rPr>
-  </w:style>
-  <w:style w:type="paragraph" w:styleId="b7ecvy">
-    <w:name w:val="toc 2"/>
-    <w:basedOn w:val="000001"/>
-    <w:next w:val="000001"/>
-    <w:autoRedefine w:val="1"/>
-    <w:uiPriority w:val="39"/>
-    <w:unhideWhenUsed w:val="1"/>
-    <w:pPr>
-      <w:ind w:left="210"/>
-      <w:jc w:val="left"/>
-    </w:pPr>
-    <w:rPr>
-      <w:rFonts w:eastAsiaTheme="minorHAnsi"/>
-      <w:smallCaps w:val="1"/>
-      <w:sz w:val="22"/>
-      <w:szCs w:val="22"/>
-    </w:rPr>
-  </w:style>
-  <w:style w:type="paragraph" w:styleId="j02txd">
-    <w:name w:val="toc 3"/>
-    <w:basedOn w:val="000001"/>
-    <w:next w:val="000001"/>
-    <w:autoRedefine w:val="1"/>
-    <w:uiPriority w:val="39"/>
-    <w:unhideWhenUsed w:val="1"/>
-    <w:pPr>
-      <w:ind w:left="420"/>
-      <w:jc w:val="left"/>
-    </w:pPr>
-    <w:rPr>
-      <w:rFonts w:eastAsiaTheme="minorHAnsi"/>
-      <w:iCs w:val="1"/>
-      <w:sz w:val="22"/>
-      <w:szCs w:val="22"/>
-    </w:rPr>
-  </w:style>
-  <w:style w:type="paragraph" w:styleId="000006">
-    <w:name w:val="heading 5"/>
-    <w:basedOn w:val="000001"/>
-    <w:next w:val="000001"/>
-    <w:qFormat w:val="1"/>
-    <w:pPr>
-      <w:keepNext w:val="1"/>
-      <w:keepLines w:val="1"/>
-      <w:spacing w:line="480" w:lineRule="auto"/>
-      <w:outlineLvl w:val="4"/>
-    </w:pPr>
-    <w:rPr>
-      <w:b w:val="1"/>
     </w:rPr>
   </w:style>
   <w:style w:type="paragraph" w:styleId="d9qtoo">
@@ -4586,6 +4519,94 @@
       <w:szCs w:val="22"/>
     </w:rPr>
   </w:style>
+  <w:style w:type="character" w:styleId="000014" w:customStyle="1">
+    <w:name w:val="标题 字符"/>
+    <w:basedOn w:val="00000b"/>
+    <w:link w:val="000013"/>
+    <w:rPr>
+      <w:rFonts w:ascii="Arial" w:hAnsi="Arial" w:eastAsia="微软雅黑" w:cstheme="majorBidi"/>
+      <w:b w:val="1"/>
+      <w:bCs w:val="1"/>
+      <w:kern w:val="2"/>
+      <w:sz w:val="48"/>
+      <w:szCs w:val="32"/>
+    </w:rPr>
+  </w:style>
+  <w:style w:type="paragraph" w:styleId="2e4cod">
+    <w:name w:val="toc 2"/>
+    <w:basedOn w:val="000001"/>
+    <w:next w:val="000001"/>
+    <w:autoRedefine w:val="1"/>
+    <w:uiPriority w:val="39"/>
+    <w:unhideWhenUsed w:val="1"/>
+    <w:pPr>
+      <w:ind w:left="210"/>
+      <w:jc w:val="left"/>
+    </w:pPr>
+    <w:rPr>
+      <w:rFonts w:eastAsiaTheme="minorHAnsi"/>
+      <w:smallCaps w:val="1"/>
+      <w:sz w:val="22"/>
+      <w:szCs w:val="22"/>
+    </w:rPr>
+  </w:style>
+  <w:style w:type="paragraph" w:styleId="000009">
+    <w:name w:val="heading 8"/>
+    <w:basedOn w:val="000001"/>
+    <w:next w:val="000001"/>
+    <w:unhideWhenUsed w:val="1"/>
+    <w:qFormat w:val="1"/>
+    <w:pPr>
+      <w:keepNext w:val="1"/>
+      <w:keepLines w:val="1"/>
+      <w:spacing w:line="480" w:lineRule="auto"/>
+      <w:outlineLvl w:val="7"/>
+    </w:pPr>
+    <w:rPr>
+      <w:b w:val="1"/>
+    </w:rPr>
+  </w:style>
+  <w:style w:type="paragraph" w:styleId="000005">
+    <w:name w:val="heading 4"/>
+    <w:basedOn w:val="000001"/>
+    <w:next w:val="000001"/>
+    <w:qFormat w:val="1"/>
+    <w:pPr>
+      <w:keepNext w:val="1"/>
+      <w:keepLines w:val="1"/>
+      <w:outlineLvl w:val="3"/>
+    </w:pPr>
+    <w:rPr>
+      <w:b w:val="1"/>
+      <w:sz w:val="24"/>
+    </w:rPr>
+  </w:style>
+  <w:style w:type="paragraph" w:styleId="j02txd">
+    <w:name w:val="toc 3"/>
+    <w:basedOn w:val="000001"/>
+    <w:next w:val="000001"/>
+    <w:autoRedefine w:val="1"/>
+    <w:uiPriority w:val="39"/>
+    <w:unhideWhenUsed w:val="1"/>
+    <w:pPr>
+      <w:ind w:left="420"/>
+      <w:jc w:val="left"/>
+    </w:pPr>
+    <w:rPr>
+      <w:rFonts w:eastAsiaTheme="minorHAnsi"/>
+      <w:iCs w:val="1"/>
+      <w:sz w:val="22"/>
+      <w:szCs w:val="22"/>
+    </w:rPr>
+  </w:style>
+  <w:style w:type="character" w:styleId="000016">
+    <w:name w:val="Hyperlink"/>
+    <w:basedOn w:val="00000b"/>
+    <w:rPr>
+      <w:color w:val="1E6FFF"/>
+      <w:u w:val="single"/>
+    </w:rPr>
+  </w:style>
   <w:style w:type="table" w:styleId="000015">
     <w:name w:val="Table Grid"/>
     <w:basedOn w:val="00000c"/>
@@ -4603,36 +4624,15 @@
       <w:vAlign w:val="center"/>
     </w:tcPr>
   </w:style>
-  <w:style w:type="character" w:styleId="000014" w:customStyle="1">
-    <w:name w:val="标题 字符"/>
-    <w:basedOn w:val="00000b"/>
-    <w:link w:val="000013"/>
-    <w:rPr>
-      <w:rFonts w:ascii="Arial" w:hAnsi="Arial" w:eastAsia="微软雅黑" w:cstheme="majorBidi"/>
-      <w:b w:val="1"/>
-      <w:bCs w:val="1"/>
-      <w:kern w:val="2"/>
-      <w:sz w:val="48"/>
-      <w:szCs w:val="32"/>
-    </w:rPr>
-  </w:style>
-  <w:style w:type="paragraph" w:styleId="7flirm">
-    <w:name w:val="toc 2"/>
+  <w:style w:type="paragraph" w:styleId="00000e">
+    <w:name w:val="toc 8"/>
     <w:basedOn w:val="000001"/>
     <w:next w:val="000001"/>
     <w:autoRedefine w:val="1"/>
-    <w:uiPriority w:val="39"/>
-    <w:unhideWhenUsed w:val="1"/>
+    <w:uiPriority w:val="99"/>
     <w:pPr>
-      <w:ind w:left="210"/>
-      <w:jc w:val="left"/>
+      <w:ind w:left="2940" w:leftChars="1400"/>
     </w:pPr>
-    <w:rPr>
-      <w:rFonts w:eastAsiaTheme="minorHAnsi"/>
-      <w:smallCaps w:val="1"/>
-      <w:sz w:val="22"/>
-      <w:szCs w:val="22"/>
-    </w:rPr>
   </w:style>
 </w:styles>
 </file>

</xml_diff>

<commit_message>
Sync latest design docs and replace chibi art with directional frames
</commit_message>
<xml_diff>
--- a/Word/《英雄酒馆》立项规划.docx
+++ b/Word/《英雄酒馆》立项规划.docx
@@ -2652,6 +2652,51 @@
 <file path=word/numbering.xml><?xml version="1.0" encoding="utf-8"?>
 <w:numbering xmlns:w="http://schemas.openxmlformats.org/wordprocessingml/2006/main">
   <w:abstractNum w:abstractNumId="0">
+    <w:lvl w:ilvl="8">
+      <w:start w:val="1"/>
+      <w:numFmt w:val="lowerRoman"/>
+      <w:lvlText w:val="%9."/>
+      <w:lvlJc w:val="left"/>
+      <w:pPr>
+        <w:ind w:left="3856" w:hanging="336"/>
+      </w:pPr>
+    </w:lvl>
+    <w:lvl w:ilvl="5">
+      <w:start w:val="1"/>
+      <w:numFmt w:val="lowerRoman"/>
+      <w:lvlText w:val="%6."/>
+      <w:lvlJc w:val="left"/>
+      <w:pPr>
+        <w:ind w:left="2536" w:hanging="336"/>
+      </w:pPr>
+    </w:lvl>
+    <w:lvl w:ilvl="6">
+      <w:start w:val="1"/>
+      <w:numFmt w:val="decimal"/>
+      <w:lvlText w:val="%7."/>
+      <w:lvlJc w:val="left"/>
+      <w:pPr>
+        <w:ind w:left="2976" w:hanging="336"/>
+      </w:pPr>
+    </w:lvl>
+    <w:lvl w:ilvl="7">
+      <w:start w:val="1"/>
+      <w:numFmt w:val="lowerLetter"/>
+      <w:lvlText w:val="%8."/>
+      <w:lvlJc w:val="left"/>
+      <w:pPr>
+        <w:ind w:left="3416" w:hanging="336"/>
+      </w:pPr>
+    </w:lvl>
+    <w:lvl w:ilvl="4">
+      <w:start w:val="1"/>
+      <w:numFmt w:val="lowerLetter"/>
+      <w:lvlText w:val="%5."/>
+      <w:lvlJc w:val="left"/>
+      <w:pPr>
+        <w:ind w:left="2096" w:hanging="336"/>
+      </w:pPr>
+    </w:lvl>
     <w:lvl w:ilvl="0">
       <w:start w:val="1"/>
       <w:numFmt w:val="decimal"/>
@@ -2662,6 +2707,35 @@
       </w:pPr>
       <w:rPr/>
     </w:lvl>
+    <w:lvl w:ilvl="1">
+      <w:start w:val="1"/>
+      <w:numFmt w:val="lowerLetter"/>
+      <w:lvlText w:val="%2."/>
+      <w:lvlJc w:val="left"/>
+      <w:pPr>
+        <w:ind w:left="776" w:hanging="336"/>
+      </w:pPr>
+    </w:lvl>
+    <w:lvl w:ilvl="2">
+      <w:start w:val="1"/>
+      <w:numFmt w:val="lowerRoman"/>
+      <w:lvlText w:val="%3."/>
+      <w:lvlJc w:val="left"/>
+      <w:pPr>
+        <w:ind w:left="1216" w:hanging="336"/>
+      </w:pPr>
+    </w:lvl>
+    <w:lvl w:ilvl="3">
+      <w:start w:val="1"/>
+      <w:numFmt w:val="decimal"/>
+      <w:lvlText w:val="%4."/>
+      <w:lvlJc w:val="left"/>
+      <w:pPr>
+        <w:ind w:left="1656" w:hanging="336"/>
+      </w:pPr>
+    </w:lvl>
+  </w:abstractNum>
+  <w:abstractNum w:abstractNumId="1">
     <w:lvl w:ilvl="7">
       <w:start w:val="1"/>
       <w:numFmt w:val="lowerLetter"/>
@@ -2671,6 +2745,52 @@
         <w:ind w:left="3416" w:hanging="336"/>
       </w:pPr>
     </w:lvl>
+    <w:lvl w:ilvl="1">
+      <w:start w:val="1"/>
+      <w:numFmt w:val="lowerLetter"/>
+      <w:lvlText w:val="%2."/>
+      <w:lvlJc w:val="left"/>
+      <w:pPr>
+        <w:ind w:left="776" w:hanging="336"/>
+      </w:pPr>
+    </w:lvl>
+    <w:lvl w:ilvl="0">
+      <w:start w:val="1"/>
+      <w:numFmt w:val="decimal"/>
+      <w:lvlText w:val="%1."/>
+      <w:lvlJc w:val="left"/>
+      <w:pPr>
+        <w:ind w:left="336" w:hanging="336"/>
+      </w:pPr>
+      <w:rPr/>
+    </w:lvl>
+    <w:lvl w:ilvl="8">
+      <w:start w:val="1"/>
+      <w:numFmt w:val="lowerRoman"/>
+      <w:lvlText w:val="%9."/>
+      <w:lvlJc w:val="left"/>
+      <w:pPr>
+        <w:ind w:left="3856" w:hanging="336"/>
+      </w:pPr>
+    </w:lvl>
+    <w:lvl w:ilvl="5">
+      <w:start w:val="1"/>
+      <w:numFmt w:val="lowerRoman"/>
+      <w:lvlText w:val="%6."/>
+      <w:lvlJc w:val="left"/>
+      <w:pPr>
+        <w:ind w:left="2536" w:hanging="336"/>
+      </w:pPr>
+    </w:lvl>
+    <w:lvl w:ilvl="2">
+      <w:start w:val="1"/>
+      <w:numFmt w:val="lowerRoman"/>
+      <w:lvlText w:val="%3."/>
+      <w:lvlJc w:val="left"/>
+      <w:pPr>
+        <w:ind w:left="1216" w:hanging="336"/>
+      </w:pPr>
+    </w:lvl>
     <w:lvl w:ilvl="6">
       <w:start w:val="1"/>
       <w:numFmt w:val="decimal"/>
@@ -2680,42 +2800,6 @@
         <w:ind w:left="2976" w:hanging="336"/>
       </w:pPr>
     </w:lvl>
-    <w:lvl w:ilvl="5">
-      <w:start w:val="1"/>
-      <w:numFmt w:val="lowerRoman"/>
-      <w:lvlText w:val="%6."/>
-      <w:lvlJc w:val="left"/>
-      <w:pPr>
-        <w:ind w:left="2536" w:hanging="336"/>
-      </w:pPr>
-    </w:lvl>
-    <w:lvl w:ilvl="8">
-      <w:start w:val="1"/>
-      <w:numFmt w:val="lowerRoman"/>
-      <w:lvlText w:val="%9."/>
-      <w:lvlJc w:val="left"/>
-      <w:pPr>
-        <w:ind w:left="3856" w:hanging="336"/>
-      </w:pPr>
-    </w:lvl>
-    <w:lvl w:ilvl="2">
-      <w:start w:val="1"/>
-      <w:numFmt w:val="lowerRoman"/>
-      <w:lvlText w:val="%3."/>
-      <w:lvlJc w:val="left"/>
-      <w:pPr>
-        <w:ind w:left="1216" w:hanging="336"/>
-      </w:pPr>
-    </w:lvl>
-    <w:lvl w:ilvl="1">
-      <w:start w:val="1"/>
-      <w:numFmt w:val="lowerLetter"/>
-      <w:lvlText w:val="%2."/>
-      <w:lvlJc w:val="left"/>
-      <w:pPr>
-        <w:ind w:left="776" w:hanging="336"/>
-      </w:pPr>
-    </w:lvl>
     <w:lvl w:ilvl="3">
       <w:start w:val="1"/>
       <w:numFmt w:val="decimal"/>
@@ -2732,90 +2816,6 @@
       <w:lvlJc w:val="left"/>
       <w:pPr>
         <w:ind w:left="2096" w:hanging="336"/>
-      </w:pPr>
-    </w:lvl>
-  </w:abstractNum>
-  <w:abstractNum w:abstractNumId="1">
-    <w:lvl w:ilvl="1">
-      <w:start w:val="1"/>
-      <w:numFmt w:val="lowerLetter"/>
-      <w:lvlText w:val="%2."/>
-      <w:lvlJc w:val="left"/>
-      <w:pPr>
-        <w:ind w:left="776" w:hanging="336"/>
-      </w:pPr>
-    </w:lvl>
-    <w:lvl w:ilvl="3">
-      <w:start w:val="1"/>
-      <w:numFmt w:val="decimal"/>
-      <w:lvlText w:val="%4."/>
-      <w:lvlJc w:val="left"/>
-      <w:pPr>
-        <w:ind w:left="1656" w:hanging="336"/>
-      </w:pPr>
-    </w:lvl>
-    <w:lvl w:ilvl="7">
-      <w:start w:val="1"/>
-      <w:numFmt w:val="lowerLetter"/>
-      <w:lvlText w:val="%8."/>
-      <w:lvlJc w:val="left"/>
-      <w:pPr>
-        <w:ind w:left="3416" w:hanging="336"/>
-      </w:pPr>
-    </w:lvl>
-    <w:lvl w:ilvl="4">
-      <w:start w:val="1"/>
-      <w:numFmt w:val="lowerLetter"/>
-      <w:lvlText w:val="%5."/>
-      <w:lvlJc w:val="left"/>
-      <w:pPr>
-        <w:ind w:left="2096" w:hanging="336"/>
-      </w:pPr>
-    </w:lvl>
-    <w:lvl w:ilvl="5">
-      <w:start w:val="1"/>
-      <w:numFmt w:val="lowerRoman"/>
-      <w:lvlText w:val="%6."/>
-      <w:lvlJc w:val="left"/>
-      <w:pPr>
-        <w:ind w:left="2536" w:hanging="336"/>
-      </w:pPr>
-    </w:lvl>
-    <w:lvl w:ilvl="6">
-      <w:start w:val="1"/>
-      <w:numFmt w:val="decimal"/>
-      <w:lvlText w:val="%7."/>
-      <w:lvlJc w:val="left"/>
-      <w:pPr>
-        <w:ind w:left="2976" w:hanging="336"/>
-      </w:pPr>
-    </w:lvl>
-    <w:lvl w:ilvl="8">
-      <w:start w:val="1"/>
-      <w:numFmt w:val="lowerRoman"/>
-      <w:lvlText w:val="%9."/>
-      <w:lvlJc w:val="left"/>
-      <w:pPr>
-        <w:ind w:left="3856" w:hanging="336"/>
-      </w:pPr>
-    </w:lvl>
-    <w:lvl w:ilvl="0">
-      <w:start w:val="1"/>
-      <w:numFmt w:val="decimal"/>
-      <w:lvlText w:val="%1."/>
-      <w:lvlJc w:val="left"/>
-      <w:pPr>
-        <w:ind w:left="336" w:hanging="336"/>
-      </w:pPr>
-      <w:rPr/>
-    </w:lvl>
-    <w:lvl w:ilvl="2">
-      <w:start w:val="1"/>
-      <w:numFmt w:val="lowerRoman"/>
-      <w:lvlText w:val="%3."/>
-      <w:lvlJc w:val="left"/>
-      <w:pPr>
-        <w:ind w:left="1216" w:hanging="336"/>
       </w:pPr>
     </w:lvl>
   </w:abstractNum>
@@ -2829,6 +2829,61 @@
         <w:ind w:left="3416" w:hanging="336"/>
       </w:pPr>
     </w:lvl>
+    <w:lvl w:ilvl="0">
+      <w:start w:val="1"/>
+      <w:numFmt w:val="decimal"/>
+      <w:lvlText w:val="%1."/>
+      <w:lvlJc w:val="left"/>
+      <w:pPr>
+        <w:ind w:left="336" w:hanging="336"/>
+      </w:pPr>
+      <w:rPr/>
+    </w:lvl>
+    <w:lvl w:ilvl="3">
+      <w:start w:val="1"/>
+      <w:numFmt w:val="decimal"/>
+      <w:lvlText w:val="%4."/>
+      <w:lvlJc w:val="left"/>
+      <w:pPr>
+        <w:ind w:left="1656" w:hanging="336"/>
+      </w:pPr>
+    </w:lvl>
+    <w:lvl w:ilvl="6">
+      <w:start w:val="1"/>
+      <w:numFmt w:val="decimal"/>
+      <w:lvlText w:val="%7."/>
+      <w:lvlJc w:val="left"/>
+      <w:pPr>
+        <w:ind w:left="2976" w:hanging="336"/>
+      </w:pPr>
+    </w:lvl>
+    <w:lvl w:ilvl="1">
+      <w:start w:val="1"/>
+      <w:numFmt w:val="lowerLetter"/>
+      <w:lvlText w:val="%2."/>
+      <w:lvlJc w:val="left"/>
+      <w:pPr>
+        <w:ind w:left="776" w:hanging="336"/>
+      </w:pPr>
+    </w:lvl>
+    <w:lvl w:ilvl="2">
+      <w:start w:val="1"/>
+      <w:numFmt w:val="lowerRoman"/>
+      <w:lvlText w:val="%3."/>
+      <w:lvlJc w:val="left"/>
+      <w:pPr>
+        <w:ind w:left="1216" w:hanging="336"/>
+      </w:pPr>
+    </w:lvl>
+    <w:lvl w:ilvl="5">
+      <w:start w:val="1"/>
+      <w:numFmt w:val="lowerRoman"/>
+      <w:lvlText w:val="%6."/>
+      <w:lvlJc w:val="left"/>
+      <w:pPr>
+        <w:ind w:left="2536" w:hanging="336"/>
+      </w:pPr>
+    </w:lvl>
     <w:lvl w:ilvl="4">
       <w:start w:val="1"/>
       <w:numFmt w:val="lowerLetter"/>
@@ -2838,6 +2893,35 @@
         <w:ind w:left="2096" w:hanging="336"/>
       </w:pPr>
     </w:lvl>
+    <w:lvl w:ilvl="8">
+      <w:start w:val="1"/>
+      <w:numFmt w:val="lowerRoman"/>
+      <w:lvlText w:val="%9."/>
+      <w:lvlJc w:val="left"/>
+      <w:pPr>
+        <w:ind w:left="3856" w:hanging="336"/>
+      </w:pPr>
+    </w:lvl>
+  </w:abstractNum>
+  <w:abstractNum w:abstractNumId="3">
+    <w:lvl w:ilvl="8">
+      <w:start w:val="1"/>
+      <w:numFmt w:val="lowerRoman"/>
+      <w:lvlText w:val="%9."/>
+      <w:lvlJc w:val="left"/>
+      <w:pPr>
+        <w:ind w:left="3856" w:hanging="336"/>
+      </w:pPr>
+    </w:lvl>
+    <w:lvl w:ilvl="1">
+      <w:start w:val="1"/>
+      <w:numFmt w:val="lowerLetter"/>
+      <w:lvlText w:val="%2."/>
+      <w:lvlJc w:val="left"/>
+      <w:pPr>
+        <w:ind w:left="776" w:hanging="336"/>
+      </w:pPr>
+    </w:lvl>
     <w:lvl w:ilvl="2">
       <w:start w:val="1"/>
       <w:numFmt w:val="lowerRoman"/>
@@ -2847,6 +2931,15 @@
         <w:ind w:left="1216" w:hanging="336"/>
       </w:pPr>
     </w:lvl>
+    <w:lvl w:ilvl="3">
+      <w:start w:val="1"/>
+      <w:numFmt w:val="decimal"/>
+      <w:lvlText w:val="%4."/>
+      <w:lvlJc w:val="left"/>
+      <w:pPr>
+        <w:ind w:left="1656" w:hanging="336"/>
+      </w:pPr>
+    </w:lvl>
     <w:lvl w:ilvl="5">
       <w:start w:val="1"/>
       <w:numFmt w:val="lowerRoman"/>
@@ -2856,6 +2949,109 @@
         <w:ind w:left="2536" w:hanging="336"/>
       </w:pPr>
     </w:lvl>
+    <w:lvl w:ilvl="6">
+      <w:start w:val="1"/>
+      <w:numFmt w:val="decimal"/>
+      <w:lvlText w:val="%7."/>
+      <w:lvlJc w:val="left"/>
+      <w:pPr>
+        <w:ind w:left="2976" w:hanging="336"/>
+      </w:pPr>
+    </w:lvl>
+    <w:lvl w:ilvl="4">
+      <w:start w:val="1"/>
+      <w:numFmt w:val="lowerLetter"/>
+      <w:lvlText w:val="%5."/>
+      <w:lvlJc w:val="left"/>
+      <w:pPr>
+        <w:ind w:left="2096" w:hanging="336"/>
+      </w:pPr>
+    </w:lvl>
+    <w:lvl w:ilvl="7">
+      <w:start w:val="1"/>
+      <w:numFmt w:val="lowerLetter"/>
+      <w:lvlText w:val="%8."/>
+      <w:lvlJc w:val="left"/>
+      <w:pPr>
+        <w:ind w:left="3416" w:hanging="336"/>
+      </w:pPr>
+    </w:lvl>
+    <w:lvl w:ilvl="0">
+      <w:start w:val="1"/>
+      <w:numFmt w:val="decimal"/>
+      <w:lvlText w:val="%1."/>
+      <w:lvlJc w:val="left"/>
+      <w:pPr>
+        <w:ind w:left="336" w:hanging="336"/>
+      </w:pPr>
+      <w:rPr/>
+    </w:lvl>
+  </w:abstractNum>
+  <w:abstractNum w:abstractNumId="4">
+    <w:lvl w:ilvl="4">
+      <w:start w:val="1"/>
+      <w:numFmt w:val="lowerLetter"/>
+      <w:lvlText w:val="%5."/>
+      <w:lvlJc w:val="left"/>
+      <w:pPr>
+        <w:ind w:left="2096" w:hanging="336"/>
+      </w:pPr>
+    </w:lvl>
+    <w:lvl w:ilvl="5">
+      <w:start w:val="1"/>
+      <w:numFmt w:val="lowerRoman"/>
+      <w:lvlText w:val="%6."/>
+      <w:lvlJc w:val="left"/>
+      <w:pPr>
+        <w:ind w:left="2536" w:hanging="336"/>
+      </w:pPr>
+    </w:lvl>
+    <w:lvl w:ilvl="8">
+      <w:start w:val="1"/>
+      <w:numFmt w:val="lowerRoman"/>
+      <w:lvlText w:val="%9."/>
+      <w:lvlJc w:val="left"/>
+      <w:pPr>
+        <w:ind w:left="3856" w:hanging="336"/>
+      </w:pPr>
+    </w:lvl>
+    <w:lvl w:ilvl="7">
+      <w:start w:val="1"/>
+      <w:numFmt w:val="lowerLetter"/>
+      <w:lvlText w:val="%8."/>
+      <w:lvlJc w:val="left"/>
+      <w:pPr>
+        <w:ind w:left="3416" w:hanging="336"/>
+      </w:pPr>
+    </w:lvl>
+    <w:lvl w:ilvl="2">
+      <w:start w:val="1"/>
+      <w:numFmt w:val="lowerRoman"/>
+      <w:lvlText w:val="%3."/>
+      <w:lvlJc w:val="left"/>
+      <w:pPr>
+        <w:ind w:left="1216" w:hanging="336"/>
+      </w:pPr>
+    </w:lvl>
+    <w:lvl w:ilvl="0">
+      <w:start w:val="1"/>
+      <w:numFmt w:val="decimal"/>
+      <w:lvlText w:val="%1."/>
+      <w:lvlJc w:val="left"/>
+      <w:pPr>
+        <w:ind w:left="336" w:hanging="336"/>
+      </w:pPr>
+      <w:rPr/>
+    </w:lvl>
+    <w:lvl w:ilvl="1">
+      <w:start w:val="1"/>
+      <w:numFmt w:val="lowerLetter"/>
+      <w:lvlText w:val="%2."/>
+      <w:lvlJc w:val="left"/>
+      <w:pPr>
+        <w:ind w:left="776" w:hanging="336"/>
+      </w:pPr>
+    </w:lvl>
     <w:lvl w:ilvl="3">
       <w:start w:val="1"/>
       <w:numFmt w:val="decimal"/>
@@ -2865,24 +3061,6 @@
         <w:ind w:left="1656" w:hanging="336"/>
       </w:pPr>
     </w:lvl>
-    <w:lvl w:ilvl="8">
-      <w:start w:val="1"/>
-      <w:numFmt w:val="lowerRoman"/>
-      <w:lvlText w:val="%9."/>
-      <w:lvlJc w:val="left"/>
-      <w:pPr>
-        <w:ind w:left="3856" w:hanging="336"/>
-      </w:pPr>
-    </w:lvl>
-    <w:lvl w:ilvl="1">
-      <w:start w:val="1"/>
-      <w:numFmt w:val="lowerLetter"/>
-      <w:lvlText w:val="%2."/>
-      <w:lvlJc w:val="left"/>
-      <w:pPr>
-        <w:ind w:left="776" w:hanging="336"/>
-      </w:pPr>
-    </w:lvl>
     <w:lvl w:ilvl="6">
       <w:start w:val="1"/>
       <w:numFmt w:val="decimal"/>
@@ -2890,184 +3068,6 @@
       <w:lvlJc w:val="left"/>
       <w:pPr>
         <w:ind w:left="2976" w:hanging="336"/>
-      </w:pPr>
-    </w:lvl>
-    <w:lvl w:ilvl="0">
-      <w:start w:val="1"/>
-      <w:numFmt w:val="decimal"/>
-      <w:lvlText w:val="%1."/>
-      <w:lvlJc w:val="left"/>
-      <w:pPr>
-        <w:ind w:left="336" w:hanging="336"/>
-      </w:pPr>
-      <w:rPr/>
-    </w:lvl>
-  </w:abstractNum>
-  <w:abstractNum w:abstractNumId="3">
-    <w:lvl w:ilvl="6">
-      <w:start w:val="1"/>
-      <w:numFmt w:val="decimal"/>
-      <w:lvlText w:val="%7."/>
-      <w:lvlJc w:val="left"/>
-      <w:pPr>
-        <w:ind w:left="2976" w:hanging="336"/>
-      </w:pPr>
-    </w:lvl>
-    <w:lvl w:ilvl="0">
-      <w:start w:val="1"/>
-      <w:numFmt w:val="decimal"/>
-      <w:lvlText w:val="%1."/>
-      <w:lvlJc w:val="left"/>
-      <w:pPr>
-        <w:ind w:left="336" w:hanging="336"/>
-      </w:pPr>
-      <w:rPr/>
-    </w:lvl>
-    <w:lvl w:ilvl="7">
-      <w:start w:val="1"/>
-      <w:numFmt w:val="lowerLetter"/>
-      <w:lvlText w:val="%8."/>
-      <w:lvlJc w:val="left"/>
-      <w:pPr>
-        <w:ind w:left="3416" w:hanging="336"/>
-      </w:pPr>
-    </w:lvl>
-    <w:lvl w:ilvl="1">
-      <w:start w:val="1"/>
-      <w:numFmt w:val="lowerLetter"/>
-      <w:lvlText w:val="%2."/>
-      <w:lvlJc w:val="left"/>
-      <w:pPr>
-        <w:ind w:left="776" w:hanging="336"/>
-      </w:pPr>
-    </w:lvl>
-    <w:lvl w:ilvl="8">
-      <w:start w:val="1"/>
-      <w:numFmt w:val="lowerRoman"/>
-      <w:lvlText w:val="%9."/>
-      <w:lvlJc w:val="left"/>
-      <w:pPr>
-        <w:ind w:left="3856" w:hanging="336"/>
-      </w:pPr>
-    </w:lvl>
-    <w:lvl w:ilvl="5">
-      <w:start w:val="1"/>
-      <w:numFmt w:val="lowerRoman"/>
-      <w:lvlText w:val="%6."/>
-      <w:lvlJc w:val="left"/>
-      <w:pPr>
-        <w:ind w:left="2536" w:hanging="336"/>
-      </w:pPr>
-    </w:lvl>
-    <w:lvl w:ilvl="4">
-      <w:start w:val="1"/>
-      <w:numFmt w:val="lowerLetter"/>
-      <w:lvlText w:val="%5."/>
-      <w:lvlJc w:val="left"/>
-      <w:pPr>
-        <w:ind w:left="2096" w:hanging="336"/>
-      </w:pPr>
-    </w:lvl>
-    <w:lvl w:ilvl="3">
-      <w:start w:val="1"/>
-      <w:numFmt w:val="decimal"/>
-      <w:lvlText w:val="%4."/>
-      <w:lvlJc w:val="left"/>
-      <w:pPr>
-        <w:ind w:left="1656" w:hanging="336"/>
-      </w:pPr>
-    </w:lvl>
-    <w:lvl w:ilvl="2">
-      <w:start w:val="1"/>
-      <w:numFmt w:val="lowerRoman"/>
-      <w:lvlText w:val="%3."/>
-      <w:lvlJc w:val="left"/>
-      <w:pPr>
-        <w:ind w:left="1216" w:hanging="336"/>
-      </w:pPr>
-    </w:lvl>
-  </w:abstractNum>
-  <w:abstractNum w:abstractNumId="4">
-    <w:lvl w:ilvl="3">
-      <w:start w:val="1"/>
-      <w:numFmt w:val="decimal"/>
-      <w:lvlText w:val="%4."/>
-      <w:lvlJc w:val="left"/>
-      <w:pPr>
-        <w:ind w:left="1656" w:hanging="336"/>
-      </w:pPr>
-    </w:lvl>
-    <w:lvl w:ilvl="5">
-      <w:start w:val="1"/>
-      <w:numFmt w:val="lowerRoman"/>
-      <w:lvlText w:val="%6."/>
-      <w:lvlJc w:val="left"/>
-      <w:pPr>
-        <w:ind w:left="2536" w:hanging="336"/>
-      </w:pPr>
-    </w:lvl>
-    <w:lvl w:ilvl="4">
-      <w:start w:val="1"/>
-      <w:numFmt w:val="lowerLetter"/>
-      <w:lvlText w:val="%5."/>
-      <w:lvlJc w:val="left"/>
-      <w:pPr>
-        <w:ind w:left="2096" w:hanging="336"/>
-      </w:pPr>
-    </w:lvl>
-    <w:lvl w:ilvl="7">
-      <w:start w:val="1"/>
-      <w:numFmt w:val="lowerLetter"/>
-      <w:lvlText w:val="%8."/>
-      <w:lvlJc w:val="left"/>
-      <w:pPr>
-        <w:ind w:left="3416" w:hanging="336"/>
-      </w:pPr>
-    </w:lvl>
-    <w:lvl w:ilvl="6">
-      <w:start w:val="1"/>
-      <w:numFmt w:val="decimal"/>
-      <w:lvlText w:val="%7."/>
-      <w:lvlJc w:val="left"/>
-      <w:pPr>
-        <w:ind w:left="2976" w:hanging="336"/>
-      </w:pPr>
-    </w:lvl>
-    <w:lvl w:ilvl="1">
-      <w:start w:val="1"/>
-      <w:numFmt w:val="lowerLetter"/>
-      <w:lvlText w:val="%2."/>
-      <w:lvlJc w:val="left"/>
-      <w:pPr>
-        <w:ind w:left="776" w:hanging="336"/>
-      </w:pPr>
-    </w:lvl>
-    <w:lvl w:ilvl="0">
-      <w:start w:val="1"/>
-      <w:numFmt w:val="decimal"/>
-      <w:lvlText w:val="%1."/>
-      <w:lvlJc w:val="left"/>
-      <w:pPr>
-        <w:ind w:left="336" w:hanging="336"/>
-      </w:pPr>
-      <w:rPr/>
-    </w:lvl>
-    <w:lvl w:ilvl="2">
-      <w:start w:val="1"/>
-      <w:numFmt w:val="lowerRoman"/>
-      <w:lvlText w:val="%3."/>
-      <w:lvlJc w:val="left"/>
-      <w:pPr>
-        <w:ind w:left="1216" w:hanging="336"/>
-      </w:pPr>
-    </w:lvl>
-    <w:lvl w:ilvl="8">
-      <w:start w:val="1"/>
-      <w:numFmt w:val="lowerRoman"/>
-      <w:lvlText w:val="%9."/>
-      <w:lvlJc w:val="left"/>
-      <w:pPr>
-        <w:ind w:left="3856" w:hanging="336"/>
       </w:pPr>
     </w:lvl>
   </w:abstractNum>
@@ -3090,6 +3090,42 @@
         <w:ind w:left="1216" w:hanging="336"/>
       </w:pPr>
     </w:lvl>
+    <w:lvl w:ilvl="5">
+      <w:start w:val="1"/>
+      <w:numFmt w:val="lowerRoman"/>
+      <w:lvlText w:val="%6."/>
+      <w:lvlJc w:val="left"/>
+      <w:pPr>
+        <w:ind w:left="2536" w:hanging="336"/>
+      </w:pPr>
+    </w:lvl>
+    <w:lvl w:ilvl="1">
+      <w:start w:val="1"/>
+      <w:numFmt w:val="lowerLetter"/>
+      <w:lvlText w:val="%2."/>
+      <w:lvlJc w:val="left"/>
+      <w:pPr>
+        <w:ind w:left="776" w:hanging="336"/>
+      </w:pPr>
+    </w:lvl>
+    <w:lvl w:ilvl="6">
+      <w:start w:val="1"/>
+      <w:numFmt w:val="decimal"/>
+      <w:lvlText w:val="%7."/>
+      <w:lvlJc w:val="left"/>
+      <w:pPr>
+        <w:ind w:left="2976" w:hanging="336"/>
+      </w:pPr>
+    </w:lvl>
+    <w:lvl w:ilvl="7">
+      <w:start w:val="1"/>
+      <w:numFmt w:val="lowerLetter"/>
+      <w:lvlText w:val="%8."/>
+      <w:lvlJc w:val="left"/>
+      <w:pPr>
+        <w:ind w:left="3416" w:hanging="336"/>
+      </w:pPr>
+    </w:lvl>
     <w:lvl w:ilvl="0">
       <w:start w:val="1"/>
       <w:numFmt w:val="decimal"/>
@@ -3100,6 +3136,15 @@
       </w:pPr>
       <w:rPr/>
     </w:lvl>
+    <w:lvl w:ilvl="4">
+      <w:start w:val="1"/>
+      <w:numFmt w:val="lowerLetter"/>
+      <w:lvlText w:val="%5."/>
+      <w:lvlJc w:val="left"/>
+      <w:pPr>
+        <w:ind w:left="2096" w:hanging="336"/>
+      </w:pPr>
+    </w:lvl>
     <w:lvl w:ilvl="8">
       <w:start w:val="1"/>
       <w:numFmt w:val="lowerRoman"/>
@@ -3109,6 +3154,63 @@
         <w:ind w:left="3856" w:hanging="336"/>
       </w:pPr>
     </w:lvl>
+  </w:abstractNum>
+  <w:abstractNum w:abstractNumId="6">
+    <w:lvl w:ilvl="8">
+      <w:start w:val="1"/>
+      <w:numFmt w:val="lowerRoman"/>
+      <w:lvlText w:val="%9."/>
+      <w:lvlJc w:val="left"/>
+      <w:pPr>
+        <w:ind w:left="3856" w:hanging="336"/>
+      </w:pPr>
+    </w:lvl>
+    <w:lvl w:ilvl="7">
+      <w:start w:val="1"/>
+      <w:numFmt w:val="lowerLetter"/>
+      <w:lvlText w:val="%8."/>
+      <w:lvlJc w:val="left"/>
+      <w:pPr>
+        <w:ind w:left="3416" w:hanging="336"/>
+      </w:pPr>
+    </w:lvl>
+    <w:lvl w:ilvl="0">
+      <w:start w:val="1"/>
+      <w:numFmt w:val="decimal"/>
+      <w:lvlText w:val="%1."/>
+      <w:lvlJc w:val="left"/>
+      <w:pPr>
+        <w:ind w:left="336" w:hanging="336"/>
+      </w:pPr>
+      <w:rPr/>
+    </w:lvl>
+    <w:lvl w:ilvl="6">
+      <w:start w:val="1"/>
+      <w:numFmt w:val="decimal"/>
+      <w:lvlText w:val="%7."/>
+      <w:lvlJc w:val="left"/>
+      <w:pPr>
+        <w:ind w:left="2976" w:hanging="336"/>
+      </w:pPr>
+    </w:lvl>
+    <w:lvl w:ilvl="4">
+      <w:start w:val="1"/>
+      <w:numFmt w:val="lowerLetter"/>
+      <w:lvlText w:val="%5."/>
+      <w:lvlJc w:val="left"/>
+      <w:pPr>
+        <w:ind w:left="2096" w:hanging="336"/>
+      </w:pPr>
+    </w:lvl>
+    <w:lvl w:ilvl="3">
+      <w:start w:val="1"/>
+      <w:numFmt w:val="decimal"/>
+      <w:lvlText w:val="%4."/>
+      <w:lvlJc w:val="left"/>
+      <w:pPr>
+        <w:ind w:left="1656" w:hanging="336"/>
+      </w:pPr>
+    </w:lvl>
     <w:lvl w:ilvl="1">
       <w:start w:val="1"/>
       <w:numFmt w:val="lowerLetter"/>
@@ -3118,6 +3220,99 @@
         <w:ind w:left="776" w:hanging="336"/>
       </w:pPr>
     </w:lvl>
+    <w:lvl w:ilvl="2">
+      <w:start w:val="1"/>
+      <w:numFmt w:val="lowerRoman"/>
+      <w:lvlText w:val="%3."/>
+      <w:lvlJc w:val="left"/>
+      <w:pPr>
+        <w:ind w:left="1216" w:hanging="336"/>
+      </w:pPr>
+    </w:lvl>
+    <w:lvl w:ilvl="5">
+      <w:start w:val="1"/>
+      <w:numFmt w:val="lowerRoman"/>
+      <w:lvlText w:val="%6."/>
+      <w:lvlJc w:val="left"/>
+      <w:pPr>
+        <w:ind w:left="2536" w:hanging="336"/>
+      </w:pPr>
+    </w:lvl>
+  </w:abstractNum>
+  <w:abstractNum w:abstractNumId="7">
+    <w:lvl w:ilvl="2">
+      <w:start w:val="1"/>
+      <w:numFmt w:val="lowerRoman"/>
+      <w:lvlText w:val="%3."/>
+      <w:lvlJc w:val="left"/>
+      <w:pPr>
+        <w:ind w:left="1216" w:hanging="336"/>
+      </w:pPr>
+    </w:lvl>
+    <w:lvl w:ilvl="4">
+      <w:start w:val="1"/>
+      <w:numFmt w:val="lowerLetter"/>
+      <w:lvlText w:val="%5."/>
+      <w:lvlJc w:val="left"/>
+      <w:pPr>
+        <w:ind w:left="2096" w:hanging="336"/>
+      </w:pPr>
+    </w:lvl>
+    <w:lvl w:ilvl="3">
+      <w:start w:val="1"/>
+      <w:numFmt w:val="decimal"/>
+      <w:lvlText w:val="%4."/>
+      <w:lvlJc w:val="left"/>
+      <w:pPr>
+        <w:ind w:left="1656" w:hanging="336"/>
+      </w:pPr>
+    </w:lvl>
+    <w:lvl w:ilvl="1">
+      <w:start w:val="1"/>
+      <w:numFmt w:val="lowerLetter"/>
+      <w:lvlText w:val="%2."/>
+      <w:lvlJc w:val="left"/>
+      <w:pPr>
+        <w:ind w:left="776" w:hanging="336"/>
+      </w:pPr>
+    </w:lvl>
+    <w:lvl w:ilvl="0">
+      <w:start w:val="1"/>
+      <w:numFmt w:val="decimal"/>
+      <w:lvlText w:val="%1."/>
+      <w:lvlJc w:val="left"/>
+      <w:pPr>
+        <w:ind w:left="336" w:hanging="336"/>
+      </w:pPr>
+      <w:rPr/>
+    </w:lvl>
+    <w:lvl w:ilvl="5">
+      <w:start w:val="1"/>
+      <w:numFmt w:val="lowerRoman"/>
+      <w:lvlText w:val="%6."/>
+      <w:lvlJc w:val="left"/>
+      <w:pPr>
+        <w:ind w:left="2536" w:hanging="336"/>
+      </w:pPr>
+    </w:lvl>
+    <w:lvl w:ilvl="6">
+      <w:start w:val="1"/>
+      <w:numFmt w:val="decimal"/>
+      <w:lvlText w:val="%7."/>
+      <w:lvlJc w:val="left"/>
+      <w:pPr>
+        <w:ind w:left="2976" w:hanging="336"/>
+      </w:pPr>
+    </w:lvl>
+    <w:lvl w:ilvl="8">
+      <w:start w:val="1"/>
+      <w:numFmt w:val="lowerRoman"/>
+      <w:lvlText w:val="%9."/>
+      <w:lvlJc w:val="left"/>
+      <w:pPr>
+        <w:ind w:left="3856" w:hanging="336"/>
+      </w:pPr>
+    </w:lvl>
     <w:lvl w:ilvl="7">
       <w:start w:val="1"/>
       <w:numFmt w:val="lowerLetter"/>
@@ -3127,6 +3322,26 @@
         <w:ind w:left="3416" w:hanging="336"/>
       </w:pPr>
     </w:lvl>
+  </w:abstractNum>
+  <w:abstractNum w:abstractNumId="8">
+    <w:lvl w:ilvl="8">
+      <w:start w:val="1"/>
+      <w:numFmt w:val="lowerRoman"/>
+      <w:lvlText w:val="%9."/>
+      <w:lvlJc w:val="left"/>
+      <w:pPr>
+        <w:ind w:left="3856" w:hanging="336"/>
+      </w:pPr>
+    </w:lvl>
+    <w:lvl w:ilvl="6">
+      <w:start w:val="1"/>
+      <w:numFmt w:val="decimal"/>
+      <w:lvlText w:val="%7."/>
+      <w:lvlJc w:val="left"/>
+      <w:pPr>
+        <w:ind w:left="2976" w:hanging="336"/>
+      </w:pPr>
+    </w:lvl>
     <w:lvl w:ilvl="5">
       <w:start w:val="1"/>
       <w:numFmt w:val="lowerRoman"/>
@@ -3136,6 +3351,126 @@
         <w:ind w:left="2536" w:hanging="336"/>
       </w:pPr>
     </w:lvl>
+    <w:lvl w:ilvl="4">
+      <w:start w:val="1"/>
+      <w:numFmt w:val="lowerLetter"/>
+      <w:lvlText w:val="%5."/>
+      <w:lvlJc w:val="left"/>
+      <w:pPr>
+        <w:ind w:left="2096" w:hanging="336"/>
+      </w:pPr>
+    </w:lvl>
+    <w:lvl w:ilvl="3">
+      <w:start w:val="1"/>
+      <w:numFmt w:val="decimal"/>
+      <w:lvlText w:val="%4."/>
+      <w:lvlJc w:val="left"/>
+      <w:pPr>
+        <w:ind w:left="1656" w:hanging="336"/>
+      </w:pPr>
+    </w:lvl>
+    <w:lvl w:ilvl="1">
+      <w:start w:val="1"/>
+      <w:numFmt w:val="lowerLetter"/>
+      <w:lvlText w:val="%2."/>
+      <w:lvlJc w:val="left"/>
+      <w:pPr>
+        <w:ind w:left="776" w:hanging="336"/>
+      </w:pPr>
+    </w:lvl>
+    <w:lvl w:ilvl="2">
+      <w:start w:val="1"/>
+      <w:numFmt w:val="lowerRoman"/>
+      <w:lvlText w:val="%3."/>
+      <w:lvlJc w:val="left"/>
+      <w:pPr>
+        <w:ind w:left="1216" w:hanging="336"/>
+      </w:pPr>
+    </w:lvl>
+    <w:lvl w:ilvl="0">
+      <w:start w:val="1"/>
+      <w:numFmt w:val="decimal"/>
+      <w:lvlText w:val="%1."/>
+      <w:lvlJc w:val="left"/>
+      <w:pPr>
+        <w:ind w:left="336" w:hanging="336"/>
+      </w:pPr>
+      <w:rPr/>
+    </w:lvl>
+    <w:lvl w:ilvl="7">
+      <w:start w:val="1"/>
+      <w:numFmt w:val="lowerLetter"/>
+      <w:lvlText w:val="%8."/>
+      <w:lvlJc w:val="left"/>
+      <w:pPr>
+        <w:ind w:left="3416" w:hanging="336"/>
+      </w:pPr>
+    </w:lvl>
+  </w:abstractNum>
+  <w:abstractNum w:abstractNumId="9">
+    <w:lvl w:ilvl="8">
+      <w:start w:val="1"/>
+      <w:numFmt w:val="lowerRoman"/>
+      <w:lvlText w:val="%9."/>
+      <w:lvlJc w:val="left"/>
+      <w:pPr>
+        <w:ind w:left="3856" w:hanging="336"/>
+      </w:pPr>
+    </w:lvl>
+    <w:lvl w:ilvl="3">
+      <w:start w:val="1"/>
+      <w:numFmt w:val="decimal"/>
+      <w:lvlText w:val="%4."/>
+      <w:lvlJc w:val="left"/>
+      <w:pPr>
+        <w:ind w:left="1656" w:hanging="336"/>
+      </w:pPr>
+    </w:lvl>
+    <w:lvl w:ilvl="7">
+      <w:start w:val="1"/>
+      <w:numFmt w:val="lowerLetter"/>
+      <w:lvlText w:val="%8."/>
+      <w:lvlJc w:val="left"/>
+      <w:pPr>
+        <w:ind w:left="3416" w:hanging="336"/>
+      </w:pPr>
+    </w:lvl>
+    <w:lvl w:ilvl="2">
+      <w:start w:val="1"/>
+      <w:numFmt w:val="lowerRoman"/>
+      <w:lvlText w:val="%3."/>
+      <w:lvlJc w:val="left"/>
+      <w:pPr>
+        <w:ind w:left="1216" w:hanging="336"/>
+      </w:pPr>
+    </w:lvl>
+    <w:lvl w:ilvl="5">
+      <w:start w:val="1"/>
+      <w:numFmt w:val="lowerRoman"/>
+      <w:lvlText w:val="%6."/>
+      <w:lvlJc w:val="left"/>
+      <w:pPr>
+        <w:ind w:left="2536" w:hanging="336"/>
+      </w:pPr>
+    </w:lvl>
+    <w:lvl w:ilvl="4">
+      <w:start w:val="1"/>
+      <w:numFmt w:val="lowerLetter"/>
+      <w:lvlText w:val="%5."/>
+      <w:lvlJc w:val="left"/>
+      <w:pPr>
+        <w:ind w:left="2096" w:hanging="336"/>
+      </w:pPr>
+    </w:lvl>
+    <w:lvl w:ilvl="1">
+      <w:start w:val="1"/>
+      <w:numFmt w:val="lowerLetter"/>
+      <w:lvlText w:val="%2."/>
+      <w:lvlJc w:val="left"/>
+      <w:pPr>
+        <w:ind w:left="776" w:hanging="336"/>
+      </w:pPr>
+    </w:lvl>
     <w:lvl w:ilvl="6">
       <w:start w:val="1"/>
       <w:numFmt w:val="decimal"/>
@@ -3145,35 +3480,6 @@
         <w:ind w:left="2976" w:hanging="336"/>
       </w:pPr>
     </w:lvl>
-    <w:lvl w:ilvl="4">
-      <w:start w:val="1"/>
-      <w:numFmt w:val="lowerLetter"/>
-      <w:lvlText w:val="%5."/>
-      <w:lvlJc w:val="left"/>
-      <w:pPr>
-        <w:ind w:left="2096" w:hanging="336"/>
-      </w:pPr>
-    </w:lvl>
-  </w:abstractNum>
-  <w:abstractNum w:abstractNumId="6">
-    <w:lvl w:ilvl="5">
-      <w:start w:val="1"/>
-      <w:numFmt w:val="lowerRoman"/>
-      <w:lvlText w:val="%6."/>
-      <w:lvlJc w:val="left"/>
-      <w:pPr>
-        <w:ind w:left="2536" w:hanging="336"/>
-      </w:pPr>
-    </w:lvl>
-    <w:lvl w:ilvl="3">
-      <w:start w:val="1"/>
-      <w:numFmt w:val="decimal"/>
-      <w:lvlText w:val="%4."/>
-      <w:lvlJc w:val="left"/>
-      <w:pPr>
-        <w:ind w:left="1656" w:hanging="336"/>
-      </w:pPr>
-    </w:lvl>
     <w:lvl w:ilvl="0">
       <w:start w:val="1"/>
       <w:numFmt w:val="decimal"/>
@@ -3183,312 +3489,6 @@
         <w:ind w:left="336" w:hanging="336"/>
       </w:pPr>
       <w:rPr/>
-    </w:lvl>
-    <w:lvl w:ilvl="7">
-      <w:start w:val="1"/>
-      <w:numFmt w:val="lowerLetter"/>
-      <w:lvlText w:val="%8."/>
-      <w:lvlJc w:val="left"/>
-      <w:pPr>
-        <w:ind w:left="3416" w:hanging="336"/>
-      </w:pPr>
-    </w:lvl>
-    <w:lvl w:ilvl="6">
-      <w:start w:val="1"/>
-      <w:numFmt w:val="decimal"/>
-      <w:lvlText w:val="%7."/>
-      <w:lvlJc w:val="left"/>
-      <w:pPr>
-        <w:ind w:left="2976" w:hanging="336"/>
-      </w:pPr>
-    </w:lvl>
-    <w:lvl w:ilvl="1">
-      <w:start w:val="1"/>
-      <w:numFmt w:val="lowerLetter"/>
-      <w:lvlText w:val="%2."/>
-      <w:lvlJc w:val="left"/>
-      <w:pPr>
-        <w:ind w:left="776" w:hanging="336"/>
-      </w:pPr>
-    </w:lvl>
-    <w:lvl w:ilvl="4">
-      <w:start w:val="1"/>
-      <w:numFmt w:val="lowerLetter"/>
-      <w:lvlText w:val="%5."/>
-      <w:lvlJc w:val="left"/>
-      <w:pPr>
-        <w:ind w:left="2096" w:hanging="336"/>
-      </w:pPr>
-    </w:lvl>
-    <w:lvl w:ilvl="8">
-      <w:start w:val="1"/>
-      <w:numFmt w:val="lowerRoman"/>
-      <w:lvlText w:val="%9."/>
-      <w:lvlJc w:val="left"/>
-      <w:pPr>
-        <w:ind w:left="3856" w:hanging="336"/>
-      </w:pPr>
-    </w:lvl>
-    <w:lvl w:ilvl="2">
-      <w:start w:val="1"/>
-      <w:numFmt w:val="lowerRoman"/>
-      <w:lvlText w:val="%3."/>
-      <w:lvlJc w:val="left"/>
-      <w:pPr>
-        <w:ind w:left="1216" w:hanging="336"/>
-      </w:pPr>
-    </w:lvl>
-  </w:abstractNum>
-  <w:abstractNum w:abstractNumId="7">
-    <w:lvl w:ilvl="7">
-      <w:start w:val="1"/>
-      <w:numFmt w:val="lowerLetter"/>
-      <w:lvlText w:val="%8."/>
-      <w:lvlJc w:val="left"/>
-      <w:pPr>
-        <w:ind w:left="3416" w:hanging="336"/>
-      </w:pPr>
-    </w:lvl>
-    <w:lvl w:ilvl="2">
-      <w:start w:val="1"/>
-      <w:numFmt w:val="lowerRoman"/>
-      <w:lvlText w:val="%3."/>
-      <w:lvlJc w:val="left"/>
-      <w:pPr>
-        <w:ind w:left="1216" w:hanging="336"/>
-      </w:pPr>
-    </w:lvl>
-    <w:lvl w:ilvl="4">
-      <w:start w:val="1"/>
-      <w:numFmt w:val="lowerLetter"/>
-      <w:lvlText w:val="%5."/>
-      <w:lvlJc w:val="left"/>
-      <w:pPr>
-        <w:ind w:left="2096" w:hanging="336"/>
-      </w:pPr>
-    </w:lvl>
-    <w:lvl w:ilvl="0">
-      <w:start w:val="1"/>
-      <w:numFmt w:val="decimal"/>
-      <w:lvlText w:val="%1."/>
-      <w:lvlJc w:val="left"/>
-      <w:pPr>
-        <w:ind w:left="336" w:hanging="336"/>
-      </w:pPr>
-      <w:rPr/>
-    </w:lvl>
-    <w:lvl w:ilvl="1">
-      <w:start w:val="1"/>
-      <w:numFmt w:val="lowerLetter"/>
-      <w:lvlText w:val="%2."/>
-      <w:lvlJc w:val="left"/>
-      <w:pPr>
-        <w:ind w:left="776" w:hanging="336"/>
-      </w:pPr>
-    </w:lvl>
-    <w:lvl w:ilvl="8">
-      <w:start w:val="1"/>
-      <w:numFmt w:val="lowerRoman"/>
-      <w:lvlText w:val="%9."/>
-      <w:lvlJc w:val="left"/>
-      <w:pPr>
-        <w:ind w:left="3856" w:hanging="336"/>
-      </w:pPr>
-    </w:lvl>
-    <w:lvl w:ilvl="3">
-      <w:start w:val="1"/>
-      <w:numFmt w:val="decimal"/>
-      <w:lvlText w:val="%4."/>
-      <w:lvlJc w:val="left"/>
-      <w:pPr>
-        <w:ind w:left="1656" w:hanging="336"/>
-      </w:pPr>
-    </w:lvl>
-    <w:lvl w:ilvl="6">
-      <w:start w:val="1"/>
-      <w:numFmt w:val="decimal"/>
-      <w:lvlText w:val="%7."/>
-      <w:lvlJc w:val="left"/>
-      <w:pPr>
-        <w:ind w:left="2976" w:hanging="336"/>
-      </w:pPr>
-    </w:lvl>
-    <w:lvl w:ilvl="5">
-      <w:start w:val="1"/>
-      <w:numFmt w:val="lowerRoman"/>
-      <w:lvlText w:val="%6."/>
-      <w:lvlJc w:val="left"/>
-      <w:pPr>
-        <w:ind w:left="2536" w:hanging="336"/>
-      </w:pPr>
-    </w:lvl>
-  </w:abstractNum>
-  <w:abstractNum w:abstractNumId="8">
-    <w:lvl w:ilvl="2">
-      <w:start w:val="1"/>
-      <w:numFmt w:val="lowerRoman"/>
-      <w:lvlText w:val="%3."/>
-      <w:lvlJc w:val="left"/>
-      <w:pPr>
-        <w:ind w:left="1216" w:hanging="336"/>
-      </w:pPr>
-    </w:lvl>
-    <w:lvl w:ilvl="7">
-      <w:start w:val="1"/>
-      <w:numFmt w:val="lowerLetter"/>
-      <w:lvlText w:val="%8."/>
-      <w:lvlJc w:val="left"/>
-      <w:pPr>
-        <w:ind w:left="3416" w:hanging="336"/>
-      </w:pPr>
-    </w:lvl>
-    <w:lvl w:ilvl="1">
-      <w:start w:val="1"/>
-      <w:numFmt w:val="lowerLetter"/>
-      <w:lvlText w:val="%2."/>
-      <w:lvlJc w:val="left"/>
-      <w:pPr>
-        <w:ind w:left="776" w:hanging="336"/>
-      </w:pPr>
-    </w:lvl>
-    <w:lvl w:ilvl="8">
-      <w:start w:val="1"/>
-      <w:numFmt w:val="lowerRoman"/>
-      <w:lvlText w:val="%9."/>
-      <w:lvlJc w:val="left"/>
-      <w:pPr>
-        <w:ind w:left="3856" w:hanging="336"/>
-      </w:pPr>
-    </w:lvl>
-    <w:lvl w:ilvl="4">
-      <w:start w:val="1"/>
-      <w:numFmt w:val="lowerLetter"/>
-      <w:lvlText w:val="%5."/>
-      <w:lvlJc w:val="left"/>
-      <w:pPr>
-        <w:ind w:left="2096" w:hanging="336"/>
-      </w:pPr>
-    </w:lvl>
-    <w:lvl w:ilvl="0">
-      <w:start w:val="1"/>
-      <w:numFmt w:val="decimal"/>
-      <w:lvlText w:val="%1."/>
-      <w:lvlJc w:val="left"/>
-      <w:pPr>
-        <w:ind w:left="336" w:hanging="336"/>
-      </w:pPr>
-      <w:rPr/>
-    </w:lvl>
-    <w:lvl w:ilvl="3">
-      <w:start w:val="1"/>
-      <w:numFmt w:val="decimal"/>
-      <w:lvlText w:val="%4."/>
-      <w:lvlJc w:val="left"/>
-      <w:pPr>
-        <w:ind w:left="1656" w:hanging="336"/>
-      </w:pPr>
-    </w:lvl>
-    <w:lvl w:ilvl="6">
-      <w:start w:val="1"/>
-      <w:numFmt w:val="decimal"/>
-      <w:lvlText w:val="%7."/>
-      <w:lvlJc w:val="left"/>
-      <w:pPr>
-        <w:ind w:left="2976" w:hanging="336"/>
-      </w:pPr>
-    </w:lvl>
-    <w:lvl w:ilvl="5">
-      <w:start w:val="1"/>
-      <w:numFmt w:val="lowerRoman"/>
-      <w:lvlText w:val="%6."/>
-      <w:lvlJc w:val="left"/>
-      <w:pPr>
-        <w:ind w:left="2536" w:hanging="336"/>
-      </w:pPr>
-    </w:lvl>
-  </w:abstractNum>
-  <w:abstractNum w:abstractNumId="9">
-    <w:lvl w:ilvl="0">
-      <w:start w:val="1"/>
-      <w:numFmt w:val="decimal"/>
-      <w:lvlText w:val="%1."/>
-      <w:lvlJc w:val="left"/>
-      <w:pPr>
-        <w:ind w:left="336" w:hanging="336"/>
-      </w:pPr>
-      <w:rPr/>
-    </w:lvl>
-    <w:lvl w:ilvl="4">
-      <w:start w:val="1"/>
-      <w:numFmt w:val="lowerLetter"/>
-      <w:lvlText w:val="%5."/>
-      <w:lvlJc w:val="left"/>
-      <w:pPr>
-        <w:ind w:left="2096" w:hanging="336"/>
-      </w:pPr>
-    </w:lvl>
-    <w:lvl w:ilvl="2">
-      <w:start w:val="1"/>
-      <w:numFmt w:val="lowerRoman"/>
-      <w:lvlText w:val="%3."/>
-      <w:lvlJc w:val="left"/>
-      <w:pPr>
-        <w:ind w:left="1216" w:hanging="336"/>
-      </w:pPr>
-    </w:lvl>
-    <w:lvl w:ilvl="1">
-      <w:start w:val="1"/>
-      <w:numFmt w:val="lowerLetter"/>
-      <w:lvlText w:val="%2."/>
-      <w:lvlJc w:val="left"/>
-      <w:pPr>
-        <w:ind w:left="776" w:hanging="336"/>
-      </w:pPr>
-    </w:lvl>
-    <w:lvl w:ilvl="3">
-      <w:start w:val="1"/>
-      <w:numFmt w:val="decimal"/>
-      <w:lvlText w:val="%4."/>
-      <w:lvlJc w:val="left"/>
-      <w:pPr>
-        <w:ind w:left="1656" w:hanging="336"/>
-      </w:pPr>
-    </w:lvl>
-    <w:lvl w:ilvl="6">
-      <w:start w:val="1"/>
-      <w:numFmt w:val="decimal"/>
-      <w:lvlText w:val="%7."/>
-      <w:lvlJc w:val="left"/>
-      <w:pPr>
-        <w:ind w:left="2976" w:hanging="336"/>
-      </w:pPr>
-    </w:lvl>
-    <w:lvl w:ilvl="7">
-      <w:start w:val="1"/>
-      <w:numFmt w:val="lowerLetter"/>
-      <w:lvlText w:val="%8."/>
-      <w:lvlJc w:val="left"/>
-      <w:pPr>
-        <w:ind w:left="3416" w:hanging="336"/>
-      </w:pPr>
-    </w:lvl>
-    <w:lvl w:ilvl="8">
-      <w:start w:val="1"/>
-      <w:numFmt w:val="lowerRoman"/>
-      <w:lvlText w:val="%9."/>
-      <w:lvlJc w:val="left"/>
-      <w:pPr>
-        <w:ind w:left="3856" w:hanging="336"/>
-      </w:pPr>
-    </w:lvl>
-    <w:lvl w:ilvl="5">
-      <w:start w:val="1"/>
-      <w:numFmt w:val="lowerRoman"/>
-      <w:lvlText w:val="%6."/>
-      <w:lvlJc w:val="left"/>
-      <w:pPr>
-        <w:ind w:left="2536" w:hanging="336"/>
-      </w:pPr>
     </w:lvl>
   </w:abstractNum>
   <w:abstractNum w:abstractNumId="10">
@@ -3501,6 +3501,33 @@
         <w:ind w:left="3856" w:hanging="336"/>
       </w:pPr>
     </w:lvl>
+    <w:lvl w:ilvl="7">
+      <w:start w:val="1"/>
+      <w:numFmt w:val="lowerLetter"/>
+      <w:lvlText w:val="%8."/>
+      <w:lvlJc w:val="left"/>
+      <w:pPr>
+        <w:ind w:left="3416" w:hanging="336"/>
+      </w:pPr>
+    </w:lvl>
+    <w:lvl w:ilvl="5">
+      <w:start w:val="1"/>
+      <w:numFmt w:val="lowerRoman"/>
+      <w:lvlText w:val="%6."/>
+      <w:lvlJc w:val="left"/>
+      <w:pPr>
+        <w:ind w:left="2536" w:hanging="336"/>
+      </w:pPr>
+    </w:lvl>
+    <w:lvl w:ilvl="6">
+      <w:start w:val="1"/>
+      <w:numFmt w:val="decimal"/>
+      <w:lvlText w:val="%7."/>
+      <w:lvlJc w:val="left"/>
+      <w:pPr>
+        <w:ind w:left="2976" w:hanging="336"/>
+      </w:pPr>
+    </w:lvl>
     <w:lvl w:ilvl="0">
       <w:start w:val="1"/>
       <w:numFmt w:val="decimal"/>
@@ -3520,6 +3547,15 @@
         <w:ind w:left="2096" w:hanging="336"/>
       </w:pPr>
     </w:lvl>
+    <w:lvl w:ilvl="2">
+      <w:start w:val="1"/>
+      <w:numFmt w:val="lowerRoman"/>
+      <w:lvlText w:val="%3."/>
+      <w:lvlJc w:val="left"/>
+      <w:pPr>
+        <w:ind w:left="1216" w:hanging="336"/>
+      </w:pPr>
+    </w:lvl>
     <w:lvl w:ilvl="1">
       <w:start w:val="1"/>
       <w:numFmt w:val="lowerLetter"/>
@@ -3529,42 +3565,6 @@
         <w:ind w:left="776" w:hanging="336"/>
       </w:pPr>
     </w:lvl>
-    <w:lvl w:ilvl="7">
-      <w:start w:val="1"/>
-      <w:numFmt w:val="lowerLetter"/>
-      <w:lvlText w:val="%8."/>
-      <w:lvlJc w:val="left"/>
-      <w:pPr>
-        <w:ind w:left="3416" w:hanging="336"/>
-      </w:pPr>
-    </w:lvl>
-    <w:lvl w:ilvl="6">
-      <w:start w:val="1"/>
-      <w:numFmt w:val="decimal"/>
-      <w:lvlText w:val="%7."/>
-      <w:lvlJc w:val="left"/>
-      <w:pPr>
-        <w:ind w:left="2976" w:hanging="336"/>
-      </w:pPr>
-    </w:lvl>
-    <w:lvl w:ilvl="5">
-      <w:start w:val="1"/>
-      <w:numFmt w:val="lowerRoman"/>
-      <w:lvlText w:val="%6."/>
-      <w:lvlJc w:val="left"/>
-      <w:pPr>
-        <w:ind w:left="2536" w:hanging="336"/>
-      </w:pPr>
-    </w:lvl>
-    <w:lvl w:ilvl="2">
-      <w:start w:val="1"/>
-      <w:numFmt w:val="lowerRoman"/>
-      <w:lvlText w:val="%3."/>
-      <w:lvlJc w:val="left"/>
-      <w:pPr>
-        <w:ind w:left="1216" w:hanging="336"/>
-      </w:pPr>
-    </w:lvl>
     <w:lvl w:ilvl="3">
       <w:start w:val="1"/>
       <w:numFmt w:val="decimal"/>
@@ -3575,38 +3575,38 @@
       </w:pPr>
     </w:lvl>
   </w:abstractNum>
-  <w:num w:numId="5">
-    <w:abstractNumId w:val="10"/>
-  </w:num>
-  <w:num w:numId="8">
-    <w:abstractNumId w:val="5"/>
-  </w:num>
-  <w:num w:numId="7">
-    <w:abstractNumId w:val="6"/>
-  </w:num>
-  <w:num w:numId="11">
-    <w:abstractNumId w:val="8"/>
-  </w:num>
-  <w:num w:numId="3">
-    <w:abstractNumId w:val="1"/>
-  </w:num>
-  <w:num w:numId="10">
-    <w:abstractNumId w:val="4"/>
-  </w:num>
-  <w:num w:numId="9">
-    <w:abstractNumId w:val="0"/>
-  </w:num>
-  <w:num w:numId="4">
-    <w:abstractNumId w:val="2"/>
-  </w:num>
-  <w:num w:numId="1">
-    <w:abstractNumId w:val="3"/>
-  </w:num>
   <w:num w:numId="2">
     <w:abstractNumId w:val="9"/>
   </w:num>
+  <w:num w:numId="4">
+    <w:abstractNumId w:val="3"/>
+  </w:num>
+  <w:num w:numId="5">
+    <w:abstractNumId w:val="2"/>
+  </w:num>
+  <w:num w:numId="8">
+    <w:abstractNumId w:val="4"/>
+  </w:num>
+  <w:num w:numId="11">
+    <w:abstractNumId w:val="0"/>
+  </w:num>
   <w:num w:numId="6">
+    <w:abstractNumId w:val="1"/>
+  </w:num>
+  <w:num w:numId="1">
+    <w:abstractNumId w:val="5"/>
+  </w:num>
+  <w:num w:numId="3">
+    <w:abstractNumId w:val="8"/>
+  </w:num>
+  <w:num w:numId="10">
+    <w:abstractNumId w:val="10"/>
+  </w:num>
+  <w:num w:numId="7">
     <w:abstractNumId w:val="7"/>
+  </w:num>
+  <w:num w:numId="9">
+    <w:abstractNumId w:val="6"/>
   </w:num>
 </w:numbering>
 </file>
@@ -3623,316 +3623,329 @@
     <w:pPrDefault/>
   </w:docDefaults>
   <w:latentStyles w:defLockedState="0" w:defUIPriority="0" w:defSemiHidden="0" w:defUnhideWhenUsed="0" w:defQFormat="0" w:count="376">
-    <w:lsdException w:name="Table Classic 3" w:semiHidden="1" w:unhideWhenUsed="1"/>
-    <w:lsdException w:name="Grid Table 6 Colorful" w:uiPriority="51"/>
-    <w:lsdException w:name="Colorful List Accent 2" w:uiPriority="72"/>
+    <w:lsdException w:name="List Table 3" w:uiPriority="48"/>
+    <w:lsdException w:name="Light Grid Accent 6" w:uiPriority="62"/>
+    <w:lsdException w:name="Light List Accent 6" w:uiPriority="61"/>
+    <w:lsdException w:name="List Table 1 Light Accent 1" w:uiPriority="46"/>
+    <w:lsdException w:name="heading 8" w:unhideWhenUsed="1" w:qFormat="1"/>
+    <w:lsdException w:name="List Table 3 Accent 6" w:uiPriority="48"/>
+    <w:lsdException w:name="Outline List 3" w:uiPriority="99" w:semiHidden="1" w:unhideWhenUsed="1"/>
+    <w:lsdException w:name="Table Colorful 2" w:semiHidden="1" w:unhideWhenUsed="1"/>
+    <w:lsdException w:name="Grid Table 2 Accent 6" w:uiPriority="47"/>
+    <w:lsdException w:name="Placeholder Text" w:uiPriority="99" w:semiHidden="1"/>
+    <w:lsdException w:name="Emphasis" w:qFormat="1"/>
+    <w:lsdException w:name="Table Theme" w:semiHidden="1" w:unhideWhenUsed="1"/>
+    <w:lsdException w:name="List Table 1 Light Accent 2" w:uiPriority="46"/>
+    <w:lsdException w:name="List Table 6 Colorful Accent 3" w:uiPriority="51"/>
+    <w:lsdException w:name="Normal" w:qFormat="1"/>
+    <w:lsdException w:name="Table List 1" w:semiHidden="1" w:unhideWhenUsed="1"/>
+    <w:lsdException w:name="heading 5" w:qFormat="1"/>
+    <w:lsdException w:name="Title" w:qFormat="1"/>
+    <w:lsdException w:name="heading 7" w:unhideWhenUsed="1" w:qFormat="1"/>
+    <w:lsdException w:name="Unresolved Mention" w:uiPriority="99" w:semiHidden="1" w:unhideWhenUsed="1"/>
+    <w:lsdException w:name="Strong" w:qFormat="1"/>
+    <w:lsdException w:name="Table Columns 3" w:semiHidden="1" w:unhideWhenUsed="1"/>
+    <w:lsdException w:name="HTML Bottom of Form" w:uiPriority="99" w:semiHidden="1" w:unhideWhenUsed="1"/>
+    <w:lsdException w:name="Medium Grid 2 Accent 3" w:uiPriority="68"/>
+    <w:lsdException w:name="HTML Address" w:uiPriority="99"/>
     <w:lsdException w:name="Smart Hyperlink" w:uiPriority="99" w:semiHidden="1" w:unhideWhenUsed="1"/>
-    <w:lsdException w:name="Light List Accent 5" w:uiPriority="61"/>
-    <w:lsdException w:name="Table Classic 2" w:semiHidden="1" w:unhideWhenUsed="1"/>
-    <w:lsdException w:name="Quote" w:uiPriority="99"/>
-    <w:lsdException w:name="Table Simple 2" w:semiHidden="1" w:unhideWhenUsed="1"/>
-    <w:lsdException w:name="Grid Table 6 Colorful Accent 3" w:uiPriority="51"/>
-    <w:lsdException w:name="Grid Table 2" w:uiPriority="47"/>
-    <w:lsdException w:name="List Table 2 Accent 4" w:uiPriority="47"/>
+    <w:lsdException w:name="Table Columns 1" w:semiHidden="1" w:unhideWhenUsed="1"/>
     <w:lsdException w:name="Table 3D effects 1" w:semiHidden="1" w:unhideWhenUsed="1"/>
-    <w:lsdException w:name="Table Columns 5" w:semiHidden="1" w:unhideWhenUsed="1"/>
-    <w:lsdException w:name="heading 5" w:qFormat="1"/>
-    <w:lsdException w:name="Colorful Grid Accent 4" w:uiPriority="73"/>
-    <w:lsdException w:name="HTML Acronym" w:uiPriority="99"/>
-    <w:lsdException w:name="Grid Table 4 Accent 3" w:uiPriority="49"/>
-    <w:lsdException w:name="Medium Grid 2 Accent 4" w:uiPriority="68"/>
-    <w:lsdException w:name="Table Theme" w:semiHidden="1" w:unhideWhenUsed="1"/>
-    <w:lsdException w:name="HTML Cite" w:uiPriority="99"/>
-    <w:lsdException w:name="List Table 5 Dark" w:uiPriority="50"/>
-    <w:lsdException w:name="Dark List Accent 6" w:uiPriority="70"/>
-    <w:lsdException w:name="Table Columns 3" w:semiHidden="1" w:unhideWhenUsed="1"/>
-    <w:lsdException w:name="Grid Table 4" w:uiPriority="49"/>
+    <w:lsdException w:name="Medium List 1 Accent 1" w:uiPriority="65"/>
+    <w:lsdException w:name="Medium Shading 2 Accent 1" w:uiPriority="64"/>
+    <w:lsdException w:name="Colorful Shading" w:uiPriority="71"/>
+    <w:lsdException w:name="List Table 6 Colorful Accent 2" w:uiPriority="51"/>
+    <w:lsdException w:name="Colorful List Accent 1" w:uiPriority="72"/>
+    <w:lsdException w:name="Table Web 2" w:semiHidden="1" w:unhideWhenUsed="1"/>
+    <w:lsdException w:name="Table Grid 3" w:semiHidden="1" w:unhideWhenUsed="1"/>
+    <w:lsdException w:name="Table List 6" w:semiHidden="1" w:unhideWhenUsed="1"/>
+    <w:lsdException w:name="Grid Table 7 Colorful Accent 1" w:uiPriority="52"/>
+    <w:lsdException w:name="Medium List 1 Accent 4" w:uiPriority="65"/>
+    <w:lsdException w:name="Medium List 2 Accent 1" w:uiPriority="66"/>
+    <w:lsdException w:name="Medium Shading 2 Accent 2" w:uiPriority="64"/>
+    <w:lsdException w:name="List Table 2 Accent 5" w:uiPriority="47"/>
     <w:lsdException w:name="Plain Table 2" w:uiPriority="42"/>
-    <w:lsdException w:name="Table List 4" w:semiHidden="1" w:unhideWhenUsed="1"/>
-    <w:lsdException w:name="toc 4" w:uiPriority="99"/>
-    <w:lsdException w:name="Normal" w:qFormat="1"/>
-    <w:lsdException w:name="List Table 6 Colorful Accent 2" w:uiPriority="51"/>
-    <w:lsdException w:name="Table Columns 2" w:semiHidden="1" w:unhideWhenUsed="1"/>
-    <w:lsdException w:name="heading 6" w:qFormat="1"/>
-    <w:lsdException w:name="List Table 4 Accent 1" w:uiPriority="49"/>
-    <w:lsdException w:name="footnote reference" w:uiPriority="99" w:semiHidden="1" w:unhideWhenUsed="1"/>
-    <w:lsdException w:name="List Table 5 Dark Accent 3" w:uiPriority="50"/>
-    <w:lsdException w:name="toc 2" w:uiPriority="99"/>
-    <w:lsdException w:name="Medium Shading 2 Accent 1" w:uiPriority="64"/>
-    <w:lsdException w:name="Grid Table 3 Accent 2" w:uiPriority="48"/>
-    <w:lsdException w:name="Title" w:qFormat="1"/>
-    <w:lsdException w:name="Grid Table 7 Colorful Accent 4" w:uiPriority="52"/>
-    <w:lsdException w:name="List Table 2 Accent 1" w:uiPriority="47"/>
-    <w:lsdException w:name="List Table 3 Accent 3" w:uiPriority="48"/>
-    <w:lsdException w:name="Medium Shading 1 Accent 6" w:uiPriority="63"/>
-    <w:lsdException w:name="Table Classic 4" w:semiHidden="1" w:unhideWhenUsed="1"/>
-    <w:lsdException w:name="Colorful Grid Accent 6" w:uiPriority="73"/>
-    <w:lsdException w:name="Medium Grid 3 Accent 5" w:uiPriority="69"/>
-    <w:lsdException w:name="Colorful Shading Accent 3" w:uiPriority="71"/>
-    <w:lsdException w:name="List Table 5 Dark Accent 4" w:uiPriority="50"/>
-    <w:lsdException w:name="Medium Grid 3 Accent 6" w:uiPriority="69"/>
-    <w:lsdException w:name="Table Columns 1" w:semiHidden="1" w:unhideWhenUsed="1"/>
-    <w:lsdException w:name="List Table 3 Accent 6" w:uiPriority="48"/>
-    <w:lsdException w:name="Table Professional" w:semiHidden="1" w:unhideWhenUsed="1"/>
-    <w:lsdException w:name="Light Grid Accent 3" w:uiPriority="62"/>
-    <w:lsdException w:name="Medium Shading 1 Accent 1" w:uiPriority="63"/>
-    <w:lsdException w:name="List Table 2 Accent 3" w:uiPriority="47"/>
-    <w:lsdException w:name="heading 2" w:qFormat="1"/>
-    <w:lsdException w:name="Grid Table 2 Accent 6" w:uiPriority="47"/>
-    <w:lsdException w:name="List Table 4 Accent 3" w:uiPriority="49"/>
-    <w:lsdException w:name="HTML Definition" w:uiPriority="99"/>
-    <w:lsdException w:name="Medium Shading 2 Accent 2" w:uiPriority="64"/>
-    <w:lsdException w:name="Table Contemporary" w:semiHidden="1" w:unhideWhenUsed="1"/>
-    <w:lsdException w:name="HTML Code" w:uiPriority="99"/>
-    <w:lsdException w:name="Subtle Emphasis" w:uiPriority="19" w:qFormat="1"/>
-    <w:lsdException w:name="Table Colorful 1" w:semiHidden="1" w:unhideWhenUsed="1"/>
-    <w:lsdException w:name="Grid Table 5 Dark" w:uiPriority="50"/>
-    <w:lsdException w:name="Medium Grid 2" w:uiPriority="68"/>
-    <w:lsdException w:name="Light Shading Accent 3" w:uiPriority="60"/>
-    <w:lsdException w:name="Grid Table 1 Light Accent 4" w:uiPriority="46"/>
-    <w:lsdException w:name="Dark List Accent 3" w:uiPriority="70"/>
-    <w:lsdException w:name="Grid Table 1 Light Accent 3" w:uiPriority="46"/>
-    <w:lsdException w:name="Medium List 1 Accent 4" w:uiPriority="65"/>
-    <w:lsdException w:name="Grid Table 7 Colorful Accent 6" w:uiPriority="52"/>
-    <w:lsdException w:name="Light Shading Accent 2" w:uiPriority="60"/>
-    <w:lsdException w:name="Table 3D effects 3" w:semiHidden="1" w:unhideWhenUsed="1"/>
-    <w:lsdException w:name="Outline List 3" w:uiPriority="99" w:semiHidden="1" w:unhideWhenUsed="1"/>
-    <w:lsdException w:name="No Spacing" w:uiPriority="99"/>
-    <w:lsdException w:name="Grid Table 3 Accent 6" w:uiPriority="48"/>
-    <w:lsdException w:name="Grid Table 2 Accent 3" w:uiPriority="47"/>
-    <w:lsdException w:name="List Table 1 Light Accent 4" w:uiPriority="46"/>
-    <w:lsdException w:name="Grid Table 4 Accent 1" w:uiPriority="49"/>
-    <w:lsdException w:name="Medium List 2" w:uiPriority="66"/>
+    <w:lsdException w:name="Grid Table 7 Colorful Accent 2" w:uiPriority="52"/>
+    <w:lsdException w:name="Grid Table 2 Accent 2" w:uiPriority="47"/>
+    <w:lsdException w:name="Table Grid" w:qFormat="1"/>
+    <w:lsdException w:name="Table Web 3" w:semiHidden="1" w:unhideWhenUsed="1"/>
     <w:lsdException w:name="HTML Top of Form" w:uiPriority="99" w:semiHidden="1" w:unhideWhenUsed="1"/>
     <w:lsdException w:name="List Table 3 Accent 2" w:uiPriority="48"/>
+    <w:lsdException w:name="List Table 1 Light Accent 5" w:uiPriority="46"/>
+    <w:lsdException w:name="Medium Shading 2 Accent 5" w:uiPriority="64"/>
+    <w:lsdException w:name="Medium Shading 2 Accent 6" w:uiPriority="64"/>
+    <w:lsdException w:name="No List" w:uiPriority="99" w:semiHidden="1" w:unhideWhenUsed="1"/>
+    <w:lsdException w:name="Revision" w:uiPriority="99" w:semiHidden="1"/>
+    <w:lsdException w:name="Medium Grid 1 Accent 4" w:uiPriority="67"/>
+    <w:lsdException w:name="Grid Table 3 Accent 2" w:uiPriority="48"/>
+    <w:lsdException w:name="Grid Table 4 Accent 5" w:uiPriority="49"/>
+    <w:lsdException w:name="Light Grid Accent 2" w:uiPriority="62"/>
+    <w:lsdException w:name="List Table 1 Light" w:uiPriority="46"/>
+    <w:lsdException w:name="List Table 6 Colorful Accent 6" w:uiPriority="51"/>
+    <w:lsdException w:name="Table Columns 2" w:semiHidden="1" w:unhideWhenUsed="1"/>
+    <w:lsdException w:name="List Table 7 Colorful Accent 3" w:uiPriority="52"/>
+    <w:lsdException w:name="Subtitle" w:qFormat="1"/>
+    <w:lsdException w:name="heading 2" w:qFormat="1"/>
+    <w:lsdException w:name="Light Shading Accent 5" w:uiPriority="60"/>
+    <w:lsdException w:name="Medium Shading 1 Accent 1" w:uiPriority="63"/>
+    <w:lsdException w:name="List Table 2 Accent 6" w:uiPriority="47"/>
+    <w:lsdException w:name="Subtle Emphasis" w:uiPriority="19" w:qFormat="1"/>
+    <w:lsdException w:name="Medium List 1 Accent 6" w:uiPriority="65"/>
+    <w:lsdException w:name="Light List Accent 1" w:uiPriority="61"/>
+    <w:lsdException w:name="Medium Shading 1 Accent 2" w:uiPriority="63"/>
+    <w:lsdException w:name="Intense Reference" w:uiPriority="32" w:qFormat="1"/>
+    <w:lsdException w:name="Medium List 2 Accent 6" w:uiPriority="66"/>
+    <w:lsdException w:name="toc 7" w:uiPriority="99"/>
+    <w:lsdException w:name="footnote text" w:uiPriority="99" w:semiHidden="1" w:unhideWhenUsed="1"/>
+    <w:lsdException w:name="Colorful Shading Accent 6" w:uiPriority="71"/>
+    <w:lsdException w:name="Table Grid 1" w:semiHidden="1" w:unhideWhenUsed="1"/>
+    <w:lsdException w:name="Grid Table 2 Accent 1" w:uiPriority="47"/>
+    <w:lsdException w:name="Grid Table 7 Colorful Accent 3" w:uiPriority="52"/>
+    <w:lsdException w:name="Colorful Grid Accent 3" w:uiPriority="73"/>
+    <w:lsdException w:name="Normal Table" w:uiPriority="99" w:semiHidden="1" w:unhideWhenUsed="1"/>
+    <w:lsdException w:name="Colorful List Accent 6" w:uiPriority="72"/>
+    <w:lsdException w:name="Bibliography" w:uiPriority="37" w:semiHidden="1" w:unhideWhenUsed="1"/>
+    <w:lsdException w:name="List Table 2 Accent 1" w:uiPriority="47"/>
+    <w:lsdException w:name="List Table 5 Dark Accent 3" w:uiPriority="50"/>
+    <w:lsdException w:name="Medium List 1 Accent 3" w:uiPriority="65"/>
+    <w:lsdException w:name="Table Classic 3" w:semiHidden="1" w:unhideWhenUsed="1"/>
+    <w:lsdException w:name="Table Grid 7" w:semiHidden="1" w:unhideWhenUsed="1"/>
+    <w:lsdException w:name="List Table 4 Accent 5" w:uiPriority="49"/>
+    <w:lsdException w:name="Grid Table 6 Colorful Accent 1" w:uiPriority="51"/>
+    <w:lsdException w:name="HTML Preformatted" w:uiPriority="99"/>
+    <w:lsdException w:name="Grid Table 5 Dark Accent 2" w:uiPriority="50"/>
+    <w:lsdException w:name="Table Classic 2" w:semiHidden="1" w:unhideWhenUsed="1"/>
+    <w:lsdException w:name="List Table 1 Light Accent 6" w:uiPriority="46"/>
+    <w:lsdException w:name="Grid Table 6 Colorful Accent 5" w:uiPriority="51"/>
+    <w:lsdException w:name="footnote reference" w:uiPriority="99" w:semiHidden="1" w:unhideWhenUsed="1"/>
+    <w:lsdException w:name="Grid Table 1 Light Accent 6" w:uiPriority="46"/>
+    <w:lsdException w:name="toc 3" w:uiPriority="99"/>
+    <w:lsdException w:name="HTML Variable" w:uiPriority="99"/>
+    <w:lsdException w:name="Medium Grid 2 Accent 4" w:uiPriority="68"/>
+    <w:lsdException w:name="Grid Table 2 Accent 3" w:uiPriority="47"/>
+    <w:lsdException w:name="Grid Table 2" w:uiPriority="47"/>
+    <w:lsdException w:name="Light List Accent 3" w:uiPriority="61"/>
+    <w:lsdException w:name="List Table 5 Dark Accent 1" w:uiPriority="50"/>
+    <w:lsdException w:name="List Table 1 Light Accent 4" w:uiPriority="46"/>
+    <w:lsdException w:name="HTML Sample" w:uiPriority="99"/>
+    <w:lsdException w:name="List Table 3 Accent 1" w:uiPriority="48"/>
+    <w:lsdException w:name="Medium List 2" w:uiPriority="66"/>
+    <w:lsdException w:name="Medium Grid 3 Accent 2" w:uiPriority="69"/>
+    <w:lsdException w:name="Colorful List Accent 4" w:uiPriority="72"/>
+    <w:lsdException w:name="Colorful Grid" w:uiPriority="73"/>
+    <w:lsdException w:name="heading 4" w:qFormat="1"/>
+    <w:lsdException w:name="Grid Table 1 Light Accent 3" w:uiPriority="46"/>
+    <w:lsdException w:name="Colorful Shading Accent 2" w:uiPriority="71"/>
+    <w:lsdException w:name="Dark List" w:uiPriority="70"/>
+    <w:lsdException w:name="Table Web 1" w:semiHidden="1" w:unhideWhenUsed="1"/>
+    <w:lsdException w:name="List Table 5 Dark Accent 5" w:uiPriority="50"/>
+    <w:lsdException w:name="Light Grid Accent 3" w:uiPriority="62"/>
+    <w:lsdException w:name="Plain Table 5" w:uiPriority="45"/>
+    <w:lsdException w:name="TOC Heading" w:uiPriority="39" w:semiHidden="1" w:unhideWhenUsed="1" w:qFormat="1"/>
+    <w:lsdException w:name="Table List 4" w:semiHidden="1" w:unhideWhenUsed="1"/>
+    <w:lsdException w:name="List Table 4 Accent 2" w:uiPriority="49"/>
+    <w:lsdException w:name="HTML Definition" w:uiPriority="99"/>
+    <w:lsdException w:name="Grid Table 4 Accent 6" w:uiPriority="49"/>
+    <w:lsdException w:name="Medium Grid 3 Accent 6" w:uiPriority="69"/>
+    <w:lsdException w:name="Medium Shading 1 Accent 3" w:uiPriority="63"/>
+    <w:lsdException w:name="Grid Table 5 Dark Accent 1" w:uiPriority="50"/>
+    <w:lsdException w:name="List Table 5 Dark Accent 6" w:uiPriority="50"/>
+    <w:lsdException w:name="List Table 7 Colorful Accent 6" w:uiPriority="52"/>
+    <w:lsdException w:name="Table Simple 1" w:semiHidden="1" w:unhideWhenUsed="1"/>
+    <w:lsdException w:name="List Table 4 Accent 3" w:uiPriority="49"/>
+    <w:lsdException w:name="Table Colorful 3" w:semiHidden="1" w:unhideWhenUsed="1"/>
+    <w:lsdException w:name="Grid Table 3 Accent 3" w:uiPriority="48"/>
+    <w:lsdException w:name="Outline List 1" w:uiPriority="99" w:semiHidden="1" w:unhideWhenUsed="1"/>
+    <w:lsdException w:name="Light Shading Accent 1" w:uiPriority="60"/>
+    <w:lsdException w:name="Light Grid" w:uiPriority="62"/>
+    <w:lsdException w:name="Light Shading Accent 2" w:uiPriority="60"/>
+    <w:lsdException w:name="Medium Shading 2 Accent 3" w:uiPriority="64"/>
+    <w:lsdException w:name="Grid Table 5 Dark Accent 6" w:uiPriority="50"/>
+    <w:lsdException w:name="toc 2" w:uiPriority="99"/>
+    <w:lsdException w:name="Grid Table 6 Colorful" w:uiPriority="51"/>
+    <w:lsdException w:name="Colorful Shading Accent 5" w:uiPriority="71"/>
+    <w:lsdException w:name="Medium Grid 1 Accent 5" w:uiPriority="67"/>
+    <w:lsdException w:name="Grid Table 4 Accent 2" w:uiPriority="49"/>
+    <w:lsdException w:name="List Table 1 Light Accent 3" w:uiPriority="46"/>
+    <w:lsdException w:name="Medium Shading 1" w:uiPriority="63"/>
+    <w:lsdException w:name="Table Classic 1" w:semiHidden="1" w:unhideWhenUsed="1"/>
+    <w:lsdException w:name="Grid Table 7 Colorful Accent 5" w:uiPriority="52"/>
+    <w:lsdException w:name="Light List" w:uiPriority="61"/>
+    <w:lsdException w:name="Medium Grid 1 Accent 2" w:uiPriority="67"/>
+    <w:lsdException w:name="Grid Table 4 Accent 1" w:uiPriority="49"/>
+    <w:lsdException w:name="List Table 2 Accent 3" w:uiPriority="47"/>
+    <w:lsdException w:name="Dark List Accent 3" w:uiPriority="70"/>
+    <w:lsdException w:name="Medium Grid 3 Accent 3" w:uiPriority="69"/>
+    <w:lsdException w:name="Table Subtle 2" w:semiHidden="1" w:unhideWhenUsed="1"/>
+    <w:lsdException w:name="Smart Link" w:uiPriority="99" w:semiHidden="1" w:unhideWhenUsed="1"/>
+    <w:lsdException w:name="Colorful Shading Accent 3" w:uiPriority="71"/>
+    <w:lsdException w:name="List Paragraph" w:uiPriority="99"/>
+    <w:lsdException w:name="List Table 3 Accent 4" w:uiPriority="48"/>
+    <w:lsdException w:name="Grid Table Light" w:uiPriority="40"/>
+    <w:lsdException w:name="Medium Grid 3 Accent 4" w:uiPriority="69"/>
+    <w:lsdException w:name="Light List Accent 2" w:uiPriority="61"/>
+    <w:lsdException w:name="HTML Keyboard" w:uiPriority="99"/>
+    <w:lsdException w:name="Medium List 2 Accent 5" w:uiPriority="66"/>
+    <w:lsdException w:name="Medium Grid 2 Accent 5" w:uiPriority="68"/>
+    <w:lsdException w:name="Grid Table 6 Colorful Accent 6" w:uiPriority="51"/>
+    <w:lsdException w:name="Plain Table 3" w:uiPriority="43"/>
+    <w:lsdException w:name="Dark List Accent 1" w:uiPriority="70"/>
+    <w:lsdException w:name="Plain Table 1" w:uiPriority="41"/>
+    <w:lsdException w:name="Grid Table 5 Dark" w:uiPriority="50"/>
+    <w:lsdException w:name="Grid Table 5 Dark Accent 3" w:uiPriority="50"/>
+    <w:lsdException w:name="Grid Table 3 Accent 6" w:uiPriority="48"/>
+    <w:lsdException w:name="List Table 6 Colorful Accent 1" w:uiPriority="51"/>
+    <w:lsdException w:name="List Table 4 Accent 1" w:uiPriority="49"/>
+    <w:lsdException w:name="Light Grid Accent 5" w:uiPriority="62"/>
+    <w:lsdException w:name="Table List 8" w:semiHidden="1" w:unhideWhenUsed="1"/>
+    <w:lsdException w:name="Table List 7" w:semiHidden="1" w:unhideWhenUsed="1"/>
+    <w:lsdException w:name="Grid Table 6 Colorful Accent 2" w:uiPriority="51"/>
+    <w:lsdException w:name="Grid Table 2 Accent 4" w:uiPriority="47"/>
+    <w:lsdException w:name="toc 9" w:uiPriority="99"/>
+    <w:lsdException w:name="Medium Grid 2 Accent 6" w:uiPriority="68"/>
+    <w:lsdException w:name="Dark List Accent 2" w:uiPriority="70"/>
+    <w:lsdException w:name="Table Columns 5" w:semiHidden="1" w:unhideWhenUsed="1"/>
+    <w:lsdException w:name="toc 1" w:uiPriority="99"/>
+    <w:lsdException w:name="Colorful Shading Accent 1" w:uiPriority="71"/>
+    <w:lsdException w:name="List Table 6 Colorful Accent 4" w:uiPriority="51"/>
+    <w:lsdException w:name="Medium Grid 3" w:uiPriority="69"/>
+    <w:lsdException w:name="HTML Cite" w:uiPriority="99"/>
+    <w:lsdException w:name="Table Grid 4" w:semiHidden="1" w:unhideWhenUsed="1"/>
+    <w:lsdException w:name="Medium Grid 1" w:uiPriority="67"/>
+    <w:lsdException w:name="Medium Shading 1 Accent 6" w:uiPriority="63"/>
+    <w:lsdException w:name="List Table 5 Dark" w:uiPriority="50"/>
+    <w:lsdException w:name="Grid Table 1 Light Accent 4" w:uiPriority="46"/>
+    <w:lsdException w:name="Medium List 1 Accent 5" w:uiPriority="65"/>
+    <w:lsdException w:name="Medium Shading 1 Accent 5" w:uiPriority="63"/>
+    <w:lsdException w:name="toc 4" w:uiPriority="99"/>
+    <w:lsdException w:name="List Table 7 Colorful Accent 1" w:uiPriority="52"/>
+    <w:lsdException w:name="Medium Grid 2 Accent 1" w:uiPriority="68"/>
+    <w:lsdException w:name="HTML Typewriter" w:uiPriority="99"/>
+    <w:lsdException w:name="Light List Accent 4" w:uiPriority="61"/>
+    <w:lsdException w:name="Intense Quote" w:uiPriority="99"/>
+    <w:lsdException w:name="Grid Table 6 Colorful Accent 4" w:uiPriority="51"/>
+    <w:lsdException w:name="Medium Grid 1 Accent 1" w:uiPriority="67"/>
+    <w:lsdException w:name="List Table 7 Colorful" w:uiPriority="52"/>
+    <w:lsdException w:name="Table Subtle 1" w:semiHidden="1" w:unhideWhenUsed="1"/>
+    <w:lsdException w:name="Grid Table 4" w:uiPriority="49"/>
+    <w:lsdException w:name="Light Shading Accent 6" w:uiPriority="60"/>
+    <w:lsdException w:name="Grid Table 7 Colorful Accent 6" w:uiPriority="52"/>
+    <w:lsdException w:name="Table Grid 2" w:semiHidden="1" w:unhideWhenUsed="1"/>
+    <w:lsdException w:name="Table Professional" w:semiHidden="1" w:unhideWhenUsed="1"/>
+    <w:lsdException w:name="Colorful Grid Accent 5" w:uiPriority="73"/>
+    <w:lsdException w:name="List Table 5 Dark Accent 2" w:uiPriority="50"/>
+    <w:lsdException w:name="Colorful List Accent 2" w:uiPriority="72"/>
+    <w:lsdException w:name="Outline List 2" w:uiPriority="99" w:semiHidden="1" w:unhideWhenUsed="1"/>
+    <w:lsdException w:name="Medium Shading 2 Accent 4" w:uiPriority="64"/>
+    <w:lsdException w:name="Light Shading Accent 4" w:uiPriority="60"/>
+    <w:lsdException w:name="Colorful Grid Accent 6" w:uiPriority="73"/>
+    <w:lsdException w:name="Grid Table 3 Accent 5" w:uiPriority="48"/>
+    <w:lsdException w:name="Dark List Accent 4" w:uiPriority="70"/>
+    <w:lsdException w:name="Colorful Grid Accent 4" w:uiPriority="73"/>
+    <w:lsdException w:name="Table Grid 5" w:semiHidden="1" w:unhideWhenUsed="1"/>
+    <w:lsdException w:name="Medium List 2 Accent 2" w:uiPriority="66"/>
+    <w:lsdException w:name="Grid Table 1 Light Accent 1" w:uiPriority="46"/>
+    <w:lsdException w:name="List Table 7 Colorful Accent 5" w:uiPriority="52"/>
+    <w:lsdException w:name="Medium List 2 Accent 3" w:uiPriority="66"/>
+    <w:lsdException w:name="List Table 3 Accent 5" w:uiPriority="48"/>
+    <w:lsdException w:name="Table 3D effects 2" w:semiHidden="1" w:unhideWhenUsed="1"/>
+    <w:lsdException w:name="Table List 5" w:semiHidden="1" w:unhideWhenUsed="1"/>
+    <w:lsdException w:name="List Table 6 Colorful" w:uiPriority="51"/>
+    <w:lsdException w:name="Table 3D effects 3" w:semiHidden="1" w:unhideWhenUsed="1"/>
+    <w:lsdException w:name="heading 6" w:qFormat="1"/>
+    <w:lsdException w:name="Table Classic 4" w:semiHidden="1" w:unhideWhenUsed="1"/>
+    <w:lsdException w:name="Medium Grid 2 Accent 2" w:uiPriority="68"/>
+    <w:lsdException w:name="HTML Code" w:uiPriority="99"/>
+    <w:lsdException w:name="Colorful Grid Accent 1" w:uiPriority="73"/>
+    <w:lsdException w:name="Colorful List" w:uiPriority="72"/>
+    <w:lsdException w:name="Grid Table 5 Dark Accent 5" w:uiPriority="50"/>
+    <w:lsdException w:name="Default Paragraph Font" w:uiPriority="1" w:semiHidden="1" w:unhideWhenUsed="1"/>
+    <w:lsdException w:name="Medium Grid 2" w:uiPriority="68"/>
+    <w:lsdException w:name="Medium Shading 1 Accent 4" w:uiPriority="63"/>
+    <w:lsdException w:name="Table Contemporary" w:semiHidden="1" w:unhideWhenUsed="1"/>
+    <w:lsdException w:name="Medium Grid 1 Accent 3" w:uiPriority="67"/>
+    <w:lsdException w:name="Grid Table 4 Accent 3" w:uiPriority="49"/>
+    <w:lsdException w:name="Table Grid 6" w:semiHidden="1" w:unhideWhenUsed="1"/>
+    <w:lsdException w:name="Grid Table 2 Accent 5" w:uiPriority="47"/>
+    <w:lsdException w:name="Light List Accent 5" w:uiPriority="61"/>
+    <w:lsdException w:name="Book Title" w:uiPriority="33" w:qFormat="1"/>
+    <w:lsdException w:name="Grid Table 5 Dark Accent 4" w:uiPriority="50"/>
+    <w:lsdException w:name="Medium List 1 Accent 2" w:uiPriority="65"/>
+    <w:lsdException w:name="Dark List Accent 5" w:uiPriority="70"/>
+    <w:lsdException w:name="Light Shading Accent 3" w:uiPriority="60"/>
+    <w:lsdException w:name="Medium Shading 2" w:uiPriority="64"/>
+    <w:lsdException w:name="Table List 2" w:semiHidden="1" w:unhideWhenUsed="1"/>
+    <w:lsdException w:name="Medium List 2 Accent 4" w:uiPriority="66"/>
+    <w:lsdException w:name="caption" w:semiHidden="1" w:unhideWhenUsed="1" w:qFormat="1"/>
+    <w:lsdException w:name="Table Elegant" w:semiHidden="1" w:unhideWhenUsed="1"/>
+    <w:lsdException w:name="Grid Table 1 Light Accent 5" w:uiPriority="46"/>
+    <w:lsdException w:name="toc 6" w:uiPriority="99"/>
+    <w:lsdException w:name="Medium Grid 3 Accent 1" w:uiPriority="69"/>
+    <w:lsdException w:name="Intense Emphasis" w:uiPriority="21" w:qFormat="1"/>
+    <w:lsdException w:name="toc 8" w:uiPriority="99"/>
+    <w:lsdException w:name="Grid Table 7 Colorful" w:uiPriority="52"/>
+    <w:lsdException w:name="toc 5" w:uiPriority="99"/>
+    <w:lsdException w:name="Subtle Reference" w:uiPriority="31" w:qFormat="1"/>
+    <w:lsdException w:name="Table Columns 4" w:semiHidden="1" w:unhideWhenUsed="1"/>
+    <w:lsdException w:name="Grid Table 7 Colorful Accent 4" w:uiPriority="52"/>
+    <w:lsdException w:name="Light Grid Accent 4" w:uiPriority="62"/>
+    <w:lsdException w:name="List Table 5 Dark Accent 4" w:uiPriority="50"/>
+    <w:lsdException w:name="List Table 7 Colorful Accent 4" w:uiPriority="52"/>
+    <w:lsdException w:name="Colorful List Accent 3" w:uiPriority="72"/>
+    <w:lsdException w:name="Mention" w:uiPriority="99" w:semiHidden="1" w:unhideWhenUsed="1"/>
+    <w:lsdException w:name="Quote" w:uiPriority="99"/>
+    <w:lsdException w:name="List Table 6 Colorful Accent 5" w:uiPriority="51"/>
+    <w:lsdException w:name="Grid Table 3" w:uiPriority="48"/>
+    <w:lsdException w:name="Grid Table 4 Accent 4" w:uiPriority="49"/>
+    <w:lsdException w:name="Colorful Grid Accent 2" w:uiPriority="73"/>
+    <w:lsdException w:name="Light Grid Accent 1" w:uiPriority="62"/>
+    <w:lsdException w:name="heading 1" w:qFormat="1"/>
+    <w:lsdException w:name="List Table 4 Accent 6" w:uiPriority="49"/>
+    <w:lsdException w:name="Grid Table 6 Colorful Accent 3" w:uiPriority="51"/>
+    <w:lsdException w:name="Grid Table 1 Light Accent 2" w:uiPriority="46"/>
+    <w:lsdException w:name="List Table 2 Accent 4" w:uiPriority="47"/>
+    <w:lsdException w:name="Grid Table 3 Accent 1" w:uiPriority="48"/>
+    <w:lsdException w:name="heading 3" w:qFormat="1"/>
+    <w:lsdException w:name="List Table 4" w:uiPriority="49"/>
+    <w:lsdException w:name="Table Simple 3" w:semiHidden="1" w:unhideWhenUsed="1"/>
+    <w:lsdException w:name="Medium List 1" w:uiPriority="65"/>
+    <w:lsdException w:name="Dark List Accent 6" w:uiPriority="70"/>
+    <w:lsdException w:name="Medium Grid 3 Accent 5" w:uiPriority="69"/>
+    <w:lsdException w:name="Colorful Shading Accent 4" w:uiPriority="71"/>
+    <w:lsdException w:name="heading 9" w:unhideWhenUsed="1" w:qFormat="1"/>
+    <w:lsdException w:name="HTML Acronym" w:uiPriority="99"/>
+    <w:lsdException w:name="Table Simple 2" w:semiHidden="1" w:unhideWhenUsed="1"/>
     <w:lsdException w:name="Grid Table 1 Light" w:uiPriority="46"/>
-    <w:lsdException w:name="Light Grid Accent 6" w:uiPriority="62"/>
-    <w:lsdException w:name="Medium List 2 Accent 1" w:uiPriority="66"/>
-    <w:lsdException w:name="TOC Heading" w:uiPriority="39" w:semiHidden="1" w:unhideWhenUsed="1" w:qFormat="1"/>
-    <w:lsdException w:name="Table Classic 1" w:semiHidden="1" w:unhideWhenUsed="1"/>
-    <w:lsdException w:name="Medium List 1 Accent 5" w:uiPriority="65"/>
-    <w:lsdException w:name="Table List 6" w:semiHidden="1" w:unhideWhenUsed="1"/>
-    <w:lsdException w:name="Grid Table 6 Colorful Accent 1" w:uiPriority="51"/>
-    <w:lsdException w:name="Grid Table 5 Dark Accent 2" w:uiPriority="50"/>
-    <w:lsdException w:name="toc 7" w:uiPriority="99"/>
-    <w:lsdException w:name="Book Title" w:uiPriority="33" w:qFormat="1"/>
-    <w:lsdException w:name="List Table 4" w:uiPriority="49"/>
-    <w:lsdException w:name="Grid Table 7 Colorful Accent 1" w:uiPriority="52"/>
-    <w:lsdException w:name="List Table 3 Accent 1" w:uiPriority="48"/>
-    <w:lsdException w:name="Emphasis" w:qFormat="1"/>
-    <w:lsdException w:name="HTML Bottom of Form" w:uiPriority="99" w:semiHidden="1" w:unhideWhenUsed="1"/>
-    <w:lsdException w:name="Medium Grid 3 Accent 1" w:uiPriority="69"/>
-    <w:lsdException w:name="Light Shading Accent 4" w:uiPriority="60"/>
-    <w:lsdException w:name="Table Grid 7" w:semiHidden="1" w:unhideWhenUsed="1"/>
-    <w:lsdException w:name="Light List Accent 3" w:uiPriority="61"/>
-    <w:lsdException w:name="heading 3" w:qFormat="1"/>
-    <w:lsdException w:name="Light Grid Accent 4" w:uiPriority="62"/>
-    <w:lsdException w:name="Colorful Shading Accent 1" w:uiPriority="71"/>
-    <w:lsdException w:name="Outline List 2" w:uiPriority="99" w:semiHidden="1" w:unhideWhenUsed="1"/>
-    <w:lsdException w:name="Table Subtle 1" w:semiHidden="1" w:unhideWhenUsed="1"/>
-    <w:lsdException w:name="Medium Shading 2 Accent 4" w:uiPriority="64"/>
-    <w:lsdException w:name="List Table 4 Accent 6" w:uiPriority="49"/>
-    <w:lsdException w:name="HTML Variable" w:uiPriority="99"/>
-    <w:lsdException w:name="Medium Grid 3 Accent 4" w:uiPriority="69"/>
-    <w:lsdException w:name="Colorful Grid Accent 5" w:uiPriority="73"/>
-    <w:lsdException w:name="Strong" w:qFormat="1"/>
-    <w:lsdException w:name="Grid Table 5 Dark Accent 5" w:uiPriority="50"/>
-    <w:lsdException w:name="Grid Table 3 Accent 5" w:uiPriority="48"/>
-    <w:lsdException w:name="toc 9" w:uiPriority="99"/>
-    <w:lsdException w:name="footnote text" w:uiPriority="99" w:semiHidden="1" w:unhideWhenUsed="1"/>
-    <w:lsdException w:name="Grid Table 4 Accent 4" w:uiPriority="49"/>
-    <w:lsdException w:name="Dark List Accent 4" w:uiPriority="70"/>
-    <w:lsdException w:name="Colorful List Accent 3" w:uiPriority="72"/>
-    <w:lsdException w:name="Table Web 2" w:semiHidden="1" w:unhideWhenUsed="1"/>
-    <w:lsdException w:name="Grid Table 6 Colorful Accent 4" w:uiPriority="51"/>
-    <w:lsdException w:name="Medium Grid 1 Accent 2" w:uiPriority="67"/>
-    <w:lsdException w:name="List Table 6 Colorful" w:uiPriority="51"/>
-    <w:lsdException w:name="Table Elegant" w:semiHidden="1" w:unhideWhenUsed="1"/>
-    <w:lsdException w:name="Grid Table 5 Dark Accent 3" w:uiPriority="50"/>
-    <w:lsdException w:name="Table Grid 1" w:semiHidden="1" w:unhideWhenUsed="1"/>
-    <w:lsdException w:name="Medium Grid 1 Accent 1" w:uiPriority="67"/>
-    <w:lsdException w:name="Grid Table 4 Accent 2" w:uiPriority="49"/>
-    <w:lsdException w:name="Colorful Shading Accent 2" w:uiPriority="71"/>
-    <w:lsdException w:name="Bibliography" w:uiPriority="37" w:semiHidden="1" w:unhideWhenUsed="1"/>
-    <w:lsdException w:name="Medium List 1 Accent 6" w:uiPriority="65"/>
-    <w:lsdException w:name="Light Grid Accent 2" w:uiPriority="62"/>
-    <w:lsdException w:name="Grid Table 6 Colorful Accent 5" w:uiPriority="51"/>
-    <w:lsdException w:name="List Table 6 Colorful Accent 1" w:uiPriority="51"/>
-    <w:lsdException w:name="List Table 6 Colorful Accent 6" w:uiPriority="51"/>
-    <w:lsdException w:name="Medium Shading 2 Accent 3" w:uiPriority="64"/>
-    <w:lsdException w:name="Table Grid 3" w:semiHidden="1" w:unhideWhenUsed="1"/>
-    <w:lsdException w:name="Table Web 1" w:semiHidden="1" w:unhideWhenUsed="1"/>
-    <w:lsdException w:name="Table Grid 6" w:semiHidden="1" w:unhideWhenUsed="1"/>
-    <w:lsdException w:name="Table Simple 3" w:semiHidden="1" w:unhideWhenUsed="1"/>
-    <w:lsdException w:name="Colorful Shading Accent 6" w:uiPriority="71"/>
-    <w:lsdException w:name="Table 3D effects 2" w:semiHidden="1" w:unhideWhenUsed="1"/>
-    <w:lsdException w:name="Grid Table 6 Colorful Accent 2" w:uiPriority="51"/>
-    <w:lsdException w:name="Light Grid" w:uiPriority="62"/>
-    <w:lsdException w:name="Colorful List Accent 1" w:uiPriority="72"/>
-    <w:lsdException w:name="Medium Grid 2 Accent 1" w:uiPriority="68"/>
-    <w:lsdException w:name="List Table 3" w:uiPriority="48"/>
+    <w:lsdException w:name="List Table 7 Colorful Accent 2" w:uiPriority="52"/>
+    <w:lsdException w:name="Table List 3" w:semiHidden="1" w:unhideWhenUsed="1"/>
+    <w:lsdException w:name="List Table 4 Accent 4" w:uiPriority="49"/>
+    <w:lsdException w:name="Table Colorful 1" w:semiHidden="1" w:unhideWhenUsed="1"/>
+    <w:lsdException w:name="Colorful List Accent 5" w:uiPriority="72"/>
+    <w:lsdException w:name="Table Grid 8" w:semiHidden="1" w:unhideWhenUsed="1"/>
+    <w:lsdException w:name="Plain Table 4" w:uiPriority="44"/>
+    <w:lsdException w:name="No Spacing" w:uiPriority="99"/>
+    <w:lsdException w:name="List Table 2" w:uiPriority="47"/>
+    <w:lsdException w:name="Hashtag" w:uiPriority="99" w:semiHidden="1" w:unhideWhenUsed="1"/>
+    <w:lsdException w:name="Grid Table 3 Accent 4" w:uiPriority="48"/>
+    <w:lsdException w:name="List Table 2 Accent 2" w:uiPriority="47"/>
     <w:lsdException w:name="Medium Grid 1 Accent 6" w:uiPriority="67"/>
-    <w:lsdException w:name="Table Grid 8" w:semiHidden="1" w:unhideWhenUsed="1"/>
-    <w:lsdException w:name="Intense Reference" w:uiPriority="32" w:qFormat="1"/>
-    <w:lsdException w:name="Medium Shading 1 Accent 2" w:uiPriority="63"/>
-    <w:lsdException w:name="Colorful List" w:uiPriority="72"/>
-    <w:lsdException w:name="List Table 2 Accent 5" w:uiPriority="47"/>
-    <w:lsdException w:name="Grid Table 1 Light Accent 1" w:uiPriority="46"/>
-    <w:lsdException w:name="toc 8" w:uiPriority="99"/>
-    <w:lsdException w:name="List Table 1 Light Accent 1" w:uiPriority="46"/>
-    <w:lsdException w:name="Table Grid 4" w:semiHidden="1" w:unhideWhenUsed="1"/>
-    <w:lsdException w:name="Table Grid 5" w:semiHidden="1" w:unhideWhenUsed="1"/>
-    <w:lsdException w:name="Plain Table 5" w:uiPriority="45"/>
-    <w:lsdException w:name="heading 4" w:qFormat="1"/>
-    <w:lsdException w:name="Light Shading Accent 1" w:uiPriority="60"/>
-    <w:lsdException w:name="List Table 1 Light Accent 6" w:uiPriority="46"/>
-    <w:lsdException w:name="List Table 7 Colorful Accent 3" w:uiPriority="52"/>
-    <w:lsdException w:name="List Table 7 Colorful Accent 6" w:uiPriority="52"/>
-    <w:lsdException w:name="Colorful List Accent 4" w:uiPriority="72"/>
-    <w:lsdException w:name="Medium List 2 Accent 6" w:uiPriority="66"/>
-    <w:lsdException w:name="Medium List 1 Accent 2" w:uiPriority="65"/>
-    <w:lsdException w:name="Grid Table 2 Accent 5" w:uiPriority="47"/>
-    <w:lsdException w:name="Medium Grid 3 Accent 2" w:uiPriority="69"/>
-    <w:lsdException w:name="List Paragraph" w:uiPriority="99"/>
-    <w:lsdException w:name="HTML Keyboard" w:uiPriority="99"/>
-    <w:lsdException w:name="Table List 3" w:semiHidden="1" w:unhideWhenUsed="1"/>
-    <w:lsdException w:name="List Table 5 Dark Accent 5" w:uiPriority="50"/>
-    <w:lsdException w:name="Medium Grid 1 Accent 3" w:uiPriority="67"/>
-    <w:lsdException w:name="Dark List Accent 5" w:uiPriority="70"/>
-    <w:lsdException w:name="Plain Table 1" w:uiPriority="41"/>
-    <w:lsdException w:name="Grid Table 3" w:uiPriority="48"/>
-    <w:lsdException w:name="List Table 3 Accent 4" w:uiPriority="48"/>
-    <w:lsdException w:name="Medium List 2 Accent 4" w:uiPriority="66"/>
-    <w:lsdException w:name="heading 7" w:unhideWhenUsed="1" w:qFormat="1"/>
-    <w:lsdException w:name="Light Grid Accent 5" w:uiPriority="62"/>
-    <w:lsdException w:name="Medium Shading 1 Accent 3" w:uiPriority="63"/>
-    <w:lsdException w:name="toc 5" w:uiPriority="99"/>
-    <w:lsdException w:name="Grid Table 2 Accent 2" w:uiPriority="47"/>
-    <w:lsdException w:name="Grid Table 2 Accent 4" w:uiPriority="47"/>
-    <w:lsdException w:name="List Table 7 Colorful Accent 5" w:uiPriority="52"/>
-    <w:lsdException w:name="Light Shading Accent 6" w:uiPriority="60"/>
-    <w:lsdException w:name="Plain Table 3" w:uiPriority="43"/>
-    <w:lsdException w:name="List Table 7 Colorful Accent 2" w:uiPriority="52"/>
-    <w:lsdException w:name="heading 8" w:unhideWhenUsed="1" w:qFormat="1"/>
-    <w:lsdException w:name="List Table 3 Accent 5" w:uiPriority="48"/>
-    <w:lsdException w:name="Medium Shading 2" w:uiPriority="64"/>
-    <w:lsdException w:name="Plain Table 4" w:uiPriority="44"/>
-    <w:lsdException w:name="List Table 5 Dark Accent 2" w:uiPriority="50"/>
-    <w:lsdException w:name="HTML Typewriter" w:uiPriority="99"/>
-    <w:lsdException w:name="Grid Table 4 Accent 5" w:uiPriority="49"/>
-    <w:lsdException w:name="List Table 2" w:uiPriority="47"/>
-    <w:lsdException w:name="Medium Shading 1 Accent 4" w:uiPriority="63"/>
-    <w:lsdException w:name="Mention" w:uiPriority="99" w:semiHidden="1" w:unhideWhenUsed="1"/>
-    <w:lsdException w:name="List Table 5 Dark Accent 6" w:uiPriority="50"/>
-    <w:lsdException w:name="Unresolved Mention" w:uiPriority="99" w:semiHidden="1" w:unhideWhenUsed="1"/>
-    <w:lsdException w:name="Grid Table 3 Accent 4" w:uiPriority="48"/>
-    <w:lsdException w:name="Colorful Grid Accent 2" w:uiPriority="73"/>
-    <w:lsdException w:name="Grid Table 3 Accent 3" w:uiPriority="48"/>
-    <w:lsdException w:name="Medium Grid 2 Accent 2" w:uiPriority="68"/>
-    <w:lsdException w:name="List Table 2 Accent 6" w:uiPriority="47"/>
-    <w:lsdException w:name="Table List 1" w:semiHidden="1" w:unhideWhenUsed="1"/>
-    <w:lsdException w:name="Medium List 1 Accent 3" w:uiPriority="65"/>
-    <w:lsdException w:name="Medium List 2 Accent 5" w:uiPriority="66"/>
-    <w:lsdException w:name="Grid Table Light" w:uiPriority="40"/>
-    <w:lsdException w:name="Placeholder Text" w:uiPriority="99" w:semiHidden="1"/>
-    <w:lsdException w:name="Medium Shading 2 Accent 5" w:uiPriority="64"/>
-    <w:lsdException w:name="Medium Grid 3 Accent 3" w:uiPriority="69"/>
-    <w:lsdException w:name="List Table 6 Colorful Accent 4" w:uiPriority="51"/>
-    <w:lsdException w:name="Light List" w:uiPriority="61"/>
-    <w:lsdException w:name="Smart Link" w:uiPriority="99" w:semiHidden="1" w:unhideWhenUsed="1"/>
-    <w:lsdException w:name="List Table 7 Colorful Accent 4" w:uiPriority="52"/>
-    <w:lsdException w:name="toc 6" w:uiPriority="99"/>
-    <w:lsdException w:name="Default Paragraph Font" w:uiPriority="1" w:semiHidden="1" w:unhideWhenUsed="1"/>
-    <w:lsdException w:name="HTML Sample" w:uiPriority="99"/>
-    <w:lsdException w:name="Colorful Shading Accent 5" w:uiPriority="71"/>
-    <w:lsdException w:name="Medium Grid 2 Accent 6" w:uiPriority="68"/>
-    <w:lsdException w:name="Colorful Grid Accent 3" w:uiPriority="73"/>
-    <w:lsdException w:name="Light Shading Accent 5" w:uiPriority="60"/>
-    <w:lsdException w:name="caption" w:semiHidden="1" w:unhideWhenUsed="1" w:qFormat="1"/>
-    <w:lsdException w:name="Intense Quote" w:uiPriority="99"/>
-    <w:lsdException w:name="Medium Grid 1 Accent 4" w:uiPriority="67"/>
-    <w:lsdException w:name="Grid Table 3 Accent 1" w:uiPriority="48"/>
-    <w:lsdException w:name="Grid Table 5 Dark Accent 4" w:uiPriority="50"/>
-    <w:lsdException w:name="Medium Grid 3" w:uiPriority="69"/>
-    <w:lsdException w:name="Medium List 2 Accent 3" w:uiPriority="66"/>
-    <w:lsdException w:name="Hashtag" w:uiPriority="99" w:semiHidden="1" w:unhideWhenUsed="1"/>
-    <w:lsdException w:name="Grid Table 2 Accent 1" w:uiPriority="47"/>
-    <w:lsdException w:name="heading 9" w:unhideWhenUsed="1" w:qFormat="1"/>
-    <w:lsdException w:name="List Table 4 Accent 5" w:uiPriority="49"/>
-    <w:lsdException w:name="Grid Table 7 Colorful Accent 2" w:uiPriority="52"/>
-    <w:lsdException w:name="Colorful List Accent 6" w:uiPriority="72"/>
-    <w:lsdException w:name="List Table 4 Accent 4" w:uiPriority="49"/>
-    <w:lsdException w:name="Medium Grid 1 Accent 5" w:uiPriority="67"/>
-    <w:lsdException w:name="List Table 7 Colorful" w:uiPriority="52"/>
-    <w:lsdException w:name="List Table 7 Colorful Accent 1" w:uiPriority="52"/>
-    <w:lsdException w:name="List Table 5 Dark Accent 1" w:uiPriority="50"/>
-    <w:lsdException w:name="Medium Shading 2 Accent 6" w:uiPriority="64"/>
-    <w:lsdException w:name="Light List Accent 1" w:uiPriority="61"/>
-    <w:lsdException w:name="Table Web 3" w:semiHidden="1" w:unhideWhenUsed="1"/>
-    <w:lsdException w:name="Colorful List Accent 5" w:uiPriority="72"/>
-    <w:lsdException w:name="List Table 1 Light Accent 2" w:uiPriority="46"/>
-    <w:lsdException w:name="No List" w:uiPriority="99" w:semiHidden="1" w:unhideWhenUsed="1"/>
-    <w:lsdException w:name="List Table 1 Light" w:uiPriority="46"/>
-    <w:lsdException w:name="List Table 1 Light Accent 3" w:uiPriority="46"/>
-    <w:lsdException w:name="Grid Table 7 Colorful Accent 5" w:uiPriority="52"/>
-    <w:lsdException w:name="Grid Table 1 Light Accent 6" w:uiPriority="46"/>
-    <w:lsdException w:name="Medium List 1" w:uiPriority="65"/>
-    <w:lsdException w:name="List Table 4 Accent 2" w:uiPriority="49"/>
-    <w:lsdException w:name="Colorful Grid" w:uiPriority="73"/>
-    <w:lsdException w:name="List Table 2 Accent 2" w:uiPriority="47"/>
-    <w:lsdException w:name="Medium List 2 Accent 2" w:uiPriority="66"/>
-    <w:lsdException w:name="Table Grid 2" w:semiHidden="1" w:unhideWhenUsed="1"/>
-    <w:lsdException w:name="Revision" w:uiPriority="99" w:semiHidden="1"/>
-    <w:lsdException w:name="Light List Accent 6" w:uiPriority="61"/>
-    <w:lsdException w:name="Grid Table 7 Colorful Accent 3" w:uiPriority="52"/>
-    <w:lsdException w:name="Table Simple 1" w:semiHidden="1" w:unhideWhenUsed="1"/>
-    <w:lsdException w:name="Dark List Accent 1" w:uiPriority="70"/>
-    <w:lsdException w:name="Grid Table 5 Dark Accent 1" w:uiPriority="50"/>
-    <w:lsdException w:name="Grid Table 7 Colorful" w:uiPriority="52"/>
-    <w:lsdException w:name="List Table 6 Colorful Accent 3" w:uiPriority="51"/>
-    <w:lsdException w:name="Subtle Reference" w:uiPriority="31" w:qFormat="1"/>
-    <w:lsdException w:name="Medium Grid 1" w:uiPriority="67"/>
-    <w:lsdException w:name="HTML Preformatted" w:uiPriority="99"/>
-    <w:lsdException w:name="Intense Emphasis" w:uiPriority="21" w:qFormat="1"/>
-    <w:lsdException w:name="List Table 1 Light Accent 5" w:uiPriority="46"/>
-    <w:lsdException w:name="Medium Grid 2 Accent 5" w:uiPriority="68"/>
-    <w:lsdException w:name="Medium Shading 1" w:uiPriority="63"/>
     <w:lsdException w:name="Light Shading" w:uiPriority="60"/>
-    <w:lsdException w:name="toc 3" w:uiPriority="99"/>
-    <w:lsdException w:name="Grid Table 1 Light Accent 2" w:uiPriority="46"/>
-    <w:lsdException w:name="HTML Address" w:uiPriority="99"/>
-    <w:lsdException w:name="Light List Accent 2" w:uiPriority="61"/>
-    <w:lsdException w:name="Table Colorful 2" w:semiHidden="1" w:unhideWhenUsed="1"/>
-    <w:lsdException w:name="Normal Table" w:uiPriority="99" w:semiHidden="1" w:unhideWhenUsed="1"/>
-    <w:lsdException w:name="Dark List" w:uiPriority="70"/>
-    <w:lsdException w:name="Grid Table 5 Dark Accent 6" w:uiPriority="50"/>
-    <w:lsdException w:name="Grid Table 1 Light Accent 5" w:uiPriority="46"/>
-    <w:lsdException w:name="Table Columns 4" w:semiHidden="1" w:unhideWhenUsed="1"/>
-    <w:lsdException w:name="Table Subtle 2" w:semiHidden="1" w:unhideWhenUsed="1"/>
-    <w:lsdException w:name="Light List Accent 4" w:uiPriority="61"/>
-    <w:lsdException w:name="Table List 8" w:semiHidden="1" w:unhideWhenUsed="1"/>
-    <w:lsdException w:name="Grid Table 6 Colorful Accent 6" w:uiPriority="51"/>
-    <w:lsdException w:name="Colorful Shading Accent 4" w:uiPriority="71"/>
-    <w:lsdException w:name="Table List 7" w:semiHidden="1" w:unhideWhenUsed="1"/>
-    <w:lsdException w:name="Outline List 1" w:uiPriority="99" w:semiHidden="1" w:unhideWhenUsed="1"/>
-    <w:lsdException w:name="Grid Table 4 Accent 6" w:uiPriority="49"/>
-    <w:lsdException w:name="Medium List 1 Accent 1" w:uiPriority="65"/>
-    <w:lsdException w:name="Table Grid" w:qFormat="1"/>
-    <w:lsdException w:name="heading 1" w:qFormat="1"/>
-    <w:lsdException w:name="Table List 2" w:semiHidden="1" w:unhideWhenUsed="1"/>
-    <w:lsdException w:name="Table Colorful 3" w:semiHidden="1" w:unhideWhenUsed="1"/>
-    <w:lsdException w:name="Colorful Grid Accent 1" w:uiPriority="73"/>
-    <w:lsdException w:name="toc 1" w:uiPriority="99"/>
-    <w:lsdException w:name="Subtitle" w:qFormat="1"/>
-    <w:lsdException w:name="Medium Shading 1 Accent 5" w:uiPriority="63"/>
-    <w:lsdException w:name="Dark List Accent 2" w:uiPriority="70"/>
-    <w:lsdException w:name="List Table 6 Colorful Accent 5" w:uiPriority="51"/>
-    <w:lsdException w:name="Medium Grid 2 Accent 3" w:uiPriority="68"/>
-    <w:lsdException w:name="Light Grid Accent 1" w:uiPriority="62"/>
-    <w:lsdException w:name="Colorful Shading" w:uiPriority="71"/>
-    <w:lsdException w:name="Table List 5" w:semiHidden="1" w:unhideWhenUsed="1"/>
+    <w:lsdException w:name="List Table 3 Accent 3" w:uiPriority="48"/>
   </w:latentStyles>
-  <w:style w:type="paragraph" w:styleId="7flirm">
+  <w:style w:type="paragraph" w:styleId="000018" w:customStyle="1">
+    <w:name w:val="melo-codeblock-Base-theme-para"/>
+    <w:uiPriority w:val="99"/>
+    <w:pPr>
+      <w:snapToGrid w:val="0"/>
+      <w:spacing w:line="360" w:lineRule="auto"/>
+    </w:pPr>
+    <w:rPr>
+      <w:rFonts w:ascii="Monaco" w:hAnsi="Monaco" w:eastAsia="Monaco" w:cs="Monaco"/>
+      <w:color w:val="000000"/>
+      <w:sz w:val="21"/>
+    </w:rPr>
+  </w:style>
+  <w:style w:type="paragraph" w:styleId="b7ecvy">
     <w:name w:val="toc 2"/>
     <w:basedOn w:val="000001"/>
     <w:next w:val="000001"/>
@@ -3946,6 +3959,74 @@
     <w:rPr>
       <w:rFonts w:eastAsiaTheme="minorHAnsi"/>
       <w:smallCaps w:val="1"/>
+      <w:sz w:val="22"/>
+      <w:szCs w:val="22"/>
+    </w:rPr>
+  </w:style>
+  <w:style w:type="character" w:styleId="000014" w:customStyle="1">
+    <w:name w:val="标题 字符"/>
+    <w:basedOn w:val="00000b"/>
+    <w:link w:val="000013"/>
+    <w:rPr>
+      <w:rFonts w:ascii="Arial" w:hAnsi="Arial" w:eastAsia="微软雅黑" w:cstheme="majorBidi"/>
+      <w:b w:val="1"/>
+      <w:bCs w:val="1"/>
+      <w:kern w:val="2"/>
+      <w:sz w:val="48"/>
+      <w:szCs w:val="32"/>
+    </w:rPr>
+  </w:style>
+  <w:style w:type="table" w:styleId="000015">
+    <w:name w:val="Table Grid"/>
+    <w:basedOn w:val="00000c"/>
+    <w:tblPr>
+      <w:tblBorders>
+        <w:top w:val="single" w:color="CBCDD1" w:sz="6" w:space="0"/>
+        <w:left w:val="single" w:color="CBCDD1" w:sz="6" w:space="0"/>
+        <w:bottom w:val="single" w:color="CBCDD1" w:sz="6" w:space="0"/>
+        <w:right w:val="single" w:color="CBCDD1" w:sz="6" w:space="0"/>
+        <w:insideH w:val="single" w:color="CBCDD1" w:sz="6" w:space="0"/>
+        <w:insideV w:val="single" w:color="CBCDD1" w:sz="6" w:space="0"/>
+      </w:tblBorders>
+    </w:tblPr>
+    <w:tcPr>
+      <w:vAlign w:val="center"/>
+    </w:tcPr>
+  </w:style>
+  <w:style w:type="paragraph" w:styleId="vwvnpp">
+    <w:name w:val="toc 3"/>
+    <w:basedOn w:val="000001"/>
+    <w:next w:val="000001"/>
+    <w:autoRedefine w:val="1"/>
+    <w:uiPriority w:val="39"/>
+    <w:unhideWhenUsed w:val="1"/>
+    <w:pPr>
+      <w:ind w:left="420"/>
+      <w:jc w:val="left"/>
+    </w:pPr>
+    <w:rPr>
+      <w:rFonts w:eastAsiaTheme="minorHAnsi"/>
+      <w:iCs w:val="1"/>
+      <w:sz w:val="22"/>
+      <w:szCs w:val="22"/>
+    </w:rPr>
+  </w:style>
+  <w:style w:type="paragraph" w:styleId="9buhbs">
+    <w:name w:val="toc 1"/>
+    <w:basedOn w:val="000001"/>
+    <w:next w:val="000001"/>
+    <w:autoRedefine w:val="1"/>
+    <w:uiPriority w:val="39"/>
+    <w:unhideWhenUsed w:val="1"/>
+    <w:pPr>
+      <w:spacing w:before="120" w:after="120"/>
+      <w:jc w:val="left"/>
+    </w:pPr>
+    <w:rPr>
+      <w:rFonts w:eastAsiaTheme="minorHAnsi"/>
+      <w:b w:val="1"/>
+      <w:bCs w:val="1"/>
+      <w:caps w:val="1"/>
       <w:sz w:val="22"/>
       <w:szCs w:val="22"/>
     </w:rPr>
@@ -3968,7 +4049,7 @@
       <w:szCs w:val="22"/>
     </w:rPr>
   </w:style>
-  <w:style w:type="paragraph" w:styleId="6lteeg">
+  <w:style w:type="paragraph" w:styleId="wdzf10">
     <w:name w:val="toc 2"/>
     <w:basedOn w:val="000001"/>
     <w:next w:val="000001"/>
@@ -3984,6 +4065,65 @@
       <w:smallCaps w:val="1"/>
       <w:sz w:val="22"/>
       <w:szCs w:val="22"/>
+    </w:rPr>
+  </w:style>
+  <w:style w:type="paragraph" w:styleId="000001" w:default="1">
+    <w:name w:val="Normal"/>
+    <w:qFormat w:val="1"/>
+    <w:pPr>
+      <w:widowControl w:val="0"/>
+      <w:spacing w:before="60" w:after="60"/>
+      <w:jc w:val="both"/>
+    </w:pPr>
+    <w:rPr>
+      <w:color w:val="333333"/>
+      <w:kern w:val="2"/>
+      <w:sz w:val="22"/>
+      <w:szCs w:val="24"/>
+    </w:rPr>
+  </w:style>
+  <w:style w:type="character" w:styleId="00000b" w:default="1">
+    <w:name w:val="Default Paragraph Font"/>
+    <w:uiPriority w:val="1"/>
+    <w:semiHidden w:val="1"/>
+    <w:unhideWhenUsed w:val="1"/>
+  </w:style>
+  <w:style w:type="paragraph" w:styleId="000011">
+    <w:name w:val="Subtitle"/>
+    <w:basedOn w:val="000001"/>
+    <w:next w:val="000001"/>
+    <w:link w:val="000012"/>
+    <w:qFormat w:val="1"/>
+    <w:pPr>
+      <w:jc w:val="center"/>
+      <w:outlineLvl w:val="1"/>
+    </w:pPr>
+    <w:rPr>
+      <w:rFonts w:cstheme="minorBidi"/>
+      <w:b w:val="1"/>
+      <w:bCs w:val="1"/>
+      <w:kern w:val="28"/>
+      <w:sz w:val="44"/>
+      <w:szCs w:val="32"/>
+    </w:rPr>
+  </w:style>
+  <w:style w:type="paragraph" w:styleId="000010">
+    <w:name w:val="header"/>
+    <w:basedOn w:val="000001"/>
+    <w:pPr>
+      <w:pBdr>
+        <w:bottom w:val="single" w:color="auto" w:sz="6" w:space="1"/>
+      </w:pBdr>
+      <w:tabs>
+        <w:tab w:val="center" w:pos="4153"/>
+        <w:tab w:val="right" w:pos="8306"/>
+      </w:tabs>
+      <w:snapToGrid w:val="0"/>
+      <w:jc w:val="center"/>
+    </w:pPr>
+    <w:rPr>
+      <w:sz w:val="18"/>
+      <w:szCs w:val="18"/>
     </w:rPr>
   </w:style>
   <w:style w:type="paragraph" w:styleId="h8wprv">
@@ -4004,234 +4144,7 @@
       <w:szCs w:val="22"/>
     </w:rPr>
   </w:style>
-  <w:style w:type="paragraph" w:styleId="00000a">
-    <w:name w:val="heading 9"/>
-    <w:basedOn w:val="000001"/>
-    <w:next w:val="000001"/>
-    <w:unhideWhenUsed w:val="1"/>
-    <w:qFormat w:val="1"/>
-    <w:pPr>
-      <w:keepNext w:val="1"/>
-      <w:keepLines w:val="1"/>
-      <w:spacing w:line="480" w:lineRule="auto"/>
-      <w:outlineLvl w:val="8"/>
-    </w:pPr>
-    <w:rPr>
-      <w:b w:val="1"/>
-    </w:rPr>
-  </w:style>
-  <w:style w:type="paragraph" w:styleId="wdzf10">
-    <w:name w:val="toc 2"/>
-    <w:basedOn w:val="000001"/>
-    <w:next w:val="000001"/>
-    <w:autoRedefine w:val="1"/>
-    <w:uiPriority w:val="39"/>
-    <w:unhideWhenUsed w:val="1"/>
-    <w:pPr>
-      <w:ind w:left="210"/>
-      <w:jc w:val="left"/>
-    </w:pPr>
-    <w:rPr>
-      <w:rFonts w:eastAsiaTheme="minorHAnsi"/>
-      <w:smallCaps w:val="1"/>
-      <w:sz w:val="22"/>
-      <w:szCs w:val="22"/>
-    </w:rPr>
-  </w:style>
-  <w:style w:type="paragraph" w:styleId="000006">
-    <w:name w:val="heading 5"/>
-    <w:basedOn w:val="000001"/>
-    <w:next w:val="000001"/>
-    <w:qFormat w:val="1"/>
-    <w:pPr>
-      <w:keepNext w:val="1"/>
-      <w:keepLines w:val="1"/>
-      <w:spacing w:line="480" w:lineRule="auto"/>
-      <w:outlineLvl w:val="4"/>
-    </w:pPr>
-    <w:rPr>
-      <w:b w:val="1"/>
-    </w:rPr>
-  </w:style>
-  <w:style w:type="paragraph" w:styleId="zwphl0">
-    <w:name w:val="toc 2"/>
-    <w:basedOn w:val="000001"/>
-    <w:next w:val="000001"/>
-    <w:autoRedefine w:val="1"/>
-    <w:uiPriority w:val="39"/>
-    <w:unhideWhenUsed w:val="1"/>
-    <w:pPr>
-      <w:ind w:left="210"/>
-      <w:jc w:val="left"/>
-    </w:pPr>
-    <w:rPr>
-      <w:rFonts w:eastAsiaTheme="minorHAnsi"/>
-      <w:smallCaps w:val="1"/>
-      <w:sz w:val="22"/>
-      <w:szCs w:val="22"/>
-    </w:rPr>
-  </w:style>
-  <w:style w:type="paragraph" w:styleId="000002">
-    <w:name w:val="heading 1"/>
-    <w:basedOn w:val="000001"/>
-    <w:next w:val="000001"/>
-    <w:qFormat w:val="1"/>
-    <w:pPr>
-      <w:keepNext w:val="1"/>
-      <w:keepLines w:val="1"/>
-      <w:outlineLvl w:val="0"/>
-    </w:pPr>
-    <w:rPr>
-      <w:b w:val="1"/>
-      <w:kern w:val="44"/>
-      <w:sz w:val="36"/>
-    </w:rPr>
-  </w:style>
-  <w:style w:type="paragraph" w:styleId="vwvnpp">
-    <w:name w:val="toc 3"/>
-    <w:basedOn w:val="000001"/>
-    <w:next w:val="000001"/>
-    <w:autoRedefine w:val="1"/>
-    <w:uiPriority w:val="39"/>
-    <w:unhideWhenUsed w:val="1"/>
-    <w:pPr>
-      <w:ind w:left="420"/>
-      <w:jc w:val="left"/>
-    </w:pPr>
-    <w:rPr>
-      <w:rFonts w:eastAsiaTheme="minorHAnsi"/>
-      <w:iCs w:val="1"/>
-      <w:sz w:val="22"/>
-      <w:szCs w:val="22"/>
-    </w:rPr>
-  </w:style>
-  <w:style w:type="character" w:styleId="00000b" w:default="1">
-    <w:name w:val="Default Paragraph Font"/>
-    <w:uiPriority w:val="1"/>
-    <w:semiHidden w:val="1"/>
-    <w:unhideWhenUsed w:val="1"/>
-  </w:style>
-  <w:style w:type="paragraph" w:styleId="000018" w:customStyle="1">
-    <w:name w:val="melo-codeblock-Base-theme-para"/>
-    <w:uiPriority w:val="99"/>
-    <w:pPr>
-      <w:snapToGrid w:val="0"/>
-      <w:spacing w:line="360" w:lineRule="auto"/>
-    </w:pPr>
-    <w:rPr>
-      <w:rFonts w:ascii="Monaco" w:hAnsi="Monaco" w:eastAsia="Monaco" w:cs="Monaco"/>
-      <w:color w:val="000000"/>
-      <w:sz w:val="21"/>
-    </w:rPr>
-  </w:style>
-  <w:style w:type="paragraph" w:styleId="00000f">
-    <w:name w:val="footer"/>
-    <w:basedOn w:val="000001"/>
-    <w:pPr>
-      <w:tabs>
-        <w:tab w:val="center" w:pos="4153"/>
-        <w:tab w:val="right" w:pos="8306"/>
-      </w:tabs>
-      <w:snapToGrid w:val="0"/>
-      <w:jc w:val="center"/>
-    </w:pPr>
-    <w:rPr>
-      <w:sz w:val="18"/>
-      <w:szCs w:val="18"/>
-    </w:rPr>
-  </w:style>
-  <w:style w:type="paragraph" w:styleId="000007">
-    <w:name w:val="heading 6"/>
-    <w:basedOn w:val="000001"/>
-    <w:next w:val="000001"/>
-    <w:qFormat w:val="1"/>
-    <w:pPr>
-      <w:keepNext w:val="1"/>
-      <w:keepLines w:val="1"/>
-      <w:spacing w:line="480" w:lineRule="auto"/>
-      <w:outlineLvl w:val="5"/>
-    </w:pPr>
-    <w:rPr>
-      <w:b w:val="1"/>
-    </w:rPr>
-  </w:style>
-  <w:style w:type="paragraph" w:styleId="000001" w:default="1">
-    <w:name w:val="Normal"/>
-    <w:qFormat w:val="1"/>
-    <w:pPr>
-      <w:widowControl w:val="0"/>
-      <w:spacing w:before="60" w:after="60"/>
-      <w:jc w:val="both"/>
-    </w:pPr>
-    <w:rPr>
-      <w:color w:val="333333"/>
-      <w:kern w:val="2"/>
-      <w:sz w:val="22"/>
-      <w:szCs w:val="24"/>
-    </w:rPr>
-  </w:style>
-  <w:style w:type="character" w:styleId="000017" w:customStyle="1">
-    <w:name w:val="melo-codeblock-Base-theme-char"/>
-    <w:uiPriority w:val="99"/>
-    <w:rPr>
-      <w:rFonts w:ascii="Monaco" w:hAnsi="Monaco" w:eastAsia="Monaco" w:cs="Monaco"/>
-      <w:color w:val="000000"/>
-      <w:sz w:val="21"/>
-    </w:rPr>
-  </w:style>
-  <w:style w:type="paragraph" w:styleId="ohqvve">
-    <w:name w:val="toc 2"/>
-    <w:basedOn w:val="000001"/>
-    <w:next w:val="000001"/>
-    <w:autoRedefine w:val="1"/>
-    <w:uiPriority w:val="39"/>
-    <w:unhideWhenUsed w:val="1"/>
-    <w:pPr>
-      <w:ind w:left="210"/>
-      <w:jc w:val="left"/>
-    </w:pPr>
-    <w:rPr>
-      <w:rFonts w:eastAsiaTheme="minorHAnsi"/>
-      <w:smallCaps w:val="1"/>
-      <w:sz w:val="22"/>
-      <w:szCs w:val="22"/>
-    </w:rPr>
-  </w:style>
-  <w:style w:type="paragraph" w:styleId="000011">
-    <w:name w:val="Subtitle"/>
-    <w:basedOn w:val="000001"/>
-    <w:next w:val="000001"/>
-    <w:link w:val="000012"/>
-    <w:qFormat w:val="1"/>
-    <w:pPr>
-      <w:jc w:val="center"/>
-      <w:outlineLvl w:val="1"/>
-    </w:pPr>
-    <w:rPr>
-      <w:rFonts w:cstheme="minorBidi"/>
-      <w:b w:val="1"/>
-      <w:bCs w:val="1"/>
-      <w:kern w:val="28"/>
-      <w:sz w:val="44"/>
-      <w:szCs w:val="32"/>
-    </w:rPr>
-  </w:style>
-  <w:style w:type="table" w:styleId="00000c" w:default="1">
-    <w:name w:val="Normal Table"/>
-    <w:uiPriority w:val="99"/>
-    <w:semiHidden w:val="1"/>
-    <w:unhideWhenUsed w:val="1"/>
-    <w:tblPr>
-      <w:tblInd w:w="0" w:type="dxa"/>
-      <w:tblCellMar>
-        <w:top w:w="0" w:type="dxa"/>
-        <w:left w:w="108" w:type="dxa"/>
-        <w:bottom w:w="0" w:type="dxa"/>
-        <w:right w:w="108" w:type="dxa"/>
-      </w:tblCellMar>
-    </w:tblPr>
-  </w:style>
-  <w:style w:type="paragraph" w:styleId="b7ecvy">
+  <w:style w:type="paragraph" w:styleId="2e4cod">
     <w:name w:val="toc 2"/>
     <w:basedOn w:val="000001"/>
     <w:next w:val="000001"/>
@@ -4262,43 +4175,40 @@
       <w:szCs w:val="32"/>
     </w:rPr>
   </w:style>
-  <w:style w:type="paragraph" w:styleId="bshjqi">
-    <w:name w:val="toc 1"/>
+  <w:style w:type="paragraph" w:styleId="1vk9h8">
+    <w:name w:val="toc 3"/>
     <w:basedOn w:val="000001"/>
     <w:next w:val="000001"/>
     <w:autoRedefine w:val="1"/>
     <w:uiPriority w:val="39"/>
     <w:unhideWhenUsed w:val="1"/>
     <w:pPr>
-      <w:spacing w:before="120" w:after="120"/>
+      <w:ind w:left="420"/>
       <w:jc w:val="left"/>
     </w:pPr>
     <w:rPr>
       <w:rFonts w:eastAsiaTheme="minorHAnsi"/>
-      <w:b w:val="1"/>
-      <w:bCs w:val="1"/>
-      <w:caps w:val="1"/>
+      <w:iCs w:val="1"/>
       <w:sz w:val="22"/>
       <w:szCs w:val="22"/>
     </w:rPr>
   </w:style>
-  <w:style w:type="paragraph" w:styleId="000010">
-    <w:name w:val="header"/>
+  <w:style w:type="paragraph" w:styleId="ohqvve">
+    <w:name w:val="toc 2"/>
     <w:basedOn w:val="000001"/>
+    <w:next w:val="000001"/>
+    <w:autoRedefine w:val="1"/>
+    <w:uiPriority w:val="39"/>
+    <w:unhideWhenUsed w:val="1"/>
     <w:pPr>
-      <w:pBdr>
-        <w:bottom w:val="single" w:color="auto" w:sz="6" w:space="1"/>
-      </w:pBdr>
-      <w:tabs>
-        <w:tab w:val="center" w:pos="4153"/>
-        <w:tab w:val="right" w:pos="8306"/>
-      </w:tabs>
-      <w:snapToGrid w:val="0"/>
-      <w:jc w:val="center"/>
+      <w:ind w:left="210"/>
+      <w:jc w:val="left"/>
     </w:pPr>
     <w:rPr>
-      <w:sz w:val="18"/>
-      <w:szCs w:val="18"/>
+      <w:rFonts w:eastAsiaTheme="minorHAnsi"/>
+      <w:smallCaps w:val="1"/>
+      <w:sz w:val="22"/>
+      <w:szCs w:val="22"/>
     </w:rPr>
   </w:style>
   <w:style w:type="paragraph" w:styleId="iukpf3">
@@ -4319,77 +4229,22 @@
       <w:szCs w:val="22"/>
     </w:rPr>
   </w:style>
-  <w:style w:type="paragraph" w:styleId="000004">
-    <w:name w:val="heading 3"/>
-    <w:basedOn w:val="000001"/>
-    <w:next w:val="000001"/>
-    <w:qFormat w:val="1"/>
-    <w:pPr>
-      <w:keepNext w:val="1"/>
-      <w:keepLines w:val="1"/>
-      <w:outlineLvl w:val="2"/>
-    </w:pPr>
-    <w:rPr>
-      <w:b w:val="1"/>
-      <w:sz w:val="28"/>
-    </w:rPr>
-  </w:style>
-  <w:style w:type="paragraph" w:styleId="64a5ey">
-    <w:name w:val="toc 3"/>
+  <w:style w:type="paragraph" w:styleId="d9qtoo">
+    <w:name w:val="toc 1"/>
     <w:basedOn w:val="000001"/>
     <w:next w:val="000001"/>
     <w:autoRedefine w:val="1"/>
     <w:uiPriority w:val="39"/>
     <w:unhideWhenUsed w:val="1"/>
     <w:pPr>
-      <w:ind w:left="420"/>
+      <w:spacing w:before="120" w:after="120"/>
       <w:jc w:val="left"/>
     </w:pPr>
     <w:rPr>
       <w:rFonts w:eastAsiaTheme="minorHAnsi"/>
-      <w:iCs w:val="1"/>
-      <w:sz w:val="22"/>
-      <w:szCs w:val="22"/>
-    </w:rPr>
-  </w:style>
-  <w:style w:type="paragraph" w:styleId="000013">
-    <w:name w:val="Title"/>
-    <w:basedOn w:val="000001"/>
-    <w:next w:val="000001"/>
-    <w:link w:val="000014"/>
-    <w:qFormat w:val="1"/>
-    <w:pPr>
-      <w:jc w:val="center"/>
-      <w:outlineLvl w:val="0"/>
-    </w:pPr>
-    <w:rPr>
-      <w:rFonts w:cstheme="majorBidi"/>
       <w:b w:val="1"/>
       <w:bCs w:val="1"/>
-      <w:sz w:val="48"/>
-      <w:szCs w:val="32"/>
-    </w:rPr>
-  </w:style>
-  <w:style w:type="numbering" w:styleId="00000d" w:default="1">
-    <w:name w:val="No List"/>
-    <w:uiPriority w:val="99"/>
-    <w:semiHidden w:val="1"/>
-    <w:unhideWhenUsed w:val="1"/>
-  </w:style>
-  <w:style w:type="paragraph" w:styleId="iwzifo">
-    <w:name w:val="toc 3"/>
-    <w:basedOn w:val="000001"/>
-    <w:next w:val="000001"/>
-    <w:autoRedefine w:val="1"/>
-    <w:uiPriority w:val="39"/>
-    <w:unhideWhenUsed w:val="1"/>
-    <w:pPr>
-      <w:ind w:left="420"/>
-      <w:jc w:val="left"/>
-    </w:pPr>
-    <w:rPr>
-      <w:rFonts w:eastAsiaTheme="minorHAnsi"/>
-      <w:iCs w:val="1"/>
+      <w:caps w:val="1"/>
       <w:sz w:val="22"/>
       <w:szCs w:val="22"/>
     </w:rPr>
@@ -4409,7 +4264,23 @@
       <w:sz w:val="32"/>
     </w:rPr>
   </w:style>
-  <w:style w:type="paragraph" w:styleId="9buhbs">
+  <w:style w:type="paragraph" w:styleId="000009">
+    <w:name w:val="heading 8"/>
+    <w:basedOn w:val="000001"/>
+    <w:next w:val="000001"/>
+    <w:unhideWhenUsed w:val="1"/>
+    <w:qFormat w:val="1"/>
+    <w:pPr>
+      <w:keepNext w:val="1"/>
+      <w:keepLines w:val="1"/>
+      <w:spacing w:line="480" w:lineRule="auto"/>
+      <w:outlineLvl w:val="7"/>
+    </w:pPr>
+    <w:rPr>
+      <w:b w:val="1"/>
+    </w:rPr>
+  </w:style>
+  <w:style w:type="paragraph" w:styleId="bshjqi">
     <w:name w:val="toc 1"/>
     <w:basedOn w:val="000001"/>
     <w:next w:val="000001"/>
@@ -4425,24 +4296,6 @@
       <w:b w:val="1"/>
       <w:bCs w:val="1"/>
       <w:caps w:val="1"/>
-      <w:sz w:val="22"/>
-      <w:szCs w:val="22"/>
-    </w:rPr>
-  </w:style>
-  <w:style w:type="paragraph" w:styleId="m2crkd">
-    <w:name w:val="toc 2"/>
-    <w:basedOn w:val="000001"/>
-    <w:next w:val="000001"/>
-    <w:autoRedefine w:val="1"/>
-    <w:uiPriority w:val="39"/>
-    <w:unhideWhenUsed w:val="1"/>
-    <w:pPr>
-      <w:ind w:left="210"/>
-      <w:jc w:val="left"/>
-    </w:pPr>
-    <w:rPr>
-      <w:rFonts w:eastAsiaTheme="minorHAnsi"/>
-      <w:smallCaps w:val="1"/>
       <w:sz w:val="22"/>
       <w:szCs w:val="22"/>
     </w:rPr>
@@ -4481,7 +4334,90 @@
       <w:b w:val="1"/>
     </w:rPr>
   </w:style>
-  <w:style w:type="paragraph" w:styleId="1vk9h8">
+  <w:style w:type="table" w:styleId="00000c" w:default="1">
+    <w:name w:val="Normal Table"/>
+    <w:uiPriority w:val="99"/>
+    <w:semiHidden w:val="1"/>
+    <w:unhideWhenUsed w:val="1"/>
+    <w:tblPr>
+      <w:tblInd w:w="0" w:type="dxa"/>
+      <w:tblCellMar>
+        <w:top w:w="0" w:type="dxa"/>
+        <w:left w:w="108" w:type="dxa"/>
+        <w:bottom w:w="0" w:type="dxa"/>
+        <w:right w:w="108" w:type="dxa"/>
+      </w:tblCellMar>
+    </w:tblPr>
+  </w:style>
+  <w:style w:type="paragraph" w:styleId="00000f">
+    <w:name w:val="footer"/>
+    <w:basedOn w:val="000001"/>
+    <w:pPr>
+      <w:tabs>
+        <w:tab w:val="center" w:pos="4153"/>
+        <w:tab w:val="right" w:pos="8306"/>
+      </w:tabs>
+      <w:snapToGrid w:val="0"/>
+      <w:jc w:val="center"/>
+    </w:pPr>
+    <w:rPr>
+      <w:sz w:val="18"/>
+      <w:szCs w:val="18"/>
+    </w:rPr>
+  </w:style>
+  <w:style w:type="paragraph" w:styleId="00000e">
+    <w:name w:val="toc 8"/>
+    <w:basedOn w:val="000001"/>
+    <w:next w:val="000001"/>
+    <w:autoRedefine w:val="1"/>
+    <w:uiPriority w:val="99"/>
+    <w:pPr>
+      <w:ind w:left="2940" w:leftChars="1400"/>
+    </w:pPr>
+  </w:style>
+  <w:style w:type="character" w:styleId="000017" w:customStyle="1">
+    <w:name w:val="melo-codeblock-Base-theme-char"/>
+    <w:uiPriority w:val="99"/>
+    <w:rPr>
+      <w:rFonts w:ascii="Monaco" w:hAnsi="Monaco" w:eastAsia="Monaco" w:cs="Monaco"/>
+      <w:color w:val="000000"/>
+      <w:sz w:val="21"/>
+    </w:rPr>
+  </w:style>
+  <w:style w:type="paragraph" w:styleId="000004">
+    <w:name w:val="heading 3"/>
+    <w:basedOn w:val="000001"/>
+    <w:next w:val="000001"/>
+    <w:qFormat w:val="1"/>
+    <w:pPr>
+      <w:keepNext w:val="1"/>
+      <w:keepLines w:val="1"/>
+      <w:outlineLvl w:val="2"/>
+    </w:pPr>
+    <w:rPr>
+      <w:b w:val="1"/>
+      <w:sz w:val="28"/>
+    </w:rPr>
+  </w:style>
+  <w:style w:type="paragraph" w:styleId="000013">
+    <w:name w:val="Title"/>
+    <w:basedOn w:val="000001"/>
+    <w:next w:val="000001"/>
+    <w:link w:val="000014"/>
+    <w:qFormat w:val="1"/>
+    <w:pPr>
+      <w:jc w:val="center"/>
+      <w:outlineLvl w:val="0"/>
+    </w:pPr>
+    <w:rPr>
+      <w:rFonts w:cstheme="majorBidi"/>
+      <w:b w:val="1"/>
+      <w:bCs w:val="1"/>
+      <w:sz w:val="48"/>
+      <w:szCs w:val="32"/>
+    </w:rPr>
+  </w:style>
+  <w:style w:type="paragraph" w:styleId="iwzifo">
     <w:name w:val="toc 3"/>
     <w:basedOn w:val="000001"/>
     <w:next w:val="000001"/>
@@ -4499,59 +4435,14 @@
       <w:szCs w:val="22"/>
     </w:rPr>
   </w:style>
-  <w:style w:type="paragraph" w:styleId="d9qtoo">
-    <w:name w:val="toc 1"/>
-    <w:basedOn w:val="000001"/>
-    <w:next w:val="000001"/>
-    <w:autoRedefine w:val="1"/>
-    <w:uiPriority w:val="39"/>
+  <w:style w:type="numbering" w:styleId="00000d" w:default="1">
+    <w:name w:val="No List"/>
+    <w:uiPriority w:val="99"/>
+    <w:semiHidden w:val="1"/>
     <w:unhideWhenUsed w:val="1"/>
-    <w:pPr>
-      <w:spacing w:before="120" w:after="120"/>
-      <w:jc w:val="left"/>
-    </w:pPr>
-    <w:rPr>
-      <w:rFonts w:eastAsiaTheme="minorHAnsi"/>
-      <w:b w:val="1"/>
-      <w:bCs w:val="1"/>
-      <w:caps w:val="1"/>
-      <w:sz w:val="22"/>
-      <w:szCs w:val="22"/>
-    </w:rPr>
   </w:style>
-  <w:style w:type="character" w:styleId="000014" w:customStyle="1">
-    <w:name w:val="标题 字符"/>
-    <w:basedOn w:val="00000b"/>
-    <w:link w:val="000013"/>
-    <w:rPr>
-      <w:rFonts w:ascii="Arial" w:hAnsi="Arial" w:eastAsia="微软雅黑" w:cstheme="majorBidi"/>
-      <w:b w:val="1"/>
-      <w:bCs w:val="1"/>
-      <w:kern w:val="2"/>
-      <w:sz w:val="48"/>
-      <w:szCs w:val="32"/>
-    </w:rPr>
-  </w:style>
-  <w:style w:type="paragraph" w:styleId="2e4cod">
-    <w:name w:val="toc 2"/>
-    <w:basedOn w:val="000001"/>
-    <w:next w:val="000001"/>
-    <w:autoRedefine w:val="1"/>
-    <w:uiPriority w:val="39"/>
-    <w:unhideWhenUsed w:val="1"/>
-    <w:pPr>
-      <w:ind w:left="210"/>
-      <w:jc w:val="left"/>
-    </w:pPr>
-    <w:rPr>
-      <w:rFonts w:eastAsiaTheme="minorHAnsi"/>
-      <w:smallCaps w:val="1"/>
-      <w:sz w:val="22"/>
-      <w:szCs w:val="22"/>
-    </w:rPr>
-  </w:style>
-  <w:style w:type="paragraph" w:styleId="000009">
-    <w:name w:val="heading 8"/>
+  <w:style w:type="paragraph" w:styleId="00000a">
+    <w:name w:val="heading 9"/>
     <w:basedOn w:val="000001"/>
     <w:next w:val="000001"/>
     <w:unhideWhenUsed w:val="1"/>
@@ -4560,7 +4451,7 @@
       <w:keepNext w:val="1"/>
       <w:keepLines w:val="1"/>
       <w:spacing w:line="480" w:lineRule="auto"/>
-      <w:outlineLvl w:val="7"/>
+      <w:outlineLvl w:val="8"/>
     </w:pPr>
     <w:rPr>
       <w:b w:val="1"/>
@@ -4581,6 +4472,150 @@
       <w:sz w:val="24"/>
     </w:rPr>
   </w:style>
+  <w:style w:type="paragraph" w:styleId="000007">
+    <w:name w:val="heading 6"/>
+    <w:basedOn w:val="000001"/>
+    <w:next w:val="000001"/>
+    <w:qFormat w:val="1"/>
+    <w:pPr>
+      <w:keepNext w:val="1"/>
+      <w:keepLines w:val="1"/>
+      <w:spacing w:line="480" w:lineRule="auto"/>
+      <w:outlineLvl w:val="5"/>
+    </w:pPr>
+    <w:rPr>
+      <w:b w:val="1"/>
+    </w:rPr>
+  </w:style>
+  <w:style w:type="paragraph" w:styleId="7flirm">
+    <w:name w:val="toc 2"/>
+    <w:basedOn w:val="000001"/>
+    <w:next w:val="000001"/>
+    <w:autoRedefine w:val="1"/>
+    <w:uiPriority w:val="39"/>
+    <w:unhideWhenUsed w:val="1"/>
+    <w:pPr>
+      <w:ind w:left="210"/>
+      <w:jc w:val="left"/>
+    </w:pPr>
+    <w:rPr>
+      <w:rFonts w:eastAsiaTheme="minorHAnsi"/>
+      <w:smallCaps w:val="1"/>
+      <w:sz w:val="22"/>
+      <w:szCs w:val="22"/>
+    </w:rPr>
+  </w:style>
+  <w:style w:type="paragraph" w:styleId="zwphl0">
+    <w:name w:val="toc 2"/>
+    <w:basedOn w:val="000001"/>
+    <w:next w:val="000001"/>
+    <w:autoRedefine w:val="1"/>
+    <w:uiPriority w:val="39"/>
+    <w:unhideWhenUsed w:val="1"/>
+    <w:pPr>
+      <w:ind w:left="210"/>
+      <w:jc w:val="left"/>
+    </w:pPr>
+    <w:rPr>
+      <w:rFonts w:eastAsiaTheme="minorHAnsi"/>
+      <w:smallCaps w:val="1"/>
+      <w:sz w:val="22"/>
+      <w:szCs w:val="22"/>
+    </w:rPr>
+  </w:style>
+  <w:style w:type="paragraph" w:styleId="m2crkd">
+    <w:name w:val="toc 2"/>
+    <w:basedOn w:val="000001"/>
+    <w:next w:val="000001"/>
+    <w:autoRedefine w:val="1"/>
+    <w:uiPriority w:val="39"/>
+    <w:unhideWhenUsed w:val="1"/>
+    <w:pPr>
+      <w:ind w:left="210"/>
+      <w:jc w:val="left"/>
+    </w:pPr>
+    <w:rPr>
+      <w:rFonts w:eastAsiaTheme="minorHAnsi"/>
+      <w:smallCaps w:val="1"/>
+      <w:sz w:val="22"/>
+      <w:szCs w:val="22"/>
+    </w:rPr>
+  </w:style>
+  <w:style w:type="paragraph" w:styleId="6lteeg">
+    <w:name w:val="toc 2"/>
+    <w:basedOn w:val="000001"/>
+    <w:next w:val="000001"/>
+    <w:autoRedefine w:val="1"/>
+    <w:uiPriority w:val="39"/>
+    <w:unhideWhenUsed w:val="1"/>
+    <w:pPr>
+      <w:ind w:left="210"/>
+      <w:jc w:val="left"/>
+    </w:pPr>
+    <w:rPr>
+      <w:rFonts w:eastAsiaTheme="minorHAnsi"/>
+      <w:smallCaps w:val="1"/>
+      <w:sz w:val="22"/>
+      <w:szCs w:val="22"/>
+    </w:rPr>
+  </w:style>
+  <w:style w:type="paragraph" w:styleId="000006">
+    <w:name w:val="heading 5"/>
+    <w:basedOn w:val="000001"/>
+    <w:next w:val="000001"/>
+    <w:qFormat w:val="1"/>
+    <w:pPr>
+      <w:keepNext w:val="1"/>
+      <w:keepLines w:val="1"/>
+      <w:spacing w:line="480" w:lineRule="auto"/>
+      <w:outlineLvl w:val="4"/>
+    </w:pPr>
+    <w:rPr>
+      <w:b w:val="1"/>
+    </w:rPr>
+  </w:style>
+  <w:style w:type="paragraph" w:styleId="000002">
+    <w:name w:val="heading 1"/>
+    <w:basedOn w:val="000001"/>
+    <w:next w:val="000001"/>
+    <w:qFormat w:val="1"/>
+    <w:pPr>
+      <w:keepNext w:val="1"/>
+      <w:keepLines w:val="1"/>
+      <w:outlineLvl w:val="0"/>
+    </w:pPr>
+    <w:rPr>
+      <w:b w:val="1"/>
+      <w:kern w:val="44"/>
+      <w:sz w:val="36"/>
+    </w:rPr>
+  </w:style>
+  <w:style w:type="character" w:styleId="000016">
+    <w:name w:val="Hyperlink"/>
+    <w:basedOn w:val="00000b"/>
+    <w:rPr>
+      <w:color w:val="1E6FFF"/>
+      <w:u w:val="single"/>
+    </w:rPr>
+  </w:style>
+  <w:style w:type="paragraph" w:styleId="64a5ey">
+    <w:name w:val="toc 3"/>
+    <w:basedOn w:val="000001"/>
+    <w:next w:val="000001"/>
+    <w:autoRedefine w:val="1"/>
+    <w:uiPriority w:val="39"/>
+    <w:unhideWhenUsed w:val="1"/>
+    <w:pPr>
+      <w:ind w:left="420"/>
+      <w:jc w:val="left"/>
+    </w:pPr>
+    <w:rPr>
+      <w:rFonts w:eastAsiaTheme="minorHAnsi"/>
+      <w:iCs w:val="1"/>
+      <w:sz w:val="22"/>
+      <w:szCs w:val="22"/>
+    </w:rPr>
+  </w:style>
   <w:style w:type="paragraph" w:styleId="j02txd">
     <w:name w:val="toc 3"/>
     <w:basedOn w:val="000001"/>
@@ -4598,41 +4633,6 @@
       <w:sz w:val="22"/>
       <w:szCs w:val="22"/>
     </w:rPr>
-  </w:style>
-  <w:style w:type="character" w:styleId="000016">
-    <w:name w:val="Hyperlink"/>
-    <w:basedOn w:val="00000b"/>
-    <w:rPr>
-      <w:color w:val="1E6FFF"/>
-      <w:u w:val="single"/>
-    </w:rPr>
-  </w:style>
-  <w:style w:type="table" w:styleId="000015">
-    <w:name w:val="Table Grid"/>
-    <w:basedOn w:val="00000c"/>
-    <w:tblPr>
-      <w:tblBorders>
-        <w:top w:val="single" w:color="CBCDD1" w:sz="6" w:space="0"/>
-        <w:left w:val="single" w:color="CBCDD1" w:sz="6" w:space="0"/>
-        <w:bottom w:val="single" w:color="CBCDD1" w:sz="6" w:space="0"/>
-        <w:right w:val="single" w:color="CBCDD1" w:sz="6" w:space="0"/>
-        <w:insideH w:val="single" w:color="CBCDD1" w:sz="6" w:space="0"/>
-        <w:insideV w:val="single" w:color="CBCDD1" w:sz="6" w:space="0"/>
-      </w:tblBorders>
-    </w:tblPr>
-    <w:tcPr>
-      <w:vAlign w:val="center"/>
-    </w:tcPr>
-  </w:style>
-  <w:style w:type="paragraph" w:styleId="00000e">
-    <w:name w:val="toc 8"/>
-    <w:basedOn w:val="000001"/>
-    <w:next w:val="000001"/>
-    <w:autoRedefine w:val="1"/>
-    <w:uiPriority w:val="99"/>
-    <w:pPr>
-      <w:ind w:left="2940" w:leftChars="1400"/>
-    </w:pPr>
   </w:style>
 </w:styles>
 </file>

</xml_diff>

<commit_message>
Update slime art, monster groups and random spawn design
</commit_message>
<xml_diff>
--- a/Word/《英雄酒馆》立项规划.docx
+++ b/Word/《英雄酒馆》立项规划.docx
@@ -2451,7 +2451,7 @@
         <w:rPr>
           <w:rFonts w:hint="eastAsia"/>
         </w:rPr>
-        <w:t>初始小镇周边拥有1个怪物刷新区域。随着游戏的进行，会出现更多怪物刷新区域。</w:t>
+        <w:t>初始小镇周边拥有1个怪物刷新区域，随着游戏进行开放更多区域。怪物按组刷新，每次从已开放且容量足够的场地中随机选择，不为场地预设固定怪种。</w:t>
       </w:r>
     </w:p>
     <w:p>
@@ -2470,7 +2470,7 @@
         <w:rPr>
           <w:rFonts w:hint="eastAsia"/>
         </w:rPr>
-        <w:t>怪物刷新后，占卜师、画家、吟游诗人将分别获得怪物的位置，形象，属性情报。</w:t>
+        <w:t>怪物组刷新后，占卜师、画家、吟游诗人将分别获得该组的实际位置、形象和属性情报，并记录组内存活数量；情报和后续悬赏沿用同一怪物组实例。</w:t>
       </w:r>
     </w:p>
     <w:p>
@@ -2490,7 +2490,7 @@
         <w:rPr>
           <w:rFonts w:hint="eastAsia"/>
         </w:rPr>
-        <w:t>怪物刷新一段时间后，将进入狩猎阶段。其将逐步靠近小镇区域，并根据其饥饿状态开始攻击所有角色，每击杀一名角色为其提供1点饱食度。饱食度超过50%时，减缓攻击的频率。饱食度满时停止攻击。</w:t>
+        <w:t>怪物组刷新一段时间后进入狩猎阶段，整组逐步靠近小镇区域。组内个体根据自身饥饿状态攻击角色，每击杀一名角色为该个体提供1点饱食度；超过50%时减缓攻击频率，饱食度满时停止攻击。</w:t>
       </w:r>
     </w:p>
     <w:p>
@@ -2652,6 +2652,43 @@
 <file path=word/numbering.xml><?xml version="1.0" encoding="utf-8"?>
 <w:numbering xmlns:w="http://schemas.openxmlformats.org/wordprocessingml/2006/main">
   <w:abstractNum w:abstractNumId="0">
+    <w:lvl w:ilvl="6">
+      <w:start w:val="1"/>
+      <w:numFmt w:val="decimal"/>
+      <w:lvlText w:val="%7."/>
+      <w:lvlJc w:val="left"/>
+      <w:pPr>
+        <w:ind w:left="2976" w:hanging="336"/>
+      </w:pPr>
+    </w:lvl>
+    <w:lvl w:ilvl="7">
+      <w:start w:val="1"/>
+      <w:numFmt w:val="lowerLetter"/>
+      <w:lvlText w:val="%8."/>
+      <w:lvlJc w:val="left"/>
+      <w:pPr>
+        <w:ind w:left="3416" w:hanging="336"/>
+      </w:pPr>
+    </w:lvl>
+    <w:lvl w:ilvl="0">
+      <w:start w:val="1"/>
+      <w:numFmt w:val="decimal"/>
+      <w:lvlText w:val="%1."/>
+      <w:lvlJc w:val="left"/>
+      <w:pPr>
+        <w:ind w:left="336" w:hanging="336"/>
+      </w:pPr>
+      <w:rPr/>
+    </w:lvl>
+    <w:lvl w:ilvl="3">
+      <w:start w:val="1"/>
+      <w:numFmt w:val="decimal"/>
+      <w:lvlText w:val="%4."/>
+      <w:lvlJc w:val="left"/>
+      <w:pPr>
+        <w:ind w:left="1656" w:hanging="336"/>
+      </w:pPr>
+    </w:lvl>
     <w:lvl w:ilvl="8">
       <w:start w:val="1"/>
       <w:numFmt w:val="lowerRoman"/>
@@ -2661,6 +2698,15 @@
         <w:ind w:left="3856" w:hanging="336"/>
       </w:pPr>
     </w:lvl>
+    <w:lvl w:ilvl="1">
+      <w:start w:val="1"/>
+      <w:numFmt w:val="lowerLetter"/>
+      <w:lvlText w:val="%2."/>
+      <w:lvlJc w:val="left"/>
+      <w:pPr>
+        <w:ind w:left="776" w:hanging="336"/>
+      </w:pPr>
+    </w:lvl>
     <w:lvl w:ilvl="5">
       <w:start w:val="1"/>
       <w:numFmt w:val="lowerRoman"/>
@@ -2670,6 +2716,53 @@
         <w:ind w:left="2536" w:hanging="336"/>
       </w:pPr>
     </w:lvl>
+    <w:lvl w:ilvl="2">
+      <w:start w:val="1"/>
+      <w:numFmt w:val="lowerRoman"/>
+      <w:lvlText w:val="%3."/>
+      <w:lvlJc w:val="left"/>
+      <w:pPr>
+        <w:ind w:left="1216" w:hanging="336"/>
+      </w:pPr>
+    </w:lvl>
+    <w:lvl w:ilvl="4">
+      <w:start w:val="1"/>
+      <w:numFmt w:val="lowerLetter"/>
+      <w:lvlText w:val="%5."/>
+      <w:lvlJc w:val="left"/>
+      <w:pPr>
+        <w:ind w:left="2096" w:hanging="336"/>
+      </w:pPr>
+    </w:lvl>
+  </w:abstractNum>
+  <w:abstractNum w:abstractNumId="1">
+    <w:lvl w:ilvl="2">
+      <w:start w:val="1"/>
+      <w:numFmt w:val="lowerRoman"/>
+      <w:lvlText w:val="%3."/>
+      <w:lvlJc w:val="left"/>
+      <w:pPr>
+        <w:ind w:left="1216" w:hanging="336"/>
+      </w:pPr>
+    </w:lvl>
+    <w:lvl w:ilvl="7">
+      <w:start w:val="1"/>
+      <w:numFmt w:val="lowerLetter"/>
+      <w:lvlText w:val="%8."/>
+      <w:lvlJc w:val="left"/>
+      <w:pPr>
+        <w:ind w:left="3416" w:hanging="336"/>
+      </w:pPr>
+    </w:lvl>
+    <w:lvl w:ilvl="1">
+      <w:start w:val="1"/>
+      <w:numFmt w:val="lowerLetter"/>
+      <w:lvlText w:val="%2."/>
+      <w:lvlJc w:val="left"/>
+      <w:pPr>
+        <w:ind w:left="776" w:hanging="336"/>
+      </w:pPr>
+    </w:lvl>
     <w:lvl w:ilvl="6">
       <w:start w:val="1"/>
       <w:numFmt w:val="decimal"/>
@@ -2679,6 +2772,100 @@
         <w:ind w:left="2976" w:hanging="336"/>
       </w:pPr>
     </w:lvl>
+    <w:lvl w:ilvl="3">
+      <w:start w:val="1"/>
+      <w:numFmt w:val="decimal"/>
+      <w:lvlText w:val="%4."/>
+      <w:lvlJc w:val="left"/>
+      <w:pPr>
+        <w:ind w:left="1656" w:hanging="336"/>
+      </w:pPr>
+    </w:lvl>
+    <w:lvl w:ilvl="4">
+      <w:start w:val="1"/>
+      <w:numFmt w:val="lowerLetter"/>
+      <w:lvlText w:val="%5."/>
+      <w:lvlJc w:val="left"/>
+      <w:pPr>
+        <w:ind w:left="2096" w:hanging="336"/>
+      </w:pPr>
+    </w:lvl>
+    <w:lvl w:ilvl="5">
+      <w:start w:val="1"/>
+      <w:numFmt w:val="lowerRoman"/>
+      <w:lvlText w:val="%6."/>
+      <w:lvlJc w:val="left"/>
+      <w:pPr>
+        <w:ind w:left="2536" w:hanging="336"/>
+      </w:pPr>
+    </w:lvl>
+    <w:lvl w:ilvl="0">
+      <w:start w:val="1"/>
+      <w:numFmt w:val="decimal"/>
+      <w:lvlText w:val="%1."/>
+      <w:lvlJc w:val="left"/>
+      <w:pPr>
+        <w:ind w:left="336" w:hanging="336"/>
+      </w:pPr>
+      <w:rPr/>
+    </w:lvl>
+    <w:lvl w:ilvl="8">
+      <w:start w:val="1"/>
+      <w:numFmt w:val="lowerRoman"/>
+      <w:lvlText w:val="%9."/>
+      <w:lvlJc w:val="left"/>
+      <w:pPr>
+        <w:ind w:left="3856" w:hanging="336"/>
+      </w:pPr>
+    </w:lvl>
+  </w:abstractNum>
+  <w:abstractNum w:abstractNumId="2">
+    <w:lvl w:ilvl="0">
+      <w:start w:val="1"/>
+      <w:numFmt w:val="decimal"/>
+      <w:lvlText w:val="%1."/>
+      <w:lvlJc w:val="left"/>
+      <w:pPr>
+        <w:ind w:left="336" w:hanging="336"/>
+      </w:pPr>
+      <w:rPr/>
+    </w:lvl>
+    <w:lvl w:ilvl="1">
+      <w:start w:val="1"/>
+      <w:numFmt w:val="lowerLetter"/>
+      <w:lvlText w:val="%2."/>
+      <w:lvlJc w:val="left"/>
+      <w:pPr>
+        <w:ind w:left="776" w:hanging="336"/>
+      </w:pPr>
+    </w:lvl>
+    <w:lvl w:ilvl="4">
+      <w:start w:val="1"/>
+      <w:numFmt w:val="lowerLetter"/>
+      <w:lvlText w:val="%5."/>
+      <w:lvlJc w:val="left"/>
+      <w:pPr>
+        <w:ind w:left="2096" w:hanging="336"/>
+      </w:pPr>
+    </w:lvl>
+    <w:lvl w:ilvl="8">
+      <w:start w:val="1"/>
+      <w:numFmt w:val="lowerRoman"/>
+      <w:lvlText w:val="%9."/>
+      <w:lvlJc w:val="left"/>
+      <w:pPr>
+        <w:ind w:left="3856" w:hanging="336"/>
+      </w:pPr>
+    </w:lvl>
+    <w:lvl w:ilvl="5">
+      <w:start w:val="1"/>
+      <w:numFmt w:val="lowerRoman"/>
+      <w:lvlText w:val="%6."/>
+      <w:lvlJc w:val="left"/>
+      <w:pPr>
+        <w:ind w:left="2536" w:hanging="336"/>
+      </w:pPr>
+    </w:lvl>
     <w:lvl w:ilvl="7">
       <w:start w:val="1"/>
       <w:numFmt w:val="lowerLetter"/>
@@ -2688,6 +2875,63 @@
         <w:ind w:left="3416" w:hanging="336"/>
       </w:pPr>
     </w:lvl>
+    <w:lvl w:ilvl="2">
+      <w:start w:val="1"/>
+      <w:numFmt w:val="lowerRoman"/>
+      <w:lvlText w:val="%3."/>
+      <w:lvlJc w:val="left"/>
+      <w:pPr>
+        <w:ind w:left="1216" w:hanging="336"/>
+      </w:pPr>
+    </w:lvl>
+    <w:lvl w:ilvl="6">
+      <w:start w:val="1"/>
+      <w:numFmt w:val="decimal"/>
+      <w:lvlText w:val="%7."/>
+      <w:lvlJc w:val="left"/>
+      <w:pPr>
+        <w:ind w:left="2976" w:hanging="336"/>
+      </w:pPr>
+    </w:lvl>
+    <w:lvl w:ilvl="3">
+      <w:start w:val="1"/>
+      <w:numFmt w:val="decimal"/>
+      <w:lvlText w:val="%4."/>
+      <w:lvlJc w:val="left"/>
+      <w:pPr>
+        <w:ind w:left="1656" w:hanging="336"/>
+      </w:pPr>
+    </w:lvl>
+  </w:abstractNum>
+  <w:abstractNum w:abstractNumId="3">
+    <w:lvl w:ilvl="6">
+      <w:start w:val="1"/>
+      <w:numFmt w:val="decimal"/>
+      <w:lvlText w:val="%7."/>
+      <w:lvlJc w:val="left"/>
+      <w:pPr>
+        <w:ind w:left="2976" w:hanging="336"/>
+      </w:pPr>
+    </w:lvl>
+    <w:lvl w:ilvl="8">
+      <w:start w:val="1"/>
+      <w:numFmt w:val="lowerRoman"/>
+      <w:lvlText w:val="%9."/>
+      <w:lvlJc w:val="left"/>
+      <w:pPr>
+        <w:ind w:left="3856" w:hanging="336"/>
+      </w:pPr>
+    </w:lvl>
+    <w:lvl w:ilvl="0">
+      <w:start w:val="1"/>
+      <w:numFmt w:val="decimal"/>
+      <w:lvlText w:val="%1."/>
+      <w:lvlJc w:val="left"/>
+      <w:pPr>
+        <w:ind w:left="336" w:hanging="336"/>
+      </w:pPr>
+      <w:rPr/>
+    </w:lvl>
     <w:lvl w:ilvl="4">
       <w:start w:val="1"/>
       <w:numFmt w:val="lowerLetter"/>
@@ -2697,6 +2941,62 @@
         <w:ind w:left="2096" w:hanging="336"/>
       </w:pPr>
     </w:lvl>
+    <w:lvl w:ilvl="1">
+      <w:start w:val="1"/>
+      <w:numFmt w:val="lowerLetter"/>
+      <w:lvlText w:val="%2."/>
+      <w:lvlJc w:val="left"/>
+      <w:pPr>
+        <w:ind w:left="776" w:hanging="336"/>
+      </w:pPr>
+    </w:lvl>
+    <w:lvl w:ilvl="2">
+      <w:start w:val="1"/>
+      <w:numFmt w:val="lowerRoman"/>
+      <w:lvlText w:val="%3."/>
+      <w:lvlJc w:val="left"/>
+      <w:pPr>
+        <w:ind w:left="1216" w:hanging="336"/>
+      </w:pPr>
+    </w:lvl>
+    <w:lvl w:ilvl="5">
+      <w:start w:val="1"/>
+      <w:numFmt w:val="lowerRoman"/>
+      <w:lvlText w:val="%6."/>
+      <w:lvlJc w:val="left"/>
+      <w:pPr>
+        <w:ind w:left="2536" w:hanging="336"/>
+      </w:pPr>
+    </w:lvl>
+    <w:lvl w:ilvl="3">
+      <w:start w:val="1"/>
+      <w:numFmt w:val="decimal"/>
+      <w:lvlText w:val="%4."/>
+      <w:lvlJc w:val="left"/>
+      <w:pPr>
+        <w:ind w:left="1656" w:hanging="336"/>
+      </w:pPr>
+    </w:lvl>
+    <w:lvl w:ilvl="7">
+      <w:start w:val="1"/>
+      <w:numFmt w:val="lowerLetter"/>
+      <w:lvlText w:val="%8."/>
+      <w:lvlJc w:val="left"/>
+      <w:pPr>
+        <w:ind w:left="3416" w:hanging="336"/>
+      </w:pPr>
+    </w:lvl>
+  </w:abstractNum>
+  <w:abstractNum w:abstractNumId="4">
+    <w:lvl w:ilvl="1">
+      <w:start w:val="1"/>
+      <w:numFmt w:val="lowerLetter"/>
+      <w:lvlText w:val="%2."/>
+      <w:lvlJc w:val="left"/>
+      <w:pPr>
+        <w:ind w:left="776" w:hanging="336"/>
+      </w:pPr>
+    </w:lvl>
     <w:lvl w:ilvl="0">
       <w:start w:val="1"/>
       <w:numFmt w:val="decimal"/>
@@ -2707,6 +3007,126 @@
       </w:pPr>
       <w:rPr/>
     </w:lvl>
+    <w:lvl w:ilvl="2">
+      <w:start w:val="1"/>
+      <w:numFmt w:val="lowerRoman"/>
+      <w:lvlText w:val="%3."/>
+      <w:lvlJc w:val="left"/>
+      <w:pPr>
+        <w:ind w:left="1216" w:hanging="336"/>
+      </w:pPr>
+    </w:lvl>
+    <w:lvl w:ilvl="7">
+      <w:start w:val="1"/>
+      <w:numFmt w:val="lowerLetter"/>
+      <w:lvlText w:val="%8."/>
+      <w:lvlJc w:val="left"/>
+      <w:pPr>
+        <w:ind w:left="3416" w:hanging="336"/>
+      </w:pPr>
+    </w:lvl>
+    <w:lvl w:ilvl="4">
+      <w:start w:val="1"/>
+      <w:numFmt w:val="lowerLetter"/>
+      <w:lvlText w:val="%5."/>
+      <w:lvlJc w:val="left"/>
+      <w:pPr>
+        <w:ind w:left="2096" w:hanging="336"/>
+      </w:pPr>
+    </w:lvl>
+    <w:lvl w:ilvl="5">
+      <w:start w:val="1"/>
+      <w:numFmt w:val="lowerRoman"/>
+      <w:lvlText w:val="%6."/>
+      <w:lvlJc w:val="left"/>
+      <w:pPr>
+        <w:ind w:left="2536" w:hanging="336"/>
+      </w:pPr>
+    </w:lvl>
+    <w:lvl w:ilvl="6">
+      <w:start w:val="1"/>
+      <w:numFmt w:val="decimal"/>
+      <w:lvlText w:val="%7."/>
+      <w:lvlJc w:val="left"/>
+      <w:pPr>
+        <w:ind w:left="2976" w:hanging="336"/>
+      </w:pPr>
+    </w:lvl>
+    <w:lvl w:ilvl="8">
+      <w:start w:val="1"/>
+      <w:numFmt w:val="lowerRoman"/>
+      <w:lvlText w:val="%9."/>
+      <w:lvlJc w:val="left"/>
+      <w:pPr>
+        <w:ind w:left="3856" w:hanging="336"/>
+      </w:pPr>
+    </w:lvl>
+    <w:lvl w:ilvl="3">
+      <w:start w:val="1"/>
+      <w:numFmt w:val="decimal"/>
+      <w:lvlText w:val="%4."/>
+      <w:lvlJc w:val="left"/>
+      <w:pPr>
+        <w:ind w:left="1656" w:hanging="336"/>
+      </w:pPr>
+    </w:lvl>
+  </w:abstractNum>
+  <w:abstractNum w:abstractNumId="5">
+    <w:lvl w:ilvl="8">
+      <w:start w:val="1"/>
+      <w:numFmt w:val="lowerRoman"/>
+      <w:lvlText w:val="%9."/>
+      <w:lvlJc w:val="left"/>
+      <w:pPr>
+        <w:ind w:left="3856" w:hanging="336"/>
+      </w:pPr>
+    </w:lvl>
+    <w:lvl w:ilvl="7">
+      <w:start w:val="1"/>
+      <w:numFmt w:val="lowerLetter"/>
+      <w:lvlText w:val="%8."/>
+      <w:lvlJc w:val="left"/>
+      <w:pPr>
+        <w:ind w:left="3416" w:hanging="336"/>
+      </w:pPr>
+    </w:lvl>
+    <w:lvl w:ilvl="5">
+      <w:start w:val="1"/>
+      <w:numFmt w:val="lowerRoman"/>
+      <w:lvlText w:val="%6."/>
+      <w:lvlJc w:val="left"/>
+      <w:pPr>
+        <w:ind w:left="2536" w:hanging="336"/>
+      </w:pPr>
+    </w:lvl>
+    <w:lvl w:ilvl="0">
+      <w:start w:val="1"/>
+      <w:numFmt w:val="decimal"/>
+      <w:lvlText w:val="%1."/>
+      <w:lvlJc w:val="left"/>
+      <w:pPr>
+        <w:ind w:left="336" w:hanging="336"/>
+      </w:pPr>
+      <w:rPr/>
+    </w:lvl>
+    <w:lvl w:ilvl="4">
+      <w:start w:val="1"/>
+      <w:numFmt w:val="lowerLetter"/>
+      <w:lvlText w:val="%5."/>
+      <w:lvlJc w:val="left"/>
+      <w:pPr>
+        <w:ind w:left="2096" w:hanging="336"/>
+      </w:pPr>
+    </w:lvl>
+    <w:lvl w:ilvl="2">
+      <w:start w:val="1"/>
+      <w:numFmt w:val="lowerRoman"/>
+      <w:lvlText w:val="%3."/>
+      <w:lvlJc w:val="left"/>
+      <w:pPr>
+        <w:ind w:left="1216" w:hanging="336"/>
+      </w:pPr>
+    </w:lvl>
     <w:lvl w:ilvl="1">
       <w:start w:val="1"/>
       <w:numFmt w:val="lowerLetter"/>
@@ -2716,6 +3136,26 @@
         <w:ind w:left="776" w:hanging="336"/>
       </w:pPr>
     </w:lvl>
+    <w:lvl w:ilvl="3">
+      <w:start w:val="1"/>
+      <w:numFmt w:val="decimal"/>
+      <w:lvlText w:val="%4."/>
+      <w:lvlJc w:val="left"/>
+      <w:pPr>
+        <w:ind w:left="1656" w:hanging="336"/>
+      </w:pPr>
+    </w:lvl>
+    <w:lvl w:ilvl="6">
+      <w:start w:val="1"/>
+      <w:numFmt w:val="decimal"/>
+      <w:lvlText w:val="%7."/>
+      <w:lvlJc w:val="left"/>
+      <w:pPr>
+        <w:ind w:left="2976" w:hanging="336"/>
+      </w:pPr>
+    </w:lvl>
+  </w:abstractNum>
+  <w:abstractNum w:abstractNumId="6">
     <w:lvl w:ilvl="2">
       <w:start w:val="1"/>
       <w:numFmt w:val="lowerRoman"/>
@@ -2725,6 +3165,61 @@
         <w:ind w:left="1216" w:hanging="336"/>
       </w:pPr>
     </w:lvl>
+    <w:lvl w:ilvl="7">
+      <w:start w:val="1"/>
+      <w:numFmt w:val="lowerLetter"/>
+      <w:lvlText w:val="%8."/>
+      <w:lvlJc w:val="left"/>
+      <w:pPr>
+        <w:ind w:left="3416" w:hanging="336"/>
+      </w:pPr>
+    </w:lvl>
+    <w:lvl w:ilvl="0">
+      <w:start w:val="1"/>
+      <w:numFmt w:val="decimal"/>
+      <w:lvlText w:val="%1."/>
+      <w:lvlJc w:val="left"/>
+      <w:pPr>
+        <w:ind w:left="336" w:hanging="336"/>
+      </w:pPr>
+      <w:rPr/>
+    </w:lvl>
+    <w:lvl w:ilvl="5">
+      <w:start w:val="1"/>
+      <w:numFmt w:val="lowerRoman"/>
+      <w:lvlText w:val="%6."/>
+      <w:lvlJc w:val="left"/>
+      <w:pPr>
+        <w:ind w:left="2536" w:hanging="336"/>
+      </w:pPr>
+    </w:lvl>
+    <w:lvl w:ilvl="1">
+      <w:start w:val="1"/>
+      <w:numFmt w:val="lowerLetter"/>
+      <w:lvlText w:val="%2."/>
+      <w:lvlJc w:val="left"/>
+      <w:pPr>
+        <w:ind w:left="776" w:hanging="336"/>
+      </w:pPr>
+    </w:lvl>
+    <w:lvl w:ilvl="6">
+      <w:start w:val="1"/>
+      <w:numFmt w:val="decimal"/>
+      <w:lvlText w:val="%7."/>
+      <w:lvlJc w:val="left"/>
+      <w:pPr>
+        <w:ind w:left="2976" w:hanging="336"/>
+      </w:pPr>
+    </w:lvl>
+    <w:lvl w:ilvl="8">
+      <w:start w:val="1"/>
+      <w:numFmt w:val="lowerRoman"/>
+      <w:lvlText w:val="%9."/>
+      <w:lvlJc w:val="left"/>
+      <w:pPr>
+        <w:ind w:left="3856" w:hanging="336"/>
+      </w:pPr>
+    </w:lvl>
     <w:lvl w:ilvl="3">
       <w:start w:val="1"/>
       <w:numFmt w:val="decimal"/>
@@ -2734,8 +3229,54 @@
         <w:ind w:left="1656" w:hanging="336"/>
       </w:pPr>
     </w:lvl>
+    <w:lvl w:ilvl="4">
+      <w:start w:val="1"/>
+      <w:numFmt w:val="lowerLetter"/>
+      <w:lvlText w:val="%5."/>
+      <w:lvlJc w:val="left"/>
+      <w:pPr>
+        <w:ind w:left="2096" w:hanging="336"/>
+      </w:pPr>
+    </w:lvl>
   </w:abstractNum>
-  <w:abstractNum w:abstractNumId="1">
+  <w:abstractNum w:abstractNumId="7">
+    <w:lvl w:ilvl="4">
+      <w:start w:val="1"/>
+      <w:numFmt w:val="lowerLetter"/>
+      <w:lvlText w:val="%5."/>
+      <w:lvlJc w:val="left"/>
+      <w:pPr>
+        <w:ind w:left="2096" w:hanging="336"/>
+      </w:pPr>
+    </w:lvl>
+    <w:lvl w:ilvl="8">
+      <w:start w:val="1"/>
+      <w:numFmt w:val="lowerRoman"/>
+      <w:lvlText w:val="%9."/>
+      <w:lvlJc w:val="left"/>
+      <w:pPr>
+        <w:ind w:left="3856" w:hanging="336"/>
+      </w:pPr>
+    </w:lvl>
+    <w:lvl w:ilvl="5">
+      <w:start w:val="1"/>
+      <w:numFmt w:val="lowerRoman"/>
+      <w:lvlText w:val="%6."/>
+      <w:lvlJc w:val="left"/>
+      <w:pPr>
+        <w:ind w:left="2536" w:hanging="336"/>
+      </w:pPr>
+    </w:lvl>
+    <w:lvl w:ilvl="0">
+      <w:start w:val="1"/>
+      <w:numFmt w:val="decimal"/>
+      <w:lvlText w:val="%1."/>
+      <w:lvlJc w:val="left"/>
+      <w:pPr>
+        <w:ind w:left="336" w:hanging="336"/>
+      </w:pPr>
+      <w:rPr/>
+    </w:lvl>
     <w:lvl w:ilvl="7">
       <w:start w:val="1"/>
       <w:numFmt w:val="lowerLetter"/>
@@ -2745,6 +3286,24 @@
         <w:ind w:left="3416" w:hanging="336"/>
       </w:pPr>
     </w:lvl>
+    <w:lvl w:ilvl="6">
+      <w:start w:val="1"/>
+      <w:numFmt w:val="decimal"/>
+      <w:lvlText w:val="%7."/>
+      <w:lvlJc w:val="left"/>
+      <w:pPr>
+        <w:ind w:left="2976" w:hanging="336"/>
+      </w:pPr>
+    </w:lvl>
+    <w:lvl w:ilvl="2">
+      <w:start w:val="1"/>
+      <w:numFmt w:val="lowerRoman"/>
+      <w:lvlText w:val="%3."/>
+      <w:lvlJc w:val="left"/>
+      <w:pPr>
+        <w:ind w:left="1216" w:hanging="336"/>
+      </w:pPr>
+    </w:lvl>
     <w:lvl w:ilvl="1">
       <w:start w:val="1"/>
       <w:numFmt w:val="lowerLetter"/>
@@ -2754,6 +3313,53 @@
         <w:ind w:left="776" w:hanging="336"/>
       </w:pPr>
     </w:lvl>
+    <w:lvl w:ilvl="3">
+      <w:start w:val="1"/>
+      <w:numFmt w:val="decimal"/>
+      <w:lvlText w:val="%4."/>
+      <w:lvlJc w:val="left"/>
+      <w:pPr>
+        <w:ind w:left="1656" w:hanging="336"/>
+      </w:pPr>
+    </w:lvl>
+  </w:abstractNum>
+  <w:abstractNum w:abstractNumId="8">
+    <w:lvl w:ilvl="3">
+      <w:start w:val="1"/>
+      <w:numFmt w:val="decimal"/>
+      <w:lvlText w:val="%4."/>
+      <w:lvlJc w:val="left"/>
+      <w:pPr>
+        <w:ind w:left="1656" w:hanging="336"/>
+      </w:pPr>
+    </w:lvl>
+    <w:lvl w:ilvl="2">
+      <w:start w:val="1"/>
+      <w:numFmt w:val="lowerRoman"/>
+      <w:lvlText w:val="%3."/>
+      <w:lvlJc w:val="left"/>
+      <w:pPr>
+        <w:ind w:left="1216" w:hanging="336"/>
+      </w:pPr>
+    </w:lvl>
+    <w:lvl w:ilvl="6">
+      <w:start w:val="1"/>
+      <w:numFmt w:val="decimal"/>
+      <w:lvlText w:val="%7."/>
+      <w:lvlJc w:val="left"/>
+      <w:pPr>
+        <w:ind w:left="2976" w:hanging="336"/>
+      </w:pPr>
+    </w:lvl>
+    <w:lvl w:ilvl="1">
+      <w:start w:val="1"/>
+      <w:numFmt w:val="lowerLetter"/>
+      <w:lvlText w:val="%2."/>
+      <w:lvlJc w:val="left"/>
+      <w:pPr>
+        <w:ind w:left="776" w:hanging="336"/>
+      </w:pPr>
+    </w:lvl>
     <w:lvl w:ilvl="0">
       <w:start w:val="1"/>
       <w:numFmt w:val="decimal"/>
@@ -2764,6 +3370,24 @@
       </w:pPr>
       <w:rPr/>
     </w:lvl>
+    <w:lvl w:ilvl="5">
+      <w:start w:val="1"/>
+      <w:numFmt w:val="lowerRoman"/>
+      <w:lvlText w:val="%6."/>
+      <w:lvlJc w:val="left"/>
+      <w:pPr>
+        <w:ind w:left="2536" w:hanging="336"/>
+      </w:pPr>
+    </w:lvl>
+    <w:lvl w:ilvl="4">
+      <w:start w:val="1"/>
+      <w:numFmt w:val="lowerLetter"/>
+      <w:lvlText w:val="%5."/>
+      <w:lvlJc w:val="left"/>
+      <w:pPr>
+        <w:ind w:left="2096" w:hanging="336"/>
+      </w:pPr>
+    </w:lvl>
     <w:lvl w:ilvl="8">
       <w:start w:val="1"/>
       <w:numFmt w:val="lowerRoman"/>
@@ -2773,6 +3397,90 @@
         <w:ind w:left="3856" w:hanging="336"/>
       </w:pPr>
     </w:lvl>
+    <w:lvl w:ilvl="7">
+      <w:start w:val="1"/>
+      <w:numFmt w:val="lowerLetter"/>
+      <w:lvlText w:val="%8."/>
+      <w:lvlJc w:val="left"/>
+      <w:pPr>
+        <w:ind w:left="3416" w:hanging="336"/>
+      </w:pPr>
+    </w:lvl>
+  </w:abstractNum>
+  <w:abstractNum w:abstractNumId="9">
+    <w:lvl w:ilvl="6">
+      <w:start w:val="1"/>
+      <w:numFmt w:val="decimal"/>
+      <w:lvlText w:val="%7."/>
+      <w:lvlJc w:val="left"/>
+      <w:pPr>
+        <w:ind w:left="2976" w:hanging="336"/>
+      </w:pPr>
+    </w:lvl>
+    <w:lvl w:ilvl="2">
+      <w:start w:val="1"/>
+      <w:numFmt w:val="lowerRoman"/>
+      <w:lvlText w:val="%3."/>
+      <w:lvlJc w:val="left"/>
+      <w:pPr>
+        <w:ind w:left="1216" w:hanging="336"/>
+      </w:pPr>
+    </w:lvl>
+    <w:lvl w:ilvl="8">
+      <w:start w:val="1"/>
+      <w:numFmt w:val="lowerRoman"/>
+      <w:lvlText w:val="%9."/>
+      <w:lvlJc w:val="left"/>
+      <w:pPr>
+        <w:ind w:left="3856" w:hanging="336"/>
+      </w:pPr>
+    </w:lvl>
+    <w:lvl w:ilvl="1">
+      <w:start w:val="1"/>
+      <w:numFmt w:val="lowerLetter"/>
+      <w:lvlText w:val="%2."/>
+      <w:lvlJc w:val="left"/>
+      <w:pPr>
+        <w:ind w:left="776" w:hanging="336"/>
+      </w:pPr>
+    </w:lvl>
+    <w:lvl w:ilvl="3">
+      <w:start w:val="1"/>
+      <w:numFmt w:val="decimal"/>
+      <w:lvlText w:val="%4."/>
+      <w:lvlJc w:val="left"/>
+      <w:pPr>
+        <w:ind w:left="1656" w:hanging="336"/>
+      </w:pPr>
+    </w:lvl>
+    <w:lvl w:ilvl="7">
+      <w:start w:val="1"/>
+      <w:numFmt w:val="lowerLetter"/>
+      <w:lvlText w:val="%8."/>
+      <w:lvlJc w:val="left"/>
+      <w:pPr>
+        <w:ind w:left="3416" w:hanging="336"/>
+      </w:pPr>
+    </w:lvl>
+    <w:lvl w:ilvl="0">
+      <w:start w:val="1"/>
+      <w:numFmt w:val="decimal"/>
+      <w:lvlText w:val="%1."/>
+      <w:lvlJc w:val="left"/>
+      <w:pPr>
+        <w:ind w:left="336" w:hanging="336"/>
+      </w:pPr>
+      <w:rPr/>
+    </w:lvl>
+    <w:lvl w:ilvl="4">
+      <w:start w:val="1"/>
+      <w:numFmt w:val="lowerLetter"/>
+      <w:lvlText w:val="%5."/>
+      <w:lvlJc w:val="left"/>
+      <w:pPr>
+        <w:ind w:left="2096" w:hanging="336"/>
+      </w:pPr>
+    </w:lvl>
     <w:lvl w:ilvl="5">
       <w:start w:val="1"/>
       <w:numFmt w:val="lowerRoman"/>
@@ -2782,6 +3490,81 @@
         <w:ind w:left="2536" w:hanging="336"/>
       </w:pPr>
     </w:lvl>
+  </w:abstractNum>
+  <w:abstractNum w:abstractNumId="10">
+    <w:lvl w:ilvl="7">
+      <w:start w:val="1"/>
+      <w:numFmt w:val="lowerLetter"/>
+      <w:lvlText w:val="%8."/>
+      <w:lvlJc w:val="left"/>
+      <w:pPr>
+        <w:ind w:left="3416" w:hanging="336"/>
+      </w:pPr>
+    </w:lvl>
+    <w:lvl w:ilvl="6">
+      <w:start w:val="1"/>
+      <w:numFmt w:val="decimal"/>
+      <w:lvlText w:val="%7."/>
+      <w:lvlJc w:val="left"/>
+      <w:pPr>
+        <w:ind w:left="2976" w:hanging="336"/>
+      </w:pPr>
+    </w:lvl>
+    <w:lvl w:ilvl="0">
+      <w:start w:val="1"/>
+      <w:numFmt w:val="decimal"/>
+      <w:lvlText w:val="%1."/>
+      <w:lvlJc w:val="left"/>
+      <w:pPr>
+        <w:ind w:left="336" w:hanging="336"/>
+      </w:pPr>
+      <w:rPr/>
+    </w:lvl>
+    <w:lvl w:ilvl="8">
+      <w:start w:val="1"/>
+      <w:numFmt w:val="lowerRoman"/>
+      <w:lvlText w:val="%9."/>
+      <w:lvlJc w:val="left"/>
+      <w:pPr>
+        <w:ind w:left="3856" w:hanging="336"/>
+      </w:pPr>
+    </w:lvl>
+    <w:lvl w:ilvl="1">
+      <w:start w:val="1"/>
+      <w:numFmt w:val="lowerLetter"/>
+      <w:lvlText w:val="%2."/>
+      <w:lvlJc w:val="left"/>
+      <w:pPr>
+        <w:ind w:left="776" w:hanging="336"/>
+      </w:pPr>
+    </w:lvl>
+    <w:lvl w:ilvl="5">
+      <w:start w:val="1"/>
+      <w:numFmt w:val="lowerRoman"/>
+      <w:lvlText w:val="%6."/>
+      <w:lvlJc w:val="left"/>
+      <w:pPr>
+        <w:ind w:left="2536" w:hanging="336"/>
+      </w:pPr>
+    </w:lvl>
+    <w:lvl w:ilvl="4">
+      <w:start w:val="1"/>
+      <w:numFmt w:val="lowerLetter"/>
+      <w:lvlText w:val="%5."/>
+      <w:lvlJc w:val="left"/>
+      <w:pPr>
+        <w:ind w:left="2096" w:hanging="336"/>
+      </w:pPr>
+    </w:lvl>
+    <w:lvl w:ilvl="3">
+      <w:start w:val="1"/>
+      <w:numFmt w:val="decimal"/>
+      <w:lvlText w:val="%4."/>
+      <w:lvlJc w:val="left"/>
+      <w:pPr>
+        <w:ind w:left="1656" w:hanging="336"/>
+      </w:pPr>
+    </w:lvl>
     <w:lvl w:ilvl="2">
       <w:start w:val="1"/>
       <w:numFmt w:val="lowerRoman"/>
@@ -2791,822 +3574,39 @@
         <w:ind w:left="1216" w:hanging="336"/>
       </w:pPr>
     </w:lvl>
-    <w:lvl w:ilvl="6">
-      <w:start w:val="1"/>
-      <w:numFmt w:val="decimal"/>
-      <w:lvlText w:val="%7."/>
-      <w:lvlJc w:val="left"/>
-      <w:pPr>
-        <w:ind w:left="2976" w:hanging="336"/>
-      </w:pPr>
-    </w:lvl>
-    <w:lvl w:ilvl="3">
-      <w:start w:val="1"/>
-      <w:numFmt w:val="decimal"/>
-      <w:lvlText w:val="%4."/>
-      <w:lvlJc w:val="left"/>
-      <w:pPr>
-        <w:ind w:left="1656" w:hanging="336"/>
-      </w:pPr>
-    </w:lvl>
-    <w:lvl w:ilvl="4">
-      <w:start w:val="1"/>
-      <w:numFmt w:val="lowerLetter"/>
-      <w:lvlText w:val="%5."/>
-      <w:lvlJc w:val="left"/>
-      <w:pPr>
-        <w:ind w:left="2096" w:hanging="336"/>
-      </w:pPr>
-    </w:lvl>
   </w:abstractNum>
-  <w:abstractNum w:abstractNumId="2">
-    <w:lvl w:ilvl="7">
-      <w:start w:val="1"/>
-      <w:numFmt w:val="lowerLetter"/>
-      <w:lvlText w:val="%8."/>
-      <w:lvlJc w:val="left"/>
-      <w:pPr>
-        <w:ind w:left="3416" w:hanging="336"/>
-      </w:pPr>
-    </w:lvl>
-    <w:lvl w:ilvl="0">
-      <w:start w:val="1"/>
-      <w:numFmt w:val="decimal"/>
-      <w:lvlText w:val="%1."/>
-      <w:lvlJc w:val="left"/>
-      <w:pPr>
-        <w:ind w:left="336" w:hanging="336"/>
-      </w:pPr>
-      <w:rPr/>
-    </w:lvl>
-    <w:lvl w:ilvl="3">
-      <w:start w:val="1"/>
-      <w:numFmt w:val="decimal"/>
-      <w:lvlText w:val="%4."/>
-      <w:lvlJc w:val="left"/>
-      <w:pPr>
-        <w:ind w:left="1656" w:hanging="336"/>
-      </w:pPr>
-    </w:lvl>
-    <w:lvl w:ilvl="6">
-      <w:start w:val="1"/>
-      <w:numFmt w:val="decimal"/>
-      <w:lvlText w:val="%7."/>
-      <w:lvlJc w:val="left"/>
-      <w:pPr>
-        <w:ind w:left="2976" w:hanging="336"/>
-      </w:pPr>
-    </w:lvl>
-    <w:lvl w:ilvl="1">
-      <w:start w:val="1"/>
-      <w:numFmt w:val="lowerLetter"/>
-      <w:lvlText w:val="%2."/>
-      <w:lvlJc w:val="left"/>
-      <w:pPr>
-        <w:ind w:left="776" w:hanging="336"/>
-      </w:pPr>
-    </w:lvl>
-    <w:lvl w:ilvl="2">
-      <w:start w:val="1"/>
-      <w:numFmt w:val="lowerRoman"/>
-      <w:lvlText w:val="%3."/>
-      <w:lvlJc w:val="left"/>
-      <w:pPr>
-        <w:ind w:left="1216" w:hanging="336"/>
-      </w:pPr>
-    </w:lvl>
-    <w:lvl w:ilvl="5">
-      <w:start w:val="1"/>
-      <w:numFmt w:val="lowerRoman"/>
-      <w:lvlText w:val="%6."/>
-      <w:lvlJc w:val="left"/>
-      <w:pPr>
-        <w:ind w:left="2536" w:hanging="336"/>
-      </w:pPr>
-    </w:lvl>
-    <w:lvl w:ilvl="4">
-      <w:start w:val="1"/>
-      <w:numFmt w:val="lowerLetter"/>
-      <w:lvlText w:val="%5."/>
-      <w:lvlJc w:val="left"/>
-      <w:pPr>
-        <w:ind w:left="2096" w:hanging="336"/>
-      </w:pPr>
-    </w:lvl>
-    <w:lvl w:ilvl="8">
-      <w:start w:val="1"/>
-      <w:numFmt w:val="lowerRoman"/>
-      <w:lvlText w:val="%9."/>
-      <w:lvlJc w:val="left"/>
-      <w:pPr>
-        <w:ind w:left="3856" w:hanging="336"/>
-      </w:pPr>
-    </w:lvl>
-  </w:abstractNum>
-  <w:abstractNum w:abstractNumId="3">
-    <w:lvl w:ilvl="8">
-      <w:start w:val="1"/>
-      <w:numFmt w:val="lowerRoman"/>
-      <w:lvlText w:val="%9."/>
-      <w:lvlJc w:val="left"/>
-      <w:pPr>
-        <w:ind w:left="3856" w:hanging="336"/>
-      </w:pPr>
-    </w:lvl>
-    <w:lvl w:ilvl="1">
-      <w:start w:val="1"/>
-      <w:numFmt w:val="lowerLetter"/>
-      <w:lvlText w:val="%2."/>
-      <w:lvlJc w:val="left"/>
-      <w:pPr>
-        <w:ind w:left="776" w:hanging="336"/>
-      </w:pPr>
-    </w:lvl>
-    <w:lvl w:ilvl="2">
-      <w:start w:val="1"/>
-      <w:numFmt w:val="lowerRoman"/>
-      <w:lvlText w:val="%3."/>
-      <w:lvlJc w:val="left"/>
-      <w:pPr>
-        <w:ind w:left="1216" w:hanging="336"/>
-      </w:pPr>
-    </w:lvl>
-    <w:lvl w:ilvl="3">
-      <w:start w:val="1"/>
-      <w:numFmt w:val="decimal"/>
-      <w:lvlText w:val="%4."/>
-      <w:lvlJc w:val="left"/>
-      <w:pPr>
-        <w:ind w:left="1656" w:hanging="336"/>
-      </w:pPr>
-    </w:lvl>
-    <w:lvl w:ilvl="5">
-      <w:start w:val="1"/>
-      <w:numFmt w:val="lowerRoman"/>
-      <w:lvlText w:val="%6."/>
-      <w:lvlJc w:val="left"/>
-      <w:pPr>
-        <w:ind w:left="2536" w:hanging="336"/>
-      </w:pPr>
-    </w:lvl>
-    <w:lvl w:ilvl="6">
-      <w:start w:val="1"/>
-      <w:numFmt w:val="decimal"/>
-      <w:lvlText w:val="%7."/>
-      <w:lvlJc w:val="left"/>
-      <w:pPr>
-        <w:ind w:left="2976" w:hanging="336"/>
-      </w:pPr>
-    </w:lvl>
-    <w:lvl w:ilvl="4">
-      <w:start w:val="1"/>
-      <w:numFmt w:val="lowerLetter"/>
-      <w:lvlText w:val="%5."/>
-      <w:lvlJc w:val="left"/>
-      <w:pPr>
-        <w:ind w:left="2096" w:hanging="336"/>
-      </w:pPr>
-    </w:lvl>
-    <w:lvl w:ilvl="7">
-      <w:start w:val="1"/>
-      <w:numFmt w:val="lowerLetter"/>
-      <w:lvlText w:val="%8."/>
-      <w:lvlJc w:val="left"/>
-      <w:pPr>
-        <w:ind w:left="3416" w:hanging="336"/>
-      </w:pPr>
-    </w:lvl>
-    <w:lvl w:ilvl="0">
-      <w:start w:val="1"/>
-      <w:numFmt w:val="decimal"/>
-      <w:lvlText w:val="%1."/>
-      <w:lvlJc w:val="left"/>
-      <w:pPr>
-        <w:ind w:left="336" w:hanging="336"/>
-      </w:pPr>
-      <w:rPr/>
-    </w:lvl>
-  </w:abstractNum>
-  <w:abstractNum w:abstractNumId="4">
-    <w:lvl w:ilvl="4">
-      <w:start w:val="1"/>
-      <w:numFmt w:val="lowerLetter"/>
-      <w:lvlText w:val="%5."/>
-      <w:lvlJc w:val="left"/>
-      <w:pPr>
-        <w:ind w:left="2096" w:hanging="336"/>
-      </w:pPr>
-    </w:lvl>
-    <w:lvl w:ilvl="5">
-      <w:start w:val="1"/>
-      <w:numFmt w:val="lowerRoman"/>
-      <w:lvlText w:val="%6."/>
-      <w:lvlJc w:val="left"/>
-      <w:pPr>
-        <w:ind w:left="2536" w:hanging="336"/>
-      </w:pPr>
-    </w:lvl>
-    <w:lvl w:ilvl="8">
-      <w:start w:val="1"/>
-      <w:numFmt w:val="lowerRoman"/>
-      <w:lvlText w:val="%9."/>
-      <w:lvlJc w:val="left"/>
-      <w:pPr>
-        <w:ind w:left="3856" w:hanging="336"/>
-      </w:pPr>
-    </w:lvl>
-    <w:lvl w:ilvl="7">
-      <w:start w:val="1"/>
-      <w:numFmt w:val="lowerLetter"/>
-      <w:lvlText w:val="%8."/>
-      <w:lvlJc w:val="left"/>
-      <w:pPr>
-        <w:ind w:left="3416" w:hanging="336"/>
-      </w:pPr>
-    </w:lvl>
-    <w:lvl w:ilvl="2">
-      <w:start w:val="1"/>
-      <w:numFmt w:val="lowerRoman"/>
-      <w:lvlText w:val="%3."/>
-      <w:lvlJc w:val="left"/>
-      <w:pPr>
-        <w:ind w:left="1216" w:hanging="336"/>
-      </w:pPr>
-    </w:lvl>
-    <w:lvl w:ilvl="0">
-      <w:start w:val="1"/>
-      <w:numFmt w:val="decimal"/>
-      <w:lvlText w:val="%1."/>
-      <w:lvlJc w:val="left"/>
-      <w:pPr>
-        <w:ind w:left="336" w:hanging="336"/>
-      </w:pPr>
-      <w:rPr/>
-    </w:lvl>
-    <w:lvl w:ilvl="1">
-      <w:start w:val="1"/>
-      <w:numFmt w:val="lowerLetter"/>
-      <w:lvlText w:val="%2."/>
-      <w:lvlJc w:val="left"/>
-      <w:pPr>
-        <w:ind w:left="776" w:hanging="336"/>
-      </w:pPr>
-    </w:lvl>
-    <w:lvl w:ilvl="3">
-      <w:start w:val="1"/>
-      <w:numFmt w:val="decimal"/>
-      <w:lvlText w:val="%4."/>
-      <w:lvlJc w:val="left"/>
-      <w:pPr>
-        <w:ind w:left="1656" w:hanging="336"/>
-      </w:pPr>
-    </w:lvl>
-    <w:lvl w:ilvl="6">
-      <w:start w:val="1"/>
-      <w:numFmt w:val="decimal"/>
-      <w:lvlText w:val="%7."/>
-      <w:lvlJc w:val="left"/>
-      <w:pPr>
-        <w:ind w:left="2976" w:hanging="336"/>
-      </w:pPr>
-    </w:lvl>
-  </w:abstractNum>
-  <w:abstractNum w:abstractNumId="5">
-    <w:lvl w:ilvl="3">
-      <w:start w:val="1"/>
-      <w:numFmt w:val="decimal"/>
-      <w:lvlText w:val="%4."/>
-      <w:lvlJc w:val="left"/>
-      <w:pPr>
-        <w:ind w:left="1656" w:hanging="336"/>
-      </w:pPr>
-    </w:lvl>
-    <w:lvl w:ilvl="2">
-      <w:start w:val="1"/>
-      <w:numFmt w:val="lowerRoman"/>
-      <w:lvlText w:val="%3."/>
-      <w:lvlJc w:val="left"/>
-      <w:pPr>
-        <w:ind w:left="1216" w:hanging="336"/>
-      </w:pPr>
-    </w:lvl>
-    <w:lvl w:ilvl="5">
-      <w:start w:val="1"/>
-      <w:numFmt w:val="lowerRoman"/>
-      <w:lvlText w:val="%6."/>
-      <w:lvlJc w:val="left"/>
-      <w:pPr>
-        <w:ind w:left="2536" w:hanging="336"/>
-      </w:pPr>
-    </w:lvl>
-    <w:lvl w:ilvl="1">
-      <w:start w:val="1"/>
-      <w:numFmt w:val="lowerLetter"/>
-      <w:lvlText w:val="%2."/>
-      <w:lvlJc w:val="left"/>
-      <w:pPr>
-        <w:ind w:left="776" w:hanging="336"/>
-      </w:pPr>
-    </w:lvl>
-    <w:lvl w:ilvl="6">
-      <w:start w:val="1"/>
-      <w:numFmt w:val="decimal"/>
-      <w:lvlText w:val="%7."/>
-      <w:lvlJc w:val="left"/>
-      <w:pPr>
-        <w:ind w:left="2976" w:hanging="336"/>
-      </w:pPr>
-    </w:lvl>
-    <w:lvl w:ilvl="7">
-      <w:start w:val="1"/>
-      <w:numFmt w:val="lowerLetter"/>
-      <w:lvlText w:val="%8."/>
-      <w:lvlJc w:val="left"/>
-      <w:pPr>
-        <w:ind w:left="3416" w:hanging="336"/>
-      </w:pPr>
-    </w:lvl>
-    <w:lvl w:ilvl="0">
-      <w:start w:val="1"/>
-      <w:numFmt w:val="decimal"/>
-      <w:lvlText w:val="%1."/>
-      <w:lvlJc w:val="left"/>
-      <w:pPr>
-        <w:ind w:left="336" w:hanging="336"/>
-      </w:pPr>
-      <w:rPr/>
-    </w:lvl>
-    <w:lvl w:ilvl="4">
-      <w:start w:val="1"/>
-      <w:numFmt w:val="lowerLetter"/>
-      <w:lvlText w:val="%5."/>
-      <w:lvlJc w:val="left"/>
-      <w:pPr>
-        <w:ind w:left="2096" w:hanging="336"/>
-      </w:pPr>
-    </w:lvl>
-    <w:lvl w:ilvl="8">
-      <w:start w:val="1"/>
-      <w:numFmt w:val="lowerRoman"/>
-      <w:lvlText w:val="%9."/>
-      <w:lvlJc w:val="left"/>
-      <w:pPr>
-        <w:ind w:left="3856" w:hanging="336"/>
-      </w:pPr>
-    </w:lvl>
-  </w:abstractNum>
-  <w:abstractNum w:abstractNumId="6">
-    <w:lvl w:ilvl="8">
-      <w:start w:val="1"/>
-      <w:numFmt w:val="lowerRoman"/>
-      <w:lvlText w:val="%9."/>
-      <w:lvlJc w:val="left"/>
-      <w:pPr>
-        <w:ind w:left="3856" w:hanging="336"/>
-      </w:pPr>
-    </w:lvl>
-    <w:lvl w:ilvl="7">
-      <w:start w:val="1"/>
-      <w:numFmt w:val="lowerLetter"/>
-      <w:lvlText w:val="%8."/>
-      <w:lvlJc w:val="left"/>
-      <w:pPr>
-        <w:ind w:left="3416" w:hanging="336"/>
-      </w:pPr>
-    </w:lvl>
-    <w:lvl w:ilvl="0">
-      <w:start w:val="1"/>
-      <w:numFmt w:val="decimal"/>
-      <w:lvlText w:val="%1."/>
-      <w:lvlJc w:val="left"/>
-      <w:pPr>
-        <w:ind w:left="336" w:hanging="336"/>
-      </w:pPr>
-      <w:rPr/>
-    </w:lvl>
-    <w:lvl w:ilvl="6">
-      <w:start w:val="1"/>
-      <w:numFmt w:val="decimal"/>
-      <w:lvlText w:val="%7."/>
-      <w:lvlJc w:val="left"/>
-      <w:pPr>
-        <w:ind w:left="2976" w:hanging="336"/>
-      </w:pPr>
-    </w:lvl>
-    <w:lvl w:ilvl="4">
-      <w:start w:val="1"/>
-      <w:numFmt w:val="lowerLetter"/>
-      <w:lvlText w:val="%5."/>
-      <w:lvlJc w:val="left"/>
-      <w:pPr>
-        <w:ind w:left="2096" w:hanging="336"/>
-      </w:pPr>
-    </w:lvl>
-    <w:lvl w:ilvl="3">
-      <w:start w:val="1"/>
-      <w:numFmt w:val="decimal"/>
-      <w:lvlText w:val="%4."/>
-      <w:lvlJc w:val="left"/>
-      <w:pPr>
-        <w:ind w:left="1656" w:hanging="336"/>
-      </w:pPr>
-    </w:lvl>
-    <w:lvl w:ilvl="1">
-      <w:start w:val="1"/>
-      <w:numFmt w:val="lowerLetter"/>
-      <w:lvlText w:val="%2."/>
-      <w:lvlJc w:val="left"/>
-      <w:pPr>
-        <w:ind w:left="776" w:hanging="336"/>
-      </w:pPr>
-    </w:lvl>
-    <w:lvl w:ilvl="2">
-      <w:start w:val="1"/>
-      <w:numFmt w:val="lowerRoman"/>
-      <w:lvlText w:val="%3."/>
-      <w:lvlJc w:val="left"/>
-      <w:pPr>
-        <w:ind w:left="1216" w:hanging="336"/>
-      </w:pPr>
-    </w:lvl>
-    <w:lvl w:ilvl="5">
-      <w:start w:val="1"/>
-      <w:numFmt w:val="lowerRoman"/>
-      <w:lvlText w:val="%6."/>
-      <w:lvlJc w:val="left"/>
-      <w:pPr>
-        <w:ind w:left="2536" w:hanging="336"/>
-      </w:pPr>
-    </w:lvl>
-  </w:abstractNum>
-  <w:abstractNum w:abstractNumId="7">
-    <w:lvl w:ilvl="2">
-      <w:start w:val="1"/>
-      <w:numFmt w:val="lowerRoman"/>
-      <w:lvlText w:val="%3."/>
-      <w:lvlJc w:val="left"/>
-      <w:pPr>
-        <w:ind w:left="1216" w:hanging="336"/>
-      </w:pPr>
-    </w:lvl>
-    <w:lvl w:ilvl="4">
-      <w:start w:val="1"/>
-      <w:numFmt w:val="lowerLetter"/>
-      <w:lvlText w:val="%5."/>
-      <w:lvlJc w:val="left"/>
-      <w:pPr>
-        <w:ind w:left="2096" w:hanging="336"/>
-      </w:pPr>
-    </w:lvl>
-    <w:lvl w:ilvl="3">
-      <w:start w:val="1"/>
-      <w:numFmt w:val="decimal"/>
-      <w:lvlText w:val="%4."/>
-      <w:lvlJc w:val="left"/>
-      <w:pPr>
-        <w:ind w:left="1656" w:hanging="336"/>
-      </w:pPr>
-    </w:lvl>
-    <w:lvl w:ilvl="1">
-      <w:start w:val="1"/>
-      <w:numFmt w:val="lowerLetter"/>
-      <w:lvlText w:val="%2."/>
-      <w:lvlJc w:val="left"/>
-      <w:pPr>
-        <w:ind w:left="776" w:hanging="336"/>
-      </w:pPr>
-    </w:lvl>
-    <w:lvl w:ilvl="0">
-      <w:start w:val="1"/>
-      <w:numFmt w:val="decimal"/>
-      <w:lvlText w:val="%1."/>
-      <w:lvlJc w:val="left"/>
-      <w:pPr>
-        <w:ind w:left="336" w:hanging="336"/>
-      </w:pPr>
-      <w:rPr/>
-    </w:lvl>
-    <w:lvl w:ilvl="5">
-      <w:start w:val="1"/>
-      <w:numFmt w:val="lowerRoman"/>
-      <w:lvlText w:val="%6."/>
-      <w:lvlJc w:val="left"/>
-      <w:pPr>
-        <w:ind w:left="2536" w:hanging="336"/>
-      </w:pPr>
-    </w:lvl>
-    <w:lvl w:ilvl="6">
-      <w:start w:val="1"/>
-      <w:numFmt w:val="decimal"/>
-      <w:lvlText w:val="%7."/>
-      <w:lvlJc w:val="left"/>
-      <w:pPr>
-        <w:ind w:left="2976" w:hanging="336"/>
-      </w:pPr>
-    </w:lvl>
-    <w:lvl w:ilvl="8">
-      <w:start w:val="1"/>
-      <w:numFmt w:val="lowerRoman"/>
-      <w:lvlText w:val="%9."/>
-      <w:lvlJc w:val="left"/>
-      <w:pPr>
-        <w:ind w:left="3856" w:hanging="336"/>
-      </w:pPr>
-    </w:lvl>
-    <w:lvl w:ilvl="7">
-      <w:start w:val="1"/>
-      <w:numFmt w:val="lowerLetter"/>
-      <w:lvlText w:val="%8."/>
-      <w:lvlJc w:val="left"/>
-      <w:pPr>
-        <w:ind w:left="3416" w:hanging="336"/>
-      </w:pPr>
-    </w:lvl>
-  </w:abstractNum>
-  <w:abstractNum w:abstractNumId="8">
-    <w:lvl w:ilvl="8">
-      <w:start w:val="1"/>
-      <w:numFmt w:val="lowerRoman"/>
-      <w:lvlText w:val="%9."/>
-      <w:lvlJc w:val="left"/>
-      <w:pPr>
-        <w:ind w:left="3856" w:hanging="336"/>
-      </w:pPr>
-    </w:lvl>
-    <w:lvl w:ilvl="6">
-      <w:start w:val="1"/>
-      <w:numFmt w:val="decimal"/>
-      <w:lvlText w:val="%7."/>
-      <w:lvlJc w:val="left"/>
-      <w:pPr>
-        <w:ind w:left="2976" w:hanging="336"/>
-      </w:pPr>
-    </w:lvl>
-    <w:lvl w:ilvl="5">
-      <w:start w:val="1"/>
-      <w:numFmt w:val="lowerRoman"/>
-      <w:lvlText w:val="%6."/>
-      <w:lvlJc w:val="left"/>
-      <w:pPr>
-        <w:ind w:left="2536" w:hanging="336"/>
-      </w:pPr>
-    </w:lvl>
-    <w:lvl w:ilvl="4">
-      <w:start w:val="1"/>
-      <w:numFmt w:val="lowerLetter"/>
-      <w:lvlText w:val="%5."/>
-      <w:lvlJc w:val="left"/>
-      <w:pPr>
-        <w:ind w:left="2096" w:hanging="336"/>
-      </w:pPr>
-    </w:lvl>
-    <w:lvl w:ilvl="3">
-      <w:start w:val="1"/>
-      <w:numFmt w:val="decimal"/>
-      <w:lvlText w:val="%4."/>
-      <w:lvlJc w:val="left"/>
-      <w:pPr>
-        <w:ind w:left="1656" w:hanging="336"/>
-      </w:pPr>
-    </w:lvl>
-    <w:lvl w:ilvl="1">
-      <w:start w:val="1"/>
-      <w:numFmt w:val="lowerLetter"/>
-      <w:lvlText w:val="%2."/>
-      <w:lvlJc w:val="left"/>
-      <w:pPr>
-        <w:ind w:left="776" w:hanging="336"/>
-      </w:pPr>
-    </w:lvl>
-    <w:lvl w:ilvl="2">
-      <w:start w:val="1"/>
-      <w:numFmt w:val="lowerRoman"/>
-      <w:lvlText w:val="%3."/>
-      <w:lvlJc w:val="left"/>
-      <w:pPr>
-        <w:ind w:left="1216" w:hanging="336"/>
-      </w:pPr>
-    </w:lvl>
-    <w:lvl w:ilvl="0">
-      <w:start w:val="1"/>
-      <w:numFmt w:val="decimal"/>
-      <w:lvlText w:val="%1."/>
-      <w:lvlJc w:val="left"/>
-      <w:pPr>
-        <w:ind w:left="336" w:hanging="336"/>
-      </w:pPr>
-      <w:rPr/>
-    </w:lvl>
-    <w:lvl w:ilvl="7">
-      <w:start w:val="1"/>
-      <w:numFmt w:val="lowerLetter"/>
-      <w:lvlText w:val="%8."/>
-      <w:lvlJc w:val="left"/>
-      <w:pPr>
-        <w:ind w:left="3416" w:hanging="336"/>
-      </w:pPr>
-    </w:lvl>
-  </w:abstractNum>
-  <w:abstractNum w:abstractNumId="9">
-    <w:lvl w:ilvl="8">
-      <w:start w:val="1"/>
-      <w:numFmt w:val="lowerRoman"/>
-      <w:lvlText w:val="%9."/>
-      <w:lvlJc w:val="left"/>
-      <w:pPr>
-        <w:ind w:left="3856" w:hanging="336"/>
-      </w:pPr>
-    </w:lvl>
-    <w:lvl w:ilvl="3">
-      <w:start w:val="1"/>
-      <w:numFmt w:val="decimal"/>
-      <w:lvlText w:val="%4."/>
-      <w:lvlJc w:val="left"/>
-      <w:pPr>
-        <w:ind w:left="1656" w:hanging="336"/>
-      </w:pPr>
-    </w:lvl>
-    <w:lvl w:ilvl="7">
-      <w:start w:val="1"/>
-      <w:numFmt w:val="lowerLetter"/>
-      <w:lvlText w:val="%8."/>
-      <w:lvlJc w:val="left"/>
-      <w:pPr>
-        <w:ind w:left="3416" w:hanging="336"/>
-      </w:pPr>
-    </w:lvl>
-    <w:lvl w:ilvl="2">
-      <w:start w:val="1"/>
-      <w:numFmt w:val="lowerRoman"/>
-      <w:lvlText w:val="%3."/>
-      <w:lvlJc w:val="left"/>
-      <w:pPr>
-        <w:ind w:left="1216" w:hanging="336"/>
-      </w:pPr>
-    </w:lvl>
-    <w:lvl w:ilvl="5">
-      <w:start w:val="1"/>
-      <w:numFmt w:val="lowerRoman"/>
-      <w:lvlText w:val="%6."/>
-      <w:lvlJc w:val="left"/>
-      <w:pPr>
-        <w:ind w:left="2536" w:hanging="336"/>
-      </w:pPr>
-    </w:lvl>
-    <w:lvl w:ilvl="4">
-      <w:start w:val="1"/>
-      <w:numFmt w:val="lowerLetter"/>
-      <w:lvlText w:val="%5."/>
-      <w:lvlJc w:val="left"/>
-      <w:pPr>
-        <w:ind w:left="2096" w:hanging="336"/>
-      </w:pPr>
-    </w:lvl>
-    <w:lvl w:ilvl="1">
-      <w:start w:val="1"/>
-      <w:numFmt w:val="lowerLetter"/>
-      <w:lvlText w:val="%2."/>
-      <w:lvlJc w:val="left"/>
-      <w:pPr>
-        <w:ind w:left="776" w:hanging="336"/>
-      </w:pPr>
-    </w:lvl>
-    <w:lvl w:ilvl="6">
-      <w:start w:val="1"/>
-      <w:numFmt w:val="decimal"/>
-      <w:lvlText w:val="%7."/>
-      <w:lvlJc w:val="left"/>
-      <w:pPr>
-        <w:ind w:left="2976" w:hanging="336"/>
-      </w:pPr>
-    </w:lvl>
-    <w:lvl w:ilvl="0">
-      <w:start w:val="1"/>
-      <w:numFmt w:val="decimal"/>
-      <w:lvlText w:val="%1."/>
-      <w:lvlJc w:val="left"/>
-      <w:pPr>
-        <w:ind w:left="336" w:hanging="336"/>
-      </w:pPr>
-      <w:rPr/>
-    </w:lvl>
-  </w:abstractNum>
-  <w:abstractNum w:abstractNumId="10">
-    <w:lvl w:ilvl="8">
-      <w:start w:val="1"/>
-      <w:numFmt w:val="lowerRoman"/>
-      <w:lvlText w:val="%9."/>
-      <w:lvlJc w:val="left"/>
-      <w:pPr>
-        <w:ind w:left="3856" w:hanging="336"/>
-      </w:pPr>
-    </w:lvl>
-    <w:lvl w:ilvl="7">
-      <w:start w:val="1"/>
-      <w:numFmt w:val="lowerLetter"/>
-      <w:lvlText w:val="%8."/>
-      <w:lvlJc w:val="left"/>
-      <w:pPr>
-        <w:ind w:left="3416" w:hanging="336"/>
-      </w:pPr>
-    </w:lvl>
-    <w:lvl w:ilvl="5">
-      <w:start w:val="1"/>
-      <w:numFmt w:val="lowerRoman"/>
-      <w:lvlText w:val="%6."/>
-      <w:lvlJc w:val="left"/>
-      <w:pPr>
-        <w:ind w:left="2536" w:hanging="336"/>
-      </w:pPr>
-    </w:lvl>
-    <w:lvl w:ilvl="6">
-      <w:start w:val="1"/>
-      <w:numFmt w:val="decimal"/>
-      <w:lvlText w:val="%7."/>
-      <w:lvlJc w:val="left"/>
-      <w:pPr>
-        <w:ind w:left="2976" w:hanging="336"/>
-      </w:pPr>
-    </w:lvl>
-    <w:lvl w:ilvl="0">
-      <w:start w:val="1"/>
-      <w:numFmt w:val="decimal"/>
-      <w:lvlText w:val="%1."/>
-      <w:lvlJc w:val="left"/>
-      <w:pPr>
-        <w:ind w:left="336" w:hanging="336"/>
-      </w:pPr>
-      <w:rPr/>
-    </w:lvl>
-    <w:lvl w:ilvl="4">
-      <w:start w:val="1"/>
-      <w:numFmt w:val="lowerLetter"/>
-      <w:lvlText w:val="%5."/>
-      <w:lvlJc w:val="left"/>
-      <w:pPr>
-        <w:ind w:left="2096" w:hanging="336"/>
-      </w:pPr>
-    </w:lvl>
-    <w:lvl w:ilvl="2">
-      <w:start w:val="1"/>
-      <w:numFmt w:val="lowerRoman"/>
-      <w:lvlText w:val="%3."/>
-      <w:lvlJc w:val="left"/>
-      <w:pPr>
-        <w:ind w:left="1216" w:hanging="336"/>
-      </w:pPr>
-    </w:lvl>
-    <w:lvl w:ilvl="1">
-      <w:start w:val="1"/>
-      <w:numFmt w:val="lowerLetter"/>
-      <w:lvlText w:val="%2."/>
-      <w:lvlJc w:val="left"/>
-      <w:pPr>
-        <w:ind w:left="776" w:hanging="336"/>
-      </w:pPr>
-    </w:lvl>
-    <w:lvl w:ilvl="3">
-      <w:start w:val="1"/>
-      <w:numFmt w:val="decimal"/>
-      <w:lvlText w:val="%4."/>
-      <w:lvlJc w:val="left"/>
-      <w:pPr>
-        <w:ind w:left="1656" w:hanging="336"/>
-      </w:pPr>
-    </w:lvl>
-  </w:abstractNum>
-  <w:num w:numId="2">
+  <w:num w:numId="10">
+    <w:abstractNumId w:val="7"/>
+  </w:num>
+  <w:num w:numId="6">
+    <w:abstractNumId w:val="6"/>
+  </w:num>
+  <w:num w:numId="5">
     <w:abstractNumId w:val="9"/>
   </w:num>
-  <w:num w:numId="4">
-    <w:abstractNumId w:val="3"/>
-  </w:num>
-  <w:num w:numId="5">
-    <w:abstractNumId w:val="2"/>
-  </w:num>
-  <w:num w:numId="8">
+  <w:num w:numId="2">
     <w:abstractNumId w:val="4"/>
   </w:num>
   <w:num w:numId="11">
-    <w:abstractNumId w:val="0"/>
-  </w:num>
-  <w:num w:numId="6">
     <w:abstractNumId w:val="1"/>
   </w:num>
+  <w:num w:numId="3">
+    <w:abstractNumId w:val="3"/>
+  </w:num>
   <w:num w:numId="1">
-    <w:abstractNumId w:val="5"/>
-  </w:num>
-  <w:num w:numId="3">
-    <w:abstractNumId w:val="8"/>
-  </w:num>
-  <w:num w:numId="10">
     <w:abstractNumId w:val="10"/>
   </w:num>
   <w:num w:numId="7">
-    <w:abstractNumId w:val="7"/>
+    <w:abstractNumId w:val="0"/>
+  </w:num>
+  <w:num w:numId="8">
+    <w:abstractNumId w:val="5"/>
   </w:num>
   <w:num w:numId="9">
-    <w:abstractNumId w:val="6"/>
+    <w:abstractNumId w:val="8"/>
+  </w:num>
+  <w:num w:numId="4">
+    <w:abstractNumId w:val="2"/>
   </w:num>
 </w:numbering>
 </file>
@@ -3623,326 +3623,538 @@
     <w:pPrDefault/>
   </w:docDefaults>
   <w:latentStyles w:defLockedState="0" w:defUIPriority="0" w:defSemiHidden="0" w:defUnhideWhenUsed="0" w:defQFormat="0" w:count="376">
+    <w:lsdException w:name="Medium Shading 2" w:uiPriority="64"/>
+    <w:lsdException w:name="Colorful List Accent 2" w:uiPriority="72"/>
+    <w:lsdException w:name="Table Classic 3" w:semiHidden="1" w:unhideWhenUsed="1"/>
+    <w:lsdException w:name="List Table 3 Accent 5" w:uiPriority="48"/>
+    <w:lsdException w:name="List Table 7 Colorful" w:uiPriority="52"/>
+    <w:lsdException w:name="List Table 7 Colorful Accent 2" w:uiPriority="52"/>
+    <w:lsdException w:name="Light List Accent 6" w:uiPriority="61"/>
+    <w:lsdException w:name="List Table 7 Colorful Accent 6" w:uiPriority="52"/>
+    <w:lsdException w:name="Table Simple 1" w:semiHidden="1" w:unhideWhenUsed="1"/>
+    <w:lsdException w:name="Colorful Grid Accent 6" w:uiPriority="73"/>
+    <w:lsdException w:name="List Table 5 Dark" w:uiPriority="50"/>
+    <w:lsdException w:name="Medium List 2 Accent 5" w:uiPriority="66"/>
+    <w:lsdException w:name="Dark List Accent 5" w:uiPriority="70"/>
+    <w:lsdException w:name="Medium Grid 3 Accent 4" w:uiPriority="69"/>
+    <w:lsdException w:name="List Table 2 Accent 2" w:uiPriority="47"/>
+    <w:lsdException w:name="Medium Grid 2 Accent 1" w:uiPriority="68"/>
+    <w:lsdException w:name="Title" w:qFormat="1"/>
+    <w:lsdException w:name="Grid Table 2 Accent 1" w:uiPriority="47"/>
+    <w:lsdException w:name="List Table 6 Colorful Accent 6" w:uiPriority="51"/>
+    <w:lsdException w:name="Plain Table 2" w:uiPriority="42"/>
+    <w:lsdException w:name="List Table 4 Accent 6" w:uiPriority="49"/>
+    <w:lsdException w:name="Medium Grid 1 Accent 6" w:uiPriority="67"/>
+    <w:lsdException w:name="Table Columns 4" w:semiHidden="1" w:unhideWhenUsed="1"/>
+    <w:lsdException w:name="Light Shading" w:uiPriority="60"/>
+    <w:lsdException w:name="Table Contemporary" w:semiHidden="1" w:unhideWhenUsed="1"/>
+    <w:lsdException w:name="Grid Table 4 Accent 3" w:uiPriority="49"/>
+    <w:lsdException w:name="Table Grid 6" w:semiHidden="1" w:unhideWhenUsed="1"/>
+    <w:lsdException w:name="Light Shading Accent 6" w:uiPriority="60"/>
+    <w:lsdException w:name="List Table 7 Colorful Accent 5" w:uiPriority="52"/>
+    <w:lsdException w:name="Grid Table 7 Colorful Accent 1" w:uiPriority="52"/>
+    <w:lsdException w:name="Light Shading Accent 2" w:uiPriority="60"/>
+    <w:lsdException w:name="List Table 3 Accent 4" w:uiPriority="48"/>
+    <w:lsdException w:name="Intense Emphasis" w:uiPriority="21" w:qFormat="1"/>
+    <w:lsdException w:name="Medium Shading 2 Accent 1" w:uiPriority="64"/>
+    <w:lsdException w:name="Smart Hyperlink" w:uiPriority="99" w:semiHidden="1" w:unhideWhenUsed="1"/>
+    <w:lsdException w:name="Medium Grid 2" w:uiPriority="68"/>
+    <w:lsdException w:name="Table List 8" w:semiHidden="1" w:unhideWhenUsed="1"/>
+    <w:lsdException w:name="Grid Table 2 Accent 2" w:uiPriority="47"/>
+    <w:lsdException w:name="Grid Table 7 Colorful Accent 5" w:uiPriority="52"/>
+    <w:lsdException w:name="Medium List 2 Accent 3" w:uiPriority="66"/>
+    <w:lsdException w:name="Medium Grid 1 Accent 3" w:uiPriority="67"/>
+    <w:lsdException w:name="List Table 3 Accent 3" w:uiPriority="48"/>
+    <w:lsdException w:name="Table Grid 7" w:semiHidden="1" w:unhideWhenUsed="1"/>
+    <w:lsdException w:name="footnote reference" w:uiPriority="99" w:semiHidden="1" w:unhideWhenUsed="1"/>
+    <w:lsdException w:name="Plain Table 1" w:uiPriority="41"/>
+    <w:lsdException w:name="HTML Definition" w:uiPriority="99"/>
+    <w:lsdException w:name="Light List Accent 1" w:uiPriority="61"/>
+    <w:lsdException w:name="List Table 1 Light Accent 3" w:uiPriority="46"/>
+    <w:lsdException w:name="Grid Table 6 Colorful" w:uiPriority="51"/>
+    <w:lsdException w:name="Outline List 1" w:uiPriority="99" w:semiHidden="1" w:unhideWhenUsed="1"/>
+    <w:lsdException w:name="Medium Grid 1 Accent 2" w:uiPriority="67"/>
+    <w:lsdException w:name="Medium Grid 3 Accent 1" w:uiPriority="69"/>
+    <w:lsdException w:name="Colorful Shading Accent 2" w:uiPriority="71"/>
+    <w:lsdException w:name="Grid Table 3 Accent 4" w:uiPriority="48"/>
+    <w:lsdException w:name="Table 3D effects 3" w:semiHidden="1" w:unhideWhenUsed="1"/>
+    <w:lsdException w:name="Table Colorful 1" w:semiHidden="1" w:unhideWhenUsed="1"/>
+    <w:lsdException w:name="Medium Shading 1 Accent 5" w:uiPriority="63"/>
+    <w:lsdException w:name="Table List 2" w:semiHidden="1" w:unhideWhenUsed="1"/>
+    <w:lsdException w:name="Medium Grid 2 Accent 6" w:uiPriority="68"/>
+    <w:lsdException w:name="List Table 5 Dark Accent 1" w:uiPriority="50"/>
+    <w:lsdException w:name="Medium List 1" w:uiPriority="65"/>
+    <w:lsdException w:name="Colorful Grid Accent 1" w:uiPriority="73"/>
+    <w:lsdException w:name="Grid Table 4 Accent 2" w:uiPriority="49"/>
+    <w:lsdException w:name="Dark List Accent 3" w:uiPriority="70"/>
+    <w:lsdException w:name="Medium Shading 1 Accent 3" w:uiPriority="63"/>
+    <w:lsdException w:name="Grid Table 6 Colorful Accent 2" w:uiPriority="51"/>
+    <w:lsdException w:name="List Table 1 Light Accent 6" w:uiPriority="46"/>
+    <w:lsdException w:name="List Table 4 Accent 5" w:uiPriority="49"/>
+    <w:lsdException w:name="Table 3D effects 2" w:semiHidden="1" w:unhideWhenUsed="1"/>
+    <w:lsdException w:name="Medium Shading 2 Accent 4" w:uiPriority="64"/>
+    <w:lsdException w:name="Colorful Shading" w:uiPriority="71"/>
+    <w:lsdException w:name="Grid Table 5 Dark Accent 2" w:uiPriority="50"/>
+    <w:lsdException w:name="heading 7" w:unhideWhenUsed="1" w:qFormat="1"/>
+    <w:lsdException w:name="Table Simple 3" w:semiHidden="1" w:unhideWhenUsed="1"/>
+    <w:lsdException w:name="Grid Table 2 Accent 4" w:uiPriority="47"/>
+    <w:lsdException w:name="toc 6" w:uiPriority="99"/>
+    <w:lsdException w:name="Colorful List Accent 4" w:uiPriority="72"/>
+    <w:lsdException w:name="Grid Table 2 Accent 3" w:uiPriority="47"/>
+    <w:lsdException w:name="Medium Grid 2 Accent 3" w:uiPriority="68"/>
+    <w:lsdException w:name="List Table 1 Light" w:uiPriority="46"/>
+    <w:lsdException w:name="Grid Table 1 Light Accent 4" w:uiPriority="46"/>
+    <w:lsdException w:name="HTML Code" w:uiPriority="99"/>
+    <w:lsdException w:name="List Table 5 Dark Accent 2" w:uiPriority="50"/>
+    <w:lsdException w:name="Normal" w:qFormat="1"/>
+    <w:lsdException w:name="Outline List 2" w:uiPriority="99" w:semiHidden="1" w:unhideWhenUsed="1"/>
+    <w:lsdException w:name="Medium Grid 1 Accent 1" w:uiPriority="67"/>
+    <w:lsdException w:name="Grid Table 4 Accent 6" w:uiPriority="49"/>
+    <w:lsdException w:name="Table Subtle 2" w:semiHidden="1" w:unhideWhenUsed="1"/>
+    <w:lsdException w:name="Light Shading Accent 3" w:uiPriority="60"/>
+    <w:lsdException w:name="Grid Table 5 Dark Accent 1" w:uiPriority="50"/>
+    <w:lsdException w:name="List Table 4 Accent 1" w:uiPriority="49"/>
+    <w:lsdException w:name="Dark List Accent 4" w:uiPriority="70"/>
+    <w:lsdException w:name="Colorful Shading Accent 4" w:uiPriority="71"/>
+    <w:lsdException w:name="List Table 2 Accent 4" w:uiPriority="47"/>
+    <w:lsdException w:name="Dark List Accent 2" w:uiPriority="70"/>
+    <w:lsdException w:name="Light Shading Accent 1" w:uiPriority="60"/>
+    <w:lsdException w:name="Medium Shading 1" w:uiPriority="63"/>
+    <w:lsdException w:name="List Table 6 Colorful" w:uiPriority="51"/>
+    <w:lsdException w:name="Grid Table 1 Light Accent 6" w:uiPriority="46"/>
+    <w:lsdException w:name="Medium Grid 1 Accent 4" w:uiPriority="67"/>
+    <w:lsdException w:name="No Spacing" w:uiPriority="99"/>
+    <w:lsdException w:name="heading 6" w:qFormat="1"/>
+    <w:lsdException w:name="Grid Table 5 Dark Accent 4" w:uiPriority="50"/>
+    <w:lsdException w:name="Medium Shading 1 Accent 2" w:uiPriority="63"/>
+    <w:lsdException w:name="List Table 6 Colorful Accent 2" w:uiPriority="51"/>
+    <w:lsdException w:name="List Table 4 Accent 2" w:uiPriority="49"/>
+    <w:lsdException w:name="List Table 6 Colorful Accent 4" w:uiPriority="51"/>
+    <w:lsdException w:name="Table Colorful 3" w:semiHidden="1" w:unhideWhenUsed="1"/>
+    <w:lsdException w:name="Grid Table 5 Dark Accent 6" w:uiPriority="50"/>
+    <w:lsdException w:name="Grid Table 7 Colorful Accent 4" w:uiPriority="52"/>
+    <w:lsdException w:name="Grid Table Light" w:uiPriority="40"/>
+    <w:lsdException w:name="Medium List 2 Accent 4" w:uiPriority="66"/>
+    <w:lsdException w:name="Dark List Accent 6" w:uiPriority="70"/>
+    <w:lsdException w:name="List Table 4 Accent 3" w:uiPriority="49"/>
+    <w:lsdException w:name="Light Grid Accent 1" w:uiPriority="62"/>
+    <w:lsdException w:name="Hashtag" w:uiPriority="99" w:semiHidden="1" w:unhideWhenUsed="1"/>
+    <w:lsdException w:name="Grid Table 6 Colorful Accent 5" w:uiPriority="51"/>
+    <w:lsdException w:name="Grid Table 3 Accent 1" w:uiPriority="48"/>
+    <w:lsdException w:name="Colorful Shading Accent 6" w:uiPriority="71"/>
+    <w:lsdException w:name="Placeholder Text" w:uiPriority="99" w:semiHidden="1"/>
+    <w:lsdException w:name="Medium Grid 2 Accent 4" w:uiPriority="68"/>
+    <w:lsdException w:name="Grid Table 3" w:uiPriority="48"/>
+    <w:lsdException w:name="Table Columns 5" w:semiHidden="1" w:unhideWhenUsed="1"/>
+    <w:lsdException w:name="Medium List 2 Accent 6" w:uiPriority="66"/>
+    <w:lsdException w:name="Grid Table 6 Colorful Accent 1" w:uiPriority="51"/>
+    <w:lsdException w:name="HTML Top of Form" w:uiPriority="99" w:semiHidden="1" w:unhideWhenUsed="1"/>
+    <w:lsdException w:name="toc 5" w:uiPriority="99"/>
+    <w:lsdException w:name="Medium List 2" w:uiPriority="66"/>
+    <w:lsdException w:name="HTML Address" w:uiPriority="99"/>
+    <w:lsdException w:name="Revision" w:uiPriority="99" w:semiHidden="1"/>
+    <w:lsdException w:name="Smart Link" w:uiPriority="99" w:semiHidden="1" w:unhideWhenUsed="1"/>
+    <w:lsdException w:name="Colorful Grid Accent 5" w:uiPriority="73"/>
+    <w:lsdException w:name="Table List 5" w:semiHidden="1" w:unhideWhenUsed="1"/>
+    <w:lsdException w:name="List Table 1 Light Accent 5" w:uiPriority="46"/>
+    <w:lsdException w:name="List Paragraph" w:uiPriority="99"/>
+    <w:lsdException w:name="Medium Grid 3 Accent 3" w:uiPriority="69"/>
+    <w:lsdException w:name="Light Grid Accent 5" w:uiPriority="62"/>
     <w:lsdException w:name="List Table 3" w:uiPriority="48"/>
-    <w:lsdException w:name="Light Grid Accent 6" w:uiPriority="62"/>
-    <w:lsdException w:name="Light List Accent 6" w:uiPriority="61"/>
+    <w:lsdException w:name="Grid Table 6 Colorful Accent 4" w:uiPriority="51"/>
+    <w:lsdException w:name="Intense Quote" w:uiPriority="99"/>
+    <w:lsdException w:name="List Table 7 Colorful Accent 1" w:uiPriority="52"/>
+    <w:lsdException w:name="Colorful Shading Accent 1" w:uiPriority="71"/>
+    <w:lsdException w:name="List Table 3 Accent 1" w:uiPriority="48"/>
+    <w:lsdException w:name="Emphasis" w:qFormat="1"/>
+    <w:lsdException w:name="Light Shading Accent 5" w:uiPriority="60"/>
+    <w:lsdException w:name="List Table 3 Accent 6" w:uiPriority="48"/>
+    <w:lsdException w:name="Strong" w:qFormat="1"/>
+    <w:lsdException w:name="List Table 2 Accent 3" w:uiPriority="47"/>
+    <w:lsdException w:name="Table Classic 1" w:semiHidden="1" w:unhideWhenUsed="1"/>
+    <w:lsdException w:name="Plain Table 4" w:uiPriority="44"/>
+    <w:lsdException w:name="Grid Table 5 Dark" w:uiPriority="50"/>
+    <w:lsdException w:name="Light Shading Accent 4" w:uiPriority="60"/>
+    <w:lsdException w:name="Table List 7" w:semiHidden="1" w:unhideWhenUsed="1"/>
+    <w:lsdException w:name="Medium List 1 Accent 3" w:uiPriority="65"/>
+    <w:lsdException w:name="List Table 7 Colorful Accent 3" w:uiPriority="52"/>
+    <w:lsdException w:name="Medium List 1 Accent 4" w:uiPriority="65"/>
+    <w:lsdException w:name="Light List Accent 4" w:uiPriority="61"/>
+    <w:lsdException w:name="toc 1" w:uiPriority="99"/>
+    <w:lsdException w:name="Colorful List" w:uiPriority="72"/>
+    <w:lsdException w:name="Table List 1" w:semiHidden="1" w:unhideWhenUsed="1"/>
+    <w:lsdException w:name="Medium List 1 Accent 2" w:uiPriority="65"/>
+    <w:lsdException w:name="heading 5" w:qFormat="1"/>
+    <w:lsdException w:name="HTML Acronym" w:uiPriority="99"/>
+    <w:lsdException w:name="caption" w:semiHidden="1" w:unhideWhenUsed="1" w:qFormat="1"/>
+    <w:lsdException w:name="List Table 7 Colorful Accent 4" w:uiPriority="52"/>
+    <w:lsdException w:name="List Table 5 Dark Accent 4" w:uiPriority="50"/>
+    <w:lsdException w:name="Table Subtle 1" w:semiHidden="1" w:unhideWhenUsed="1"/>
+    <w:lsdException w:name="Colorful Shading Accent 3" w:uiPriority="71"/>
+    <w:lsdException w:name="Grid Table 2 Accent 6" w:uiPriority="47"/>
+    <w:lsdException w:name="toc 4" w:uiPriority="99"/>
+    <w:lsdException w:name="heading 2" w:qFormat="1"/>
     <w:lsdException w:name="List Table 1 Light Accent 1" w:uiPriority="46"/>
-    <w:lsdException w:name="heading 8" w:unhideWhenUsed="1" w:qFormat="1"/>
-    <w:lsdException w:name="List Table 3 Accent 6" w:uiPriority="48"/>
-    <w:lsdException w:name="Outline List 3" w:uiPriority="99" w:semiHidden="1" w:unhideWhenUsed="1"/>
-    <w:lsdException w:name="Table Colorful 2" w:semiHidden="1" w:unhideWhenUsed="1"/>
-    <w:lsdException w:name="Grid Table 2 Accent 6" w:uiPriority="47"/>
-    <w:lsdException w:name="Placeholder Text" w:uiPriority="99" w:semiHidden="1"/>
-    <w:lsdException w:name="Emphasis" w:qFormat="1"/>
-    <w:lsdException w:name="Table Theme" w:semiHidden="1" w:unhideWhenUsed="1"/>
-    <w:lsdException w:name="List Table 1 Light Accent 2" w:uiPriority="46"/>
-    <w:lsdException w:name="List Table 6 Colorful Accent 3" w:uiPriority="51"/>
-    <w:lsdException w:name="Normal" w:qFormat="1"/>
-    <w:lsdException w:name="Table List 1" w:semiHidden="1" w:unhideWhenUsed="1"/>
-    <w:lsdException w:name="heading 5" w:qFormat="1"/>
-    <w:lsdException w:name="Title" w:qFormat="1"/>
-    <w:lsdException w:name="heading 7" w:unhideWhenUsed="1" w:qFormat="1"/>
-    <w:lsdException w:name="Unresolved Mention" w:uiPriority="99" w:semiHidden="1" w:unhideWhenUsed="1"/>
-    <w:lsdException w:name="Strong" w:qFormat="1"/>
-    <w:lsdException w:name="Table Columns 3" w:semiHidden="1" w:unhideWhenUsed="1"/>
-    <w:lsdException w:name="HTML Bottom of Form" w:uiPriority="99" w:semiHidden="1" w:unhideWhenUsed="1"/>
-    <w:lsdException w:name="Medium Grid 2 Accent 3" w:uiPriority="68"/>
-    <w:lsdException w:name="HTML Address" w:uiPriority="99"/>
-    <w:lsdException w:name="Smart Hyperlink" w:uiPriority="99" w:semiHidden="1" w:unhideWhenUsed="1"/>
-    <w:lsdException w:name="Table Columns 1" w:semiHidden="1" w:unhideWhenUsed="1"/>
-    <w:lsdException w:name="Table 3D effects 1" w:semiHidden="1" w:unhideWhenUsed="1"/>
+    <w:lsdException w:name="Grid Table 1 Light" w:uiPriority="46"/>
+    <w:lsdException w:name="Grid Table 2" w:uiPriority="47"/>
+    <w:lsdException w:name="Table Web 3" w:semiHidden="1" w:unhideWhenUsed="1"/>
+    <w:lsdException w:name="Medium Shading 2 Accent 6" w:uiPriority="64"/>
+    <w:lsdException w:name="List Table 3 Accent 2" w:uiPriority="48"/>
     <w:lsdException w:name="Medium List 1 Accent 1" w:uiPriority="65"/>
-    <w:lsdException w:name="Medium Shading 2 Accent 1" w:uiPriority="64"/>
-    <w:lsdException w:name="Colorful Shading" w:uiPriority="71"/>
-    <w:lsdException w:name="List Table 6 Colorful Accent 2" w:uiPriority="51"/>
-    <w:lsdException w:name="Colorful List Accent 1" w:uiPriority="72"/>
-    <w:lsdException w:name="Table Web 2" w:semiHidden="1" w:unhideWhenUsed="1"/>
     <w:lsdException w:name="Table Grid 3" w:semiHidden="1" w:unhideWhenUsed="1"/>
-    <w:lsdException w:name="Table List 6" w:semiHidden="1" w:unhideWhenUsed="1"/>
-    <w:lsdException w:name="Grid Table 7 Colorful Accent 1" w:uiPriority="52"/>
-    <w:lsdException w:name="Medium List 1 Accent 4" w:uiPriority="65"/>
-    <w:lsdException w:name="Medium List 2 Accent 1" w:uiPriority="66"/>
-    <w:lsdException w:name="Medium Shading 2 Accent 2" w:uiPriority="64"/>
-    <w:lsdException w:name="List Table 2 Accent 5" w:uiPriority="47"/>
-    <w:lsdException w:name="Plain Table 2" w:uiPriority="42"/>
-    <w:lsdException w:name="Grid Table 7 Colorful Accent 2" w:uiPriority="52"/>
-    <w:lsdException w:name="Grid Table 2 Accent 2" w:uiPriority="47"/>
-    <w:lsdException w:name="Table Grid" w:qFormat="1"/>
-    <w:lsdException w:name="Table Web 3" w:semiHidden="1" w:unhideWhenUsed="1"/>
-    <w:lsdException w:name="HTML Top of Form" w:uiPriority="99" w:semiHidden="1" w:unhideWhenUsed="1"/>
-    <w:lsdException w:name="List Table 3 Accent 2" w:uiPriority="48"/>
-    <w:lsdException w:name="List Table 1 Light Accent 5" w:uiPriority="46"/>
-    <w:lsdException w:name="Medium Shading 2 Accent 5" w:uiPriority="64"/>
-    <w:lsdException w:name="Medium Shading 2 Accent 6" w:uiPriority="64"/>
-    <w:lsdException w:name="No List" w:uiPriority="99" w:semiHidden="1" w:unhideWhenUsed="1"/>
-    <w:lsdException w:name="Revision" w:uiPriority="99" w:semiHidden="1"/>
-    <w:lsdException w:name="Medium Grid 1 Accent 4" w:uiPriority="67"/>
-    <w:lsdException w:name="Grid Table 3 Accent 2" w:uiPriority="48"/>
-    <w:lsdException w:name="Grid Table 4 Accent 5" w:uiPriority="49"/>
-    <w:lsdException w:name="Light Grid Accent 2" w:uiPriority="62"/>
-    <w:lsdException w:name="List Table 1 Light" w:uiPriority="46"/>
-    <w:lsdException w:name="List Table 6 Colorful Accent 6" w:uiPriority="51"/>
-    <w:lsdException w:name="Table Columns 2" w:semiHidden="1" w:unhideWhenUsed="1"/>
-    <w:lsdException w:name="List Table 7 Colorful Accent 3" w:uiPriority="52"/>
-    <w:lsdException w:name="Subtitle" w:qFormat="1"/>
-    <w:lsdException w:name="heading 2" w:qFormat="1"/>
-    <w:lsdException w:name="Light Shading Accent 5" w:uiPriority="60"/>
-    <w:lsdException w:name="Medium Shading 1 Accent 1" w:uiPriority="63"/>
     <w:lsdException w:name="List Table 2 Accent 6" w:uiPriority="47"/>
+    <w:lsdException w:name="Medium Grid 3 Accent 2" w:uiPriority="69"/>
+    <w:lsdException w:name="Grid Table 1 Light Accent 3" w:uiPriority="46"/>
     <w:lsdException w:name="Subtle Emphasis" w:uiPriority="19" w:qFormat="1"/>
-    <w:lsdException w:name="Medium List 1 Accent 6" w:uiPriority="65"/>
-    <w:lsdException w:name="Light List Accent 1" w:uiPriority="61"/>
-    <w:lsdException w:name="Medium Shading 1 Accent 2" w:uiPriority="63"/>
-    <w:lsdException w:name="Intense Reference" w:uiPriority="32" w:qFormat="1"/>
-    <w:lsdException w:name="Medium List 2 Accent 6" w:uiPriority="66"/>
-    <w:lsdException w:name="toc 7" w:uiPriority="99"/>
-    <w:lsdException w:name="footnote text" w:uiPriority="99" w:semiHidden="1" w:unhideWhenUsed="1"/>
-    <w:lsdException w:name="Colorful Shading Accent 6" w:uiPriority="71"/>
-    <w:lsdException w:name="Table Grid 1" w:semiHidden="1" w:unhideWhenUsed="1"/>
-    <w:lsdException w:name="Grid Table 2 Accent 1" w:uiPriority="47"/>
-    <w:lsdException w:name="Grid Table 7 Colorful Accent 3" w:uiPriority="52"/>
-    <w:lsdException w:name="Colorful Grid Accent 3" w:uiPriority="73"/>
-    <w:lsdException w:name="Normal Table" w:uiPriority="99" w:semiHidden="1" w:unhideWhenUsed="1"/>
-    <w:lsdException w:name="Colorful List Accent 6" w:uiPriority="72"/>
-    <w:lsdException w:name="Bibliography" w:uiPriority="37" w:semiHidden="1" w:unhideWhenUsed="1"/>
-    <w:lsdException w:name="List Table 2 Accent 1" w:uiPriority="47"/>
-    <w:lsdException w:name="List Table 5 Dark Accent 3" w:uiPriority="50"/>
-    <w:lsdException w:name="Medium List 1 Accent 3" w:uiPriority="65"/>
-    <w:lsdException w:name="Table Classic 3" w:semiHidden="1" w:unhideWhenUsed="1"/>
-    <w:lsdException w:name="Table Grid 7" w:semiHidden="1" w:unhideWhenUsed="1"/>
-    <w:lsdException w:name="List Table 4 Accent 5" w:uiPriority="49"/>
-    <w:lsdException w:name="Grid Table 6 Colorful Accent 1" w:uiPriority="51"/>
-    <w:lsdException w:name="HTML Preformatted" w:uiPriority="99"/>
-    <w:lsdException w:name="Grid Table 5 Dark Accent 2" w:uiPriority="50"/>
-    <w:lsdException w:name="Table Classic 2" w:semiHidden="1" w:unhideWhenUsed="1"/>
-    <w:lsdException w:name="List Table 1 Light Accent 6" w:uiPriority="46"/>
-    <w:lsdException w:name="Grid Table 6 Colorful Accent 5" w:uiPriority="51"/>
-    <w:lsdException w:name="footnote reference" w:uiPriority="99" w:semiHidden="1" w:unhideWhenUsed="1"/>
-    <w:lsdException w:name="Grid Table 1 Light Accent 6" w:uiPriority="46"/>
-    <w:lsdException w:name="toc 3" w:uiPriority="99"/>
-    <w:lsdException w:name="HTML Variable" w:uiPriority="99"/>
-    <w:lsdException w:name="Medium Grid 2 Accent 4" w:uiPriority="68"/>
-    <w:lsdException w:name="Grid Table 2 Accent 3" w:uiPriority="47"/>
-    <w:lsdException w:name="Grid Table 2" w:uiPriority="47"/>
-    <w:lsdException w:name="Light List Accent 3" w:uiPriority="61"/>
-    <w:lsdException w:name="List Table 5 Dark Accent 1" w:uiPriority="50"/>
+    <w:lsdException w:name="HTML Keyboard" w:uiPriority="99"/>
+    <w:lsdException w:name="Medium Grid 2 Accent 2" w:uiPriority="68"/>
     <w:lsdException w:name="List Table 1 Light Accent 4" w:uiPriority="46"/>
     <w:lsdException w:name="HTML Sample" w:uiPriority="99"/>
-    <w:lsdException w:name="List Table 3 Accent 1" w:uiPriority="48"/>
-    <w:lsdException w:name="Medium List 2" w:uiPriority="66"/>
-    <w:lsdException w:name="Medium Grid 3 Accent 2" w:uiPriority="69"/>
-    <w:lsdException w:name="Colorful List Accent 4" w:uiPriority="72"/>
+    <w:lsdException w:name="Book Title" w:uiPriority="33" w:qFormat="1"/>
+    <w:lsdException w:name="List Table 1 Light Accent 2" w:uiPriority="46"/>
+    <w:lsdException w:name="Table Simple 2" w:semiHidden="1" w:unhideWhenUsed="1"/>
+    <w:lsdException w:name="List Table 6 Colorful Accent 1" w:uiPriority="51"/>
+    <w:lsdException w:name="Medium Shading 2 Accent 3" w:uiPriority="64"/>
+    <w:lsdException w:name="Medium List 2 Accent 1" w:uiPriority="66"/>
+    <w:lsdException w:name="Table Classic 2" w:semiHidden="1" w:unhideWhenUsed="1"/>
+    <w:lsdException w:name="Grid Table 1 Light Accent 1" w:uiPriority="46"/>
+    <w:lsdException w:name="Grid Table 4 Accent 1" w:uiPriority="49"/>
+    <w:lsdException w:name="Medium Grid 3 Accent 6" w:uiPriority="69"/>
+    <w:lsdException w:name="Table Classic 4" w:semiHidden="1" w:unhideWhenUsed="1"/>
+    <w:lsdException w:name="Medium Shading 2 Accent 2" w:uiPriority="64"/>
+    <w:lsdException w:name="List Table 6 Colorful Accent 3" w:uiPriority="51"/>
+    <w:lsdException w:name="Grid Table 3 Accent 5" w:uiPriority="48"/>
+    <w:lsdException w:name="Light List Accent 5" w:uiPriority="61"/>
+    <w:lsdException w:name="Grid Table 1 Light Accent 5" w:uiPriority="46"/>
+    <w:lsdException w:name="Medium Grid 2 Accent 5" w:uiPriority="68"/>
+    <w:lsdException w:name="Grid Table 5 Dark Accent 3" w:uiPriority="50"/>
+    <w:lsdException w:name="Dark List" w:uiPriority="70"/>
+    <w:lsdException w:name="Light Grid Accent 3" w:uiPriority="62"/>
+    <w:lsdException w:name="Bibliography" w:uiPriority="37" w:semiHidden="1" w:unhideWhenUsed="1"/>
+    <w:lsdException w:name="List Table 5 Dark Accent 6" w:uiPriority="50"/>
+    <w:lsdException w:name="Light Grid Accent 6" w:uiPriority="62"/>
+    <w:lsdException w:name="List Table 5 Dark Accent 3" w:uiPriority="50"/>
+    <w:lsdException w:name="Colorful List Accent 5" w:uiPriority="72"/>
+    <w:lsdException w:name="Light List Accent 3" w:uiPriority="61"/>
+    <w:lsdException w:name="Table Web 1" w:semiHidden="1" w:unhideWhenUsed="1"/>
+    <w:lsdException w:name="Grid Table 6 Colorful Accent 6" w:uiPriority="51"/>
+    <w:lsdException w:name="Grid Table 3 Accent 3" w:uiPriority="48"/>
+    <w:lsdException w:name="toc 7" w:uiPriority="99"/>
+    <w:lsdException w:name="Grid Table 7 Colorful" w:uiPriority="52"/>
+    <w:lsdException w:name="Grid Table 6 Colorful Accent 3" w:uiPriority="51"/>
+    <w:lsdException w:name="Grid Table 4 Accent 4" w:uiPriority="49"/>
+    <w:lsdException w:name="Grid Table 4" w:uiPriority="49"/>
+    <w:lsdException w:name="Colorful Grid Accent 3" w:uiPriority="73"/>
+    <w:lsdException w:name="Colorful Shading Accent 5" w:uiPriority="71"/>
+    <w:lsdException w:name="Table Grid 1" w:semiHidden="1" w:unhideWhenUsed="1"/>
+    <w:lsdException w:name="Grid Table 2 Accent 5" w:uiPriority="47"/>
+    <w:lsdException w:name="HTML Typewriter" w:uiPriority="99"/>
     <w:lsdException w:name="Colorful Grid" w:uiPriority="73"/>
+    <w:lsdException w:name="Colorful List Accent 6" w:uiPriority="72"/>
+    <w:lsdException w:name="List Table 5 Dark Accent 5" w:uiPriority="50"/>
+    <w:lsdException w:name="Colorful Grid Accent 4" w:uiPriority="73"/>
+    <w:lsdException w:name="Table List 3" w:semiHidden="1" w:unhideWhenUsed="1"/>
+    <w:lsdException w:name="Table Elegant" w:semiHidden="1" w:unhideWhenUsed="1"/>
+    <w:lsdException w:name="Table Grid 2" w:semiHidden="1" w:unhideWhenUsed="1"/>
+    <w:lsdException w:name="Subtle Reference" w:uiPriority="31" w:qFormat="1"/>
+    <w:lsdException w:name="Light List Accent 2" w:uiPriority="61"/>
+    <w:lsdException w:name="Table Professional" w:semiHidden="1" w:unhideWhenUsed="1"/>
+    <w:lsdException w:name="Intense Reference" w:uiPriority="32" w:qFormat="1"/>
+    <w:lsdException w:name="Default Paragraph Font" w:uiPriority="1" w:semiHidden="1" w:unhideWhenUsed="1"/>
+    <w:lsdException w:name="TOC Heading" w:uiPriority="39" w:semiHidden="1" w:unhideWhenUsed="1" w:qFormat="1"/>
+    <w:lsdException w:name="Table Grid" w:qFormat="1"/>
+    <w:lsdException w:name="Grid Table 3 Accent 2" w:uiPriority="48"/>
+    <w:lsdException w:name="List Table 2 Accent 5" w:uiPriority="47"/>
+    <w:lsdException w:name="Table 3D effects 1" w:semiHidden="1" w:unhideWhenUsed="1"/>
+    <w:lsdException w:name="Medium Shading 2 Accent 5" w:uiPriority="64"/>
+    <w:lsdException w:name="List Table 2" w:uiPriority="47"/>
+    <w:lsdException w:name="Light Grid" w:uiPriority="62"/>
+    <w:lsdException w:name="heading 1" w:qFormat="1"/>
+    <w:lsdException w:name="Unresolved Mention" w:uiPriority="99" w:semiHidden="1" w:unhideWhenUsed="1"/>
+    <w:lsdException w:name="Medium Grid 3" w:uiPriority="69"/>
+    <w:lsdException w:name="Medium List 2 Accent 2" w:uiPriority="66"/>
+    <w:lsdException w:name="Table List 6" w:semiHidden="1" w:unhideWhenUsed="1"/>
+    <w:lsdException w:name="Table Theme" w:semiHidden="1" w:unhideWhenUsed="1"/>
+    <w:lsdException w:name="toc 8" w:uiPriority="99"/>
+    <w:lsdException w:name="Table Colorful 2" w:semiHidden="1" w:unhideWhenUsed="1"/>
+    <w:lsdException w:name="Medium Grid 1 Accent 5" w:uiPriority="67"/>
+    <w:lsdException w:name="Grid Table 1 Light Accent 2" w:uiPriority="46"/>
+    <w:lsdException w:name="Plain Table 3" w:uiPriority="43"/>
+    <w:lsdException w:name="HTML Cite" w:uiPriority="99"/>
+    <w:lsdException w:name="Table Columns 1" w:semiHidden="1" w:unhideWhenUsed="1"/>
+    <w:lsdException w:name="Outline List 3" w:uiPriority="99" w:semiHidden="1" w:unhideWhenUsed="1"/>
+    <w:lsdException w:name="toc 9" w:uiPriority="99"/>
+    <w:lsdException w:name="Quote" w:uiPriority="99"/>
+    <w:lsdException w:name="Grid Table 4 Accent 5" w:uiPriority="49"/>
+    <w:lsdException w:name="Plain Table 5" w:uiPriority="45"/>
+    <w:lsdException w:name="Light Grid Accent 2" w:uiPriority="62"/>
+    <w:lsdException w:name="Table Columns 3" w:semiHidden="1" w:unhideWhenUsed="1"/>
+    <w:lsdException w:name="List Table 2 Accent 1" w:uiPriority="47"/>
+    <w:lsdException w:name="Colorful List Accent 1" w:uiPriority="72"/>
+    <w:lsdException w:name="heading 9" w:unhideWhenUsed="1" w:qFormat="1"/>
+    <w:lsdException w:name="toc 3" w:uiPriority="99"/>
+    <w:lsdException w:name="Grid Table 7 Colorful Accent 3" w:uiPriority="52"/>
+    <w:lsdException w:name="Table List 4" w:semiHidden="1" w:unhideWhenUsed="1"/>
+    <w:lsdException w:name="List Table 6 Colorful Accent 5" w:uiPriority="51"/>
+    <w:lsdException w:name="HTML Bottom of Form" w:uiPriority="99" w:semiHidden="1" w:unhideWhenUsed="1"/>
+    <w:lsdException w:name="Table Grid 8" w:semiHidden="1" w:unhideWhenUsed="1"/>
+    <w:lsdException w:name="No List" w:uiPriority="99" w:semiHidden="1" w:unhideWhenUsed="1"/>
+    <w:lsdException w:name="Grid Table 3 Accent 6" w:uiPriority="48"/>
+    <w:lsdException w:name="Light Grid Accent 4" w:uiPriority="62"/>
+    <w:lsdException w:name="Medium Shading 1 Accent 1" w:uiPriority="63"/>
+    <w:lsdException w:name="HTML Variable" w:uiPriority="99"/>
+    <w:lsdException w:name="toc 2" w:uiPriority="99"/>
+    <w:lsdException w:name="Grid Table 5 Dark Accent 5" w:uiPriority="50"/>
+    <w:lsdException w:name="heading 3" w:qFormat="1"/>
+    <w:lsdException w:name="heading 8" w:unhideWhenUsed="1" w:qFormat="1"/>
+    <w:lsdException w:name="Colorful Grid Accent 2" w:uiPriority="73"/>
+    <w:lsdException w:name="Normal Table" w:uiPriority="99" w:semiHidden="1" w:unhideWhenUsed="1"/>
+    <w:lsdException w:name="HTML Preformatted" w:uiPriority="99"/>
+    <w:lsdException w:name="Subtitle" w:qFormat="1"/>
+    <w:lsdException w:name="Medium Shading 1 Accent 6" w:uiPriority="63"/>
+    <w:lsdException w:name="Table Grid 4" w:semiHidden="1" w:unhideWhenUsed="1"/>
+    <w:lsdException w:name="List Table 4" w:uiPriority="49"/>
+    <w:lsdException w:name="List Table 4 Accent 4" w:uiPriority="49"/>
+    <w:lsdException w:name="Light List" w:uiPriority="61"/>
+    <w:lsdException w:name="Colorful List Accent 3" w:uiPriority="72"/>
+    <w:lsdException w:name="Medium Shading 1 Accent 4" w:uiPriority="63"/>
+    <w:lsdException w:name="Grid Table 7 Colorful Accent 6" w:uiPriority="52"/>
     <w:lsdException w:name="heading 4" w:qFormat="1"/>
-    <w:lsdException w:name="Grid Table 1 Light Accent 3" w:uiPriority="46"/>
-    <w:lsdException w:name="Colorful Shading Accent 2" w:uiPriority="71"/>
-    <w:lsdException w:name="Dark List" w:uiPriority="70"/>
-    <w:lsdException w:name="Table Web 1" w:semiHidden="1" w:unhideWhenUsed="1"/>
-    <w:lsdException w:name="List Table 5 Dark Accent 5" w:uiPriority="50"/>
-    <w:lsdException w:name="Light Grid Accent 3" w:uiPriority="62"/>
-    <w:lsdException w:name="Plain Table 5" w:uiPriority="45"/>
-    <w:lsdException w:name="TOC Heading" w:uiPriority="39" w:semiHidden="1" w:unhideWhenUsed="1" w:qFormat="1"/>
-    <w:lsdException w:name="Table List 4" w:semiHidden="1" w:unhideWhenUsed="1"/>
-    <w:lsdException w:name="List Table 4 Accent 2" w:uiPriority="49"/>
-    <w:lsdException w:name="HTML Definition" w:uiPriority="99"/>
-    <w:lsdException w:name="Grid Table 4 Accent 6" w:uiPriority="49"/>
-    <w:lsdException w:name="Medium Grid 3 Accent 6" w:uiPriority="69"/>
-    <w:lsdException w:name="Medium Shading 1 Accent 3" w:uiPriority="63"/>
-    <w:lsdException w:name="Grid Table 5 Dark Accent 1" w:uiPriority="50"/>
-    <w:lsdException w:name="List Table 5 Dark Accent 6" w:uiPriority="50"/>
-    <w:lsdException w:name="List Table 7 Colorful Accent 6" w:uiPriority="52"/>
-    <w:lsdException w:name="Table Simple 1" w:semiHidden="1" w:unhideWhenUsed="1"/>
-    <w:lsdException w:name="List Table 4 Accent 3" w:uiPriority="49"/>
-    <w:lsdException w:name="Table Colorful 3" w:semiHidden="1" w:unhideWhenUsed="1"/>
-    <w:lsdException w:name="Grid Table 3 Accent 3" w:uiPriority="48"/>
-    <w:lsdException w:name="Outline List 1" w:uiPriority="99" w:semiHidden="1" w:unhideWhenUsed="1"/>
-    <w:lsdException w:name="Light Shading Accent 1" w:uiPriority="60"/>
-    <w:lsdException w:name="Light Grid" w:uiPriority="62"/>
-    <w:lsdException w:name="Light Shading Accent 2" w:uiPriority="60"/>
-    <w:lsdException w:name="Medium Shading 2 Accent 3" w:uiPriority="64"/>
-    <w:lsdException w:name="Grid Table 5 Dark Accent 6" w:uiPriority="50"/>
-    <w:lsdException w:name="toc 2" w:uiPriority="99"/>
-    <w:lsdException w:name="Grid Table 6 Colorful" w:uiPriority="51"/>
-    <w:lsdException w:name="Colorful Shading Accent 5" w:uiPriority="71"/>
-    <w:lsdException w:name="Medium Grid 1 Accent 5" w:uiPriority="67"/>
-    <w:lsdException w:name="Grid Table 4 Accent 2" w:uiPriority="49"/>
-    <w:lsdException w:name="List Table 1 Light Accent 3" w:uiPriority="46"/>
-    <w:lsdException w:name="Medium Shading 1" w:uiPriority="63"/>
-    <w:lsdException w:name="Table Classic 1" w:semiHidden="1" w:unhideWhenUsed="1"/>
-    <w:lsdException w:name="Grid Table 7 Colorful Accent 5" w:uiPriority="52"/>
-    <w:lsdException w:name="Light List" w:uiPriority="61"/>
-    <w:lsdException w:name="Medium Grid 1 Accent 2" w:uiPriority="67"/>
-    <w:lsdException w:name="Grid Table 4 Accent 1" w:uiPriority="49"/>
-    <w:lsdException w:name="List Table 2 Accent 3" w:uiPriority="47"/>
-    <w:lsdException w:name="Dark List Accent 3" w:uiPriority="70"/>
-    <w:lsdException w:name="Medium Grid 3 Accent 3" w:uiPriority="69"/>
-    <w:lsdException w:name="Table Subtle 2" w:semiHidden="1" w:unhideWhenUsed="1"/>
-    <w:lsdException w:name="Smart Link" w:uiPriority="99" w:semiHidden="1" w:unhideWhenUsed="1"/>
-    <w:lsdException w:name="Colorful Shading Accent 3" w:uiPriority="71"/>
-    <w:lsdException w:name="List Paragraph" w:uiPriority="99"/>
-    <w:lsdException w:name="List Table 3 Accent 4" w:uiPriority="48"/>
-    <w:lsdException w:name="Grid Table Light" w:uiPriority="40"/>
-    <w:lsdException w:name="Medium Grid 3 Accent 4" w:uiPriority="69"/>
-    <w:lsdException w:name="Light List Accent 2" w:uiPriority="61"/>
-    <w:lsdException w:name="HTML Keyboard" w:uiPriority="99"/>
-    <w:lsdException w:name="Medium List 2 Accent 5" w:uiPriority="66"/>
-    <w:lsdException w:name="Medium Grid 2 Accent 5" w:uiPriority="68"/>
-    <w:lsdException w:name="Grid Table 6 Colorful Accent 6" w:uiPriority="51"/>
-    <w:lsdException w:name="Plain Table 3" w:uiPriority="43"/>
+    <w:lsdException w:name="Table Web 2" w:semiHidden="1" w:unhideWhenUsed="1"/>
     <w:lsdException w:name="Dark List Accent 1" w:uiPriority="70"/>
-    <w:lsdException w:name="Plain Table 1" w:uiPriority="41"/>
-    <w:lsdException w:name="Grid Table 5 Dark" w:uiPriority="50"/>
-    <w:lsdException w:name="Grid Table 5 Dark Accent 3" w:uiPriority="50"/>
-    <w:lsdException w:name="Grid Table 3 Accent 6" w:uiPriority="48"/>
-    <w:lsdException w:name="List Table 6 Colorful Accent 1" w:uiPriority="51"/>
-    <w:lsdException w:name="List Table 4 Accent 1" w:uiPriority="49"/>
-    <w:lsdException w:name="Light Grid Accent 5" w:uiPriority="62"/>
-    <w:lsdException w:name="Table List 8" w:semiHidden="1" w:unhideWhenUsed="1"/>
-    <w:lsdException w:name="Table List 7" w:semiHidden="1" w:unhideWhenUsed="1"/>
-    <w:lsdException w:name="Grid Table 6 Colorful Accent 2" w:uiPriority="51"/>
-    <w:lsdException w:name="Grid Table 2 Accent 4" w:uiPriority="47"/>
-    <w:lsdException w:name="toc 9" w:uiPriority="99"/>
-    <w:lsdException w:name="Medium Grid 2 Accent 6" w:uiPriority="68"/>
-    <w:lsdException w:name="Dark List Accent 2" w:uiPriority="70"/>
-    <w:lsdException w:name="Table Columns 5" w:semiHidden="1" w:unhideWhenUsed="1"/>
-    <w:lsdException w:name="toc 1" w:uiPriority="99"/>
-    <w:lsdException w:name="Colorful Shading Accent 1" w:uiPriority="71"/>
-    <w:lsdException w:name="List Table 6 Colorful Accent 4" w:uiPriority="51"/>
-    <w:lsdException w:name="Medium Grid 3" w:uiPriority="69"/>
-    <w:lsdException w:name="HTML Cite" w:uiPriority="99"/>
-    <w:lsdException w:name="Table Grid 4" w:semiHidden="1" w:unhideWhenUsed="1"/>
+    <w:lsdException w:name="Medium Grid 3 Accent 5" w:uiPriority="69"/>
+    <w:lsdException w:name="footnote text" w:uiPriority="99" w:semiHidden="1" w:unhideWhenUsed="1"/>
+    <w:lsdException w:name="Table Grid 5" w:semiHidden="1" w:unhideWhenUsed="1"/>
+    <w:lsdException w:name="Grid Table 7 Colorful Accent 2" w:uiPriority="52"/>
+    <w:lsdException w:name="Mention" w:uiPriority="99" w:semiHidden="1" w:unhideWhenUsed="1"/>
     <w:lsdException w:name="Medium Grid 1" w:uiPriority="67"/>
-    <w:lsdException w:name="Medium Shading 1 Accent 6" w:uiPriority="63"/>
-    <w:lsdException w:name="List Table 5 Dark" w:uiPriority="50"/>
-    <w:lsdException w:name="Grid Table 1 Light Accent 4" w:uiPriority="46"/>
+    <w:lsdException w:name="Table Columns 2" w:semiHidden="1" w:unhideWhenUsed="1"/>
     <w:lsdException w:name="Medium List 1 Accent 5" w:uiPriority="65"/>
-    <w:lsdException w:name="Medium Shading 1 Accent 5" w:uiPriority="63"/>
-    <w:lsdException w:name="toc 4" w:uiPriority="99"/>
-    <w:lsdException w:name="List Table 7 Colorful Accent 1" w:uiPriority="52"/>
-    <w:lsdException w:name="Medium Grid 2 Accent 1" w:uiPriority="68"/>
-    <w:lsdException w:name="HTML Typewriter" w:uiPriority="99"/>
-    <w:lsdException w:name="Light List Accent 4" w:uiPriority="61"/>
-    <w:lsdException w:name="Intense Quote" w:uiPriority="99"/>
-    <w:lsdException w:name="Grid Table 6 Colorful Accent 4" w:uiPriority="51"/>
-    <w:lsdException w:name="Medium Grid 1 Accent 1" w:uiPriority="67"/>
-    <w:lsdException w:name="List Table 7 Colorful" w:uiPriority="52"/>
-    <w:lsdException w:name="Table Subtle 1" w:semiHidden="1" w:unhideWhenUsed="1"/>
-    <w:lsdException w:name="Grid Table 4" w:uiPriority="49"/>
-    <w:lsdException w:name="Light Shading Accent 6" w:uiPriority="60"/>
-    <w:lsdException w:name="Grid Table 7 Colorful Accent 6" w:uiPriority="52"/>
-    <w:lsdException w:name="Table Grid 2" w:semiHidden="1" w:unhideWhenUsed="1"/>
-    <w:lsdException w:name="Table Professional" w:semiHidden="1" w:unhideWhenUsed="1"/>
-    <w:lsdException w:name="Colorful Grid Accent 5" w:uiPriority="73"/>
-    <w:lsdException w:name="List Table 5 Dark Accent 2" w:uiPriority="50"/>
-    <w:lsdException w:name="Colorful List Accent 2" w:uiPriority="72"/>
-    <w:lsdException w:name="Outline List 2" w:uiPriority="99" w:semiHidden="1" w:unhideWhenUsed="1"/>
-    <w:lsdException w:name="Medium Shading 2 Accent 4" w:uiPriority="64"/>
-    <w:lsdException w:name="Light Shading Accent 4" w:uiPriority="60"/>
-    <w:lsdException w:name="Colorful Grid Accent 6" w:uiPriority="73"/>
-    <w:lsdException w:name="Grid Table 3 Accent 5" w:uiPriority="48"/>
-    <w:lsdException w:name="Dark List Accent 4" w:uiPriority="70"/>
-    <w:lsdException w:name="Colorful Grid Accent 4" w:uiPriority="73"/>
-    <w:lsdException w:name="Table Grid 5" w:semiHidden="1" w:unhideWhenUsed="1"/>
-    <w:lsdException w:name="Medium List 2 Accent 2" w:uiPriority="66"/>
-    <w:lsdException w:name="Grid Table 1 Light Accent 1" w:uiPriority="46"/>
-    <w:lsdException w:name="List Table 7 Colorful Accent 5" w:uiPriority="52"/>
-    <w:lsdException w:name="Medium List 2 Accent 3" w:uiPriority="66"/>
-    <w:lsdException w:name="List Table 3 Accent 5" w:uiPriority="48"/>
-    <w:lsdException w:name="Table 3D effects 2" w:semiHidden="1" w:unhideWhenUsed="1"/>
-    <w:lsdException w:name="Table List 5" w:semiHidden="1" w:unhideWhenUsed="1"/>
-    <w:lsdException w:name="List Table 6 Colorful" w:uiPriority="51"/>
-    <w:lsdException w:name="Table 3D effects 3" w:semiHidden="1" w:unhideWhenUsed="1"/>
-    <w:lsdException w:name="heading 6" w:qFormat="1"/>
-    <w:lsdException w:name="Table Classic 4" w:semiHidden="1" w:unhideWhenUsed="1"/>
-    <w:lsdException w:name="Medium Grid 2 Accent 2" w:uiPriority="68"/>
-    <w:lsdException w:name="HTML Code" w:uiPriority="99"/>
-    <w:lsdException w:name="Colorful Grid Accent 1" w:uiPriority="73"/>
-    <w:lsdException w:name="Colorful List" w:uiPriority="72"/>
-    <w:lsdException w:name="Grid Table 5 Dark Accent 5" w:uiPriority="50"/>
-    <w:lsdException w:name="Default Paragraph Font" w:uiPriority="1" w:semiHidden="1" w:unhideWhenUsed="1"/>
-    <w:lsdException w:name="Medium Grid 2" w:uiPriority="68"/>
-    <w:lsdException w:name="Medium Shading 1 Accent 4" w:uiPriority="63"/>
-    <w:lsdException w:name="Table Contemporary" w:semiHidden="1" w:unhideWhenUsed="1"/>
-    <w:lsdException w:name="Medium Grid 1 Accent 3" w:uiPriority="67"/>
-    <w:lsdException w:name="Grid Table 4 Accent 3" w:uiPriority="49"/>
-    <w:lsdException w:name="Table Grid 6" w:semiHidden="1" w:unhideWhenUsed="1"/>
-    <w:lsdException w:name="Grid Table 2 Accent 5" w:uiPriority="47"/>
-    <w:lsdException w:name="Light List Accent 5" w:uiPriority="61"/>
-    <w:lsdException w:name="Book Title" w:uiPriority="33" w:qFormat="1"/>
-    <w:lsdException w:name="Grid Table 5 Dark Accent 4" w:uiPriority="50"/>
-    <w:lsdException w:name="Medium List 1 Accent 2" w:uiPriority="65"/>
-    <w:lsdException w:name="Dark List Accent 5" w:uiPriority="70"/>
-    <w:lsdException w:name="Light Shading Accent 3" w:uiPriority="60"/>
-    <w:lsdException w:name="Medium Shading 2" w:uiPriority="64"/>
-    <w:lsdException w:name="Table List 2" w:semiHidden="1" w:unhideWhenUsed="1"/>
-    <w:lsdException w:name="Medium List 2 Accent 4" w:uiPriority="66"/>
-    <w:lsdException w:name="caption" w:semiHidden="1" w:unhideWhenUsed="1" w:qFormat="1"/>
-    <w:lsdException w:name="Table Elegant" w:semiHidden="1" w:unhideWhenUsed="1"/>
-    <w:lsdException w:name="Grid Table 1 Light Accent 5" w:uiPriority="46"/>
-    <w:lsdException w:name="toc 6" w:uiPriority="99"/>
-    <w:lsdException w:name="Medium Grid 3 Accent 1" w:uiPriority="69"/>
-    <w:lsdException w:name="Intense Emphasis" w:uiPriority="21" w:qFormat="1"/>
-    <w:lsdException w:name="toc 8" w:uiPriority="99"/>
-    <w:lsdException w:name="Grid Table 7 Colorful" w:uiPriority="52"/>
-    <w:lsdException w:name="toc 5" w:uiPriority="99"/>
-    <w:lsdException w:name="Subtle Reference" w:uiPriority="31" w:qFormat="1"/>
-    <w:lsdException w:name="Table Columns 4" w:semiHidden="1" w:unhideWhenUsed="1"/>
-    <w:lsdException w:name="Grid Table 7 Colorful Accent 4" w:uiPriority="52"/>
-    <w:lsdException w:name="Light Grid Accent 4" w:uiPriority="62"/>
-    <w:lsdException w:name="List Table 5 Dark Accent 4" w:uiPriority="50"/>
-    <w:lsdException w:name="List Table 7 Colorful Accent 4" w:uiPriority="52"/>
-    <w:lsdException w:name="Colorful List Accent 3" w:uiPriority="72"/>
-    <w:lsdException w:name="Mention" w:uiPriority="99" w:semiHidden="1" w:unhideWhenUsed="1"/>
-    <w:lsdException w:name="Quote" w:uiPriority="99"/>
-    <w:lsdException w:name="List Table 6 Colorful Accent 5" w:uiPriority="51"/>
-    <w:lsdException w:name="Grid Table 3" w:uiPriority="48"/>
-    <w:lsdException w:name="Grid Table 4 Accent 4" w:uiPriority="49"/>
-    <w:lsdException w:name="Colorful Grid Accent 2" w:uiPriority="73"/>
-    <w:lsdException w:name="Light Grid Accent 1" w:uiPriority="62"/>
-    <w:lsdException w:name="heading 1" w:qFormat="1"/>
-    <w:lsdException w:name="List Table 4 Accent 6" w:uiPriority="49"/>
-    <w:lsdException w:name="Grid Table 6 Colorful Accent 3" w:uiPriority="51"/>
-    <w:lsdException w:name="Grid Table 1 Light Accent 2" w:uiPriority="46"/>
-    <w:lsdException w:name="List Table 2 Accent 4" w:uiPriority="47"/>
-    <w:lsdException w:name="Grid Table 3 Accent 1" w:uiPriority="48"/>
-    <w:lsdException w:name="heading 3" w:qFormat="1"/>
-    <w:lsdException w:name="List Table 4" w:uiPriority="49"/>
-    <w:lsdException w:name="Table Simple 3" w:semiHidden="1" w:unhideWhenUsed="1"/>
-    <w:lsdException w:name="Medium List 1" w:uiPriority="65"/>
-    <w:lsdException w:name="Dark List Accent 6" w:uiPriority="70"/>
-    <w:lsdException w:name="Medium Grid 3 Accent 5" w:uiPriority="69"/>
-    <w:lsdException w:name="Colorful Shading Accent 4" w:uiPriority="71"/>
-    <w:lsdException w:name="heading 9" w:unhideWhenUsed="1" w:qFormat="1"/>
-    <w:lsdException w:name="HTML Acronym" w:uiPriority="99"/>
-    <w:lsdException w:name="Table Simple 2" w:semiHidden="1" w:unhideWhenUsed="1"/>
-    <w:lsdException w:name="Grid Table 1 Light" w:uiPriority="46"/>
-    <w:lsdException w:name="List Table 7 Colorful Accent 2" w:uiPriority="52"/>
-    <w:lsdException w:name="Table List 3" w:semiHidden="1" w:unhideWhenUsed="1"/>
-    <w:lsdException w:name="List Table 4 Accent 4" w:uiPriority="49"/>
-    <w:lsdException w:name="Table Colorful 1" w:semiHidden="1" w:unhideWhenUsed="1"/>
-    <w:lsdException w:name="Colorful List Accent 5" w:uiPriority="72"/>
-    <w:lsdException w:name="Table Grid 8" w:semiHidden="1" w:unhideWhenUsed="1"/>
-    <w:lsdException w:name="Plain Table 4" w:uiPriority="44"/>
-    <w:lsdException w:name="No Spacing" w:uiPriority="99"/>
-    <w:lsdException w:name="List Table 2" w:uiPriority="47"/>
-    <w:lsdException w:name="Hashtag" w:uiPriority="99" w:semiHidden="1" w:unhideWhenUsed="1"/>
-    <w:lsdException w:name="Grid Table 3 Accent 4" w:uiPriority="48"/>
-    <w:lsdException w:name="List Table 2 Accent 2" w:uiPriority="47"/>
-    <w:lsdException w:name="Medium Grid 1 Accent 6" w:uiPriority="67"/>
-    <w:lsdException w:name="Light Shading" w:uiPriority="60"/>
-    <w:lsdException w:name="List Table 3 Accent 3" w:uiPriority="48"/>
+    <w:lsdException w:name="Medium List 1 Accent 6" w:uiPriority="65"/>
   </w:latentStyles>
-  <w:style w:type="paragraph" w:styleId="000018" w:customStyle="1">
-    <w:name w:val="melo-codeblock-Base-theme-para"/>
-    <w:uiPriority w:val="99"/>
+  <w:style w:type="paragraph" w:styleId="o14ybc">
+    <w:name w:val="toc 3"/>
+    <w:basedOn w:val="000001"/>
+    <w:next w:val="000001"/>
+    <w:autoRedefine w:val="1"/>
+    <w:uiPriority w:val="39"/>
+    <w:unhideWhenUsed w:val="1"/>
     <w:pPr>
-      <w:snapToGrid w:val="0"/>
-      <w:spacing w:line="360" w:lineRule="auto"/>
+      <w:ind w:left="420"/>
+      <w:jc w:val="left"/>
     </w:pPr>
     <w:rPr>
-      <w:rFonts w:ascii="Monaco" w:hAnsi="Monaco" w:eastAsia="Monaco" w:cs="Monaco"/>
-      <w:color w:val="000000"/>
-      <w:sz w:val="21"/>
+      <w:rFonts w:eastAsiaTheme="minorHAnsi"/>
+      <w:iCs w:val="1"/>
+      <w:sz w:val="22"/>
+      <w:szCs w:val="22"/>
+    </w:rPr>
+  </w:style>
+  <w:style w:type="paragraph" w:styleId="vwvnpp">
+    <w:name w:val="toc 3"/>
+    <w:basedOn w:val="000001"/>
+    <w:next w:val="000001"/>
+    <w:autoRedefine w:val="1"/>
+    <w:uiPriority w:val="39"/>
+    <w:unhideWhenUsed w:val="1"/>
+    <w:pPr>
+      <w:ind w:left="420"/>
+      <w:jc w:val="left"/>
+    </w:pPr>
+    <w:rPr>
+      <w:rFonts w:eastAsiaTheme="minorHAnsi"/>
+      <w:iCs w:val="1"/>
+      <w:sz w:val="22"/>
+      <w:szCs w:val="22"/>
+    </w:rPr>
+  </w:style>
+  <w:style w:type="paragraph" w:styleId="000010">
+    <w:name w:val="header"/>
+    <w:basedOn w:val="000001"/>
+    <w:pPr>
+      <w:pBdr>
+        <w:bottom w:val="single" w:color="auto" w:sz="6" w:space="1"/>
+      </w:pBdr>
+      <w:tabs>
+        <w:tab w:val="center" w:pos="4153"/>
+        <w:tab w:val="right" w:pos="8306"/>
+      </w:tabs>
+      <w:snapToGrid w:val="0"/>
+      <w:jc w:val="center"/>
+    </w:pPr>
+    <w:rPr>
+      <w:sz w:val="18"/>
+      <w:szCs w:val="18"/>
+    </w:rPr>
+  </w:style>
+  <w:style w:type="character" w:styleId="00000b" w:default="1">
+    <w:name w:val="Default Paragraph Font"/>
+    <w:uiPriority w:val="1"/>
+    <w:semiHidden w:val="1"/>
+    <w:unhideWhenUsed w:val="1"/>
+  </w:style>
+  <w:style w:type="paragraph" w:styleId="000008">
+    <w:name w:val="heading 7"/>
+    <w:basedOn w:val="000001"/>
+    <w:next w:val="000001"/>
+    <w:unhideWhenUsed w:val="1"/>
+    <w:qFormat w:val="1"/>
+    <w:pPr>
+      <w:keepNext w:val="1"/>
+      <w:keepLines w:val="1"/>
+      <w:spacing w:line="480" w:lineRule="auto"/>
+      <w:outlineLvl w:val="6"/>
+    </w:pPr>
+    <w:rPr>
+      <w:b w:val="1"/>
+    </w:rPr>
+  </w:style>
+  <w:style w:type="paragraph" w:styleId="2e4cod">
+    <w:name w:val="toc 2"/>
+    <w:basedOn w:val="000001"/>
+    <w:next w:val="000001"/>
+    <w:autoRedefine w:val="1"/>
+    <w:uiPriority w:val="39"/>
+    <w:unhideWhenUsed w:val="1"/>
+    <w:pPr>
+      <w:ind w:left="210"/>
+      <w:jc w:val="left"/>
+    </w:pPr>
+    <w:rPr>
+      <w:rFonts w:eastAsiaTheme="minorHAnsi"/>
+      <w:smallCaps w:val="1"/>
+      <w:sz w:val="22"/>
+      <w:szCs w:val="22"/>
+    </w:rPr>
+  </w:style>
+  <w:style w:type="numbering" w:styleId="00000d" w:default="1">
+    <w:name w:val="No List"/>
+    <w:uiPriority w:val="99"/>
+    <w:semiHidden w:val="1"/>
+    <w:unhideWhenUsed w:val="1"/>
+  </w:style>
+  <w:style w:type="character" w:styleId="000016">
+    <w:name w:val="Hyperlink"/>
+    <w:basedOn w:val="00000b"/>
+    <w:rPr>
+      <w:color w:val="1E6FFF"/>
+      <w:u w:val="single"/>
+    </w:rPr>
+  </w:style>
+  <w:style w:type="character" w:styleId="000014" w:customStyle="1">
+    <w:name w:val="标题 字符"/>
+    <w:basedOn w:val="00000b"/>
+    <w:link w:val="000013"/>
+    <w:rPr>
+      <w:rFonts w:ascii="Arial" w:hAnsi="Arial" w:eastAsia="微软雅黑" w:cstheme="majorBidi"/>
+      <w:b w:val="1"/>
+      <w:bCs w:val="1"/>
+      <w:kern w:val="2"/>
+      <w:sz w:val="48"/>
+      <w:szCs w:val="32"/>
+    </w:rPr>
+  </w:style>
+  <w:style w:type="table" w:styleId="00000c" w:default="1">
+    <w:name w:val="Normal Table"/>
+    <w:uiPriority w:val="99"/>
+    <w:semiHidden w:val="1"/>
+    <w:unhideWhenUsed w:val="1"/>
+    <w:tblPr>
+      <w:tblInd w:w="0" w:type="dxa"/>
+      <w:tblCellMar>
+        <w:top w:w="0" w:type="dxa"/>
+        <w:left w:w="108" w:type="dxa"/>
+        <w:bottom w:w="0" w:type="dxa"/>
+        <w:right w:w="108" w:type="dxa"/>
+      </w:tblCellMar>
+    </w:tblPr>
+  </w:style>
+  <w:style w:type="paragraph" w:styleId="000003">
+    <w:name w:val="heading 2"/>
+    <w:basedOn w:val="000001"/>
+    <w:next w:val="000001"/>
+    <w:qFormat w:val="1"/>
+    <w:pPr>
+      <w:keepNext w:val="1"/>
+      <w:keepLines w:val="1"/>
+      <w:outlineLvl w:val="1"/>
+    </w:pPr>
+    <w:rPr>
+      <w:b w:val="1"/>
+      <w:sz w:val="32"/>
+    </w:rPr>
+  </w:style>
+  <w:style w:type="table" w:styleId="000015">
+    <w:name w:val="Table Grid"/>
+    <w:basedOn w:val="00000c"/>
+    <w:tblPr>
+      <w:tblBorders>
+        <w:top w:val="single" w:color="CBCDD1" w:sz="6" w:space="0"/>
+        <w:left w:val="single" w:color="CBCDD1" w:sz="6" w:space="0"/>
+        <w:bottom w:val="single" w:color="CBCDD1" w:sz="6" w:space="0"/>
+        <w:right w:val="single" w:color="CBCDD1" w:sz="6" w:space="0"/>
+        <w:insideH w:val="single" w:color="CBCDD1" w:sz="6" w:space="0"/>
+        <w:insideV w:val="single" w:color="CBCDD1" w:sz="6" w:space="0"/>
+      </w:tblBorders>
+    </w:tblPr>
+    <w:tcPr>
+      <w:vAlign w:val="center"/>
+    </w:tcPr>
+  </w:style>
+  <w:style w:type="paragraph" w:styleId="bshjqi">
+    <w:name w:val="toc 1"/>
+    <w:basedOn w:val="000001"/>
+    <w:next w:val="000001"/>
+    <w:autoRedefine w:val="1"/>
+    <w:uiPriority w:val="39"/>
+    <w:unhideWhenUsed w:val="1"/>
+    <w:pPr>
+      <w:spacing w:before="120" w:after="120"/>
+      <w:jc w:val="left"/>
+    </w:pPr>
+    <w:rPr>
+      <w:rFonts w:eastAsiaTheme="minorHAnsi"/>
+      <w:b w:val="1"/>
+      <w:bCs w:val="1"/>
+      <w:caps w:val="1"/>
+      <w:sz w:val="22"/>
+      <w:szCs w:val="22"/>
+    </w:rPr>
+  </w:style>
+  <w:style w:type="paragraph" w:styleId="1vk9h8">
+    <w:name w:val="toc 3"/>
+    <w:basedOn w:val="000001"/>
+    <w:next w:val="000001"/>
+    <w:autoRedefine w:val="1"/>
+    <w:uiPriority w:val="39"/>
+    <w:unhideWhenUsed w:val="1"/>
+    <w:pPr>
+      <w:ind w:left="420"/>
+      <w:jc w:val="left"/>
+    </w:pPr>
+    <w:rPr>
+      <w:rFonts w:eastAsiaTheme="minorHAnsi"/>
+      <w:iCs w:val="1"/>
+      <w:sz w:val="22"/>
+      <w:szCs w:val="22"/>
+    </w:rPr>
+  </w:style>
+  <w:style w:type="paragraph" w:styleId="6lteeg">
+    <w:name w:val="toc 2"/>
+    <w:basedOn w:val="000001"/>
+    <w:next w:val="000001"/>
+    <w:autoRedefine w:val="1"/>
+    <w:uiPriority w:val="39"/>
+    <w:unhideWhenUsed w:val="1"/>
+    <w:pPr>
+      <w:ind w:left="210"/>
+      <w:jc w:val="left"/>
+    </w:pPr>
+    <w:rPr>
+      <w:rFonts w:eastAsiaTheme="minorHAnsi"/>
+      <w:smallCaps w:val="1"/>
+      <w:sz w:val="22"/>
+      <w:szCs w:val="22"/>
     </w:rPr>
   </w:style>
   <w:style w:type="paragraph" w:styleId="b7ecvy">
@@ -3963,52 +4175,19 @@
       <w:szCs w:val="22"/>
     </w:rPr>
   </w:style>
-  <w:style w:type="character" w:styleId="000014" w:customStyle="1">
-    <w:name w:val="标题 字符"/>
-    <w:basedOn w:val="00000b"/>
-    <w:link w:val="000013"/>
-    <w:rPr>
-      <w:rFonts w:ascii="Arial" w:hAnsi="Arial" w:eastAsia="微软雅黑" w:cstheme="majorBidi"/>
-      <w:b w:val="1"/>
-      <w:bCs w:val="1"/>
-      <w:kern w:val="2"/>
-      <w:sz w:val="48"/>
-      <w:szCs w:val="32"/>
-    </w:rPr>
-  </w:style>
-  <w:style w:type="table" w:styleId="000015">
-    <w:name w:val="Table Grid"/>
-    <w:basedOn w:val="00000c"/>
-    <w:tblPr>
-      <w:tblBorders>
-        <w:top w:val="single" w:color="CBCDD1" w:sz="6" w:space="0"/>
-        <w:left w:val="single" w:color="CBCDD1" w:sz="6" w:space="0"/>
-        <w:bottom w:val="single" w:color="CBCDD1" w:sz="6" w:space="0"/>
-        <w:right w:val="single" w:color="CBCDD1" w:sz="6" w:space="0"/>
-        <w:insideH w:val="single" w:color="CBCDD1" w:sz="6" w:space="0"/>
-        <w:insideV w:val="single" w:color="CBCDD1" w:sz="6" w:space="0"/>
-      </w:tblBorders>
-    </w:tblPr>
-    <w:tcPr>
-      <w:vAlign w:val="center"/>
-    </w:tcPr>
-  </w:style>
-  <w:style w:type="paragraph" w:styleId="vwvnpp">
-    <w:name w:val="toc 3"/>
+  <w:style w:type="paragraph" w:styleId="000004">
+    <w:name w:val="heading 3"/>
     <w:basedOn w:val="000001"/>
     <w:next w:val="000001"/>
-    <w:autoRedefine w:val="1"/>
-    <w:uiPriority w:val="39"/>
-    <w:unhideWhenUsed w:val="1"/>
+    <w:qFormat w:val="1"/>
     <w:pPr>
-      <w:ind w:left="420"/>
-      <w:jc w:val="left"/>
+      <w:keepNext w:val="1"/>
+      <w:keepLines w:val="1"/>
+      <w:outlineLvl w:val="2"/>
     </w:pPr>
     <w:rPr>
-      <w:rFonts w:eastAsiaTheme="minorHAnsi"/>
-      <w:iCs w:val="1"/>
-      <w:sz w:val="22"/>
-      <w:szCs w:val="22"/>
+      <w:b w:val="1"/>
+      <w:sz w:val="28"/>
     </w:rPr>
   </w:style>
   <w:style w:type="paragraph" w:styleId="9buhbs">
@@ -4031,7 +4210,25 @@
       <w:szCs w:val="22"/>
     </w:rPr>
   </w:style>
-  <w:style w:type="paragraph" w:styleId="o14ybc">
+  <w:style w:type="paragraph" w:styleId="zwphl0">
+    <w:name w:val="toc 2"/>
+    <w:basedOn w:val="000001"/>
+    <w:next w:val="000001"/>
+    <w:autoRedefine w:val="1"/>
+    <w:uiPriority w:val="39"/>
+    <w:unhideWhenUsed w:val="1"/>
+    <w:pPr>
+      <w:ind w:left="210"/>
+      <w:jc w:val="left"/>
+    </w:pPr>
+    <w:rPr>
+      <w:rFonts w:eastAsiaTheme="minorHAnsi"/>
+      <w:smallCaps w:val="1"/>
+      <w:sz w:val="22"/>
+      <w:szCs w:val="22"/>
+    </w:rPr>
+  </w:style>
+  <w:style w:type="paragraph" w:styleId="j02txd">
     <w:name w:val="toc 3"/>
     <w:basedOn w:val="000001"/>
     <w:next w:val="000001"/>
@@ -4045,6 +4242,213 @@
     <w:rPr>
       <w:rFonts w:eastAsiaTheme="minorHAnsi"/>
       <w:iCs w:val="1"/>
+      <w:sz w:val="22"/>
+      <w:szCs w:val="22"/>
+    </w:rPr>
+  </w:style>
+  <w:style w:type="paragraph" w:styleId="7flirm">
+    <w:name w:val="toc 2"/>
+    <w:basedOn w:val="000001"/>
+    <w:next w:val="000001"/>
+    <w:autoRedefine w:val="1"/>
+    <w:uiPriority w:val="39"/>
+    <w:unhideWhenUsed w:val="1"/>
+    <w:pPr>
+      <w:ind w:left="210"/>
+      <w:jc w:val="left"/>
+    </w:pPr>
+    <w:rPr>
+      <w:rFonts w:eastAsiaTheme="minorHAnsi"/>
+      <w:smallCaps w:val="1"/>
+      <w:sz w:val="22"/>
+      <w:szCs w:val="22"/>
+    </w:rPr>
+  </w:style>
+  <w:style w:type="paragraph" w:styleId="h8wprv">
+    <w:name w:val="toc 2"/>
+    <w:basedOn w:val="000001"/>
+    <w:next w:val="000001"/>
+    <w:autoRedefine w:val="1"/>
+    <w:uiPriority w:val="39"/>
+    <w:unhideWhenUsed w:val="1"/>
+    <w:pPr>
+      <w:ind w:left="210"/>
+      <w:jc w:val="left"/>
+    </w:pPr>
+    <w:rPr>
+      <w:rFonts w:eastAsiaTheme="minorHAnsi"/>
+      <w:smallCaps w:val="1"/>
+      <w:sz w:val="22"/>
+      <w:szCs w:val="22"/>
+    </w:rPr>
+  </w:style>
+  <w:style w:type="paragraph" w:styleId="00000e">
+    <w:name w:val="toc 8"/>
+    <w:basedOn w:val="000001"/>
+    <w:next w:val="000001"/>
+    <w:autoRedefine w:val="1"/>
+    <w:uiPriority w:val="99"/>
+    <w:pPr>
+      <w:ind w:left="2940" w:leftChars="1400"/>
+    </w:pPr>
+  </w:style>
+  <w:style w:type="paragraph" w:styleId="rolian">
+    <w:name w:val="toc 3"/>
+    <w:basedOn w:val="000001"/>
+    <w:next w:val="000001"/>
+    <w:autoRedefine w:val="1"/>
+    <w:uiPriority w:val="39"/>
+    <w:unhideWhenUsed w:val="1"/>
+    <w:pPr>
+      <w:ind w:left="420"/>
+      <w:jc w:val="left"/>
+    </w:pPr>
+    <w:rPr>
+      <w:rFonts w:eastAsiaTheme="minorHAnsi"/>
+      <w:iCs w:val="1"/>
+      <w:sz w:val="22"/>
+      <w:szCs w:val="22"/>
+    </w:rPr>
+  </w:style>
+  <w:style w:type="paragraph" w:styleId="000007">
+    <w:name w:val="heading 6"/>
+    <w:basedOn w:val="000001"/>
+    <w:next w:val="000001"/>
+    <w:qFormat w:val="1"/>
+    <w:pPr>
+      <w:keepNext w:val="1"/>
+      <w:keepLines w:val="1"/>
+      <w:spacing w:line="480" w:lineRule="auto"/>
+      <w:outlineLvl w:val="5"/>
+    </w:pPr>
+    <w:rPr>
+      <w:b w:val="1"/>
+    </w:rPr>
+  </w:style>
+  <w:style w:type="paragraph" w:styleId="m2crkd">
+    <w:name w:val="toc 2"/>
+    <w:basedOn w:val="000001"/>
+    <w:next w:val="000001"/>
+    <w:autoRedefine w:val="1"/>
+    <w:uiPriority w:val="39"/>
+    <w:unhideWhenUsed w:val="1"/>
+    <w:pPr>
+      <w:ind w:left="210"/>
+      <w:jc w:val="left"/>
+    </w:pPr>
+    <w:rPr>
+      <w:rFonts w:eastAsiaTheme="minorHAnsi"/>
+      <w:smallCaps w:val="1"/>
+      <w:sz w:val="22"/>
+      <w:szCs w:val="22"/>
+    </w:rPr>
+  </w:style>
+  <w:style w:type="character" w:styleId="000017" w:customStyle="1">
+    <w:name w:val="melo-codeblock-Base-theme-char"/>
+    <w:uiPriority w:val="99"/>
+    <w:rPr>
+      <w:rFonts w:ascii="Monaco" w:hAnsi="Monaco" w:eastAsia="Monaco" w:cs="Monaco"/>
+      <w:color w:val="000000"/>
+      <w:sz w:val="21"/>
+    </w:rPr>
+  </w:style>
+  <w:style w:type="paragraph" w:styleId="000002">
+    <w:name w:val="heading 1"/>
+    <w:basedOn w:val="000001"/>
+    <w:next w:val="000001"/>
+    <w:qFormat w:val="1"/>
+    <w:pPr>
+      <w:keepNext w:val="1"/>
+      <w:keepLines w:val="1"/>
+      <w:outlineLvl w:val="0"/>
+    </w:pPr>
+    <w:rPr>
+      <w:b w:val="1"/>
+      <w:kern w:val="44"/>
+      <w:sz w:val="36"/>
+    </w:rPr>
+  </w:style>
+  <w:style w:type="paragraph" w:styleId="000006">
+    <w:name w:val="heading 5"/>
+    <w:basedOn w:val="000001"/>
+    <w:next w:val="000001"/>
+    <w:qFormat w:val="1"/>
+    <w:pPr>
+      <w:keepNext w:val="1"/>
+      <w:keepLines w:val="1"/>
+      <w:spacing w:line="480" w:lineRule="auto"/>
+      <w:outlineLvl w:val="4"/>
+    </w:pPr>
+    <w:rPr>
+      <w:b w:val="1"/>
+    </w:rPr>
+  </w:style>
+  <w:style w:type="paragraph" w:styleId="00000a">
+    <w:name w:val="heading 9"/>
+    <w:basedOn w:val="000001"/>
+    <w:next w:val="000001"/>
+    <w:unhideWhenUsed w:val="1"/>
+    <w:qFormat w:val="1"/>
+    <w:pPr>
+      <w:keepNext w:val="1"/>
+      <w:keepLines w:val="1"/>
+      <w:spacing w:line="480" w:lineRule="auto"/>
+      <w:outlineLvl w:val="8"/>
+    </w:pPr>
+    <w:rPr>
+      <w:b w:val="1"/>
+    </w:rPr>
+  </w:style>
+  <w:style w:type="paragraph" w:styleId="00000f">
+    <w:name w:val="footer"/>
+    <w:basedOn w:val="000001"/>
+    <w:pPr>
+      <w:tabs>
+        <w:tab w:val="center" w:pos="4153"/>
+        <w:tab w:val="right" w:pos="8306"/>
+      </w:tabs>
+      <w:snapToGrid w:val="0"/>
+      <w:jc w:val="center"/>
+    </w:pPr>
+    <w:rPr>
+      <w:sz w:val="18"/>
+      <w:szCs w:val="18"/>
+    </w:rPr>
+  </w:style>
+  <w:style w:type="paragraph" w:styleId="000013">
+    <w:name w:val="Title"/>
+    <w:basedOn w:val="000001"/>
+    <w:next w:val="000001"/>
+    <w:link w:val="000014"/>
+    <w:qFormat w:val="1"/>
+    <w:pPr>
+      <w:jc w:val="center"/>
+      <w:outlineLvl w:val="0"/>
+    </w:pPr>
+    <w:rPr>
+      <w:rFonts w:cstheme="majorBidi"/>
+      <w:b w:val="1"/>
+      <w:bCs w:val="1"/>
+      <w:sz w:val="48"/>
+      <w:szCs w:val="32"/>
+    </w:rPr>
+  </w:style>
+  <w:style w:type="paragraph" w:styleId="d9qtoo">
+    <w:name w:val="toc 1"/>
+    <w:basedOn w:val="000001"/>
+    <w:next w:val="000001"/>
+    <w:autoRedefine w:val="1"/>
+    <w:uiPriority w:val="39"/>
+    <w:unhideWhenUsed w:val="1"/>
+    <w:pPr>
+      <w:spacing w:before="120" w:after="120"/>
+      <w:jc w:val="left"/>
+    </w:pPr>
+    <w:rPr>
+      <w:rFonts w:eastAsiaTheme="minorHAnsi"/>
+      <w:b w:val="1"/>
+      <w:bCs w:val="1"/>
+      <w:caps w:val="1"/>
       <w:sz w:val="22"/>
       <w:szCs w:val="22"/>
     </w:rPr>
@@ -4067,27 +4471,6 @@
       <w:szCs w:val="22"/>
     </w:rPr>
   </w:style>
-  <w:style w:type="paragraph" w:styleId="000001" w:default="1">
-    <w:name w:val="Normal"/>
-    <w:qFormat w:val="1"/>
-    <w:pPr>
-      <w:widowControl w:val="0"/>
-      <w:spacing w:before="60" w:after="60"/>
-      <w:jc w:val="both"/>
-    </w:pPr>
-    <w:rPr>
-      <w:color w:val="333333"/>
-      <w:kern w:val="2"/>
-      <w:sz w:val="22"/>
-      <w:szCs w:val="24"/>
-    </w:rPr>
-  </w:style>
-  <w:style w:type="character" w:styleId="00000b" w:default="1">
-    <w:name w:val="Default Paragraph Font"/>
-    <w:uiPriority w:val="1"/>
-    <w:semiHidden w:val="1"/>
-    <w:unhideWhenUsed w:val="1"/>
-  </w:style>
   <w:style w:type="paragraph" w:styleId="000011">
     <w:name w:val="Subtitle"/>
     <w:basedOn w:val="000001"/>
@@ -4107,26 +4490,35 @@
       <w:szCs w:val="32"/>
     </w:rPr>
   </w:style>
-  <w:style w:type="paragraph" w:styleId="000010">
-    <w:name w:val="header"/>
+  <w:style w:type="character" w:styleId="000012" w:customStyle="1">
+    <w:name w:val="副标题 字符"/>
+    <w:basedOn w:val="00000b"/>
+    <w:link w:val="000011"/>
+    <w:rPr>
+      <w:rFonts w:ascii="Arial" w:hAnsi="Arial" w:eastAsia="微软雅黑" w:cstheme="minorBidi"/>
+      <w:b w:val="1"/>
+      <w:bCs w:val="1"/>
+      <w:kern w:val="28"/>
+      <w:sz w:val="44"/>
+      <w:szCs w:val="32"/>
+    </w:rPr>
+  </w:style>
+  <w:style w:type="paragraph" w:styleId="000005">
+    <w:name w:val="heading 4"/>
     <w:basedOn w:val="000001"/>
+    <w:next w:val="000001"/>
+    <w:qFormat w:val="1"/>
     <w:pPr>
-      <w:pBdr>
-        <w:bottom w:val="single" w:color="auto" w:sz="6" w:space="1"/>
-      </w:pBdr>
-      <w:tabs>
-        <w:tab w:val="center" w:pos="4153"/>
-        <w:tab w:val="right" w:pos="8306"/>
-      </w:tabs>
-      <w:snapToGrid w:val="0"/>
-      <w:jc w:val="center"/>
+      <w:keepNext w:val="1"/>
+      <w:keepLines w:val="1"/>
+      <w:outlineLvl w:val="3"/>
     </w:pPr>
     <w:rPr>
-      <w:sz w:val="18"/>
-      <w:szCs w:val="18"/>
+      <w:b w:val="1"/>
+      <w:sz w:val="24"/>
     </w:rPr>
   </w:style>
-  <w:style w:type="paragraph" w:styleId="h8wprv">
+  <w:style w:type="paragraph" w:styleId="iukpf3">
     <w:name w:val="toc 2"/>
     <w:basedOn w:val="000001"/>
     <w:next w:val="000001"/>
@@ -4144,53 +4536,20 @@
       <w:szCs w:val="22"/>
     </w:rPr>
   </w:style>
-  <w:style w:type="paragraph" w:styleId="2e4cod">
-    <w:name w:val="toc 2"/>
+  <w:style w:type="paragraph" w:styleId="000009">
+    <w:name w:val="heading 8"/>
     <w:basedOn w:val="000001"/>
     <w:next w:val="000001"/>
-    <w:autoRedefine w:val="1"/>
-    <w:uiPriority w:val="39"/>
     <w:unhideWhenUsed w:val="1"/>
+    <w:qFormat w:val="1"/>
     <w:pPr>
-      <w:ind w:left="210"/>
-      <w:jc w:val="left"/>
+      <w:keepNext w:val="1"/>
+      <w:keepLines w:val="1"/>
+      <w:spacing w:line="480" w:lineRule="auto"/>
+      <w:outlineLvl w:val="7"/>
     </w:pPr>
     <w:rPr>
-      <w:rFonts w:eastAsiaTheme="minorHAnsi"/>
-      <w:smallCaps w:val="1"/>
-      <w:sz w:val="22"/>
-      <w:szCs w:val="22"/>
-    </w:rPr>
-  </w:style>
-  <w:style w:type="character" w:styleId="000012" w:customStyle="1">
-    <w:name w:val="副标题 字符"/>
-    <w:basedOn w:val="00000b"/>
-    <w:link w:val="000011"/>
-    <w:rPr>
-      <w:rFonts w:ascii="Arial" w:hAnsi="Arial" w:eastAsia="微软雅黑" w:cstheme="minorBidi"/>
       <w:b w:val="1"/>
-      <w:bCs w:val="1"/>
-      <w:kern w:val="28"/>
-      <w:sz w:val="44"/>
-      <w:szCs w:val="32"/>
-    </w:rPr>
-  </w:style>
-  <w:style w:type="paragraph" w:styleId="1vk9h8">
-    <w:name w:val="toc 3"/>
-    <w:basedOn w:val="000001"/>
-    <w:next w:val="000001"/>
-    <w:autoRedefine w:val="1"/>
-    <w:uiPriority w:val="39"/>
-    <w:unhideWhenUsed w:val="1"/>
-    <w:pPr>
-      <w:ind w:left="420"/>
-      <w:jc w:val="left"/>
-    </w:pPr>
-    <w:rPr>
-      <w:rFonts w:eastAsiaTheme="minorHAnsi"/>
-      <w:iCs w:val="1"/>
-      <w:sz w:val="22"/>
-      <w:szCs w:val="22"/>
     </w:rPr>
   </w:style>
   <w:style w:type="paragraph" w:styleId="ohqvve">
@@ -4211,210 +4570,17 @@
       <w:szCs w:val="22"/>
     </w:rPr>
   </w:style>
-  <w:style w:type="paragraph" w:styleId="iukpf3">
-    <w:name w:val="toc 2"/>
-    <w:basedOn w:val="000001"/>
-    <w:next w:val="000001"/>
-    <w:autoRedefine w:val="1"/>
-    <w:uiPriority w:val="39"/>
-    <w:unhideWhenUsed w:val="1"/>
-    <w:pPr>
-      <w:ind w:left="210"/>
-      <w:jc w:val="left"/>
-    </w:pPr>
-    <w:rPr>
-      <w:rFonts w:eastAsiaTheme="minorHAnsi"/>
-      <w:smallCaps w:val="1"/>
-      <w:sz w:val="22"/>
-      <w:szCs w:val="22"/>
-    </w:rPr>
-  </w:style>
-  <w:style w:type="paragraph" w:styleId="d9qtoo">
-    <w:name w:val="toc 1"/>
-    <w:basedOn w:val="000001"/>
-    <w:next w:val="000001"/>
-    <w:autoRedefine w:val="1"/>
-    <w:uiPriority w:val="39"/>
-    <w:unhideWhenUsed w:val="1"/>
-    <w:pPr>
-      <w:spacing w:before="120" w:after="120"/>
-      <w:jc w:val="left"/>
-    </w:pPr>
-    <w:rPr>
-      <w:rFonts w:eastAsiaTheme="minorHAnsi"/>
-      <w:b w:val="1"/>
-      <w:bCs w:val="1"/>
-      <w:caps w:val="1"/>
-      <w:sz w:val="22"/>
-      <w:szCs w:val="22"/>
-    </w:rPr>
-  </w:style>
-  <w:style w:type="paragraph" w:styleId="000003">
-    <w:name w:val="heading 2"/>
-    <w:basedOn w:val="000001"/>
-    <w:next w:val="000001"/>
-    <w:qFormat w:val="1"/>
-    <w:pPr>
-      <w:keepNext w:val="1"/>
-      <w:keepLines w:val="1"/>
-      <w:outlineLvl w:val="1"/>
-    </w:pPr>
-    <w:rPr>
-      <w:b w:val="1"/>
-      <w:sz w:val="32"/>
-    </w:rPr>
-  </w:style>
-  <w:style w:type="paragraph" w:styleId="000009">
-    <w:name w:val="heading 8"/>
-    <w:basedOn w:val="000001"/>
-    <w:next w:val="000001"/>
-    <w:unhideWhenUsed w:val="1"/>
-    <w:qFormat w:val="1"/>
-    <w:pPr>
-      <w:keepNext w:val="1"/>
-      <w:keepLines w:val="1"/>
-      <w:spacing w:line="480" w:lineRule="auto"/>
-      <w:outlineLvl w:val="7"/>
-    </w:pPr>
-    <w:rPr>
-      <w:b w:val="1"/>
-    </w:rPr>
-  </w:style>
-  <w:style w:type="paragraph" w:styleId="bshjqi">
-    <w:name w:val="toc 1"/>
-    <w:basedOn w:val="000001"/>
-    <w:next w:val="000001"/>
-    <w:autoRedefine w:val="1"/>
-    <w:uiPriority w:val="39"/>
-    <w:unhideWhenUsed w:val="1"/>
-    <w:pPr>
-      <w:spacing w:before="120" w:after="120"/>
-      <w:jc w:val="left"/>
-    </w:pPr>
-    <w:rPr>
-      <w:rFonts w:eastAsiaTheme="minorHAnsi"/>
-      <w:b w:val="1"/>
-      <w:bCs w:val="1"/>
-      <w:caps w:val="1"/>
-      <w:sz w:val="22"/>
-      <w:szCs w:val="22"/>
-    </w:rPr>
-  </w:style>
-  <w:style w:type="paragraph" w:styleId="rolian">
-    <w:name w:val="toc 3"/>
-    <w:basedOn w:val="000001"/>
-    <w:next w:val="000001"/>
-    <w:autoRedefine w:val="1"/>
-    <w:uiPriority w:val="39"/>
-    <w:unhideWhenUsed w:val="1"/>
-    <w:pPr>
-      <w:ind w:left="420"/>
-      <w:jc w:val="left"/>
-    </w:pPr>
-    <w:rPr>
-      <w:rFonts w:eastAsiaTheme="minorHAnsi"/>
-      <w:iCs w:val="1"/>
-      <w:sz w:val="22"/>
-      <w:szCs w:val="22"/>
-    </w:rPr>
-  </w:style>
-  <w:style w:type="paragraph" w:styleId="000008">
-    <w:name w:val="heading 7"/>
-    <w:basedOn w:val="000001"/>
-    <w:next w:val="000001"/>
-    <w:unhideWhenUsed w:val="1"/>
-    <w:qFormat w:val="1"/>
-    <w:pPr>
-      <w:keepNext w:val="1"/>
-      <w:keepLines w:val="1"/>
-      <w:spacing w:line="480" w:lineRule="auto"/>
-      <w:outlineLvl w:val="6"/>
-    </w:pPr>
-    <w:rPr>
-      <w:b w:val="1"/>
-    </w:rPr>
-  </w:style>
-  <w:style w:type="table" w:styleId="00000c" w:default="1">
-    <w:name w:val="Normal Table"/>
-    <w:uiPriority w:val="99"/>
-    <w:semiHidden w:val="1"/>
-    <w:unhideWhenUsed w:val="1"/>
-    <w:tblPr>
-      <w:tblInd w:w="0" w:type="dxa"/>
-      <w:tblCellMar>
-        <w:top w:w="0" w:type="dxa"/>
-        <w:left w:w="108" w:type="dxa"/>
-        <w:bottom w:w="0" w:type="dxa"/>
-        <w:right w:w="108" w:type="dxa"/>
-      </w:tblCellMar>
-    </w:tblPr>
-  </w:style>
-  <w:style w:type="paragraph" w:styleId="00000f">
-    <w:name w:val="footer"/>
-    <w:basedOn w:val="000001"/>
-    <w:pPr>
-      <w:tabs>
-        <w:tab w:val="center" w:pos="4153"/>
-        <w:tab w:val="right" w:pos="8306"/>
-      </w:tabs>
-      <w:snapToGrid w:val="0"/>
-      <w:jc w:val="center"/>
-    </w:pPr>
-    <w:rPr>
-      <w:sz w:val="18"/>
-      <w:szCs w:val="18"/>
-    </w:rPr>
-  </w:style>
-  <w:style w:type="paragraph" w:styleId="00000e">
-    <w:name w:val="toc 8"/>
-    <w:basedOn w:val="000001"/>
-    <w:next w:val="000001"/>
-    <w:autoRedefine w:val="1"/>
+  <w:style w:type="paragraph" w:styleId="000018" w:customStyle="1">
+    <w:name w:val="melo-codeblock-Base-theme-para"/>
     <w:uiPriority w:val="99"/>
     <w:pPr>
-      <w:ind w:left="2940" w:leftChars="1400"/>
+      <w:snapToGrid w:val="0"/>
+      <w:spacing w:line="360" w:lineRule="auto"/>
     </w:pPr>
-  </w:style>
-  <w:style w:type="character" w:styleId="000017" w:customStyle="1">
-    <w:name w:val="melo-codeblock-Base-theme-char"/>
-    <w:uiPriority w:val="99"/>
     <w:rPr>
       <w:rFonts w:ascii="Monaco" w:hAnsi="Monaco" w:eastAsia="Monaco" w:cs="Monaco"/>
       <w:color w:val="000000"/>
       <w:sz w:val="21"/>
-    </w:rPr>
-  </w:style>
-  <w:style w:type="paragraph" w:styleId="000004">
-    <w:name w:val="heading 3"/>
-    <w:basedOn w:val="000001"/>
-    <w:next w:val="000001"/>
-    <w:qFormat w:val="1"/>
-    <w:pPr>
-      <w:keepNext w:val="1"/>
-      <w:keepLines w:val="1"/>
-      <w:outlineLvl w:val="2"/>
-    </w:pPr>
-    <w:rPr>
-      <w:b w:val="1"/>
-      <w:sz w:val="28"/>
-    </w:rPr>
-  </w:style>
-  <w:style w:type="paragraph" w:styleId="000013">
-    <w:name w:val="Title"/>
-    <w:basedOn w:val="000001"/>
-    <w:next w:val="000001"/>
-    <w:link w:val="000014"/>
-    <w:qFormat w:val="1"/>
-    <w:pPr>
-      <w:jc w:val="center"/>
-      <w:outlineLvl w:val="0"/>
-    </w:pPr>
-    <w:rPr>
-      <w:rFonts w:cstheme="majorBidi"/>
-      <w:b w:val="1"/>
-      <w:bCs w:val="1"/>
-      <w:sz w:val="48"/>
-      <w:szCs w:val="32"/>
     </w:rPr>
   </w:style>
   <w:style w:type="paragraph" w:styleId="iwzifo">
@@ -4435,188 +4601,22 @@
       <w:szCs w:val="22"/>
     </w:rPr>
   </w:style>
-  <w:style w:type="numbering" w:styleId="00000d" w:default="1">
-    <w:name w:val="No List"/>
-    <w:uiPriority w:val="99"/>
-    <w:semiHidden w:val="1"/>
-    <w:unhideWhenUsed w:val="1"/>
-  </w:style>
-  <w:style w:type="paragraph" w:styleId="00000a">
-    <w:name w:val="heading 9"/>
-    <w:basedOn w:val="000001"/>
-    <w:next w:val="000001"/>
-    <w:unhideWhenUsed w:val="1"/>
+  <w:style w:type="paragraph" w:styleId="000001" w:default="1">
+    <w:name w:val="Normal"/>
     <w:qFormat w:val="1"/>
     <w:pPr>
-      <w:keepNext w:val="1"/>
-      <w:keepLines w:val="1"/>
-      <w:spacing w:line="480" w:lineRule="auto"/>
-      <w:outlineLvl w:val="8"/>
+      <w:widowControl w:val="0"/>
+      <w:spacing w:before="60" w:after="60"/>
+      <w:jc w:val="both"/>
     </w:pPr>
     <w:rPr>
-      <w:b w:val="1"/>
-    </w:rPr>
-  </w:style>
-  <w:style w:type="paragraph" w:styleId="000005">
-    <w:name w:val="heading 4"/>
-    <w:basedOn w:val="000001"/>
-    <w:next w:val="000001"/>
-    <w:qFormat w:val="1"/>
-    <w:pPr>
-      <w:keepNext w:val="1"/>
-      <w:keepLines w:val="1"/>
-      <w:outlineLvl w:val="3"/>
-    </w:pPr>
-    <w:rPr>
-      <w:b w:val="1"/>
-      <w:sz w:val="24"/>
-    </w:rPr>
-  </w:style>
-  <w:style w:type="paragraph" w:styleId="000007">
-    <w:name w:val="heading 6"/>
-    <w:basedOn w:val="000001"/>
-    <w:next w:val="000001"/>
-    <w:qFormat w:val="1"/>
-    <w:pPr>
-      <w:keepNext w:val="1"/>
-      <w:keepLines w:val="1"/>
-      <w:spacing w:line="480" w:lineRule="auto"/>
-      <w:outlineLvl w:val="5"/>
-    </w:pPr>
-    <w:rPr>
-      <w:b w:val="1"/>
-    </w:rPr>
-  </w:style>
-  <w:style w:type="paragraph" w:styleId="7flirm">
-    <w:name w:val="toc 2"/>
-    <w:basedOn w:val="000001"/>
-    <w:next w:val="000001"/>
-    <w:autoRedefine w:val="1"/>
-    <w:uiPriority w:val="39"/>
-    <w:unhideWhenUsed w:val="1"/>
-    <w:pPr>
-      <w:ind w:left="210"/>
-      <w:jc w:val="left"/>
-    </w:pPr>
-    <w:rPr>
-      <w:rFonts w:eastAsiaTheme="minorHAnsi"/>
-      <w:smallCaps w:val="1"/>
+      <w:color w:val="333333"/>
+      <w:kern w:val="2"/>
       <w:sz w:val="22"/>
-      <w:szCs w:val="22"/>
-    </w:rPr>
-  </w:style>
-  <w:style w:type="paragraph" w:styleId="zwphl0">
-    <w:name w:val="toc 2"/>
-    <w:basedOn w:val="000001"/>
-    <w:next w:val="000001"/>
-    <w:autoRedefine w:val="1"/>
-    <w:uiPriority w:val="39"/>
-    <w:unhideWhenUsed w:val="1"/>
-    <w:pPr>
-      <w:ind w:left="210"/>
-      <w:jc w:val="left"/>
-    </w:pPr>
-    <w:rPr>
-      <w:rFonts w:eastAsiaTheme="minorHAnsi"/>
-      <w:smallCaps w:val="1"/>
-      <w:sz w:val="22"/>
-      <w:szCs w:val="22"/>
-    </w:rPr>
-  </w:style>
-  <w:style w:type="paragraph" w:styleId="m2crkd">
-    <w:name w:val="toc 2"/>
-    <w:basedOn w:val="000001"/>
-    <w:next w:val="000001"/>
-    <w:autoRedefine w:val="1"/>
-    <w:uiPriority w:val="39"/>
-    <w:unhideWhenUsed w:val="1"/>
-    <w:pPr>
-      <w:ind w:left="210"/>
-      <w:jc w:val="left"/>
-    </w:pPr>
-    <w:rPr>
-      <w:rFonts w:eastAsiaTheme="minorHAnsi"/>
-      <w:smallCaps w:val="1"/>
-      <w:sz w:val="22"/>
-      <w:szCs w:val="22"/>
-    </w:rPr>
-  </w:style>
-  <w:style w:type="paragraph" w:styleId="6lteeg">
-    <w:name w:val="toc 2"/>
-    <w:basedOn w:val="000001"/>
-    <w:next w:val="000001"/>
-    <w:autoRedefine w:val="1"/>
-    <w:uiPriority w:val="39"/>
-    <w:unhideWhenUsed w:val="1"/>
-    <w:pPr>
-      <w:ind w:left="210"/>
-      <w:jc w:val="left"/>
-    </w:pPr>
-    <w:rPr>
-      <w:rFonts w:eastAsiaTheme="minorHAnsi"/>
-      <w:smallCaps w:val="1"/>
-      <w:sz w:val="22"/>
-      <w:szCs w:val="22"/>
-    </w:rPr>
-  </w:style>
-  <w:style w:type="paragraph" w:styleId="000006">
-    <w:name w:val="heading 5"/>
-    <w:basedOn w:val="000001"/>
-    <w:next w:val="000001"/>
-    <w:qFormat w:val="1"/>
-    <w:pPr>
-      <w:keepNext w:val="1"/>
-      <w:keepLines w:val="1"/>
-      <w:spacing w:line="480" w:lineRule="auto"/>
-      <w:outlineLvl w:val="4"/>
-    </w:pPr>
-    <w:rPr>
-      <w:b w:val="1"/>
-    </w:rPr>
-  </w:style>
-  <w:style w:type="paragraph" w:styleId="000002">
-    <w:name w:val="heading 1"/>
-    <w:basedOn w:val="000001"/>
-    <w:next w:val="000001"/>
-    <w:qFormat w:val="1"/>
-    <w:pPr>
-      <w:keepNext w:val="1"/>
-      <w:keepLines w:val="1"/>
-      <w:outlineLvl w:val="0"/>
-    </w:pPr>
-    <w:rPr>
-      <w:b w:val="1"/>
-      <w:kern w:val="44"/>
-      <w:sz w:val="36"/>
-    </w:rPr>
-  </w:style>
-  <w:style w:type="character" w:styleId="000016">
-    <w:name w:val="Hyperlink"/>
-    <w:basedOn w:val="00000b"/>
-    <w:rPr>
-      <w:color w:val="1E6FFF"/>
-      <w:u w:val="single"/>
+      <w:szCs w:val="24"/>
     </w:rPr>
   </w:style>
   <w:style w:type="paragraph" w:styleId="64a5ey">
-    <w:name w:val="toc 3"/>
-    <w:basedOn w:val="000001"/>
-    <w:next w:val="000001"/>
-    <w:autoRedefine w:val="1"/>
-    <w:uiPriority w:val="39"/>
-    <w:unhideWhenUsed w:val="1"/>
-    <w:pPr>
-      <w:ind w:left="420"/>
-      <w:jc w:val="left"/>
-    </w:pPr>
-    <w:rPr>
-      <w:rFonts w:eastAsiaTheme="minorHAnsi"/>
-      <w:iCs w:val="1"/>
-      <w:sz w:val="22"/>
-      <w:szCs w:val="22"/>
-    </w:rPr>
-  </w:style>
-  <w:style w:type="paragraph" w:styleId="j02txd">
     <w:name w:val="toc 3"/>
     <w:basedOn w:val="000001"/>
     <w:next w:val="000001"/>

</xml_diff>